<commit_message>
Reformat AIEC國防領域AI應用導入專案規劃書.docx with SimHei (中黑體) for Traditional Chinese text and Arial for English text across all document styles and TOC
</commit_message>
<xml_diff>
--- a/AIEC國防領域AI應用導入專案規劃書.docx
+++ b/AIEC國防領域AI應用導入專案規劃書.docx
@@ -9,7 +9,7 @@
       </w:pPr>
       <w:r>
         <w:rPr>
-          <w:rFonts w:ascii="微軟正黑體" w:hAnsi="微軟正黑體"/>
+          <w:rFonts w:ascii="Arial" w:hAnsi="Arial" w:eastAsia="SimHei" w:cs="Arial"/>
           <w:b/>
           <w:color w:val="2563EB"/>
           <w:sz w:val="28"/>
@@ -19,7 +19,7 @@
       </w:r>
       <w:r>
         <w:rPr>
-          <w:rFonts w:ascii="微軟正黑體" w:hAnsi="微軟正黑體"/>
+          <w:rFonts w:ascii="Arial" w:hAnsi="Arial" w:eastAsia="SimHei" w:cs="Arial"/>
           <w:b/>
           <w:color w:val="0C2340"/>
           <w:sz w:val="56"/>
@@ -34,7 +34,7 @@
       </w:pPr>
       <w:r>
         <w:rPr>
-          <w:rFonts w:ascii="微軟正黑體" w:hAnsi="微軟正黑體"/>
+          <w:rFonts w:ascii="Arial" w:hAnsi="Arial" w:eastAsia="SimHei" w:cs="Arial"/>
           <w:b/>
           <w:color w:val="475569"/>
           <w:sz w:val="27"/>
@@ -63,7 +63,7 @@
             </w:pPr>
             <w:r>
               <w:rPr>
-                <w:rFonts w:ascii="微軟正黑體" w:hAnsi="微軟正黑體"/>
+                <w:rFonts w:ascii="Arial" w:hAnsi="Arial" w:eastAsia="SimHei" w:cs="Arial"/>
                 <w:b/>
                 <w:color w:val="2563EB"/>
                 <w:sz w:val="21"/>
@@ -79,7 +79,7 @@
           <w:p>
             <w:r>
               <w:rPr>
-                <w:rFonts w:ascii="微軟正黑體" w:hAnsi="微軟正黑體"/>
+                <w:rFonts w:ascii="Arial" w:hAnsi="Arial" w:eastAsia="SimHei" w:cs="Arial"/>
                 <w:color w:val="0C2340"/>
                 <w:sz w:val="21"/>
               </w:rPr>
@@ -99,7 +99,7 @@
             </w:pPr>
             <w:r>
               <w:rPr>
-                <w:rFonts w:ascii="微軟正黑體" w:hAnsi="微軟正黑體"/>
+                <w:rFonts w:ascii="Arial" w:hAnsi="Arial" w:eastAsia="SimHei" w:cs="Arial"/>
                 <w:b/>
                 <w:color w:val="2563EB"/>
                 <w:sz w:val="21"/>
@@ -115,7 +115,7 @@
           <w:p>
             <w:r>
               <w:rPr>
-                <w:rFonts w:ascii="微軟正黑體" w:hAnsi="微軟正黑體"/>
+                <w:rFonts w:ascii="Arial" w:hAnsi="Arial" w:eastAsia="SimHei" w:cs="Arial"/>
                 <w:color w:val="0C2340"/>
                 <w:sz w:val="21"/>
               </w:rPr>
@@ -135,7 +135,7 @@
             </w:pPr>
             <w:r>
               <w:rPr>
-                <w:rFonts w:ascii="微軟正黑體" w:hAnsi="微軟正黑體"/>
+                <w:rFonts w:ascii="Arial" w:hAnsi="Arial" w:eastAsia="SimHei" w:cs="Arial"/>
                 <w:b/>
                 <w:color w:val="2563EB"/>
                 <w:sz w:val="21"/>
@@ -151,7 +151,7 @@
           <w:p>
             <w:r>
               <w:rPr>
-                <w:rFonts w:ascii="微軟正黑體" w:hAnsi="微軟正黑體"/>
+                <w:rFonts w:ascii="Arial" w:hAnsi="Arial" w:eastAsia="SimHei" w:cs="Arial"/>
                 <w:color w:val="0C2340"/>
                 <w:sz w:val="21"/>
               </w:rPr>
@@ -171,7 +171,7 @@
             </w:pPr>
             <w:r>
               <w:rPr>
-                <w:rFonts w:ascii="微軟正黑體" w:hAnsi="微軟正黑體"/>
+                <w:rFonts w:ascii="Arial" w:hAnsi="Arial" w:eastAsia="SimHei" w:cs="Arial"/>
                 <w:b/>
                 <w:color w:val="2563EB"/>
                 <w:sz w:val="21"/>
@@ -187,7 +187,7 @@
           <w:p>
             <w:r>
               <w:rPr>
-                <w:rFonts w:ascii="微軟正黑體" w:hAnsi="微軟正黑體"/>
+                <w:rFonts w:ascii="Arial" w:hAnsi="Arial" w:eastAsia="SimHei" w:cs="Arial"/>
                 <w:color w:val="0C2340"/>
                 <w:sz w:val="21"/>
               </w:rPr>
@@ -207,7 +207,7 @@
             </w:pPr>
             <w:r>
               <w:rPr>
-                <w:rFonts w:ascii="微軟正黑體" w:hAnsi="微軟正黑體"/>
+                <w:rFonts w:ascii="Arial" w:hAnsi="Arial" w:eastAsia="SimHei" w:cs="Arial"/>
                 <w:b/>
                 <w:color w:val="2563EB"/>
                 <w:sz w:val="21"/>
@@ -223,7 +223,7 @@
           <w:p>
             <w:r>
               <w:rPr>
-                <w:rFonts w:ascii="微軟正黑體" w:hAnsi="微軟正黑體"/>
+                <w:rFonts w:ascii="Arial" w:hAnsi="Arial" w:eastAsia="SimHei" w:cs="Arial"/>
                 <w:color w:val="0C2340"/>
                 <w:sz w:val="21"/>
               </w:rPr>
@@ -244,7 +244,7 @@
       </w:pPr>
       <w:r>
         <w:rPr>
-          <w:rFonts w:ascii="微軟正黑體" w:hAnsi="微軟正黑體"/>
+          <w:rFonts w:ascii="Arial" w:hAnsi="Arial" w:eastAsia="SimHei" w:cs="Arial"/>
           <w:b/>
           <w:color w:val="0C2340"/>
           <w:sz w:val="40"/>
@@ -258,7 +258,7 @@
       </w:pPr>
       <w:r>
         <w:rPr>
-          <w:rFonts w:ascii="微軟正黑體" w:hAnsi="微軟正黑體"/>
+          <w:rFonts w:ascii="Arial" w:hAnsi="Arial" w:eastAsia="SimHei" w:cs="Arial"/>
           <w:color w:val="0C2340"/>
           <w:sz w:val="20"/>
         </w:rPr>
@@ -271,7 +271,7 @@
       </w:pPr>
       <w:r>
         <w:rPr>
-          <w:rFonts w:ascii="微軟正黑體" w:hAnsi="微軟正黑體"/>
+          <w:rFonts w:ascii="Arial" w:hAnsi="Arial" w:eastAsia="SimHei" w:cs="Arial"/>
           <w:color w:val="0C2340"/>
           <w:sz w:val="20"/>
         </w:rPr>
@@ -284,7 +284,7 @@
       </w:pPr>
       <w:r>
         <w:rPr>
-          <w:rFonts w:ascii="微軟正黑體" w:hAnsi="微軟正黑體"/>
+          <w:rFonts w:ascii="Arial" w:hAnsi="Arial" w:eastAsia="SimHei" w:cs="Arial"/>
           <w:color w:val="0C2340"/>
           <w:sz w:val="20"/>
         </w:rPr>
@@ -297,7 +297,7 @@
       </w:pPr>
       <w:r>
         <w:rPr>
-          <w:rFonts w:ascii="微軟正黑體" w:hAnsi="微軟正黑體"/>
+          <w:rFonts w:ascii="Arial" w:hAnsi="Arial" w:eastAsia="SimHei" w:cs="Arial"/>
           <w:color w:val="0C2340"/>
           <w:sz w:val="20"/>
         </w:rPr>
@@ -310,7 +310,7 @@
       </w:pPr>
       <w:r>
         <w:rPr>
-          <w:rFonts w:ascii="微軟正黑體" w:hAnsi="微軟正黑體"/>
+          <w:rFonts w:ascii="Arial" w:hAnsi="Arial" w:eastAsia="SimHei" w:cs="Arial"/>
           <w:color w:val="0C2340"/>
           <w:sz w:val="20"/>
         </w:rPr>
@@ -323,7 +323,7 @@
       </w:pPr>
       <w:r>
         <w:rPr>
-          <w:rFonts w:ascii="微軟正黑體" w:hAnsi="微軟正黑體"/>
+          <w:rFonts w:ascii="Arial" w:hAnsi="Arial" w:eastAsia="SimHei" w:cs="Arial"/>
           <w:color w:val="0C2340"/>
           <w:sz w:val="20"/>
         </w:rPr>
@@ -336,7 +336,7 @@
       </w:pPr>
       <w:r>
         <w:rPr>
-          <w:rFonts w:ascii="微軟正黑體" w:hAnsi="微軟正黑體"/>
+          <w:rFonts w:ascii="Arial" w:hAnsi="Arial" w:eastAsia="SimHei" w:cs="Arial"/>
           <w:color w:val="0C2340"/>
           <w:sz w:val="20"/>
         </w:rPr>
@@ -349,7 +349,7 @@
       </w:pPr>
       <w:r>
         <w:rPr>
-          <w:rFonts w:ascii="微軟正黑體" w:hAnsi="微軟正黑體"/>
+          <w:rFonts w:ascii="Arial" w:hAnsi="Arial" w:eastAsia="SimHei" w:cs="Arial"/>
           <w:color w:val="0C2340"/>
           <w:sz w:val="20"/>
         </w:rPr>
@@ -362,7 +362,7 @@
       </w:pPr>
       <w:r>
         <w:rPr>
-          <w:rFonts w:ascii="微軟正黑體" w:hAnsi="微軟正黑體"/>
+          <w:rFonts w:ascii="Arial" w:hAnsi="Arial" w:eastAsia="SimHei" w:cs="Arial"/>
           <w:color w:val="0C2340"/>
           <w:sz w:val="20"/>
         </w:rPr>
@@ -375,7 +375,7 @@
       </w:pPr>
       <w:r>
         <w:rPr>
-          <w:rFonts w:ascii="微軟正黑體" w:hAnsi="微軟正黑體"/>
+          <w:rFonts w:ascii="Arial" w:hAnsi="Arial" w:eastAsia="SimHei" w:cs="Arial"/>
           <w:color w:val="0C2340"/>
           <w:sz w:val="20"/>
         </w:rPr>
@@ -388,7 +388,7 @@
       </w:pPr>
       <w:r>
         <w:rPr>
-          <w:rFonts w:ascii="微軟正黑體" w:hAnsi="微軟正黑體"/>
+          <w:rFonts w:ascii="Arial" w:hAnsi="Arial" w:eastAsia="SimHei" w:cs="Arial"/>
           <w:color w:val="0C2340"/>
           <w:sz w:val="20"/>
         </w:rPr>
@@ -401,7 +401,7 @@
       </w:pPr>
       <w:r>
         <w:rPr>
-          <w:rFonts w:ascii="微軟正黑體" w:hAnsi="微軟正黑體"/>
+          <w:rFonts w:ascii="Arial" w:hAnsi="Arial" w:eastAsia="SimHei" w:cs="Arial"/>
           <w:color w:val="0C2340"/>
           <w:sz w:val="20"/>
         </w:rPr>
@@ -414,7 +414,7 @@
       </w:pPr>
       <w:r>
         <w:rPr>
-          <w:rFonts w:ascii="微軟正黑體" w:hAnsi="微軟正黑體"/>
+          <w:rFonts w:ascii="Arial" w:hAnsi="Arial" w:eastAsia="SimHei" w:cs="Arial"/>
           <w:color w:val="0C2340"/>
           <w:sz w:val="20"/>
         </w:rPr>
@@ -427,7 +427,7 @@
       </w:pPr>
       <w:r>
         <w:rPr>
-          <w:rFonts w:ascii="微軟正黑體" w:hAnsi="微軟正黑體"/>
+          <w:rFonts w:ascii="Arial" w:hAnsi="Arial" w:eastAsia="SimHei" w:cs="Arial"/>
           <w:color w:val="0C2340"/>
           <w:sz w:val="20"/>
         </w:rPr>
@@ -440,7 +440,7 @@
       </w:pPr>
       <w:r>
         <w:rPr>
-          <w:rFonts w:ascii="微軟正黑體" w:hAnsi="微軟正黑體"/>
+          <w:rFonts w:ascii="Arial" w:hAnsi="Arial" w:eastAsia="SimHei" w:cs="Arial"/>
           <w:color w:val="0C2340"/>
           <w:sz w:val="20"/>
         </w:rPr>
@@ -453,7 +453,7 @@
       </w:pPr>
       <w:r>
         <w:rPr>
-          <w:rFonts w:ascii="微軟正黑體" w:hAnsi="微軟正黑體"/>
+          <w:rFonts w:ascii="Arial" w:hAnsi="Arial" w:eastAsia="SimHei" w:cs="Arial"/>
           <w:color w:val="0C2340"/>
           <w:sz w:val="20"/>
         </w:rPr>
@@ -466,7 +466,7 @@
       </w:pPr>
       <w:r>
         <w:rPr>
-          <w:rFonts w:ascii="微軟正黑體" w:hAnsi="微軟正黑體"/>
+          <w:rFonts w:ascii="Arial" w:hAnsi="Arial" w:eastAsia="SimHei" w:cs="Arial"/>
           <w:color w:val="0C2340"/>
           <w:sz w:val="20"/>
         </w:rPr>
@@ -479,7 +479,7 @@
       </w:pPr>
       <w:r>
         <w:rPr>
-          <w:rFonts w:ascii="微軟正黑體" w:hAnsi="微軟正黑體"/>
+          <w:rFonts w:ascii="Arial" w:hAnsi="Arial" w:eastAsia="SimHei" w:cs="Arial"/>
           <w:color w:val="0C2340"/>
           <w:sz w:val="20"/>
         </w:rPr>
@@ -497,7 +497,7 @@
       </w:pPr>
       <w:r>
         <w:rPr>
-          <w:rFonts w:ascii="微軟正黑體" w:hAnsi="微軟正黑體"/>
+          <w:rFonts w:ascii="Arial" w:hAnsi="Arial" w:eastAsia="SimHei" w:cs="Arial"/>
           <w:b/>
           <w:color w:val="2563EB"/>
           <w:sz w:val="29"/>
@@ -511,7 +511,7 @@
       </w:pPr>
       <w:r>
         <w:rPr>
-          <w:rFonts w:ascii="微軟正黑體" w:hAnsi="微軟正黑體"/>
+          <w:rFonts w:ascii="Arial" w:hAnsi="Arial" w:eastAsia="SimHei" w:cs="Arial"/>
           <w:color w:val="2563EB"/>
           <w:sz w:val="20"/>
         </w:rPr>
@@ -524,7 +524,7 @@
       </w:pPr>
       <w:r>
         <w:rPr>
-          <w:rFonts w:ascii="微軟正黑體" w:hAnsi="微軟正黑體"/>
+          <w:rFonts w:ascii="Arial" w:hAnsi="Arial" w:eastAsia="SimHei" w:cs="Arial"/>
           <w:color w:val="2563EB"/>
           <w:sz w:val="20"/>
         </w:rPr>
@@ -537,7 +537,7 @@
       </w:pPr>
       <w:r>
         <w:rPr>
-          <w:rFonts w:ascii="微軟正黑體" w:hAnsi="微軟正黑體"/>
+          <w:rFonts w:ascii="Arial" w:hAnsi="Arial" w:eastAsia="SimHei" w:cs="Arial"/>
           <w:color w:val="2563EB"/>
           <w:sz w:val="20"/>
         </w:rPr>
@@ -555,7 +555,7 @@
       </w:pPr>
       <w:r>
         <w:rPr>
-          <w:rFonts w:ascii="微軟正黑體" w:hAnsi="微軟正黑體"/>
+          <w:rFonts w:ascii="Arial" w:hAnsi="Arial" w:eastAsia="SimHei" w:cs="Arial"/>
           <w:b/>
           <w:color w:val="2563EB"/>
           <w:sz w:val="29"/>
@@ -569,7 +569,7 @@
       </w:pPr>
       <w:r>
         <w:rPr>
-          <w:rFonts w:ascii="微軟正黑體" w:hAnsi="微軟正黑體"/>
+          <w:rFonts w:ascii="Arial" w:hAnsi="Arial" w:eastAsia="SimHei" w:cs="Arial"/>
           <w:color w:val="1E3A8A"/>
           <w:sz w:val="20"/>
         </w:rPr>
@@ -582,7 +582,7 @@
       </w:pPr>
       <w:r>
         <w:rPr>
-          <w:rFonts w:ascii="微軟正黑體" w:hAnsi="微軟正黑體"/>
+          <w:rFonts w:ascii="Arial" w:hAnsi="Arial" w:eastAsia="SimHei" w:cs="Arial"/>
           <w:color w:val="1E3A8A"/>
           <w:sz w:val="20"/>
         </w:rPr>
@@ -595,7 +595,7 @@
       </w:pPr>
       <w:r>
         <w:rPr>
-          <w:rFonts w:ascii="微軟正黑體" w:hAnsi="微軟正黑體"/>
+          <w:rFonts w:ascii="Arial" w:hAnsi="Arial" w:eastAsia="SimHei" w:cs="Arial"/>
           <w:color w:val="1E3A8A"/>
           <w:sz w:val="20"/>
         </w:rPr>
@@ -608,7 +608,7 @@
       </w:pPr>
       <w:r>
         <w:rPr>
-          <w:rFonts w:ascii="微軟正黑體" w:hAnsi="微軟正黑體"/>
+          <w:rFonts w:ascii="Arial" w:hAnsi="Arial" w:eastAsia="SimHei" w:cs="Arial"/>
           <w:color w:val="1E3A8A"/>
           <w:sz w:val="20"/>
         </w:rPr>
@@ -621,7 +621,7 @@
       </w:pPr>
       <w:r>
         <w:rPr>
-          <w:rFonts w:ascii="微軟正黑體" w:hAnsi="微軟正黑體"/>
+          <w:rFonts w:ascii="Arial" w:hAnsi="Arial" w:eastAsia="SimHei" w:cs="Arial"/>
           <w:color w:val="1E3A8A"/>
           <w:sz w:val="20"/>
         </w:rPr>
@@ -634,7 +634,7 @@
       </w:pPr>
       <w:r>
         <w:rPr>
-          <w:rFonts w:ascii="微軟正黑體" w:hAnsi="微軟正黑體"/>
+          <w:rFonts w:ascii="Arial" w:hAnsi="Arial" w:eastAsia="SimHei" w:cs="Arial"/>
           <w:color w:val="1E3A8A"/>
           <w:sz w:val="20"/>
         </w:rPr>
@@ -647,7 +647,7 @@
       </w:pPr>
       <w:r>
         <w:rPr>
-          <w:rFonts w:ascii="微軟正黑體" w:hAnsi="微軟正黑體"/>
+          <w:rFonts w:ascii="Arial" w:hAnsi="Arial" w:eastAsia="SimHei" w:cs="Arial"/>
           <w:color w:val="1E3A8A"/>
           <w:sz w:val="20"/>
         </w:rPr>
@@ -665,7 +665,7 @@
       </w:pPr>
       <w:r>
         <w:rPr>
-          <w:rFonts w:ascii="微軟正黑體" w:hAnsi="微軟正黑體"/>
+          <w:rFonts w:ascii="Arial" w:hAnsi="Arial" w:eastAsia="SimHei" w:cs="Arial"/>
           <w:b/>
           <w:color w:val="0C2340"/>
           <w:sz w:val="40"/>
@@ -679,7 +679,7 @@
       </w:pPr>
       <w:r>
         <w:rPr>
-          <w:rFonts w:ascii="微軟正黑體" w:hAnsi="微軟正黑體"/>
+          <w:rFonts w:ascii="Arial" w:hAnsi="Arial" w:eastAsia="SimHei" w:cs="Arial"/>
           <w:b/>
           <w:color w:val="2563EB"/>
           <w:sz w:val="29"/>
@@ -693,7 +693,7 @@
       </w:pPr>
       <w:r>
         <w:rPr>
-          <w:rFonts w:ascii="微軟正黑體" w:hAnsi="微軟正黑體"/>
+          <w:rFonts w:ascii="Arial" w:hAnsi="Arial" w:eastAsia="SimHei" w:cs="Arial"/>
           <w:color w:val="334155"/>
           <w:sz w:val="22"/>
         </w:rPr>
@@ -706,7 +706,7 @@
       </w:pPr>
       <w:r>
         <w:rPr>
-          <w:rFonts w:ascii="微軟正黑體" w:hAnsi="微軟正黑體"/>
+          <w:rFonts w:ascii="Arial" w:hAnsi="Arial" w:eastAsia="SimHei" w:cs="Arial"/>
           <w:b/>
           <w:color w:val="2563EB"/>
           <w:sz w:val="29"/>
@@ -720,7 +720,7 @@
       </w:pPr>
       <w:r>
         <w:rPr>
-          <w:rFonts w:ascii="微軟正黑體" w:hAnsi="微軟正黑體"/>
+          <w:rFonts w:ascii="Arial" w:hAnsi="Arial" w:eastAsia="SimHei" w:cs="Arial"/>
           <w:color w:val="334155"/>
           <w:sz w:val="22"/>
         </w:rPr>
@@ -733,7 +733,7 @@
       </w:pPr>
       <w:r>
         <w:rPr>
-          <w:rFonts w:ascii="微軟正黑體" w:hAnsi="微軟正黑體"/>
+          <w:rFonts w:ascii="Arial" w:hAnsi="Arial" w:eastAsia="SimHei" w:cs="Arial"/>
           <w:b/>
           <w:color w:val="2563EB"/>
           <w:sz w:val="29"/>
@@ -747,7 +747,7 @@
       </w:pPr>
       <w:r>
         <w:rPr>
-          <w:rFonts w:ascii="微軟正黑體" w:hAnsi="微軟正黑體"/>
+          <w:rFonts w:ascii="Arial" w:hAnsi="Arial" w:eastAsia="SimHei" w:cs="Arial"/>
           <w:color w:val="334155"/>
           <w:sz w:val="22"/>
         </w:rPr>
@@ -760,7 +760,7 @@
       </w:pPr>
       <w:r>
         <w:rPr>
-          <w:rFonts w:ascii="微軟正黑體" w:hAnsi="微軟正黑體"/>
+          <w:rFonts w:ascii="Arial" w:hAnsi="Arial" w:eastAsia="SimHei" w:cs="Arial"/>
           <w:b/>
           <w:color w:val="0C2340"/>
           <w:sz w:val="21"/>
@@ -805,7 +805,7 @@
             </w:pPr>
             <w:r>
               <w:rPr>
-                <w:rFonts w:ascii="微軟正黑體" w:hAnsi="微軟正黑體"/>
+                <w:rFonts w:ascii="Arial" w:hAnsi="Arial" w:eastAsia="SimHei" w:cs="Arial"/>
                 <w:b/>
                 <w:color w:val="FFFFFF"/>
                 <w:sz w:val="20"/>
@@ -831,7 +831,7 @@
             </w:pPr>
             <w:r>
               <w:rPr>
-                <w:rFonts w:ascii="微軟正黑體" w:hAnsi="微軟正黑體"/>
+                <w:rFonts w:ascii="Arial" w:hAnsi="Arial" w:eastAsia="SimHei" w:cs="Arial"/>
                 <w:b/>
                 <w:color w:val="FFFFFF"/>
                 <w:sz w:val="20"/>
@@ -857,7 +857,7 @@
             </w:pPr>
             <w:r>
               <w:rPr>
-                <w:rFonts w:ascii="微軟正黑體" w:hAnsi="微軟正黑體"/>
+                <w:rFonts w:ascii="Arial" w:hAnsi="Arial" w:eastAsia="SimHei" w:cs="Arial"/>
                 <w:b/>
                 <w:color w:val="FFFFFF"/>
                 <w:sz w:val="20"/>
@@ -885,7 +885,7 @@
             </w:pPr>
             <w:r>
               <w:rPr>
-                <w:rFonts w:ascii="微軟正黑體" w:hAnsi="微軟正黑體"/>
+                <w:rFonts w:ascii="Arial" w:hAnsi="Arial" w:eastAsia="SimHei" w:cs="Arial"/>
                 <w:color w:val="1E293B"/>
                 <w:sz w:val="19"/>
               </w:rPr>
@@ -907,7 +907,7 @@
           <w:p>
             <w:r>
               <w:rPr>
-                <w:rFonts w:ascii="微軟正黑體" w:hAnsi="微軟正黑體"/>
+                <w:rFonts w:ascii="Arial" w:hAnsi="Arial" w:eastAsia="SimHei" w:cs="Arial"/>
                 <w:color w:val="1E293B"/>
                 <w:sz w:val="19"/>
               </w:rPr>
@@ -929,7 +929,7 @@
           <w:p>
             <w:r>
               <w:rPr>
-                <w:rFonts w:ascii="微軟正黑體" w:hAnsi="微軟正黑體"/>
+                <w:rFonts w:ascii="Arial" w:hAnsi="Arial" w:eastAsia="SimHei" w:cs="Arial"/>
                 <w:color w:val="1E293B"/>
                 <w:sz w:val="19"/>
               </w:rPr>
@@ -956,7 +956,7 @@
             </w:pPr>
             <w:r>
               <w:rPr>
-                <w:rFonts w:ascii="微軟正黑體" w:hAnsi="微軟正黑體"/>
+                <w:rFonts w:ascii="Arial" w:hAnsi="Arial" w:eastAsia="SimHei" w:cs="Arial"/>
                 <w:color w:val="1E293B"/>
                 <w:sz w:val="19"/>
               </w:rPr>
@@ -978,7 +978,7 @@
           <w:p>
             <w:r>
               <w:rPr>
-                <w:rFonts w:ascii="微軟正黑體" w:hAnsi="微軟正黑體"/>
+                <w:rFonts w:ascii="Arial" w:hAnsi="Arial" w:eastAsia="SimHei" w:cs="Arial"/>
                 <w:color w:val="1E293B"/>
                 <w:sz w:val="19"/>
               </w:rPr>
@@ -1000,7 +1000,7 @@
           <w:p>
             <w:r>
               <w:rPr>
-                <w:rFonts w:ascii="微軟正黑體" w:hAnsi="微軟正黑體"/>
+                <w:rFonts w:ascii="Arial" w:hAnsi="Arial" w:eastAsia="SimHei" w:cs="Arial"/>
                 <w:color w:val="1E293B"/>
                 <w:sz w:val="19"/>
               </w:rPr>
@@ -1027,7 +1027,7 @@
             </w:pPr>
             <w:r>
               <w:rPr>
-                <w:rFonts w:ascii="微軟正黑體" w:hAnsi="微軟正黑體"/>
+                <w:rFonts w:ascii="Arial" w:hAnsi="Arial" w:eastAsia="SimHei" w:cs="Arial"/>
                 <w:color w:val="1E293B"/>
                 <w:sz w:val="19"/>
               </w:rPr>
@@ -1049,7 +1049,7 @@
           <w:p>
             <w:r>
               <w:rPr>
-                <w:rFonts w:ascii="微軟正黑體" w:hAnsi="微軟正黑體"/>
+                <w:rFonts w:ascii="Arial" w:hAnsi="Arial" w:eastAsia="SimHei" w:cs="Arial"/>
                 <w:color w:val="1E293B"/>
                 <w:sz w:val="19"/>
               </w:rPr>
@@ -1071,7 +1071,7 @@
           <w:p>
             <w:r>
               <w:rPr>
-                <w:rFonts w:ascii="微軟正黑體" w:hAnsi="微軟正黑體"/>
+                <w:rFonts w:ascii="Arial" w:hAnsi="Arial" w:eastAsia="SimHei" w:cs="Arial"/>
                 <w:color w:val="1E293B"/>
                 <w:sz w:val="19"/>
               </w:rPr>
@@ -1098,7 +1098,7 @@
             </w:pPr>
             <w:r>
               <w:rPr>
-                <w:rFonts w:ascii="微軟正黑體" w:hAnsi="微軟正黑體"/>
+                <w:rFonts w:ascii="Arial" w:hAnsi="Arial" w:eastAsia="SimHei" w:cs="Arial"/>
                 <w:color w:val="1E293B"/>
                 <w:sz w:val="19"/>
               </w:rPr>
@@ -1120,7 +1120,7 @@
           <w:p>
             <w:r>
               <w:rPr>
-                <w:rFonts w:ascii="微軟正黑體" w:hAnsi="微軟正黑體"/>
+                <w:rFonts w:ascii="Arial" w:hAnsi="Arial" w:eastAsia="SimHei" w:cs="Arial"/>
                 <w:color w:val="1E293B"/>
                 <w:sz w:val="19"/>
               </w:rPr>
@@ -1142,7 +1142,7 @@
           <w:p>
             <w:r>
               <w:rPr>
-                <w:rFonts w:ascii="微軟正黑體" w:hAnsi="微軟正黑體"/>
+                <w:rFonts w:ascii="Arial" w:hAnsi="Arial" w:eastAsia="SimHei" w:cs="Arial"/>
                 <w:color w:val="1E293B"/>
                 <w:sz w:val="19"/>
               </w:rPr>
@@ -1158,7 +1158,7 @@
       </w:pPr>
       <w:r>
         <w:rPr>
-          <w:rFonts w:ascii="微軟正黑體" w:hAnsi="微軟正黑體"/>
+          <w:rFonts w:ascii="Arial" w:hAnsi="Arial" w:eastAsia="SimHei" w:cs="Arial"/>
           <w:b/>
           <w:color w:val="2563EB"/>
           <w:sz w:val="29"/>
@@ -1172,7 +1172,7 @@
       </w:pPr>
       <w:r>
         <w:rPr>
-          <w:rFonts w:ascii="微軟正黑體" w:hAnsi="微軟正黑體"/>
+          <w:rFonts w:ascii="Arial" w:hAnsi="Arial" w:eastAsia="SimHei" w:cs="Arial"/>
           <w:color w:val="334155"/>
           <w:sz w:val="22"/>
         </w:rPr>
@@ -1185,7 +1185,7 @@
       </w:pPr>
       <w:r>
         <w:rPr>
-          <w:rFonts w:ascii="微軟正黑體" w:hAnsi="微軟正黑體"/>
+          <w:rFonts w:ascii="Arial" w:hAnsi="Arial" w:eastAsia="SimHei" w:cs="Arial"/>
           <w:b/>
           <w:color w:val="0C2340"/>
           <w:sz w:val="22"/>
@@ -1194,7 +1194,7 @@
       </w:r>
       <w:r>
         <w:rPr>
-          <w:rFonts w:ascii="微軟正黑體" w:hAnsi="微軟正黑體"/>
+          <w:rFonts w:ascii="Arial" w:hAnsi="Arial" w:eastAsia="SimHei" w:cs="Arial"/>
           <w:color w:val="334155"/>
           <w:sz w:val="22"/>
         </w:rPr>
@@ -1207,7 +1207,7 @@
       </w:pPr>
       <w:r>
         <w:rPr>
-          <w:rFonts w:ascii="微軟正黑體" w:hAnsi="微軟正黑體"/>
+          <w:rFonts w:ascii="Arial" w:hAnsi="Arial" w:eastAsia="SimHei" w:cs="Arial"/>
           <w:b/>
           <w:color w:val="0C2340"/>
           <w:sz w:val="22"/>
@@ -1216,7 +1216,7 @@
       </w:r>
       <w:r>
         <w:rPr>
-          <w:rFonts w:ascii="微軟正黑體" w:hAnsi="微軟正黑體"/>
+          <w:rFonts w:ascii="Arial" w:hAnsi="Arial" w:eastAsia="SimHei" w:cs="Arial"/>
           <w:color w:val="334155"/>
           <w:sz w:val="22"/>
         </w:rPr>
@@ -1229,7 +1229,7 @@
       </w:pPr>
       <w:r>
         <w:rPr>
-          <w:rFonts w:ascii="微軟正黑體" w:hAnsi="微軟正黑體"/>
+          <w:rFonts w:ascii="Arial" w:hAnsi="Arial" w:eastAsia="SimHei" w:cs="Arial"/>
           <w:b/>
           <w:color w:val="0C2340"/>
           <w:sz w:val="22"/>
@@ -1238,7 +1238,7 @@
       </w:r>
       <w:r>
         <w:rPr>
-          <w:rFonts w:ascii="微軟正黑體" w:hAnsi="微軟正黑體"/>
+          <w:rFonts w:ascii="Arial" w:hAnsi="Arial" w:eastAsia="SimHei" w:cs="Arial"/>
           <w:color w:val="334155"/>
           <w:sz w:val="22"/>
         </w:rPr>
@@ -1251,7 +1251,7 @@
       </w:pPr>
       <w:r>
         <w:rPr>
-          <w:rFonts w:ascii="微軟正黑體" w:hAnsi="微軟正黑體"/>
+          <w:rFonts w:ascii="Arial" w:hAnsi="Arial" w:eastAsia="SimHei" w:cs="Arial"/>
           <w:b/>
           <w:color w:val="2563EB"/>
           <w:sz w:val="29"/>
@@ -1265,7 +1265,7 @@
       </w:pPr>
       <w:r>
         <w:rPr>
-          <w:rFonts w:ascii="微軟正黑體" w:hAnsi="微軟正黑體"/>
+          <w:rFonts w:ascii="Arial" w:hAnsi="Arial" w:eastAsia="SimHei" w:cs="Arial"/>
           <w:color w:val="334155"/>
           <w:sz w:val="22"/>
         </w:rPr>
@@ -1278,7 +1278,7 @@
       </w:pPr>
       <w:r>
         <w:rPr>
-          <w:rFonts w:ascii="微軟正黑體" w:hAnsi="微軟正黑體"/>
+          <w:rFonts w:ascii="Arial" w:hAnsi="Arial" w:eastAsia="SimHei" w:cs="Arial"/>
           <w:b/>
           <w:color w:val="0C2340"/>
           <w:sz w:val="22"/>
@@ -1287,7 +1287,7 @@
       </w:r>
       <w:r>
         <w:rPr>
-          <w:rFonts w:ascii="微軟正黑體" w:hAnsi="微軟正黑體"/>
+          <w:rFonts w:ascii="Arial" w:hAnsi="Arial" w:eastAsia="SimHei" w:cs="Arial"/>
           <w:color w:val="334155"/>
           <w:sz w:val="22"/>
         </w:rPr>
@@ -1300,7 +1300,7 @@
       </w:pPr>
       <w:r>
         <w:rPr>
-          <w:rFonts w:ascii="微軟正黑體" w:hAnsi="微軟正黑體"/>
+          <w:rFonts w:ascii="Arial" w:hAnsi="Arial" w:eastAsia="SimHei" w:cs="Arial"/>
           <w:b/>
           <w:color w:val="0C2340"/>
           <w:sz w:val="22"/>
@@ -1309,7 +1309,7 @@
       </w:r>
       <w:r>
         <w:rPr>
-          <w:rFonts w:ascii="微軟正黑體" w:hAnsi="微軟正黑體"/>
+          <w:rFonts w:ascii="Arial" w:hAnsi="Arial" w:eastAsia="SimHei" w:cs="Arial"/>
           <w:color w:val="334155"/>
           <w:sz w:val="22"/>
         </w:rPr>
@@ -1322,7 +1322,7 @@
       </w:pPr>
       <w:r>
         <w:rPr>
-          <w:rFonts w:ascii="微軟正黑體" w:hAnsi="微軟正黑體"/>
+          <w:rFonts w:ascii="Arial" w:hAnsi="Arial" w:eastAsia="SimHei" w:cs="Arial"/>
           <w:b/>
           <w:color w:val="0C2340"/>
           <w:sz w:val="22"/>
@@ -1331,7 +1331,7 @@
       </w:r>
       <w:r>
         <w:rPr>
-          <w:rFonts w:ascii="微軟正黑體" w:hAnsi="微軟正黑體"/>
+          <w:rFonts w:ascii="Arial" w:hAnsi="Arial" w:eastAsia="SimHei" w:cs="Arial"/>
           <w:color w:val="334155"/>
           <w:sz w:val="22"/>
         </w:rPr>
@@ -1344,7 +1344,7 @@
       </w:pPr>
       <w:r>
         <w:rPr>
-          <w:rFonts w:ascii="微軟正黑體" w:hAnsi="微軟正黑體"/>
+          <w:rFonts w:ascii="Arial" w:hAnsi="Arial" w:eastAsia="SimHei" w:cs="Arial"/>
           <w:b/>
           <w:color w:val="0C2340"/>
           <w:sz w:val="22"/>
@@ -1353,7 +1353,7 @@
       </w:r>
       <w:r>
         <w:rPr>
-          <w:rFonts w:ascii="微軟正黑體" w:hAnsi="微軟正黑體"/>
+          <w:rFonts w:ascii="Arial" w:hAnsi="Arial" w:eastAsia="SimHei" w:cs="Arial"/>
           <w:color w:val="334155"/>
           <w:sz w:val="22"/>
         </w:rPr>
@@ -1366,7 +1366,7 @@
       </w:pPr>
       <w:r>
         <w:rPr>
-          <w:rFonts w:ascii="微軟正黑體" w:hAnsi="微軟正黑體"/>
+          <w:rFonts w:ascii="Arial" w:hAnsi="Arial" w:eastAsia="SimHei" w:cs="Arial"/>
           <w:b/>
           <w:color w:val="2563EB"/>
           <w:sz w:val="29"/>
@@ -1380,7 +1380,7 @@
       </w:pPr>
       <w:r>
         <w:rPr>
-          <w:rFonts w:ascii="微軟正黑體" w:hAnsi="微軟正黑體"/>
+          <w:rFonts w:ascii="Arial" w:hAnsi="Arial" w:eastAsia="SimHei" w:cs="Arial"/>
           <w:color w:val="334155"/>
           <w:sz w:val="22"/>
         </w:rPr>
@@ -1398,7 +1398,7 @@
       </w:pPr>
       <w:r>
         <w:rPr>
-          <w:rFonts w:ascii="微軟正黑體" w:hAnsi="微軟正黑體"/>
+          <w:rFonts w:ascii="Arial" w:hAnsi="Arial" w:eastAsia="SimHei" w:cs="Arial"/>
           <w:b/>
           <w:color w:val="0C2340"/>
           <w:sz w:val="40"/>
@@ -1412,7 +1412,7 @@
       </w:pPr>
       <w:r>
         <w:rPr>
-          <w:rFonts w:ascii="微軟正黑體" w:hAnsi="微軟正黑體"/>
+          <w:rFonts w:ascii="Arial" w:hAnsi="Arial" w:eastAsia="SimHei" w:cs="Arial"/>
           <w:b/>
           <w:color w:val="2563EB"/>
           <w:sz w:val="29"/>
@@ -1426,7 +1426,7 @@
       </w:pPr>
       <w:r>
         <w:rPr>
-          <w:rFonts w:ascii="微軟正黑體" w:hAnsi="微軟正黑體"/>
+          <w:rFonts w:ascii="Arial" w:hAnsi="Arial" w:eastAsia="SimHei" w:cs="Arial"/>
           <w:color w:val="334155"/>
           <w:sz w:val="22"/>
         </w:rPr>
@@ -1439,7 +1439,7 @@
       </w:pPr>
       <w:r>
         <w:rPr>
-          <w:rFonts w:ascii="微軟正黑體" w:hAnsi="微軟正黑體"/>
+          <w:rFonts w:ascii="Arial" w:hAnsi="Arial" w:eastAsia="SimHei" w:cs="Arial"/>
           <w:b/>
           <w:color w:val="0C2340"/>
           <w:sz w:val="21"/>
@@ -1484,7 +1484,7 @@
             </w:pPr>
             <w:r>
               <w:rPr>
-                <w:rFonts w:ascii="微軟正黑體" w:hAnsi="微軟正黑體"/>
+                <w:rFonts w:ascii="Arial" w:hAnsi="Arial" w:eastAsia="SimHei" w:cs="Arial"/>
                 <w:b/>
                 <w:color w:val="FFFFFF"/>
                 <w:sz w:val="20"/>
@@ -1510,7 +1510,7 @@
             </w:pPr>
             <w:r>
               <w:rPr>
-                <w:rFonts w:ascii="微軟正黑體" w:hAnsi="微軟正黑體"/>
+                <w:rFonts w:ascii="Arial" w:hAnsi="Arial" w:eastAsia="SimHei" w:cs="Arial"/>
                 <w:b/>
                 <w:color w:val="FFFFFF"/>
                 <w:sz w:val="20"/>
@@ -1536,7 +1536,7 @@
             </w:pPr>
             <w:r>
               <w:rPr>
-                <w:rFonts w:ascii="微軟正黑體" w:hAnsi="微軟正黑體"/>
+                <w:rFonts w:ascii="Arial" w:hAnsi="Arial" w:eastAsia="SimHei" w:cs="Arial"/>
                 <w:b/>
                 <w:color w:val="FFFFFF"/>
                 <w:sz w:val="20"/>
@@ -1564,7 +1564,7 @@
             </w:pPr>
             <w:r>
               <w:rPr>
-                <w:rFonts w:ascii="微軟正黑體" w:hAnsi="微軟正黑體"/>
+                <w:rFonts w:ascii="Arial" w:hAnsi="Arial" w:eastAsia="SimHei" w:cs="Arial"/>
                 <w:color w:val="1E293B"/>
                 <w:sz w:val="19"/>
               </w:rPr>
@@ -1586,7 +1586,7 @@
           <w:p>
             <w:r>
               <w:rPr>
-                <w:rFonts w:ascii="微軟正黑體" w:hAnsi="微軟正黑體"/>
+                <w:rFonts w:ascii="Arial" w:hAnsi="Arial" w:eastAsia="SimHei" w:cs="Arial"/>
                 <w:color w:val="1E293B"/>
                 <w:sz w:val="19"/>
               </w:rPr>
@@ -1608,7 +1608,7 @@
           <w:p>
             <w:r>
               <w:rPr>
-                <w:rFonts w:ascii="微軟正黑體" w:hAnsi="微軟正黑體"/>
+                <w:rFonts w:ascii="Arial" w:hAnsi="Arial" w:eastAsia="SimHei" w:cs="Arial"/>
                 <w:color w:val="1E293B"/>
                 <w:sz w:val="19"/>
               </w:rPr>
@@ -1635,7 +1635,7 @@
             </w:pPr>
             <w:r>
               <w:rPr>
-                <w:rFonts w:ascii="微軟正黑體" w:hAnsi="微軟正黑體"/>
+                <w:rFonts w:ascii="Arial" w:hAnsi="Arial" w:eastAsia="SimHei" w:cs="Arial"/>
                 <w:color w:val="1E293B"/>
                 <w:sz w:val="19"/>
               </w:rPr>
@@ -1657,7 +1657,7 @@
           <w:p>
             <w:r>
               <w:rPr>
-                <w:rFonts w:ascii="微軟正黑體" w:hAnsi="微軟正黑體"/>
+                <w:rFonts w:ascii="Arial" w:hAnsi="Arial" w:eastAsia="SimHei" w:cs="Arial"/>
                 <w:color w:val="1E293B"/>
                 <w:sz w:val="19"/>
               </w:rPr>
@@ -1679,7 +1679,7 @@
           <w:p>
             <w:r>
               <w:rPr>
-                <w:rFonts w:ascii="微軟正黑體" w:hAnsi="微軟正黑體"/>
+                <w:rFonts w:ascii="Arial" w:hAnsi="Arial" w:eastAsia="SimHei" w:cs="Arial"/>
                 <w:color w:val="1E293B"/>
                 <w:sz w:val="19"/>
               </w:rPr>
@@ -1706,7 +1706,7 @@
             </w:pPr>
             <w:r>
               <w:rPr>
-                <w:rFonts w:ascii="微軟正黑體" w:hAnsi="微軟正黑體"/>
+                <w:rFonts w:ascii="Arial" w:hAnsi="Arial" w:eastAsia="SimHei" w:cs="Arial"/>
                 <w:color w:val="1E293B"/>
                 <w:sz w:val="19"/>
               </w:rPr>
@@ -1728,7 +1728,7 @@
           <w:p>
             <w:r>
               <w:rPr>
-                <w:rFonts w:ascii="微軟正黑體" w:hAnsi="微軟正黑體"/>
+                <w:rFonts w:ascii="Arial" w:hAnsi="Arial" w:eastAsia="SimHei" w:cs="Arial"/>
                 <w:color w:val="1E293B"/>
                 <w:sz w:val="19"/>
               </w:rPr>
@@ -1750,7 +1750,7 @@
           <w:p>
             <w:r>
               <w:rPr>
-                <w:rFonts w:ascii="微軟正黑體" w:hAnsi="微軟正黑體"/>
+                <w:rFonts w:ascii="Arial" w:hAnsi="Arial" w:eastAsia="SimHei" w:cs="Arial"/>
                 <w:color w:val="1E293B"/>
                 <w:sz w:val="19"/>
               </w:rPr>
@@ -1766,7 +1766,7 @@
       </w:pPr>
       <w:r>
         <w:rPr>
-          <w:rFonts w:ascii="微軟正黑體" w:hAnsi="微軟正黑體"/>
+          <w:rFonts w:ascii="Arial" w:hAnsi="Arial" w:eastAsia="SimHei" w:cs="Arial"/>
           <w:b/>
           <w:color w:val="0C2340"/>
           <w:sz w:val="21"/>
@@ -1812,7 +1812,7 @@
             </w:pPr>
             <w:r>
               <w:rPr>
-                <w:rFonts w:ascii="微軟正黑體" w:hAnsi="微軟正黑體"/>
+                <w:rFonts w:ascii="Arial" w:hAnsi="Arial" w:eastAsia="SimHei" w:cs="Arial"/>
                 <w:b/>
                 <w:color w:val="FFFFFF"/>
                 <w:sz w:val="19"/>
@@ -1838,7 +1838,7 @@
             </w:pPr>
             <w:r>
               <w:rPr>
-                <w:rFonts w:ascii="微軟正黑體" w:hAnsi="微軟正黑體"/>
+                <w:rFonts w:ascii="Arial" w:hAnsi="Arial" w:eastAsia="SimHei" w:cs="Arial"/>
                 <w:b/>
                 <w:color w:val="FFFFFF"/>
                 <w:sz w:val="19"/>
@@ -1864,7 +1864,7 @@
             </w:pPr>
             <w:r>
               <w:rPr>
-                <w:rFonts w:ascii="微軟正黑體" w:hAnsi="微軟正黑體"/>
+                <w:rFonts w:ascii="Arial" w:hAnsi="Arial" w:eastAsia="SimHei" w:cs="Arial"/>
                 <w:b/>
                 <w:color w:val="FFFFFF"/>
                 <w:sz w:val="19"/>
@@ -1890,7 +1890,7 @@
             </w:pPr>
             <w:r>
               <w:rPr>
-                <w:rFonts w:ascii="微軟正黑體" w:hAnsi="微軟正黑體"/>
+                <w:rFonts w:ascii="Arial" w:hAnsi="Arial" w:eastAsia="SimHei" w:cs="Arial"/>
                 <w:b/>
                 <w:color w:val="FFFFFF"/>
                 <w:sz w:val="19"/>
@@ -1918,7 +1918,7 @@
             </w:pPr>
             <w:r>
               <w:rPr>
-                <w:rFonts w:ascii="微軟正黑體" w:hAnsi="微軟正黑體"/>
+                <w:rFonts w:ascii="Arial" w:hAnsi="Arial" w:eastAsia="SimHei" w:cs="Arial"/>
                 <w:color w:val="1E293B"/>
                 <w:sz w:val="18"/>
               </w:rPr>
@@ -1940,7 +1940,7 @@
           <w:p>
             <w:r>
               <w:rPr>
-                <w:rFonts w:ascii="微軟正黑體" w:hAnsi="微軟正黑體"/>
+                <w:rFonts w:ascii="Arial" w:hAnsi="Arial" w:eastAsia="SimHei" w:cs="Arial"/>
                 <w:color w:val="1E293B"/>
                 <w:sz w:val="18"/>
               </w:rPr>
@@ -1962,7 +1962,7 @@
           <w:p>
             <w:r>
               <w:rPr>
-                <w:rFonts w:ascii="微軟正黑體" w:hAnsi="微軟正黑體"/>
+                <w:rFonts w:ascii="Arial" w:hAnsi="Arial" w:eastAsia="SimHei" w:cs="Arial"/>
                 <w:color w:val="1E293B"/>
                 <w:sz w:val="18"/>
               </w:rPr>
@@ -1984,7 +1984,7 @@
           <w:p>
             <w:r>
               <w:rPr>
-                <w:rFonts w:ascii="微軟正黑體" w:hAnsi="微軟正黑體"/>
+                <w:rFonts w:ascii="Arial" w:hAnsi="Arial" w:eastAsia="SimHei" w:cs="Arial"/>
                 <w:color w:val="1E293B"/>
                 <w:sz w:val="18"/>
               </w:rPr>
@@ -2011,7 +2011,7 @@
             </w:pPr>
             <w:r>
               <w:rPr>
-                <w:rFonts w:ascii="微軟正黑體" w:hAnsi="微軟正黑體"/>
+                <w:rFonts w:ascii="Arial" w:hAnsi="Arial" w:eastAsia="SimHei" w:cs="Arial"/>
                 <w:color w:val="1E293B"/>
                 <w:sz w:val="18"/>
               </w:rPr>
@@ -2033,7 +2033,7 @@
           <w:p>
             <w:r>
               <w:rPr>
-                <w:rFonts w:ascii="微軟正黑體" w:hAnsi="微軟正黑體"/>
+                <w:rFonts w:ascii="Arial" w:hAnsi="Arial" w:eastAsia="SimHei" w:cs="Arial"/>
                 <w:color w:val="1E293B"/>
                 <w:sz w:val="18"/>
               </w:rPr>
@@ -2055,7 +2055,7 @@
           <w:p>
             <w:r>
               <w:rPr>
-                <w:rFonts w:ascii="微軟正黑體" w:hAnsi="微軟正黑體"/>
+                <w:rFonts w:ascii="Arial" w:hAnsi="Arial" w:eastAsia="SimHei" w:cs="Arial"/>
                 <w:color w:val="1E293B"/>
                 <w:sz w:val="18"/>
               </w:rPr>
@@ -2077,7 +2077,7 @@
           <w:p>
             <w:r>
               <w:rPr>
-                <w:rFonts w:ascii="微軟正黑體" w:hAnsi="微軟正黑體"/>
+                <w:rFonts w:ascii="Arial" w:hAnsi="Arial" w:eastAsia="SimHei" w:cs="Arial"/>
                 <w:color w:val="1E293B"/>
                 <w:sz w:val="18"/>
               </w:rPr>
@@ -2104,7 +2104,7 @@
             </w:pPr>
             <w:r>
               <w:rPr>
-                <w:rFonts w:ascii="微軟正黑體" w:hAnsi="微軟正黑體"/>
+                <w:rFonts w:ascii="Arial" w:hAnsi="Arial" w:eastAsia="SimHei" w:cs="Arial"/>
                 <w:color w:val="1E293B"/>
                 <w:sz w:val="18"/>
               </w:rPr>
@@ -2126,7 +2126,7 @@
           <w:p>
             <w:r>
               <w:rPr>
-                <w:rFonts w:ascii="微軟正黑體" w:hAnsi="微軟正黑體"/>
+                <w:rFonts w:ascii="Arial" w:hAnsi="Arial" w:eastAsia="SimHei" w:cs="Arial"/>
                 <w:color w:val="1E293B"/>
                 <w:sz w:val="18"/>
               </w:rPr>
@@ -2148,7 +2148,7 @@
           <w:p>
             <w:r>
               <w:rPr>
-                <w:rFonts w:ascii="微軟正黑體" w:hAnsi="微軟正黑體"/>
+                <w:rFonts w:ascii="Arial" w:hAnsi="Arial" w:eastAsia="SimHei" w:cs="Arial"/>
                 <w:color w:val="1E293B"/>
                 <w:sz w:val="18"/>
               </w:rPr>
@@ -2170,7 +2170,7 @@
           <w:p>
             <w:r>
               <w:rPr>
-                <w:rFonts w:ascii="微軟正黑體" w:hAnsi="微軟正黑體"/>
+                <w:rFonts w:ascii="Arial" w:hAnsi="Arial" w:eastAsia="SimHei" w:cs="Arial"/>
                 <w:color w:val="1E293B"/>
                 <w:sz w:val="18"/>
               </w:rPr>
@@ -2227,7 +2227,7 @@
       </w:pPr>
       <w:r>
         <w:rPr>
-          <w:rFonts w:ascii="微軟正黑體" w:hAnsi="微軟正黑體"/>
+          <w:rFonts w:ascii="Arial" w:hAnsi="Arial" w:eastAsia="SimHei" w:cs="Arial"/>
           <w:b/>
           <w:color w:val="2563EB"/>
           <w:sz w:val="19"/>
@@ -2241,7 +2241,7 @@
       </w:pPr>
       <w:r>
         <w:rPr>
-          <w:rFonts w:ascii="微軟正黑體" w:hAnsi="微軟正黑體"/>
+          <w:rFonts w:ascii="Arial" w:hAnsi="Arial" w:eastAsia="SimHei" w:cs="Arial"/>
           <w:b/>
           <w:color w:val="2563EB"/>
           <w:sz w:val="29"/>
@@ -2255,7 +2255,7 @@
       </w:pPr>
       <w:r>
         <w:rPr>
-          <w:rFonts w:ascii="微軟正黑體" w:hAnsi="微軟正黑體"/>
+          <w:rFonts w:ascii="Arial" w:hAnsi="Arial" w:eastAsia="SimHei" w:cs="Arial"/>
           <w:color w:val="334155"/>
           <w:sz w:val="22"/>
         </w:rPr>
@@ -2268,7 +2268,7 @@
       </w:pPr>
       <w:r>
         <w:rPr>
-          <w:rFonts w:ascii="微軟正黑體" w:hAnsi="微軟正黑體"/>
+          <w:rFonts w:ascii="Arial" w:hAnsi="Arial" w:eastAsia="SimHei" w:cs="Arial"/>
           <w:b/>
           <w:color w:val="0C2340"/>
           <w:sz w:val="21"/>
@@ -2314,7 +2314,7 @@
             </w:pPr>
             <w:r>
               <w:rPr>
-                <w:rFonts w:ascii="微軟正黑體" w:hAnsi="微軟正黑體"/>
+                <w:rFonts w:ascii="Arial" w:hAnsi="Arial" w:eastAsia="SimHei" w:cs="Arial"/>
                 <w:b/>
                 <w:color w:val="FFFFFF"/>
                 <w:sz w:val="19"/>
@@ -2340,7 +2340,7 @@
             </w:pPr>
             <w:r>
               <w:rPr>
-                <w:rFonts w:ascii="微軟正黑體" w:hAnsi="微軟正黑體"/>
+                <w:rFonts w:ascii="Arial" w:hAnsi="Arial" w:eastAsia="SimHei" w:cs="Arial"/>
                 <w:b/>
                 <w:color w:val="FFFFFF"/>
                 <w:sz w:val="19"/>
@@ -2366,7 +2366,7 @@
             </w:pPr>
             <w:r>
               <w:rPr>
-                <w:rFonts w:ascii="微軟正黑體" w:hAnsi="微軟正黑體"/>
+                <w:rFonts w:ascii="Arial" w:hAnsi="Arial" w:eastAsia="SimHei" w:cs="Arial"/>
                 <w:b/>
                 <w:color w:val="FFFFFF"/>
                 <w:sz w:val="19"/>
@@ -2392,7 +2392,7 @@
             </w:pPr>
             <w:r>
               <w:rPr>
-                <w:rFonts w:ascii="微軟正黑體" w:hAnsi="微軟正黑體"/>
+                <w:rFonts w:ascii="Arial" w:hAnsi="Arial" w:eastAsia="SimHei" w:cs="Arial"/>
                 <w:b/>
                 <w:color w:val="FFFFFF"/>
                 <w:sz w:val="19"/>
@@ -2420,7 +2420,7 @@
             </w:pPr>
             <w:r>
               <w:rPr>
-                <w:rFonts w:ascii="微軟正黑體" w:hAnsi="微軟正黑體"/>
+                <w:rFonts w:ascii="Arial" w:hAnsi="Arial" w:eastAsia="SimHei" w:cs="Arial"/>
                 <w:color w:val="1E293B"/>
                 <w:sz w:val="17"/>
               </w:rPr>
@@ -2442,7 +2442,7 @@
           <w:p>
             <w:r>
               <w:rPr>
-                <w:rFonts w:ascii="微軟正黑體" w:hAnsi="微軟正黑體"/>
+                <w:rFonts w:ascii="Arial" w:hAnsi="Arial" w:eastAsia="SimHei" w:cs="Arial"/>
                 <w:color w:val="1E293B"/>
                 <w:sz w:val="17"/>
               </w:rPr>
@@ -2467,7 +2467,7 @@
             </w:pPr>
             <w:r>
               <w:rPr>
-                <w:rFonts w:ascii="微軟正黑體" w:hAnsi="微軟正黑體"/>
+                <w:rFonts w:ascii="Arial" w:hAnsi="Arial" w:eastAsia="SimHei" w:cs="Arial"/>
                 <w:color w:val="1E293B"/>
                 <w:sz w:val="17"/>
               </w:rPr>
@@ -2489,7 +2489,7 @@
           <w:p>
             <w:r>
               <w:rPr>
-                <w:rFonts w:ascii="微軟正黑體" w:hAnsi="微軟正黑體"/>
+                <w:rFonts w:ascii="Arial" w:hAnsi="Arial" w:eastAsia="SimHei" w:cs="Arial"/>
                 <w:color w:val="1E293B"/>
                 <w:sz w:val="17"/>
               </w:rPr>
@@ -2516,7 +2516,7 @@
             </w:pPr>
             <w:r>
               <w:rPr>
-                <w:rFonts w:ascii="微軟正黑體" w:hAnsi="微軟正黑體"/>
+                <w:rFonts w:ascii="Arial" w:hAnsi="Arial" w:eastAsia="SimHei" w:cs="Arial"/>
                 <w:color w:val="1E293B"/>
                 <w:sz w:val="17"/>
               </w:rPr>
@@ -2538,7 +2538,7 @@
           <w:p>
             <w:r>
               <w:rPr>
-                <w:rFonts w:ascii="微軟正黑體" w:hAnsi="微軟正黑體"/>
+                <w:rFonts w:ascii="Arial" w:hAnsi="Arial" w:eastAsia="SimHei" w:cs="Arial"/>
                 <w:color w:val="1E293B"/>
                 <w:sz w:val="17"/>
               </w:rPr>
@@ -2563,7 +2563,7 @@
             </w:pPr>
             <w:r>
               <w:rPr>
-                <w:rFonts w:ascii="微軟正黑體" w:hAnsi="微軟正黑體"/>
+                <w:rFonts w:ascii="Arial" w:hAnsi="Arial" w:eastAsia="SimHei" w:cs="Arial"/>
                 <w:color w:val="1E293B"/>
                 <w:sz w:val="17"/>
               </w:rPr>
@@ -2585,7 +2585,7 @@
           <w:p>
             <w:r>
               <w:rPr>
-                <w:rFonts w:ascii="微軟正黑體" w:hAnsi="微軟正黑體"/>
+                <w:rFonts w:ascii="Arial" w:hAnsi="Arial" w:eastAsia="SimHei" w:cs="Arial"/>
                 <w:color w:val="1E293B"/>
                 <w:sz w:val="17"/>
               </w:rPr>
@@ -2612,7 +2612,7 @@
             </w:pPr>
             <w:r>
               <w:rPr>
-                <w:rFonts w:ascii="微軟正黑體" w:hAnsi="微軟正黑體"/>
+                <w:rFonts w:ascii="Arial" w:hAnsi="Arial" w:eastAsia="SimHei" w:cs="Arial"/>
                 <w:color w:val="1E293B"/>
                 <w:sz w:val="17"/>
               </w:rPr>
@@ -2634,7 +2634,7 @@
           <w:p>
             <w:r>
               <w:rPr>
-                <w:rFonts w:ascii="微軟正黑體" w:hAnsi="微軟正黑體"/>
+                <w:rFonts w:ascii="Arial" w:hAnsi="Arial" w:eastAsia="SimHei" w:cs="Arial"/>
                 <w:color w:val="1E293B"/>
                 <w:sz w:val="17"/>
               </w:rPr>
@@ -2659,7 +2659,7 @@
             </w:pPr>
             <w:r>
               <w:rPr>
-                <w:rFonts w:ascii="微軟正黑體" w:hAnsi="微軟正黑體"/>
+                <w:rFonts w:ascii="Arial" w:hAnsi="Arial" w:eastAsia="SimHei" w:cs="Arial"/>
                 <w:color w:val="1E293B"/>
                 <w:sz w:val="17"/>
               </w:rPr>
@@ -2681,7 +2681,7 @@
           <w:p>
             <w:r>
               <w:rPr>
-                <w:rFonts w:ascii="微軟正黑體" w:hAnsi="微軟正黑體"/>
+                <w:rFonts w:ascii="Arial" w:hAnsi="Arial" w:eastAsia="SimHei" w:cs="Arial"/>
                 <w:color w:val="1E293B"/>
                 <w:sz w:val="17"/>
               </w:rPr>
@@ -2708,7 +2708,7 @@
             </w:pPr>
             <w:r>
               <w:rPr>
-                <w:rFonts w:ascii="微軟正黑體" w:hAnsi="微軟正黑體"/>
+                <w:rFonts w:ascii="Arial" w:hAnsi="Arial" w:eastAsia="SimHei" w:cs="Arial"/>
                 <w:color w:val="1E293B"/>
                 <w:sz w:val="17"/>
               </w:rPr>
@@ -2730,7 +2730,7 @@
           <w:p>
             <w:r>
               <w:rPr>
-                <w:rFonts w:ascii="微軟正黑體" w:hAnsi="微軟正黑體"/>
+                <w:rFonts w:ascii="Arial" w:hAnsi="Arial" w:eastAsia="SimHei" w:cs="Arial"/>
                 <w:color w:val="1E293B"/>
                 <w:sz w:val="17"/>
               </w:rPr>
@@ -2755,7 +2755,7 @@
             </w:pPr>
             <w:r>
               <w:rPr>
-                <w:rFonts w:ascii="微軟正黑體" w:hAnsi="微軟正黑體"/>
+                <w:rFonts w:ascii="Arial" w:hAnsi="Arial" w:eastAsia="SimHei" w:cs="Arial"/>
                 <w:color w:val="1E293B"/>
                 <w:sz w:val="17"/>
               </w:rPr>
@@ -2777,7 +2777,7 @@
           <w:p>
             <w:r>
               <w:rPr>
-                <w:rFonts w:ascii="微軟正黑體" w:hAnsi="微軟正黑體"/>
+                <w:rFonts w:ascii="Arial" w:hAnsi="Arial" w:eastAsia="SimHei" w:cs="Arial"/>
                 <w:color w:val="1E293B"/>
                 <w:sz w:val="17"/>
               </w:rPr>
@@ -2804,7 +2804,7 @@
             </w:pPr>
             <w:r>
               <w:rPr>
-                <w:rFonts w:ascii="微軟正黑體" w:hAnsi="微軟正黑體"/>
+                <w:rFonts w:ascii="Arial" w:hAnsi="Arial" w:eastAsia="SimHei" w:cs="Arial"/>
                 <w:color w:val="1E293B"/>
                 <w:sz w:val="17"/>
               </w:rPr>
@@ -2826,7 +2826,7 @@
           <w:p>
             <w:r>
               <w:rPr>
-                <w:rFonts w:ascii="微軟正黑體" w:hAnsi="微軟正黑體"/>
+                <w:rFonts w:ascii="Arial" w:hAnsi="Arial" w:eastAsia="SimHei" w:cs="Arial"/>
                 <w:color w:val="1E293B"/>
                 <w:sz w:val="17"/>
               </w:rPr>
@@ -2851,7 +2851,7 @@
             </w:pPr>
             <w:r>
               <w:rPr>
-                <w:rFonts w:ascii="微軟正黑體" w:hAnsi="微軟正黑體"/>
+                <w:rFonts w:ascii="Arial" w:hAnsi="Arial" w:eastAsia="SimHei" w:cs="Arial"/>
                 <w:color w:val="1E293B"/>
                 <w:sz w:val="17"/>
               </w:rPr>
@@ -2873,7 +2873,7 @@
           <w:p>
             <w:r>
               <w:rPr>
-                <w:rFonts w:ascii="微軟正黑體" w:hAnsi="微軟正黑體"/>
+                <w:rFonts w:ascii="Arial" w:hAnsi="Arial" w:eastAsia="SimHei" w:cs="Arial"/>
                 <w:color w:val="1E293B"/>
                 <w:sz w:val="17"/>
               </w:rPr>
@@ -2900,7 +2900,7 @@
             </w:pPr>
             <w:r>
               <w:rPr>
-                <w:rFonts w:ascii="微軟正黑體" w:hAnsi="微軟正黑體"/>
+                <w:rFonts w:ascii="Arial" w:hAnsi="Arial" w:eastAsia="SimHei" w:cs="Arial"/>
                 <w:color w:val="1E293B"/>
                 <w:sz w:val="17"/>
               </w:rPr>
@@ -2922,7 +2922,7 @@
           <w:p>
             <w:r>
               <w:rPr>
-                <w:rFonts w:ascii="微軟正黑體" w:hAnsi="微軟正黑體"/>
+                <w:rFonts w:ascii="Arial" w:hAnsi="Arial" w:eastAsia="SimHei" w:cs="Arial"/>
                 <w:color w:val="1E293B"/>
                 <w:sz w:val="17"/>
               </w:rPr>
@@ -2947,7 +2947,7 @@
             </w:pPr>
             <w:r>
               <w:rPr>
-                <w:rFonts w:ascii="微軟正黑體" w:hAnsi="微軟正黑體"/>
+                <w:rFonts w:ascii="Arial" w:hAnsi="Arial" w:eastAsia="SimHei" w:cs="Arial"/>
                 <w:color w:val="1E293B"/>
                 <w:sz w:val="17"/>
               </w:rPr>
@@ -2969,7 +2969,7 @@
           <w:p>
             <w:r>
               <w:rPr>
-                <w:rFonts w:ascii="微軟正黑體" w:hAnsi="微軟正黑體"/>
+                <w:rFonts w:ascii="Arial" w:hAnsi="Arial" w:eastAsia="SimHei" w:cs="Arial"/>
                 <w:color w:val="1E293B"/>
                 <w:sz w:val="17"/>
               </w:rPr>
@@ -2996,7 +2996,7 @@
             </w:pPr>
             <w:r>
               <w:rPr>
-                <w:rFonts w:ascii="微軟正黑體" w:hAnsi="微軟正黑體"/>
+                <w:rFonts w:ascii="Arial" w:hAnsi="Arial" w:eastAsia="SimHei" w:cs="Arial"/>
                 <w:color w:val="1E293B"/>
                 <w:sz w:val="17"/>
               </w:rPr>
@@ -3018,7 +3018,7 @@
           <w:p>
             <w:r>
               <w:rPr>
-                <w:rFonts w:ascii="微軟正黑體" w:hAnsi="微軟正黑體"/>
+                <w:rFonts w:ascii="Arial" w:hAnsi="Arial" w:eastAsia="SimHei" w:cs="Arial"/>
                 <w:color w:val="1E293B"/>
                 <w:sz w:val="17"/>
               </w:rPr>
@@ -3043,7 +3043,7 @@
             </w:pPr>
             <w:r>
               <w:rPr>
-                <w:rFonts w:ascii="微軟正黑體" w:hAnsi="微軟正黑體"/>
+                <w:rFonts w:ascii="Arial" w:hAnsi="Arial" w:eastAsia="SimHei" w:cs="Arial"/>
                 <w:color w:val="1E293B"/>
                 <w:sz w:val="17"/>
               </w:rPr>
@@ -3065,7 +3065,7 @@
           <w:p>
             <w:r>
               <w:rPr>
-                <w:rFonts w:ascii="微軟正黑體" w:hAnsi="微軟正黑體"/>
+                <w:rFonts w:ascii="Arial" w:hAnsi="Arial" w:eastAsia="SimHei" w:cs="Arial"/>
                 <w:color w:val="1E293B"/>
                 <w:sz w:val="17"/>
               </w:rPr>
@@ -3092,7 +3092,7 @@
             </w:pPr>
             <w:r>
               <w:rPr>
-                <w:rFonts w:ascii="微軟正黑體" w:hAnsi="微軟正黑體"/>
+                <w:rFonts w:ascii="Arial" w:hAnsi="Arial" w:eastAsia="SimHei" w:cs="Arial"/>
                 <w:color w:val="1E293B"/>
                 <w:sz w:val="17"/>
               </w:rPr>
@@ -3114,7 +3114,7 @@
           <w:p>
             <w:r>
               <w:rPr>
-                <w:rFonts w:ascii="微軟正黑體" w:hAnsi="微軟正黑體"/>
+                <w:rFonts w:ascii="Arial" w:hAnsi="Arial" w:eastAsia="SimHei" w:cs="Arial"/>
                 <w:color w:val="1E293B"/>
                 <w:sz w:val="17"/>
               </w:rPr>
@@ -3139,7 +3139,7 @@
             </w:pPr>
             <w:r>
               <w:rPr>
-                <w:rFonts w:ascii="微軟正黑體" w:hAnsi="微軟正黑體"/>
+                <w:rFonts w:ascii="Arial" w:hAnsi="Arial" w:eastAsia="SimHei" w:cs="Arial"/>
                 <w:color w:val="1E293B"/>
                 <w:sz w:val="17"/>
               </w:rPr>
@@ -3161,7 +3161,7 @@
           <w:p>
             <w:r>
               <w:rPr>
-                <w:rFonts w:ascii="微軟正黑體" w:hAnsi="微軟正黑體"/>
+                <w:rFonts w:ascii="Arial" w:hAnsi="Arial" w:eastAsia="SimHei" w:cs="Arial"/>
                 <w:color w:val="1E293B"/>
                 <w:sz w:val="17"/>
               </w:rPr>
@@ -3188,7 +3188,7 @@
             </w:pPr>
             <w:r>
               <w:rPr>
-                <w:rFonts w:ascii="微軟正黑體" w:hAnsi="微軟正黑體"/>
+                <w:rFonts w:ascii="Arial" w:hAnsi="Arial" w:eastAsia="SimHei" w:cs="Arial"/>
                 <w:color w:val="1E293B"/>
                 <w:sz w:val="17"/>
               </w:rPr>
@@ -3210,7 +3210,7 @@
           <w:p>
             <w:r>
               <w:rPr>
-                <w:rFonts w:ascii="微軟正黑體" w:hAnsi="微軟正黑體"/>
+                <w:rFonts w:ascii="Arial" w:hAnsi="Arial" w:eastAsia="SimHei" w:cs="Arial"/>
                 <w:color w:val="1E293B"/>
                 <w:sz w:val="17"/>
               </w:rPr>
@@ -3235,7 +3235,7 @@
             </w:pPr>
             <w:r>
               <w:rPr>
-                <w:rFonts w:ascii="微軟正黑體" w:hAnsi="微軟正黑體"/>
+                <w:rFonts w:ascii="Arial" w:hAnsi="Arial" w:eastAsia="SimHei" w:cs="Arial"/>
                 <w:color w:val="1E293B"/>
                 <w:sz w:val="17"/>
               </w:rPr>
@@ -3257,7 +3257,7 @@
           <w:p>
             <w:r>
               <w:rPr>
-                <w:rFonts w:ascii="微軟正黑體" w:hAnsi="微軟正黑體"/>
+                <w:rFonts w:ascii="Arial" w:hAnsi="Arial" w:eastAsia="SimHei" w:cs="Arial"/>
                 <w:color w:val="1E293B"/>
                 <w:sz w:val="17"/>
               </w:rPr>
@@ -3284,7 +3284,7 @@
             </w:pPr>
             <w:r>
               <w:rPr>
-                <w:rFonts w:ascii="微軟正黑體" w:hAnsi="微軟正黑體"/>
+                <w:rFonts w:ascii="Arial" w:hAnsi="Arial" w:eastAsia="SimHei" w:cs="Arial"/>
                 <w:color w:val="1E293B"/>
                 <w:sz w:val="17"/>
               </w:rPr>
@@ -3306,7 +3306,7 @@
           <w:p>
             <w:r>
               <w:rPr>
-                <w:rFonts w:ascii="微軟正黑體" w:hAnsi="微軟正黑體"/>
+                <w:rFonts w:ascii="Arial" w:hAnsi="Arial" w:eastAsia="SimHei" w:cs="Arial"/>
                 <w:color w:val="1E293B"/>
                 <w:sz w:val="17"/>
               </w:rPr>
@@ -3331,7 +3331,7 @@
             </w:pPr>
             <w:r>
               <w:rPr>
-                <w:rFonts w:ascii="微軟正黑體" w:hAnsi="微軟正黑體"/>
+                <w:rFonts w:ascii="Arial" w:hAnsi="Arial" w:eastAsia="SimHei" w:cs="Arial"/>
                 <w:color w:val="1E293B"/>
                 <w:sz w:val="17"/>
               </w:rPr>
@@ -3353,7 +3353,7 @@
           <w:p>
             <w:r>
               <w:rPr>
-                <w:rFonts w:ascii="微軟正黑體" w:hAnsi="微軟正黑體"/>
+                <w:rFonts w:ascii="Arial" w:hAnsi="Arial" w:eastAsia="SimHei" w:cs="Arial"/>
                 <w:color w:val="1E293B"/>
                 <w:sz w:val="17"/>
               </w:rPr>
@@ -3380,7 +3380,7 @@
             </w:pPr>
             <w:r>
               <w:rPr>
-                <w:rFonts w:ascii="微軟正黑體" w:hAnsi="微軟正黑體"/>
+                <w:rFonts w:ascii="Arial" w:hAnsi="Arial" w:eastAsia="SimHei" w:cs="Arial"/>
                 <w:color w:val="1E293B"/>
                 <w:sz w:val="17"/>
               </w:rPr>
@@ -3402,7 +3402,7 @@
           <w:p>
             <w:r>
               <w:rPr>
-                <w:rFonts w:ascii="微軟正黑體" w:hAnsi="微軟正黑體"/>
+                <w:rFonts w:ascii="Arial" w:hAnsi="Arial" w:eastAsia="SimHei" w:cs="Arial"/>
                 <w:color w:val="1E293B"/>
                 <w:sz w:val="17"/>
               </w:rPr>
@@ -3427,7 +3427,7 @@
             </w:pPr>
             <w:r>
               <w:rPr>
-                <w:rFonts w:ascii="微軟正黑體" w:hAnsi="微軟正黑體"/>
+                <w:rFonts w:ascii="Arial" w:hAnsi="Arial" w:eastAsia="SimHei" w:cs="Arial"/>
                 <w:color w:val="1E293B"/>
                 <w:sz w:val="17"/>
               </w:rPr>
@@ -3449,7 +3449,7 @@
           <w:p>
             <w:r>
               <w:rPr>
-                <w:rFonts w:ascii="微軟正黑體" w:hAnsi="微軟正黑體"/>
+                <w:rFonts w:ascii="Arial" w:hAnsi="Arial" w:eastAsia="SimHei" w:cs="Arial"/>
                 <w:color w:val="1E293B"/>
                 <w:sz w:val="17"/>
               </w:rPr>
@@ -3476,7 +3476,7 @@
             </w:pPr>
             <w:r>
               <w:rPr>
-                <w:rFonts w:ascii="微軟正黑體" w:hAnsi="微軟正黑體"/>
+                <w:rFonts w:ascii="Arial" w:hAnsi="Arial" w:eastAsia="SimHei" w:cs="Arial"/>
                 <w:color w:val="1E293B"/>
                 <w:sz w:val="17"/>
               </w:rPr>
@@ -3498,7 +3498,7 @@
           <w:p>
             <w:r>
               <w:rPr>
-                <w:rFonts w:ascii="微軟正黑體" w:hAnsi="微軟正黑體"/>
+                <w:rFonts w:ascii="Arial" w:hAnsi="Arial" w:eastAsia="SimHei" w:cs="Arial"/>
                 <w:color w:val="1E293B"/>
                 <w:sz w:val="17"/>
               </w:rPr>
@@ -3523,7 +3523,7 @@
             </w:pPr>
             <w:r>
               <w:rPr>
-                <w:rFonts w:ascii="微軟正黑體" w:hAnsi="微軟正黑體"/>
+                <w:rFonts w:ascii="Arial" w:hAnsi="Arial" w:eastAsia="SimHei" w:cs="Arial"/>
                 <w:color w:val="1E293B"/>
                 <w:sz w:val="17"/>
               </w:rPr>
@@ -3545,7 +3545,7 @@
           <w:p>
             <w:r>
               <w:rPr>
-                <w:rFonts w:ascii="微軟正黑體" w:hAnsi="微軟正黑體"/>
+                <w:rFonts w:ascii="Arial" w:hAnsi="Arial" w:eastAsia="SimHei" w:cs="Arial"/>
                 <w:color w:val="1E293B"/>
                 <w:sz w:val="17"/>
               </w:rPr>
@@ -3572,7 +3572,7 @@
             </w:pPr>
             <w:r>
               <w:rPr>
-                <w:rFonts w:ascii="微軟正黑體" w:hAnsi="微軟正黑體"/>
+                <w:rFonts w:ascii="Arial" w:hAnsi="Arial" w:eastAsia="SimHei" w:cs="Arial"/>
                 <w:color w:val="1E293B"/>
                 <w:sz w:val="17"/>
               </w:rPr>
@@ -3594,7 +3594,7 @@
           <w:p>
             <w:r>
               <w:rPr>
-                <w:rFonts w:ascii="微軟正黑體" w:hAnsi="微軟正黑體"/>
+                <w:rFonts w:ascii="Arial" w:hAnsi="Arial" w:eastAsia="SimHei" w:cs="Arial"/>
                 <w:color w:val="1E293B"/>
                 <w:sz w:val="17"/>
               </w:rPr>
@@ -3619,7 +3619,7 @@
             </w:pPr>
             <w:r>
               <w:rPr>
-                <w:rFonts w:ascii="微軟正黑體" w:hAnsi="微軟正黑體"/>
+                <w:rFonts w:ascii="Arial" w:hAnsi="Arial" w:eastAsia="SimHei" w:cs="Arial"/>
                 <w:color w:val="1E293B"/>
                 <w:sz w:val="17"/>
               </w:rPr>
@@ -3641,7 +3641,7 @@
           <w:p>
             <w:r>
               <w:rPr>
-                <w:rFonts w:ascii="微軟正黑體" w:hAnsi="微軟正黑體"/>
+                <w:rFonts w:ascii="Arial" w:hAnsi="Arial" w:eastAsia="SimHei" w:cs="Arial"/>
                 <w:color w:val="1E293B"/>
                 <w:sz w:val="17"/>
               </w:rPr>
@@ -3668,7 +3668,7 @@
             </w:pPr>
             <w:r>
               <w:rPr>
-                <w:rFonts w:ascii="微軟正黑體" w:hAnsi="微軟正黑體"/>
+                <w:rFonts w:ascii="Arial" w:hAnsi="Arial" w:eastAsia="SimHei" w:cs="Arial"/>
                 <w:color w:val="1E293B"/>
                 <w:sz w:val="17"/>
               </w:rPr>
@@ -3690,7 +3690,7 @@
           <w:p>
             <w:r>
               <w:rPr>
-                <w:rFonts w:ascii="微軟正黑體" w:hAnsi="微軟正黑體"/>
+                <w:rFonts w:ascii="Arial" w:hAnsi="Arial" w:eastAsia="SimHei" w:cs="Arial"/>
                 <w:color w:val="1E293B"/>
                 <w:sz w:val="17"/>
               </w:rPr>
@@ -3715,7 +3715,7 @@
             </w:pPr>
             <w:r>
               <w:rPr>
-                <w:rFonts w:ascii="微軟正黑體" w:hAnsi="微軟正黑體"/>
+                <w:rFonts w:ascii="Arial" w:hAnsi="Arial" w:eastAsia="SimHei" w:cs="Arial"/>
                 <w:color w:val="1E293B"/>
                 <w:sz w:val="17"/>
               </w:rPr>
@@ -3737,7 +3737,7 @@
           <w:p>
             <w:r>
               <w:rPr>
-                <w:rFonts w:ascii="微軟正黑體" w:hAnsi="微軟正黑體"/>
+                <w:rFonts w:ascii="Arial" w:hAnsi="Arial" w:eastAsia="SimHei" w:cs="Arial"/>
                 <w:color w:val="1E293B"/>
                 <w:sz w:val="17"/>
               </w:rPr>
@@ -3764,7 +3764,7 @@
             </w:pPr>
             <w:r>
               <w:rPr>
-                <w:rFonts w:ascii="微軟正黑體" w:hAnsi="微軟正黑體"/>
+                <w:rFonts w:ascii="Arial" w:hAnsi="Arial" w:eastAsia="SimHei" w:cs="Arial"/>
                 <w:color w:val="1E293B"/>
                 <w:sz w:val="17"/>
               </w:rPr>
@@ -3786,7 +3786,7 @@
           <w:p>
             <w:r>
               <w:rPr>
-                <w:rFonts w:ascii="微軟正黑體" w:hAnsi="微軟正黑體"/>
+                <w:rFonts w:ascii="Arial" w:hAnsi="Arial" w:eastAsia="SimHei" w:cs="Arial"/>
                 <w:color w:val="1E293B"/>
                 <w:sz w:val="17"/>
               </w:rPr>
@@ -3811,7 +3811,7 @@
             </w:pPr>
             <w:r>
               <w:rPr>
-                <w:rFonts w:ascii="微軟正黑體" w:hAnsi="微軟正黑體"/>
+                <w:rFonts w:ascii="Arial" w:hAnsi="Arial" w:eastAsia="SimHei" w:cs="Arial"/>
                 <w:color w:val="1E293B"/>
                 <w:sz w:val="17"/>
               </w:rPr>
@@ -3833,7 +3833,7 @@
           <w:p>
             <w:r>
               <w:rPr>
-                <w:rFonts w:ascii="微軟正黑體" w:hAnsi="微軟正黑體"/>
+                <w:rFonts w:ascii="Arial" w:hAnsi="Arial" w:eastAsia="SimHei" w:cs="Arial"/>
                 <w:color w:val="1E293B"/>
                 <w:sz w:val="17"/>
               </w:rPr>
@@ -3890,7 +3890,7 @@
       </w:pPr>
       <w:r>
         <w:rPr>
-          <w:rFonts w:ascii="微軟正黑體" w:hAnsi="微軟正黑體"/>
+          <w:rFonts w:ascii="Arial" w:hAnsi="Arial" w:eastAsia="SimHei" w:cs="Arial"/>
           <w:b/>
           <w:color w:val="2563EB"/>
           <w:sz w:val="19"/>
@@ -3904,7 +3904,7 @@
       </w:pPr>
       <w:r>
         <w:rPr>
-          <w:rFonts w:ascii="微軟正黑體" w:hAnsi="微軟正黑體"/>
+          <w:rFonts w:ascii="Arial" w:hAnsi="Arial" w:eastAsia="SimHei" w:cs="Arial"/>
           <w:b/>
           <w:color w:val="2563EB"/>
           <w:sz w:val="29"/>
@@ -3918,7 +3918,7 @@
       </w:pPr>
       <w:r>
         <w:rPr>
-          <w:rFonts w:ascii="微軟正黑體" w:hAnsi="微軟正黑體"/>
+          <w:rFonts w:ascii="Arial" w:hAnsi="Arial" w:eastAsia="SimHei" w:cs="Arial"/>
           <w:color w:val="334155"/>
           <w:sz w:val="22"/>
         </w:rPr>
@@ -3972,7 +3972,7 @@
       </w:pPr>
       <w:r>
         <w:rPr>
-          <w:rFonts w:ascii="微軟正黑體" w:hAnsi="微軟正黑體"/>
+          <w:rFonts w:ascii="Arial" w:hAnsi="Arial" w:eastAsia="SimHei" w:cs="Arial"/>
           <w:b/>
           <w:color w:val="2563EB"/>
           <w:sz w:val="19"/>
@@ -3991,7 +3991,7 @@
       </w:pPr>
       <w:r>
         <w:rPr>
-          <w:rFonts w:ascii="微軟正黑體" w:hAnsi="微軟正黑體"/>
+          <w:rFonts w:ascii="Arial" w:hAnsi="Arial" w:eastAsia="SimHei" w:cs="Arial"/>
           <w:b/>
           <w:color w:val="0C2340"/>
           <w:sz w:val="40"/>
@@ -4005,7 +4005,7 @@
       </w:pPr>
       <w:r>
         <w:rPr>
-          <w:rFonts w:ascii="微軟正黑體" w:hAnsi="微軟正黑體"/>
+          <w:rFonts w:ascii="Arial" w:hAnsi="Arial" w:eastAsia="SimHei" w:cs="Arial"/>
           <w:b/>
           <w:color w:val="2563EB"/>
           <w:sz w:val="29"/>
@@ -4019,7 +4019,7 @@
       </w:pPr>
       <w:r>
         <w:rPr>
-          <w:rFonts w:ascii="微軟正黑體" w:hAnsi="微軟正黑體"/>
+          <w:rFonts w:ascii="Arial" w:hAnsi="Arial" w:eastAsia="SimHei" w:cs="Arial"/>
           <w:color w:val="334155"/>
           <w:sz w:val="22"/>
         </w:rPr>
@@ -4032,7 +4032,7 @@
       </w:pPr>
       <w:r>
         <w:rPr>
-          <w:rFonts w:ascii="微軟正黑體" w:hAnsi="微軟正黑體"/>
+          <w:rFonts w:ascii="Arial" w:hAnsi="Arial" w:eastAsia="SimHei" w:cs="Arial"/>
           <w:b/>
           <w:color w:val="0C2340"/>
           <w:sz w:val="22"/>
@@ -4041,7 +4041,7 @@
       </w:r>
       <w:r>
         <w:rPr>
-          <w:rFonts w:ascii="微軟正黑體" w:hAnsi="微軟正黑體"/>
+          <w:rFonts w:ascii="Arial" w:hAnsi="Arial" w:eastAsia="SimHei" w:cs="Arial"/>
           <w:color w:val="334155"/>
           <w:sz w:val="22"/>
         </w:rPr>
@@ -4054,7 +4054,7 @@
       </w:pPr>
       <w:r>
         <w:rPr>
-          <w:rFonts w:ascii="微軟正黑體" w:hAnsi="微軟正黑體"/>
+          <w:rFonts w:ascii="Arial" w:hAnsi="Arial" w:eastAsia="SimHei" w:cs="Arial"/>
           <w:b/>
           <w:color w:val="0C2340"/>
           <w:sz w:val="22"/>
@@ -4063,7 +4063,7 @@
       </w:r>
       <w:r>
         <w:rPr>
-          <w:rFonts w:ascii="微軟正黑體" w:hAnsi="微軟正黑體"/>
+          <w:rFonts w:ascii="Arial" w:hAnsi="Arial" w:eastAsia="SimHei" w:cs="Arial"/>
           <w:color w:val="334155"/>
           <w:sz w:val="22"/>
         </w:rPr>
@@ -4076,7 +4076,7 @@
       </w:pPr>
       <w:r>
         <w:rPr>
-          <w:rFonts w:ascii="微軟正黑體" w:hAnsi="微軟正黑體"/>
+          <w:rFonts w:ascii="Arial" w:hAnsi="Arial" w:eastAsia="SimHei" w:cs="Arial"/>
           <w:b/>
           <w:color w:val="0C2340"/>
           <w:sz w:val="22"/>
@@ -4085,7 +4085,7 @@
       </w:r>
       <w:r>
         <w:rPr>
-          <w:rFonts w:ascii="微軟正黑體" w:hAnsi="微軟正黑體"/>
+          <w:rFonts w:ascii="Arial" w:hAnsi="Arial" w:eastAsia="SimHei" w:cs="Arial"/>
           <w:color w:val="334155"/>
           <w:sz w:val="22"/>
         </w:rPr>
@@ -4098,7 +4098,7 @@
       </w:pPr>
       <w:r>
         <w:rPr>
-          <w:rFonts w:ascii="微軟正黑體" w:hAnsi="微軟正黑體"/>
+          <w:rFonts w:ascii="Arial" w:hAnsi="Arial" w:eastAsia="SimHei" w:cs="Arial"/>
           <w:b/>
           <w:color w:val="0C2340"/>
           <w:sz w:val="22"/>
@@ -4107,7 +4107,7 @@
       </w:r>
       <w:r>
         <w:rPr>
-          <w:rFonts w:ascii="微軟正黑體" w:hAnsi="微軟正黑體"/>
+          <w:rFonts w:ascii="Arial" w:hAnsi="Arial" w:eastAsia="SimHei" w:cs="Arial"/>
           <w:color w:val="334155"/>
           <w:sz w:val="22"/>
         </w:rPr>
@@ -4120,7 +4120,7 @@
       </w:pPr>
       <w:r>
         <w:rPr>
-          <w:rFonts w:ascii="微軟正黑體" w:hAnsi="微軟正黑體"/>
+          <w:rFonts w:ascii="Arial" w:hAnsi="Arial" w:eastAsia="SimHei" w:cs="Arial"/>
           <w:b/>
           <w:color w:val="2563EB"/>
           <w:sz w:val="29"/>
@@ -4134,7 +4134,7 @@
       </w:pPr>
       <w:r>
         <w:rPr>
-          <w:rFonts w:ascii="微軟正黑體" w:hAnsi="微軟正黑體"/>
+          <w:rFonts w:ascii="Arial" w:hAnsi="Arial" w:eastAsia="SimHei" w:cs="Arial"/>
           <w:b/>
           <w:color w:val="0C2340"/>
           <w:sz w:val="21"/>
@@ -4181,7 +4181,7 @@
             </w:pPr>
             <w:r>
               <w:rPr>
-                <w:rFonts w:ascii="微軟正黑體" w:hAnsi="微軟正黑體"/>
+                <w:rFonts w:ascii="Arial" w:hAnsi="Arial" w:eastAsia="SimHei" w:cs="Arial"/>
                 <w:b/>
                 <w:color w:val="FFFFFF"/>
                 <w:sz w:val="19"/>
@@ -4207,7 +4207,7 @@
             </w:pPr>
             <w:r>
               <w:rPr>
-                <w:rFonts w:ascii="微軟正黑體" w:hAnsi="微軟正黑體"/>
+                <w:rFonts w:ascii="Arial" w:hAnsi="Arial" w:eastAsia="SimHei" w:cs="Arial"/>
                 <w:b/>
                 <w:color w:val="FFFFFF"/>
                 <w:sz w:val="19"/>
@@ -4233,7 +4233,7 @@
             </w:pPr>
             <w:r>
               <w:rPr>
-                <w:rFonts w:ascii="微軟正黑體" w:hAnsi="微軟正黑體"/>
+                <w:rFonts w:ascii="Arial" w:hAnsi="Arial" w:eastAsia="SimHei" w:cs="Arial"/>
                 <w:b/>
                 <w:color w:val="FFFFFF"/>
                 <w:sz w:val="19"/>
@@ -4259,7 +4259,7 @@
             </w:pPr>
             <w:r>
               <w:rPr>
-                <w:rFonts w:ascii="微軟正黑體" w:hAnsi="微軟正黑體"/>
+                <w:rFonts w:ascii="Arial" w:hAnsi="Arial" w:eastAsia="SimHei" w:cs="Arial"/>
                 <w:b/>
                 <w:color w:val="FFFFFF"/>
                 <w:sz w:val="19"/>
@@ -4285,7 +4285,7 @@
             </w:pPr>
             <w:r>
               <w:rPr>
-                <w:rFonts w:ascii="微軟正黑體" w:hAnsi="微軟正黑體"/>
+                <w:rFonts w:ascii="Arial" w:hAnsi="Arial" w:eastAsia="SimHei" w:cs="Arial"/>
                 <w:b/>
                 <w:color w:val="FFFFFF"/>
                 <w:sz w:val="19"/>
@@ -4313,7 +4313,7 @@
             </w:pPr>
             <w:r>
               <w:rPr>
-                <w:rFonts w:ascii="微軟正黑體" w:hAnsi="微軟正黑體"/>
+                <w:rFonts w:ascii="Arial" w:hAnsi="Arial" w:eastAsia="SimHei" w:cs="Arial"/>
                 <w:color w:val="1E293B"/>
                 <w:sz w:val="17"/>
               </w:rPr>
@@ -4335,7 +4335,7 @@
           <w:p>
             <w:r>
               <w:rPr>
-                <w:rFonts w:ascii="微軟正黑體" w:hAnsi="微軟正黑體"/>
+                <w:rFonts w:ascii="Arial" w:hAnsi="Arial" w:eastAsia="SimHei" w:cs="Arial"/>
                 <w:color w:val="1E293B"/>
                 <w:sz w:val="17"/>
               </w:rPr>
@@ -4360,7 +4360,7 @@
             </w:pPr>
             <w:r>
               <w:rPr>
-                <w:rFonts w:ascii="微軟正黑體" w:hAnsi="微軟正黑體"/>
+                <w:rFonts w:ascii="Arial" w:hAnsi="Arial" w:eastAsia="SimHei" w:cs="Arial"/>
                 <w:color w:val="1E293B"/>
                 <w:sz w:val="17"/>
               </w:rPr>
@@ -4382,7 +4382,7 @@
           <w:p>
             <w:r>
               <w:rPr>
-                <w:rFonts w:ascii="微軟正黑體" w:hAnsi="微軟正黑體"/>
+                <w:rFonts w:ascii="Arial" w:hAnsi="Arial" w:eastAsia="SimHei" w:cs="Arial"/>
                 <w:color w:val="1E293B"/>
                 <w:sz w:val="17"/>
               </w:rPr>
@@ -4404,7 +4404,7 @@
           <w:p>
             <w:r>
               <w:rPr>
-                <w:rFonts w:ascii="微軟正黑體" w:hAnsi="微軟正黑體"/>
+                <w:rFonts w:ascii="Arial" w:hAnsi="Arial" w:eastAsia="SimHei" w:cs="Arial"/>
                 <w:color w:val="1E293B"/>
                 <w:sz w:val="17"/>
               </w:rPr>
@@ -4431,7 +4431,7 @@
             </w:pPr>
             <w:r>
               <w:rPr>
-                <w:rFonts w:ascii="微軟正黑體" w:hAnsi="微軟正黑體"/>
+                <w:rFonts w:ascii="Arial" w:hAnsi="Arial" w:eastAsia="SimHei" w:cs="Arial"/>
                 <w:color w:val="1E293B"/>
                 <w:sz w:val="17"/>
               </w:rPr>
@@ -4453,7 +4453,7 @@
           <w:p>
             <w:r>
               <w:rPr>
-                <w:rFonts w:ascii="微軟正黑體" w:hAnsi="微軟正黑體"/>
+                <w:rFonts w:ascii="Arial" w:hAnsi="Arial" w:eastAsia="SimHei" w:cs="Arial"/>
                 <w:color w:val="1E293B"/>
                 <w:sz w:val="17"/>
               </w:rPr>
@@ -4478,7 +4478,7 @@
             </w:pPr>
             <w:r>
               <w:rPr>
-                <w:rFonts w:ascii="微軟正黑體" w:hAnsi="微軟正黑體"/>
+                <w:rFonts w:ascii="Arial" w:hAnsi="Arial" w:eastAsia="SimHei" w:cs="Arial"/>
                 <w:color w:val="1E293B"/>
                 <w:sz w:val="17"/>
               </w:rPr>
@@ -4500,7 +4500,7 @@
           <w:p>
             <w:r>
               <w:rPr>
-                <w:rFonts w:ascii="微軟正黑體" w:hAnsi="微軟正黑體"/>
+                <w:rFonts w:ascii="Arial" w:hAnsi="Arial" w:eastAsia="SimHei" w:cs="Arial"/>
                 <w:color w:val="1E293B"/>
                 <w:sz w:val="17"/>
               </w:rPr>
@@ -4522,7 +4522,7 @@
           <w:p>
             <w:r>
               <w:rPr>
-                <w:rFonts w:ascii="微軟正黑體" w:hAnsi="微軟正黑體"/>
+                <w:rFonts w:ascii="Arial" w:hAnsi="Arial" w:eastAsia="SimHei" w:cs="Arial"/>
                 <w:color w:val="1E293B"/>
                 <w:sz w:val="17"/>
               </w:rPr>
@@ -4549,7 +4549,7 @@
             </w:pPr>
             <w:r>
               <w:rPr>
-                <w:rFonts w:ascii="微軟正黑體" w:hAnsi="微軟正黑體"/>
+                <w:rFonts w:ascii="Arial" w:hAnsi="Arial" w:eastAsia="SimHei" w:cs="Arial"/>
                 <w:color w:val="1E293B"/>
                 <w:sz w:val="17"/>
               </w:rPr>
@@ -4571,7 +4571,7 @@
           <w:p>
             <w:r>
               <w:rPr>
-                <w:rFonts w:ascii="微軟正黑體" w:hAnsi="微軟正黑體"/>
+                <w:rFonts w:ascii="Arial" w:hAnsi="Arial" w:eastAsia="SimHei" w:cs="Arial"/>
                 <w:color w:val="1E293B"/>
                 <w:sz w:val="17"/>
               </w:rPr>
@@ -4596,7 +4596,7 @@
             </w:pPr>
             <w:r>
               <w:rPr>
-                <w:rFonts w:ascii="微軟正黑體" w:hAnsi="微軟正黑體"/>
+                <w:rFonts w:ascii="Arial" w:hAnsi="Arial" w:eastAsia="SimHei" w:cs="Arial"/>
                 <w:color w:val="1E293B"/>
                 <w:sz w:val="17"/>
               </w:rPr>
@@ -4618,7 +4618,7 @@
           <w:p>
             <w:r>
               <w:rPr>
-                <w:rFonts w:ascii="微軟正黑體" w:hAnsi="微軟正黑體"/>
+                <w:rFonts w:ascii="Arial" w:hAnsi="Arial" w:eastAsia="SimHei" w:cs="Arial"/>
                 <w:color w:val="1E293B"/>
                 <w:sz w:val="17"/>
               </w:rPr>
@@ -4640,7 +4640,7 @@
           <w:p>
             <w:r>
               <w:rPr>
-                <w:rFonts w:ascii="微軟正黑體" w:hAnsi="微軟正黑體"/>
+                <w:rFonts w:ascii="Arial" w:hAnsi="Arial" w:eastAsia="SimHei" w:cs="Arial"/>
                 <w:color w:val="1E293B"/>
                 <w:sz w:val="17"/>
               </w:rPr>
@@ -4667,7 +4667,7 @@
             </w:pPr>
             <w:r>
               <w:rPr>
-                <w:rFonts w:ascii="微軟正黑體" w:hAnsi="微軟正黑體"/>
+                <w:rFonts w:ascii="Arial" w:hAnsi="Arial" w:eastAsia="SimHei" w:cs="Arial"/>
                 <w:color w:val="1E293B"/>
                 <w:sz w:val="17"/>
               </w:rPr>
@@ -4689,7 +4689,7 @@
           <w:p>
             <w:r>
               <w:rPr>
-                <w:rFonts w:ascii="微軟正黑體" w:hAnsi="微軟正黑體"/>
+                <w:rFonts w:ascii="Arial" w:hAnsi="Arial" w:eastAsia="SimHei" w:cs="Arial"/>
                 <w:color w:val="1E293B"/>
                 <w:sz w:val="17"/>
               </w:rPr>
@@ -4714,7 +4714,7 @@
             </w:pPr>
             <w:r>
               <w:rPr>
-                <w:rFonts w:ascii="微軟正黑體" w:hAnsi="微軟正黑體"/>
+                <w:rFonts w:ascii="Arial" w:hAnsi="Arial" w:eastAsia="SimHei" w:cs="Arial"/>
                 <w:color w:val="1E293B"/>
                 <w:sz w:val="17"/>
               </w:rPr>
@@ -4736,7 +4736,7 @@
           <w:p>
             <w:r>
               <w:rPr>
-                <w:rFonts w:ascii="微軟正黑體" w:hAnsi="微軟正黑體"/>
+                <w:rFonts w:ascii="Arial" w:hAnsi="Arial" w:eastAsia="SimHei" w:cs="Arial"/>
                 <w:color w:val="1E293B"/>
                 <w:sz w:val="17"/>
               </w:rPr>
@@ -4758,7 +4758,7 @@
           <w:p>
             <w:r>
               <w:rPr>
-                <w:rFonts w:ascii="微軟正黑體" w:hAnsi="微軟正黑體"/>
+                <w:rFonts w:ascii="Arial" w:hAnsi="Arial" w:eastAsia="SimHei" w:cs="Arial"/>
                 <w:color w:val="1E293B"/>
                 <w:sz w:val="17"/>
               </w:rPr>
@@ -4785,7 +4785,7 @@
             </w:pPr>
             <w:r>
               <w:rPr>
-                <w:rFonts w:ascii="微軟正黑體" w:hAnsi="微軟正黑體"/>
+                <w:rFonts w:ascii="Arial" w:hAnsi="Arial" w:eastAsia="SimHei" w:cs="Arial"/>
                 <w:color w:val="1E293B"/>
                 <w:sz w:val="17"/>
               </w:rPr>
@@ -4807,7 +4807,7 @@
           <w:p>
             <w:r>
               <w:rPr>
-                <w:rFonts w:ascii="微軟正黑體" w:hAnsi="微軟正黑體"/>
+                <w:rFonts w:ascii="Arial" w:hAnsi="Arial" w:eastAsia="SimHei" w:cs="Arial"/>
                 <w:color w:val="1E293B"/>
                 <w:sz w:val="17"/>
               </w:rPr>
@@ -4832,7 +4832,7 @@
             </w:pPr>
             <w:r>
               <w:rPr>
-                <w:rFonts w:ascii="微軟正黑體" w:hAnsi="微軟正黑體"/>
+                <w:rFonts w:ascii="Arial" w:hAnsi="Arial" w:eastAsia="SimHei" w:cs="Arial"/>
                 <w:color w:val="1E293B"/>
                 <w:sz w:val="17"/>
               </w:rPr>
@@ -4854,7 +4854,7 @@
           <w:p>
             <w:r>
               <w:rPr>
-                <w:rFonts w:ascii="微軟正黑體" w:hAnsi="微軟正黑體"/>
+                <w:rFonts w:ascii="Arial" w:hAnsi="Arial" w:eastAsia="SimHei" w:cs="Arial"/>
                 <w:color w:val="1E293B"/>
                 <w:sz w:val="17"/>
               </w:rPr>
@@ -4876,7 +4876,7 @@
           <w:p>
             <w:r>
               <w:rPr>
-                <w:rFonts w:ascii="微軟正黑體" w:hAnsi="微軟正黑體"/>
+                <w:rFonts w:ascii="Arial" w:hAnsi="Arial" w:eastAsia="SimHei" w:cs="Arial"/>
                 <w:color w:val="1E293B"/>
                 <w:sz w:val="17"/>
               </w:rPr>
@@ -4903,7 +4903,7 @@
             </w:pPr>
             <w:r>
               <w:rPr>
-                <w:rFonts w:ascii="微軟正黑體" w:hAnsi="微軟正黑體"/>
+                <w:rFonts w:ascii="Arial" w:hAnsi="Arial" w:eastAsia="SimHei" w:cs="Arial"/>
                 <w:color w:val="1E293B"/>
                 <w:sz w:val="17"/>
               </w:rPr>
@@ -4925,7 +4925,7 @@
           <w:p>
             <w:r>
               <w:rPr>
-                <w:rFonts w:ascii="微軟正黑體" w:hAnsi="微軟正黑體"/>
+                <w:rFonts w:ascii="Arial" w:hAnsi="Arial" w:eastAsia="SimHei" w:cs="Arial"/>
                 <w:color w:val="1E293B"/>
                 <w:sz w:val="17"/>
               </w:rPr>
@@ -4950,7 +4950,7 @@
             </w:pPr>
             <w:r>
               <w:rPr>
-                <w:rFonts w:ascii="微軟正黑體" w:hAnsi="微軟正黑體"/>
+                <w:rFonts w:ascii="Arial" w:hAnsi="Arial" w:eastAsia="SimHei" w:cs="Arial"/>
                 <w:color w:val="1E293B"/>
                 <w:sz w:val="17"/>
               </w:rPr>
@@ -4972,7 +4972,7 @@
           <w:p>
             <w:r>
               <w:rPr>
-                <w:rFonts w:ascii="微軟正黑體" w:hAnsi="微軟正黑體"/>
+                <w:rFonts w:ascii="Arial" w:hAnsi="Arial" w:eastAsia="SimHei" w:cs="Arial"/>
                 <w:color w:val="1E293B"/>
                 <w:sz w:val="17"/>
               </w:rPr>
@@ -4994,7 +4994,7 @@
           <w:p>
             <w:r>
               <w:rPr>
-                <w:rFonts w:ascii="微軟正黑體" w:hAnsi="微軟正黑體"/>
+                <w:rFonts w:ascii="Arial" w:hAnsi="Arial" w:eastAsia="SimHei" w:cs="Arial"/>
                 <w:color w:val="1E293B"/>
                 <w:sz w:val="17"/>
               </w:rPr>
@@ -5021,7 +5021,7 @@
             </w:pPr>
             <w:r>
               <w:rPr>
-                <w:rFonts w:ascii="微軟正黑體" w:hAnsi="微軟正黑體"/>
+                <w:rFonts w:ascii="Arial" w:hAnsi="Arial" w:eastAsia="SimHei" w:cs="Arial"/>
                 <w:color w:val="1E293B"/>
                 <w:sz w:val="17"/>
               </w:rPr>
@@ -5043,7 +5043,7 @@
           <w:p>
             <w:r>
               <w:rPr>
-                <w:rFonts w:ascii="微軟正黑體" w:hAnsi="微軟正黑體"/>
+                <w:rFonts w:ascii="Arial" w:hAnsi="Arial" w:eastAsia="SimHei" w:cs="Arial"/>
                 <w:color w:val="1E293B"/>
                 <w:sz w:val="17"/>
               </w:rPr>
@@ -5068,7 +5068,7 @@
             </w:pPr>
             <w:r>
               <w:rPr>
-                <w:rFonts w:ascii="微軟正黑體" w:hAnsi="微軟正黑體"/>
+                <w:rFonts w:ascii="Arial" w:hAnsi="Arial" w:eastAsia="SimHei" w:cs="Arial"/>
                 <w:color w:val="1E293B"/>
                 <w:sz w:val="17"/>
               </w:rPr>
@@ -5090,7 +5090,7 @@
           <w:p>
             <w:r>
               <w:rPr>
-                <w:rFonts w:ascii="微軟正黑體" w:hAnsi="微軟正黑體"/>
+                <w:rFonts w:ascii="Arial" w:hAnsi="Arial" w:eastAsia="SimHei" w:cs="Arial"/>
                 <w:color w:val="1E293B"/>
                 <w:sz w:val="17"/>
               </w:rPr>
@@ -5112,7 +5112,7 @@
           <w:p>
             <w:r>
               <w:rPr>
-                <w:rFonts w:ascii="微軟正黑體" w:hAnsi="微軟正黑體"/>
+                <w:rFonts w:ascii="Arial" w:hAnsi="Arial" w:eastAsia="SimHei" w:cs="Arial"/>
                 <w:color w:val="1E293B"/>
                 <w:sz w:val="17"/>
               </w:rPr>
@@ -5139,7 +5139,7 @@
             </w:pPr>
             <w:r>
               <w:rPr>
-                <w:rFonts w:ascii="微軟正黑體" w:hAnsi="微軟正黑體"/>
+                <w:rFonts w:ascii="Arial" w:hAnsi="Arial" w:eastAsia="SimHei" w:cs="Arial"/>
                 <w:color w:val="1E293B"/>
                 <w:sz w:val="17"/>
               </w:rPr>
@@ -5161,7 +5161,7 @@
           <w:p>
             <w:r>
               <w:rPr>
-                <w:rFonts w:ascii="微軟正黑體" w:hAnsi="微軟正黑體"/>
+                <w:rFonts w:ascii="Arial" w:hAnsi="Arial" w:eastAsia="SimHei" w:cs="Arial"/>
                 <w:color w:val="1E293B"/>
                 <w:sz w:val="17"/>
               </w:rPr>
@@ -5186,7 +5186,7 @@
             </w:pPr>
             <w:r>
               <w:rPr>
-                <w:rFonts w:ascii="微軟正黑體" w:hAnsi="微軟正黑體"/>
+                <w:rFonts w:ascii="Arial" w:hAnsi="Arial" w:eastAsia="SimHei" w:cs="Arial"/>
                 <w:color w:val="1E293B"/>
                 <w:sz w:val="17"/>
               </w:rPr>
@@ -5208,7 +5208,7 @@
           <w:p>
             <w:r>
               <w:rPr>
-                <w:rFonts w:ascii="微軟正黑體" w:hAnsi="微軟正黑體"/>
+                <w:rFonts w:ascii="Arial" w:hAnsi="Arial" w:eastAsia="SimHei" w:cs="Arial"/>
                 <w:color w:val="1E293B"/>
                 <w:sz w:val="17"/>
               </w:rPr>
@@ -5230,7 +5230,7 @@
           <w:p>
             <w:r>
               <w:rPr>
-                <w:rFonts w:ascii="微軟正黑體" w:hAnsi="微軟正黑體"/>
+                <w:rFonts w:ascii="Arial" w:hAnsi="Arial" w:eastAsia="SimHei" w:cs="Arial"/>
                 <w:color w:val="1E293B"/>
                 <w:sz w:val="17"/>
               </w:rPr>
@@ -5251,7 +5251,7 @@
       </w:pPr>
       <w:r>
         <w:rPr>
-          <w:rFonts w:ascii="微軟正黑體" w:hAnsi="微軟正黑體"/>
+          <w:rFonts w:ascii="Arial" w:hAnsi="Arial" w:eastAsia="SimHei" w:cs="Arial"/>
           <w:b/>
           <w:color w:val="0C2340"/>
           <w:sz w:val="40"/>
@@ -5265,7 +5265,7 @@
       </w:pPr>
       <w:r>
         <w:rPr>
-          <w:rFonts w:ascii="微軟正黑體" w:hAnsi="微軟正黑體"/>
+          <w:rFonts w:ascii="Arial" w:hAnsi="Arial" w:eastAsia="SimHei" w:cs="Arial"/>
           <w:b/>
           <w:color w:val="2563EB"/>
           <w:sz w:val="29"/>
@@ -5279,7 +5279,7 @@
       </w:pPr>
       <w:r>
         <w:rPr>
-          <w:rFonts w:ascii="微軟正黑體" w:hAnsi="微軟正黑體"/>
+          <w:rFonts w:ascii="Arial" w:hAnsi="Arial" w:eastAsia="SimHei" w:cs="Arial"/>
           <w:b/>
           <w:color w:val="0C2340"/>
           <w:sz w:val="21"/>
@@ -5324,7 +5324,7 @@
             </w:pPr>
             <w:r>
               <w:rPr>
-                <w:rFonts w:ascii="微軟正黑體" w:hAnsi="微軟正黑體"/>
+                <w:rFonts w:ascii="Arial" w:hAnsi="Arial" w:eastAsia="SimHei" w:cs="Arial"/>
                 <w:b/>
                 <w:color w:val="FFFFFF"/>
                 <w:sz w:val="19"/>
@@ -5350,7 +5350,7 @@
             </w:pPr>
             <w:r>
               <w:rPr>
-                <w:rFonts w:ascii="微軟正黑體" w:hAnsi="微軟正黑體"/>
+                <w:rFonts w:ascii="Arial" w:hAnsi="Arial" w:eastAsia="SimHei" w:cs="Arial"/>
                 <w:b/>
                 <w:color w:val="FFFFFF"/>
                 <w:sz w:val="19"/>
@@ -5376,7 +5376,7 @@
             </w:pPr>
             <w:r>
               <w:rPr>
-                <w:rFonts w:ascii="微軟正黑體" w:hAnsi="微軟正黑體"/>
+                <w:rFonts w:ascii="Arial" w:hAnsi="Arial" w:eastAsia="SimHei" w:cs="Arial"/>
                 <w:b/>
                 <w:color w:val="FFFFFF"/>
                 <w:sz w:val="19"/>
@@ -5404,7 +5404,7 @@
             </w:pPr>
             <w:r>
               <w:rPr>
-                <w:rFonts w:ascii="微軟正黑體" w:hAnsi="微軟正黑體"/>
+                <w:rFonts w:ascii="Arial" w:hAnsi="Arial" w:eastAsia="SimHei" w:cs="Arial"/>
                 <w:color w:val="1E293B"/>
                 <w:sz w:val="18"/>
               </w:rPr>
@@ -5426,7 +5426,7 @@
           <w:p>
             <w:r>
               <w:rPr>
-                <w:rFonts w:ascii="微軟正黑體" w:hAnsi="微軟正黑體"/>
+                <w:rFonts w:ascii="Arial" w:hAnsi="Arial" w:eastAsia="SimHei" w:cs="Arial"/>
                 <w:color w:val="1E293B"/>
                 <w:sz w:val="18"/>
               </w:rPr>
@@ -5448,7 +5448,7 @@
           <w:p>
             <w:r>
               <w:rPr>
-                <w:rFonts w:ascii="微軟正黑體" w:hAnsi="微軟正黑體"/>
+                <w:rFonts w:ascii="Arial" w:hAnsi="Arial" w:eastAsia="SimHei" w:cs="Arial"/>
                 <w:color w:val="1E293B"/>
                 <w:sz w:val="18"/>
               </w:rPr>
@@ -5475,7 +5475,7 @@
             </w:pPr>
             <w:r>
               <w:rPr>
-                <w:rFonts w:ascii="微軟正黑體" w:hAnsi="微軟正黑體"/>
+                <w:rFonts w:ascii="Arial" w:hAnsi="Arial" w:eastAsia="SimHei" w:cs="Arial"/>
                 <w:color w:val="1E293B"/>
                 <w:sz w:val="18"/>
               </w:rPr>
@@ -5497,7 +5497,7 @@
           <w:p>
             <w:r>
               <w:rPr>
-                <w:rFonts w:ascii="微軟正黑體" w:hAnsi="微軟正黑體"/>
+                <w:rFonts w:ascii="Arial" w:hAnsi="Arial" w:eastAsia="SimHei" w:cs="Arial"/>
                 <w:color w:val="1E293B"/>
                 <w:sz w:val="18"/>
               </w:rPr>
@@ -5519,7 +5519,7 @@
           <w:p>
             <w:r>
               <w:rPr>
-                <w:rFonts w:ascii="微軟正黑體" w:hAnsi="微軟正黑體"/>
+                <w:rFonts w:ascii="Arial" w:hAnsi="Arial" w:eastAsia="SimHei" w:cs="Arial"/>
                 <w:color w:val="1E293B"/>
                 <w:sz w:val="18"/>
               </w:rPr>
@@ -5546,7 +5546,7 @@
             </w:pPr>
             <w:r>
               <w:rPr>
-                <w:rFonts w:ascii="微軟正黑體" w:hAnsi="微軟正黑體"/>
+                <w:rFonts w:ascii="Arial" w:hAnsi="Arial" w:eastAsia="SimHei" w:cs="Arial"/>
                 <w:color w:val="1E293B"/>
                 <w:sz w:val="18"/>
               </w:rPr>
@@ -5568,7 +5568,7 @@
           <w:p>
             <w:r>
               <w:rPr>
-                <w:rFonts w:ascii="微軟正黑體" w:hAnsi="微軟正黑體"/>
+                <w:rFonts w:ascii="Arial" w:hAnsi="Arial" w:eastAsia="SimHei" w:cs="Arial"/>
                 <w:color w:val="1E293B"/>
                 <w:sz w:val="18"/>
               </w:rPr>
@@ -5590,7 +5590,7 @@
           <w:p>
             <w:r>
               <w:rPr>
-                <w:rFonts w:ascii="微軟正黑體" w:hAnsi="微軟正黑體"/>
+                <w:rFonts w:ascii="Arial" w:hAnsi="Arial" w:eastAsia="SimHei" w:cs="Arial"/>
                 <w:color w:val="1E293B"/>
                 <w:sz w:val="18"/>
               </w:rPr>
@@ -5617,7 +5617,7 @@
             </w:pPr>
             <w:r>
               <w:rPr>
-                <w:rFonts w:ascii="微軟正黑體" w:hAnsi="微軟正黑體"/>
+                <w:rFonts w:ascii="Arial" w:hAnsi="Arial" w:eastAsia="SimHei" w:cs="Arial"/>
                 <w:color w:val="1E293B"/>
                 <w:sz w:val="18"/>
               </w:rPr>
@@ -5639,7 +5639,7 @@
           <w:p>
             <w:r>
               <w:rPr>
-                <w:rFonts w:ascii="微軟正黑體" w:hAnsi="微軟正黑體"/>
+                <w:rFonts w:ascii="Arial" w:hAnsi="Arial" w:eastAsia="SimHei" w:cs="Arial"/>
                 <w:color w:val="1E293B"/>
                 <w:sz w:val="18"/>
               </w:rPr>
@@ -5661,7 +5661,7 @@
           <w:p>
             <w:r>
               <w:rPr>
-                <w:rFonts w:ascii="微軟正黑體" w:hAnsi="微軟正黑體"/>
+                <w:rFonts w:ascii="Arial" w:hAnsi="Arial" w:eastAsia="SimHei" w:cs="Arial"/>
                 <w:color w:val="1E293B"/>
                 <w:sz w:val="18"/>
               </w:rPr>
@@ -5677,7 +5677,7 @@
       </w:pPr>
       <w:r>
         <w:rPr>
-          <w:rFonts w:ascii="微軟正黑體" w:hAnsi="微軟正黑體"/>
+          <w:rFonts w:ascii="Arial" w:hAnsi="Arial" w:eastAsia="SimHei" w:cs="Arial"/>
           <w:b/>
           <w:color w:val="2563EB"/>
           <w:sz w:val="29"/>
@@ -5691,7 +5691,7 @@
       </w:pPr>
       <w:r>
         <w:rPr>
-          <w:rFonts w:ascii="微軟正黑體" w:hAnsi="微軟正黑體"/>
+          <w:rFonts w:ascii="Arial" w:hAnsi="Arial" w:eastAsia="SimHei" w:cs="Arial"/>
           <w:b/>
           <w:color w:val="0C2340"/>
           <w:sz w:val="21"/>
@@ -5737,7 +5737,7 @@
             </w:pPr>
             <w:r>
               <w:rPr>
-                <w:rFonts w:ascii="微軟正黑體" w:hAnsi="微軟正黑體"/>
+                <w:rFonts w:ascii="Arial" w:hAnsi="Arial" w:eastAsia="SimHei" w:cs="Arial"/>
                 <w:b/>
                 <w:color w:val="FFFFFF"/>
                 <w:sz w:val="19"/>
@@ -5763,7 +5763,7 @@
             </w:pPr>
             <w:r>
               <w:rPr>
-                <w:rFonts w:ascii="微軟正黑體" w:hAnsi="微軟正黑體"/>
+                <w:rFonts w:ascii="Arial" w:hAnsi="Arial" w:eastAsia="SimHei" w:cs="Arial"/>
                 <w:b/>
                 <w:color w:val="FFFFFF"/>
                 <w:sz w:val="19"/>
@@ -5789,7 +5789,7 @@
             </w:pPr>
             <w:r>
               <w:rPr>
-                <w:rFonts w:ascii="微軟正黑體" w:hAnsi="微軟正黑體"/>
+                <w:rFonts w:ascii="Arial" w:hAnsi="Arial" w:eastAsia="SimHei" w:cs="Arial"/>
                 <w:b/>
                 <w:color w:val="FFFFFF"/>
                 <w:sz w:val="19"/>
@@ -5815,7 +5815,7 @@
             </w:pPr>
             <w:r>
               <w:rPr>
-                <w:rFonts w:ascii="微軟正黑體" w:hAnsi="微軟正黑體"/>
+                <w:rFonts w:ascii="Arial" w:hAnsi="Arial" w:eastAsia="SimHei" w:cs="Arial"/>
                 <w:b/>
                 <w:color w:val="FFFFFF"/>
                 <w:sz w:val="19"/>
@@ -5843,7 +5843,7 @@
             </w:pPr>
             <w:r>
               <w:rPr>
-                <w:rFonts w:ascii="微軟正黑體" w:hAnsi="微軟正黑體"/>
+                <w:rFonts w:ascii="Arial" w:hAnsi="Arial" w:eastAsia="SimHei" w:cs="Arial"/>
                 <w:color w:val="1E293B"/>
                 <w:sz w:val="18"/>
               </w:rPr>
@@ -5868,7 +5868,7 @@
             </w:pPr>
             <w:r>
               <w:rPr>
-                <w:rFonts w:ascii="微軟正黑體" w:hAnsi="微軟正黑體"/>
+                <w:rFonts w:ascii="Arial" w:hAnsi="Arial" w:eastAsia="SimHei" w:cs="Arial"/>
                 <w:color w:val="1E293B"/>
                 <w:sz w:val="18"/>
               </w:rPr>
@@ -5890,7 +5890,7 @@
           <w:p>
             <w:r>
               <w:rPr>
-                <w:rFonts w:ascii="微軟正黑體" w:hAnsi="微軟正黑體"/>
+                <w:rFonts w:ascii="Arial" w:hAnsi="Arial" w:eastAsia="SimHei" w:cs="Arial"/>
                 <w:color w:val="1E293B"/>
                 <w:sz w:val="18"/>
               </w:rPr>
@@ -5912,7 +5912,7 @@
           <w:p>
             <w:r>
               <w:rPr>
-                <w:rFonts w:ascii="微軟正黑體" w:hAnsi="微軟正黑體"/>
+                <w:rFonts w:ascii="Arial" w:hAnsi="Arial" w:eastAsia="SimHei" w:cs="Arial"/>
                 <w:color w:val="1E293B"/>
                 <w:sz w:val="18"/>
               </w:rPr>
@@ -5939,7 +5939,7 @@
             </w:pPr>
             <w:r>
               <w:rPr>
-                <w:rFonts w:ascii="微軟正黑體" w:hAnsi="微軟正黑體"/>
+                <w:rFonts w:ascii="Arial" w:hAnsi="Arial" w:eastAsia="SimHei" w:cs="Arial"/>
                 <w:color w:val="1E293B"/>
                 <w:sz w:val="18"/>
               </w:rPr>
@@ -5964,7 +5964,7 @@
             </w:pPr>
             <w:r>
               <w:rPr>
-                <w:rFonts w:ascii="微軟正黑體" w:hAnsi="微軟正黑體"/>
+                <w:rFonts w:ascii="Arial" w:hAnsi="Arial" w:eastAsia="SimHei" w:cs="Arial"/>
                 <w:color w:val="1E293B"/>
                 <w:sz w:val="18"/>
               </w:rPr>
@@ -5986,7 +5986,7 @@
           <w:p>
             <w:r>
               <w:rPr>
-                <w:rFonts w:ascii="微軟正黑體" w:hAnsi="微軟正黑體"/>
+                <w:rFonts w:ascii="Arial" w:hAnsi="Arial" w:eastAsia="SimHei" w:cs="Arial"/>
                 <w:color w:val="1E293B"/>
                 <w:sz w:val="18"/>
               </w:rPr>
@@ -6008,7 +6008,7 @@
           <w:p>
             <w:r>
               <w:rPr>
-                <w:rFonts w:ascii="微軟正黑體" w:hAnsi="微軟正黑體"/>
+                <w:rFonts w:ascii="Arial" w:hAnsi="Arial" w:eastAsia="SimHei" w:cs="Arial"/>
                 <w:color w:val="1E293B"/>
                 <w:sz w:val="18"/>
               </w:rPr>
@@ -6035,7 +6035,7 @@
             </w:pPr>
             <w:r>
               <w:rPr>
-                <w:rFonts w:ascii="微軟正黑體" w:hAnsi="微軟正黑體"/>
+                <w:rFonts w:ascii="Arial" w:hAnsi="Arial" w:eastAsia="SimHei" w:cs="Arial"/>
                 <w:color w:val="1E293B"/>
                 <w:sz w:val="18"/>
               </w:rPr>
@@ -6060,7 +6060,7 @@
             </w:pPr>
             <w:r>
               <w:rPr>
-                <w:rFonts w:ascii="微軟正黑體" w:hAnsi="微軟正黑體"/>
+                <w:rFonts w:ascii="Arial" w:hAnsi="Arial" w:eastAsia="SimHei" w:cs="Arial"/>
                 <w:color w:val="1E293B"/>
                 <w:sz w:val="18"/>
               </w:rPr>
@@ -6082,7 +6082,7 @@
           <w:p>
             <w:r>
               <w:rPr>
-                <w:rFonts w:ascii="微軟正黑體" w:hAnsi="微軟正黑體"/>
+                <w:rFonts w:ascii="Arial" w:hAnsi="Arial" w:eastAsia="SimHei" w:cs="Arial"/>
                 <w:color w:val="1E293B"/>
                 <w:sz w:val="18"/>
               </w:rPr>
@@ -6104,7 +6104,7 @@
           <w:p>
             <w:r>
               <w:rPr>
-                <w:rFonts w:ascii="微軟正黑體" w:hAnsi="微軟正黑體"/>
+                <w:rFonts w:ascii="Arial" w:hAnsi="Arial" w:eastAsia="SimHei" w:cs="Arial"/>
                 <w:color w:val="1E293B"/>
                 <w:sz w:val="18"/>
               </w:rPr>
@@ -6131,7 +6131,7 @@
             </w:pPr>
             <w:r>
               <w:rPr>
-                <w:rFonts w:ascii="微軟正黑體" w:hAnsi="微軟正黑體"/>
+                <w:rFonts w:ascii="Arial" w:hAnsi="Arial" w:eastAsia="SimHei" w:cs="Arial"/>
                 <w:color w:val="1E293B"/>
                 <w:sz w:val="18"/>
               </w:rPr>
@@ -6156,7 +6156,7 @@
             </w:pPr>
             <w:r>
               <w:rPr>
-                <w:rFonts w:ascii="微軟正黑體" w:hAnsi="微軟正黑體"/>
+                <w:rFonts w:ascii="Arial" w:hAnsi="Arial" w:eastAsia="SimHei" w:cs="Arial"/>
                 <w:color w:val="1E293B"/>
                 <w:sz w:val="18"/>
               </w:rPr>
@@ -6178,7 +6178,7 @@
           <w:p>
             <w:r>
               <w:rPr>
-                <w:rFonts w:ascii="微軟正黑體" w:hAnsi="微軟正黑體"/>
+                <w:rFonts w:ascii="Arial" w:hAnsi="Arial" w:eastAsia="SimHei" w:cs="Arial"/>
                 <w:color w:val="1E293B"/>
                 <w:sz w:val="18"/>
               </w:rPr>
@@ -6200,7 +6200,7 @@
           <w:p>
             <w:r>
               <w:rPr>
-                <w:rFonts w:ascii="微軟正黑體" w:hAnsi="微軟正黑體"/>
+                <w:rFonts w:ascii="Arial" w:hAnsi="Arial" w:eastAsia="SimHei" w:cs="Arial"/>
                 <w:color w:val="1E293B"/>
                 <w:sz w:val="18"/>
               </w:rPr>
@@ -6221,7 +6221,7 @@
       </w:pPr>
       <w:r>
         <w:rPr>
-          <w:rFonts w:ascii="微軟正黑體" w:hAnsi="微軟正黑體"/>
+          <w:rFonts w:ascii="Arial" w:hAnsi="Arial" w:eastAsia="SimHei" w:cs="Arial"/>
           <w:b/>
           <w:color w:val="0C2340"/>
           <w:sz w:val="40"/>
@@ -6235,7 +6235,7 @@
       </w:pPr>
       <w:r>
         <w:rPr>
-          <w:rFonts w:ascii="微軟正黑體" w:hAnsi="微軟正黑體"/>
+          <w:rFonts w:ascii="Arial" w:hAnsi="Arial" w:eastAsia="SimHei" w:cs="Arial"/>
           <w:color w:val="334155"/>
           <w:sz w:val="22"/>
         </w:rPr>
@@ -6248,7 +6248,7 @@
       </w:pPr>
       <w:r>
         <w:rPr>
-          <w:rFonts w:ascii="微軟正黑體" w:hAnsi="微軟正黑體"/>
+          <w:rFonts w:ascii="Arial" w:hAnsi="Arial" w:eastAsia="SimHei" w:cs="Arial"/>
           <w:b/>
           <w:color w:val="2563EB"/>
           <w:sz w:val="29"/>
@@ -6262,7 +6262,7 @@
       </w:pPr>
       <w:r>
         <w:rPr>
-          <w:rFonts w:ascii="微軟正黑體" w:hAnsi="微軟正黑體"/>
+          <w:rFonts w:ascii="Arial" w:hAnsi="Arial" w:eastAsia="SimHei" w:cs="Arial"/>
           <w:color w:val="334155"/>
           <w:sz w:val="22"/>
         </w:rPr>
@@ -6275,7 +6275,7 @@
       </w:pPr>
       <w:r>
         <w:rPr>
-          <w:rFonts w:ascii="微軟正黑體" w:hAnsi="微軟正黑體"/>
+          <w:rFonts w:ascii="Arial" w:hAnsi="Arial" w:eastAsia="SimHei" w:cs="Arial"/>
           <w:b/>
           <w:color w:val="2563EB"/>
           <w:sz w:val="29"/>
@@ -6289,7 +6289,7 @@
       </w:pPr>
       <w:r>
         <w:rPr>
-          <w:rFonts w:ascii="微軟正黑體" w:hAnsi="微軟正黑體"/>
+          <w:rFonts w:ascii="Arial" w:hAnsi="Arial" w:eastAsia="SimHei" w:cs="Arial"/>
           <w:color w:val="334155"/>
           <w:sz w:val="22"/>
         </w:rPr>
@@ -6302,7 +6302,7 @@
       </w:pPr>
       <w:r>
         <w:rPr>
-          <w:rFonts w:ascii="微軟正黑體" w:hAnsi="微軟正黑體"/>
+          <w:rFonts w:ascii="Arial" w:hAnsi="Arial" w:eastAsia="SimHei" w:cs="Arial"/>
           <w:b/>
           <w:color w:val="2563EB"/>
           <w:sz w:val="29"/>
@@ -6316,7 +6316,7 @@
       </w:pPr>
       <w:r>
         <w:rPr>
-          <w:rFonts w:ascii="微軟正黑體" w:hAnsi="微軟正黑體"/>
+          <w:rFonts w:ascii="Arial" w:hAnsi="Arial" w:eastAsia="SimHei" w:cs="Arial"/>
           <w:color w:val="334155"/>
           <w:sz w:val="22"/>
         </w:rPr>
@@ -6696,6 +6696,9 @@
     <w:name w:val="Normal"/>
     <w:qFormat/>
     <w:rsid w:val="00FC693F"/>
+    <w:rPr>
+      <w:rFonts w:ascii="Arial" w:hAnsi="Arial" w:eastAsia="SimHei" w:cs="Arial"/>
+    </w:rPr>
   </w:style>
   <w:style w:type="paragraph" w:styleId="Header">
     <w:name w:val="header"/>
@@ -6711,6 +6714,9 @@
       </w:tabs>
       <w:spacing w:after="0" w:line="240" w:lineRule="auto"/>
     </w:pPr>
+    <w:rPr>
+      <w:rFonts w:ascii="Arial" w:hAnsi="Arial" w:eastAsia="SimHei" w:cs="Arial"/>
+    </w:rPr>
   </w:style>
   <w:style w:type="character" w:customStyle="1" w:styleId="HeaderChar">
     <w:name w:val="Header Char"/>
@@ -6733,6 +6739,9 @@
       </w:tabs>
       <w:spacing w:after="0" w:line="240" w:lineRule="auto"/>
     </w:pPr>
+    <w:rPr>
+      <w:rFonts w:ascii="Arial" w:hAnsi="Arial" w:eastAsia="SimHei" w:cs="Arial"/>
+    </w:rPr>
   </w:style>
   <w:style w:type="character" w:customStyle="1" w:styleId="FooterChar">
     <w:name w:val="Footer Char"/>
@@ -6756,7 +6765,7 @@
       <w:outlineLvl w:val="0"/>
     </w:pPr>
     <w:rPr>
-      <w:rFonts w:asciiTheme="majorHAnsi" w:eastAsiaTheme="majorEastAsia" w:hAnsiTheme="majorHAnsi" w:cstheme="majorBidi"/>
+      <w:rFonts w:ascii="Arial" w:hAnsi="Arial" w:eastAsia="SimHei" w:cs="Arial"/>
       <w:b/>
       <w:bCs/>
       <w:color w:val="365F91" w:themeColor="accent1" w:themeShade="BF"/>
@@ -6780,7 +6789,7 @@
       <w:outlineLvl w:val="1"/>
     </w:pPr>
     <w:rPr>
-      <w:rFonts w:asciiTheme="majorHAnsi" w:eastAsiaTheme="majorEastAsia" w:hAnsiTheme="majorHAnsi" w:cstheme="majorBidi"/>
+      <w:rFonts w:ascii="Arial" w:hAnsi="Arial" w:eastAsia="SimHei" w:cs="Arial"/>
       <w:b/>
       <w:bCs/>
       <w:color w:val="4F81BD" w:themeColor="accent1"/>
@@ -6804,7 +6813,7 @@
       <w:outlineLvl w:val="2"/>
     </w:pPr>
     <w:rPr>
-      <w:rFonts w:asciiTheme="majorHAnsi" w:eastAsiaTheme="majorEastAsia" w:hAnsiTheme="majorHAnsi" w:cstheme="majorBidi"/>
+      <w:rFonts w:ascii="Arial" w:hAnsi="Arial" w:eastAsia="SimHei" w:cs="Arial"/>
       <w:b/>
       <w:bCs/>
       <w:color w:val="4F81BD" w:themeColor="accent1"/>
@@ -7640,6 +7649,9 @@
     <w:pPr>
       <w:spacing w:after="0" w:line="240" w:lineRule="auto"/>
     </w:pPr>
+    <w:rPr>
+      <w:rFonts w:ascii="Arial" w:hAnsi="Arial" w:eastAsia="SimHei" w:cs="Arial"/>
+    </w:rPr>
     <w:tblPr>
       <w:tblInd w:w="0" w:type="dxa"/>
       <w:tblBorders>

</xml_diff>

<commit_message>
Update AIEC國防領域AI應用導入專案規劃書.docx to use Word References menu automatic Table of Contents component (w:sdt) and Heading 3 styles for all Figure and Table titles
</commit_message>
<xml_diff>
--- a/AIEC國防領域AI應用導入專案規劃書.docx
+++ b/AIEC國防領域AI應用導入專案規劃書.docx
@@ -252,12 +252,6 @@
         </w:rPr>
         <w:t>📋 目錄 (Table of Contents)</w:t>
       </w:r>
-    </w:p>
-    <w:p>
-      <w:pPr>
-        <w:spacing w:before="80" w:after="240"/>
-      </w:pPr>
-      <w:fldSimple w:instr="TOC \o &quot;1-3&quot; \h \z \u"/>
     </w:p>
     <w:p>
       <w:pPr>
@@ -533,12 +527,6 @@
     </w:p>
     <w:p>
       <w:pPr>
-        <w:spacing w:before="80" w:after="240"/>
-      </w:pPr>
-      <w:fldSimple w:instr="TOC \h \z \t &quot;Figure,圖,Caption&quot;"/>
-    </w:p>
-    <w:p>
-      <w:pPr>
         <w:spacing w:after="40"/>
       </w:pPr>
       <w:r>
@@ -595,12 +583,6 @@
         </w:rPr>
         <w:t>📊 表目錄 (List of Tables)</w:t>
       </w:r>
-    </w:p>
-    <w:p>
-      <w:pPr>
-        <w:spacing w:before="80" w:after="240"/>
-      </w:pPr>
-      <w:fldSimple w:instr="TOC \h \z \t &quot;Table,表&quot;"/>
     </w:p>
     <w:p>
       <w:pPr>
@@ -799,15 +781,15 @@
     </w:p>
     <w:p>
       <w:pPr>
-        <w:pStyle w:val="Caption"/>
-        <w:spacing w:before="120" w:after="80"/>
+        <w:pStyle w:val="Heading3"/>
+        <w:spacing w:before="160" w:after="120"/>
       </w:pPr>
       <w:r>
         <w:rPr>
           <w:rFonts w:ascii="Arial" w:hAnsi="Arial" w:eastAsia="SimHei" w:cs="Arial"/>
           <w:b/>
-          <w:color w:val="0C2340"/>
-          <w:sz w:val="21"/>
+          <w:color w:val="1E3A8A"/>
+          <w:sz w:val="24"/>
         </w:rPr>
         <w:t>表 1-1：傳統軍事戰術 vs. 非對稱 AI 戰術比較表</w:t>
       </w:r>
@@ -1484,15 +1466,15 @@
     </w:p>
     <w:p>
       <w:pPr>
-        <w:pStyle w:val="Caption"/>
-        <w:spacing w:before="120" w:after="80"/>
+        <w:pStyle w:val="Heading3"/>
+        <w:spacing w:before="160" w:after="120"/>
       </w:pPr>
       <w:r>
         <w:rPr>
           <w:rFonts w:ascii="Arial" w:hAnsi="Arial" w:eastAsia="SimHei" w:cs="Arial"/>
           <w:b/>
-          <w:color w:val="0C2340"/>
-          <w:sz w:val="21"/>
+          <w:color w:val="1E3A8A"/>
+          <w:sz w:val="24"/>
         </w:rPr>
         <w:t>表 2-1：ISO 42001 (AIMS) 通用標準 vs. AIEC 國防權責分工比較表</w:t>
       </w:r>
@@ -1812,15 +1794,15 @@
     </w:tbl>
     <w:p>
       <w:pPr>
-        <w:pStyle w:val="Caption"/>
-        <w:spacing w:before="160" w:after="80"/>
+        <w:pStyle w:val="Heading3"/>
+        <w:spacing w:before="160" w:after="120"/>
       </w:pPr>
       <w:r>
         <w:rPr>
           <w:rFonts w:ascii="Arial" w:hAnsi="Arial" w:eastAsia="SimHei" w:cs="Arial"/>
           <w:b/>
-          <w:color w:val="0C2340"/>
-          <w:sz w:val="21"/>
+          <w:color w:val="1E3A8A"/>
+          <w:sz w:val="24"/>
         </w:rPr>
         <w:t>表 2-2：交戰規則 (RoE) 人機授權三階權能邊界比較表 (HITL / HOTL / HOOTL)</w:t>
       </w:r>
@@ -2233,7 +2215,6 @@
     </w:tbl>
     <w:p>
       <w:pPr>
-        <w:pStyle w:val="Caption"/>
         <w:spacing w:before="240" w:after="80"/>
         <w:jc w:val="center"/>
       </w:pPr>
@@ -2274,16 +2255,15 @@
     </w:p>
     <w:p>
       <w:pPr>
-        <w:pStyle w:val="Caption"/>
-        <w:spacing w:after="240"/>
-        <w:jc w:val="center"/>
+        <w:pStyle w:val="Heading3"/>
+        <w:spacing w:before="160" w:after="120"/>
       </w:pPr>
       <w:r>
         <w:rPr>
           <w:rFonts w:ascii="Arial" w:hAnsi="Arial" w:eastAsia="SimHei" w:cs="Arial"/>
           <w:b/>
-          <w:color w:val="2563EB"/>
-          <w:sz w:val="19"/>
+          <w:color w:val="1E3A8A"/>
+          <w:sz w:val="24"/>
         </w:rPr>
         <w:t>圖 2-1：AIEC 國防 AI 評測五大階段標準流程圖 (Nano Banana pro 生成)</w:t>
       </w:r>
@@ -2318,15 +2298,15 @@
     </w:p>
     <w:p>
       <w:pPr>
-        <w:pStyle w:val="Caption"/>
-        <w:spacing w:before="120" w:after="80"/>
+        <w:pStyle w:val="Heading3"/>
+        <w:spacing w:before="160" w:after="120"/>
       </w:pPr>
       <w:r>
         <w:rPr>
           <w:rFonts w:ascii="Arial" w:hAnsi="Arial" w:eastAsia="SimHei" w:cs="Arial"/>
           <w:b/>
-          <w:color w:val="0C2340"/>
-          <w:sz w:val="21"/>
+          <w:color w:val="1E3A8A"/>
+          <w:sz w:val="24"/>
         </w:rPr>
         <w:t>表 2-3：AIEC 15 項量化評測指標 (Q1~Q15) 與合格門檻對照總表</w:t>
       </w:r>
@@ -3900,7 +3880,6 @@
     </w:tbl>
     <w:p>
       <w:pPr>
-        <w:pStyle w:val="Caption"/>
         <w:spacing w:before="240" w:after="80"/>
         <w:jc w:val="center"/>
       </w:pPr>
@@ -3941,16 +3920,15 @@
     </w:p>
     <w:p>
       <w:pPr>
-        <w:pStyle w:val="Caption"/>
-        <w:spacing w:after="240"/>
-        <w:jc w:val="center"/>
+        <w:pStyle w:val="Heading3"/>
+        <w:spacing w:before="160" w:after="120"/>
       </w:pPr>
       <w:r>
         <w:rPr>
           <w:rFonts w:ascii="Arial" w:hAnsi="Arial" w:eastAsia="SimHei" w:cs="Arial"/>
           <w:b/>
-          <w:color w:val="2563EB"/>
-          <w:sz w:val="19"/>
+          <w:color w:val="1E3A8A"/>
+          <w:sz w:val="24"/>
         </w:rPr>
         <w:t>圖 2-2：國防 AI 安全保密審計 3D 縱深防禦矩陣圖 (Nano Banana pro 生成)</w:t>
       </w:r>
@@ -3985,7 +3963,6 @@
     </w:p>
     <w:p>
       <w:pPr>
-        <w:pStyle w:val="Caption"/>
         <w:spacing w:before="240" w:after="80"/>
         <w:jc w:val="center"/>
       </w:pPr>
@@ -4026,16 +4003,15 @@
     </w:p>
     <w:p>
       <w:pPr>
-        <w:pStyle w:val="Caption"/>
-        <w:spacing w:after="240"/>
-        <w:jc w:val="center"/>
+        <w:pStyle w:val="Heading3"/>
+        <w:spacing w:before="160" w:after="120"/>
       </w:pPr>
       <w:r>
         <w:rPr>
           <w:rFonts w:ascii="Arial" w:hAnsi="Arial" w:eastAsia="SimHei" w:cs="Arial"/>
           <w:b/>
-          <w:color w:val="2563EB"/>
-          <w:sz w:val="19"/>
+          <w:color w:val="1E3A8A"/>
+          <w:sz w:val="24"/>
         </w:rPr>
         <w:t>圖 2-3：民雄院區國家級主權 AI 四層算力堆疊架構圖 (Nano Banana pro 生成)</w:t>
       </w:r>
@@ -4193,15 +4169,15 @@
     </w:p>
     <w:p>
       <w:pPr>
-        <w:pStyle w:val="Caption"/>
-        <w:spacing w:before="120" w:after="80"/>
+        <w:pStyle w:val="Heading3"/>
+        <w:spacing w:before="160" w:after="120"/>
       </w:pPr>
       <w:r>
         <w:rPr>
           <w:rFonts w:ascii="Arial" w:hAnsi="Arial" w:eastAsia="SimHei" w:cs="Arial"/>
           <w:b/>
-          <w:color w:val="0C2340"/>
-          <w:sz w:val="21"/>
+          <w:color w:val="1E3A8A"/>
+          <w:sz w:val="24"/>
         </w:rPr>
         <w:t>表 3-1：AIEC 國防 AI 導入專案 24 個月執行時程規劃表</w:t>
       </w:r>
@@ -5341,15 +5317,15 @@
     </w:p>
     <w:p>
       <w:pPr>
-        <w:pStyle w:val="Caption"/>
-        <w:spacing w:before="120" w:after="80"/>
+        <w:pStyle w:val="Heading3"/>
+        <w:spacing w:before="160" w:after="120"/>
       </w:pPr>
       <w:r>
         <w:rPr>
           <w:rFonts w:ascii="Arial" w:hAnsi="Arial" w:eastAsia="SimHei" w:cs="Arial"/>
           <w:b/>
-          <w:color w:val="0C2340"/>
-          <w:sz w:val="21"/>
+          <w:color w:val="1E3A8A"/>
+          <w:sz w:val="24"/>
         </w:rPr>
         <w:t>表 4-1：專案人力、主權算力與軟硬體資源配置表</w:t>
       </w:r>
@@ -5755,15 +5731,15 @@
     </w:p>
     <w:p>
       <w:pPr>
-        <w:pStyle w:val="Caption"/>
-        <w:spacing w:before="120" w:after="80"/>
+        <w:pStyle w:val="Heading3"/>
+        <w:spacing w:before="160" w:after="120"/>
       </w:pPr>
       <w:r>
         <w:rPr>
           <w:rFonts w:ascii="Arial" w:hAnsi="Arial" w:eastAsia="SimHei" w:cs="Arial"/>
           <w:b/>
-          <w:color w:val="0C2340"/>
-          <w:sz w:val="21"/>
+          <w:color w:val="1E3A8A"/>
+          <w:sz w:val="24"/>
         </w:rPr>
         <w:t>表 4-2：國防 AI 導入主要風險評估與處置矩陣表</w:t>
       </w:r>
@@ -6403,6 +6379,45 @@
       <w:cols w:space="720"/>
       <w:docGrid w:linePitch="360"/>
     </w:sectPr>
+    <w:sdt>
+      <w:sdtPr>
+        <w:docPartObj>
+          <w:docPartGallery w:val="Table of Contents"/>
+          <w:docPartUnique/>
+        </w:docPartObj>
+      </w:sdtPr>
+      <w:sdtContent>
+        <w:p>
+          <w:fldSimple w:instr="TOC \o &quot;1-3&quot; \h \z \u"/>
+        </w:p>
+      </w:sdtContent>
+    </w:sdt>
+    <w:sdt>
+      <w:sdtPr>
+        <w:docPartObj>
+          <w:docPartGallery w:val="Table of Contents"/>
+          <w:docPartUnique/>
+        </w:docPartObj>
+      </w:sdtPr>
+      <w:sdtContent>
+        <w:p>
+          <w:fldSimple w:instr="TOC \t &quot;Heading 3,1&quot; \h \z \u"/>
+        </w:p>
+      </w:sdtContent>
+    </w:sdt>
+    <w:sdt>
+      <w:sdtPr>
+        <w:docPartObj>
+          <w:docPartGallery w:val="Table of Contents"/>
+          <w:docPartUnique/>
+        </w:docPartObj>
+      </w:sdtPr>
+      <w:sdtContent>
+        <w:p>
+          <w:fldSimple w:instr="TOC \t &quot;Heading 3,1&quot; \h \z \u"/>
+        </w:p>
+      </w:sdtContent>
+    </w:sdt>
   </w:body>
 </w:document>
 </file>
@@ -7597,11 +7612,10 @@
       <w:spacing w:line="240" w:lineRule="auto"/>
     </w:pPr>
     <w:rPr>
-      <w:rFonts w:ascii="Arial" w:hAnsi="Arial" w:eastAsia="SimHei" w:cs="Arial"/>
       <w:b/>
       <w:bCs/>
-      <w:color w:val="2563EB"/>
-      <w:sz w:val="19"/>
+      <w:color w:val="4F81BD" w:themeColor="accent1"/>
+      <w:sz w:val="18"/>
       <w:szCs w:val="18"/>
     </w:rPr>
   </w:style>

</xml_diff>

<commit_message>
Update AIEC國防領域AI應用導入專案規劃書.docx to use 100% pure Word automatic TOC fields and native Caption SEQ fields without manual text dots
</commit_message>
<xml_diff>
--- a/AIEC國防領域AI應用導入專案規劃書.docx
+++ b/AIEC國防領域AI應用導入專案規劃書.docx
@@ -255,259 +255,7 @@
     </w:p>
     <w:p>
       <w:pPr>
-        <w:spacing w:after="40"/>
-      </w:pPr>
-      <w:r>
-        <w:rPr>
-          <w:rFonts w:ascii="Arial" w:hAnsi="Arial" w:eastAsia="SimHei" w:cs="Arial"/>
-          <w:b/>
-          <w:color w:val="0C2340"/>
-          <w:sz w:val="20"/>
-        </w:rPr>
-        <w:t>第一章 前言：國防 AI 應用的戰略急迫性與發展理念  .........................................................................................................................  3</w:t>
-      </w:r>
-    </w:p>
-    <w:p>
-      <w:pPr>
-        <w:spacing w:after="40"/>
-      </w:pPr>
-      <w:r>
-        <w:rPr>
-          <w:rFonts w:ascii="Arial" w:hAnsi="Arial" w:eastAsia="SimHei" w:cs="Arial"/>
-          <w:b w:val="0"/>
-          <w:color w:val="0C2340"/>
-          <w:sz w:val="20"/>
-        </w:rPr>
-        <w:t xml:space="preserve">    1.1 AI 於國防領域應用的必要性與急迫性  .........................................................................................................................  3</w:t>
-      </w:r>
-    </w:p>
-    <w:p>
-      <w:pPr>
-        <w:spacing w:after="40"/>
-      </w:pPr>
-      <w:r>
-        <w:rPr>
-          <w:rFonts w:ascii="Arial" w:hAnsi="Arial" w:eastAsia="SimHei" w:cs="Arial"/>
-          <w:b w:val="0"/>
-          <w:color w:val="0C2340"/>
-          <w:sz w:val="20"/>
-        </w:rPr>
-        <w:t xml:space="preserve">    1.2 美國國防部 (DoD) AI First 政策理念與經驗啟示  .........................................................................................................................  4</w:t>
-      </w:r>
-    </w:p>
-    <w:p>
-      <w:pPr>
-        <w:spacing w:after="40"/>
-      </w:pPr>
-      <w:r>
-        <w:rPr>
-          <w:rFonts w:ascii="Arial" w:hAnsi="Arial" w:eastAsia="SimHei" w:cs="Arial"/>
-          <w:b w:val="0"/>
-          <w:color w:val="0C2340"/>
-          <w:sz w:val="20"/>
-        </w:rPr>
-        <w:t xml:space="preserve">    1.3 台灣面對中國威脅與非對稱作戰 (Asymmetric Warfare) 態勢  .........................................................................................................................  5</w:t>
-      </w:r>
-    </w:p>
-    <w:p>
-      <w:pPr>
-        <w:spacing w:after="40"/>
-      </w:pPr>
-      <w:r>
-        <w:rPr>
-          <w:rFonts w:ascii="Arial" w:hAnsi="Arial" w:eastAsia="SimHei" w:cs="Arial"/>
-          <w:b w:val="0"/>
-          <w:color w:val="0C2340"/>
-          <w:sz w:val="20"/>
-        </w:rPr>
-        <w:t xml:space="preserve">    1.4 無人化打擊載具應用：無人機、無人船、無人潛艦、無人車與機器狗  .........................................................................................................................  6</w:t>
-      </w:r>
-    </w:p>
-    <w:p>
-      <w:pPr>
-        <w:spacing w:after="40"/>
-      </w:pPr>
-      <w:r>
-        <w:rPr>
-          <w:rFonts w:ascii="Arial" w:hAnsi="Arial" w:eastAsia="SimHei" w:cs="Arial"/>
-          <w:b w:val="0"/>
-          <w:color w:val="0C2340"/>
-          <w:sz w:val="20"/>
-        </w:rPr>
-        <w:t xml:space="preserve">    1.5 實現「可靠、可信任、可解釋、可當責」之國防 AI  .........................................................................................................................  7</w:t>
-      </w:r>
-    </w:p>
-    <w:p>
-      <w:pPr>
-        <w:spacing w:after="40"/>
-      </w:pPr>
-      <w:r>
-        <w:rPr>
-          <w:rFonts w:ascii="Arial" w:hAnsi="Arial" w:eastAsia="SimHei" w:cs="Arial"/>
-          <w:b w:val="0"/>
-          <w:color w:val="0C2340"/>
-          <w:sz w:val="20"/>
-        </w:rPr>
-        <w:t xml:space="preserve">    1.6 適合台灣本土環境落地方案：為什麼要做、如何做、怎麼樣做  .........................................................................................................................  8</w:t>
-      </w:r>
-    </w:p>
-    <w:p>
-      <w:pPr>
-        <w:spacing w:after="40"/>
-      </w:pPr>
-      <w:r>
-        <w:rPr>
-          <w:rFonts w:ascii="Arial" w:hAnsi="Arial" w:eastAsia="SimHei" w:cs="Arial"/>
-          <w:b/>
-          <w:color w:val="0C2340"/>
-          <w:sz w:val="20"/>
-        </w:rPr>
-        <w:t>第二章 專案執行範圍與三大核心區塊架構  .........................................................................................................................  9</w:t>
-      </w:r>
-    </w:p>
-    <w:p>
-      <w:pPr>
-        <w:spacing w:after="40"/>
-      </w:pPr>
-      <w:r>
-        <w:rPr>
-          <w:rFonts w:ascii="Arial" w:hAnsi="Arial" w:eastAsia="SimHei" w:cs="Arial"/>
-          <w:b w:val="0"/>
-          <w:color w:val="0C2340"/>
-          <w:sz w:val="20"/>
-        </w:rPr>
-        <w:t xml:space="preserve">    2.1 第一部分：治理與標準 (ISO 42001, SHIELD, RoE, CMMC L2)  .........................................................................................................................  9</w:t>
-      </w:r>
-    </w:p>
-    <w:p>
-      <w:pPr>
-        <w:spacing w:after="40"/>
-      </w:pPr>
-      <w:r>
-        <w:rPr>
-          <w:rFonts w:ascii="Arial" w:hAnsi="Arial" w:eastAsia="SimHei" w:cs="Arial"/>
-          <w:b w:val="0"/>
-          <w:color w:val="0C2340"/>
-          <w:sz w:val="20"/>
-        </w:rPr>
-        <w:t xml:space="preserve">    2.2 第二部分：矩陣與架構 (T&amp;E 4層階梯, JATIC 7構面, Q1~Q15 量化門檻)  .........................................................................................................................  11</w:t>
-      </w:r>
-    </w:p>
-    <w:p>
-      <w:pPr>
-        <w:spacing w:after="40"/>
-      </w:pPr>
-      <w:r>
-        <w:rPr>
-          <w:rFonts w:ascii="Arial" w:hAnsi="Arial" w:eastAsia="SimHei" w:cs="Arial"/>
-          <w:b w:val="0"/>
-          <w:color w:val="0C2340"/>
-          <w:sz w:val="20"/>
-        </w:rPr>
-        <w:t xml:space="preserve">    2.3 第三部分：應用系統與驗測 SOP (A~F 類系統與無人載具驗測)  .........................................................................................................................  14</w:t>
-      </w:r>
-    </w:p>
-    <w:p>
-      <w:pPr>
-        <w:spacing w:after="40"/>
-      </w:pPr>
-      <w:r>
-        <w:rPr>
-          <w:rFonts w:ascii="Arial" w:hAnsi="Arial" w:eastAsia="SimHei" w:cs="Arial"/>
-          <w:b/>
-          <w:color w:val="0C2340"/>
-          <w:sz w:val="20"/>
-        </w:rPr>
-        <w:t>第三章 階段性任務與 24 個月時程規劃  .........................................................................................................................  17</w:t>
-      </w:r>
-    </w:p>
-    <w:p>
-      <w:pPr>
-        <w:spacing w:after="40"/>
-      </w:pPr>
-      <w:r>
-        <w:rPr>
-          <w:rFonts w:ascii="Arial" w:hAnsi="Arial" w:eastAsia="SimHei" w:cs="Arial"/>
-          <w:b w:val="0"/>
-          <w:color w:val="0C2340"/>
-          <w:sz w:val="20"/>
-        </w:rPr>
-        <w:t xml:space="preserve">    3.1 四大階段任務與發展里程碑 (Milestones)  .........................................................................................................................  17</w:t>
-      </w:r>
-    </w:p>
-    <w:p>
-      <w:pPr>
-        <w:spacing w:after="40"/>
-      </w:pPr>
-      <w:r>
-        <w:rPr>
-          <w:rFonts w:ascii="Arial" w:hAnsi="Arial" w:eastAsia="SimHei" w:cs="Arial"/>
-          <w:b w:val="0"/>
-          <w:color w:val="0C2340"/>
-          <w:sz w:val="20"/>
-        </w:rPr>
-        <w:t xml:space="preserve">    3.2 24 個月專案時程對照表 (Gantt Schedule)  .........................................................................................................................  19</w:t>
-      </w:r>
-    </w:p>
-    <w:p>
-      <w:pPr>
-        <w:spacing w:after="40"/>
-      </w:pPr>
-      <w:r>
-        <w:rPr>
-          <w:rFonts w:ascii="Arial" w:hAnsi="Arial" w:eastAsia="SimHei" w:cs="Arial"/>
-          <w:b/>
-          <w:color w:val="0C2340"/>
-          <w:sz w:val="20"/>
-        </w:rPr>
-        <w:t>第四章 資源配置與專案風險管理  .........................................................................................................................  20</w:t>
-      </w:r>
-    </w:p>
-    <w:p>
-      <w:pPr>
-        <w:spacing w:after="40"/>
-      </w:pPr>
-      <w:r>
-        <w:rPr>
-          <w:rFonts w:ascii="Arial" w:hAnsi="Arial" w:eastAsia="SimHei" w:cs="Arial"/>
-          <w:b w:val="0"/>
-          <w:color w:val="0C2340"/>
-          <w:sz w:val="20"/>
-        </w:rPr>
-        <w:t xml:space="preserve">    4.1 軟硬體、民雄算力與人力資源配置表  .........................................................................................................................  20</w:t>
-      </w:r>
-    </w:p>
-    <w:p>
-      <w:pPr>
-        <w:spacing w:after="40"/>
-      </w:pPr>
-      <w:r>
-        <w:rPr>
-          <w:rFonts w:ascii="Arial" w:hAnsi="Arial" w:eastAsia="SimHei" w:cs="Arial"/>
-          <w:b w:val="0"/>
-          <w:color w:val="0C2340"/>
-          <w:sz w:val="20"/>
-        </w:rPr>
-        <w:t xml:space="preserve">    4.2 專案風險評估與因應對策 (Risk Matrix)  .........................................................................................................................  21</w:t>
-      </w:r>
-    </w:p>
-    <w:p>
-      <w:pPr>
-        <w:spacing w:after="40"/>
-      </w:pPr>
-      <w:r>
-        <w:rPr>
-          <w:rFonts w:ascii="Arial" w:hAnsi="Arial" w:eastAsia="SimHei" w:cs="Arial"/>
-          <w:b/>
-          <w:color w:val="0C2340"/>
-          <w:sz w:val="20"/>
-        </w:rPr>
-        <w:t>第五章 預期效益與戰略成果  .........................................................................................................................  22</w:t>
-      </w:r>
-    </w:p>
-    <w:p>
-      <w:pPr>
-        <w:spacing w:after="160"/>
+        <w:spacing w:after="240"/>
       </w:pPr>
     </w:p>
     <w:p>
@@ -527,46 +275,7 @@
     </w:p>
     <w:p>
       <w:pPr>
-        <w:spacing w:after="40"/>
-      </w:pPr>
-      <w:r>
-        <w:rPr>
-          <w:rFonts w:ascii="Arial" w:hAnsi="Arial" w:eastAsia="SimHei" w:cs="Arial"/>
-          <w:color w:val="2563EB"/>
-          <w:sz w:val="20"/>
-        </w:rPr>
-        <w:t>圖 2-1：AIEC 國防 AI 評測五大階段標準流程圖 (Nano Banana pro 生成)  ...................................................................................................  10</w:t>
-      </w:r>
-    </w:p>
-    <w:p>
-      <w:pPr>
-        <w:spacing w:after="40"/>
-      </w:pPr>
-      <w:r>
-        <w:rPr>
-          <w:rFonts w:ascii="Arial" w:hAnsi="Arial" w:eastAsia="SimHei" w:cs="Arial"/>
-          <w:color w:val="2563EB"/>
-          <w:sz w:val="20"/>
-        </w:rPr>
-        <w:t>圖 2-2：國防 AI 安全保密審計 3D 縱深防禦矩陣圖 (Nano Banana pro 生成)  ...................................................................................................  13</w:t>
-      </w:r>
-    </w:p>
-    <w:p>
-      <w:pPr>
-        <w:spacing w:after="40"/>
-      </w:pPr>
-      <w:r>
-        <w:rPr>
-          <w:rFonts w:ascii="Arial" w:hAnsi="Arial" w:eastAsia="SimHei" w:cs="Arial"/>
-          <w:color w:val="2563EB"/>
-          <w:sz w:val="20"/>
-        </w:rPr>
-        <w:t>圖 2-3：民雄院區國家級主權 AI 四層算力堆疊架構圖 (Nano Banana pro 生成)  ...................................................................................................  16</w:t>
-      </w:r>
-    </w:p>
-    <w:p>
-      <w:pPr>
-        <w:spacing w:after="160"/>
+        <w:spacing w:after="240"/>
       </w:pPr>
     </w:p>
     <w:p>
@@ -582,97 +291,6 @@
           <w:sz w:val="29"/>
         </w:rPr>
         <w:t>📊 表目錄 (List of Tables)</w:t>
-      </w:r>
-    </w:p>
-    <w:p>
-      <w:pPr>
-        <w:spacing w:after="40"/>
-      </w:pPr>
-      <w:r>
-        <w:rPr>
-          <w:rFonts w:ascii="Arial" w:hAnsi="Arial" w:eastAsia="SimHei" w:cs="Arial"/>
-          <w:color w:val="1E3A8A"/>
-          <w:sz w:val="20"/>
-        </w:rPr>
-        <w:t>表 1-1：傳統軍事戰術 vs. 非對稱 AI 戰術比較表  ...................................................................................................  5</w:t>
-      </w:r>
-    </w:p>
-    <w:p>
-      <w:pPr>
-        <w:spacing w:after="40"/>
-      </w:pPr>
-      <w:r>
-        <w:rPr>
-          <w:rFonts w:ascii="Arial" w:hAnsi="Arial" w:eastAsia="SimHei" w:cs="Arial"/>
-          <w:color w:val="1E3A8A"/>
-          <w:sz w:val="20"/>
-        </w:rPr>
-        <w:t>表 2-1：ISO 42001 (AIMS) 通用標準 vs. AIEC 國防權責分工比較表  ...................................................................................................  9</w:t>
-      </w:r>
-    </w:p>
-    <w:p>
-      <w:pPr>
-        <w:spacing w:after="40"/>
-      </w:pPr>
-      <w:r>
-        <w:rPr>
-          <w:rFonts w:ascii="Arial" w:hAnsi="Arial" w:eastAsia="SimHei" w:cs="Arial"/>
-          <w:color w:val="1E3A8A"/>
-          <w:sz w:val="20"/>
-        </w:rPr>
-        <w:t>表 2-2：交戰規則 (RoE) 人機授權三階權能邊界比較表 (HITL / HOTL / HOOTL)  ...................................................................................................  10</w:t>
-      </w:r>
-    </w:p>
-    <w:p>
-      <w:pPr>
-        <w:spacing w:after="40"/>
-      </w:pPr>
-      <w:r>
-        <w:rPr>
-          <w:rFonts w:ascii="Arial" w:hAnsi="Arial" w:eastAsia="SimHei" w:cs="Arial"/>
-          <w:color w:val="1E3A8A"/>
-          <w:sz w:val="20"/>
-        </w:rPr>
-        <w:t>表 2-3：AIEC 15 項量化評測指標 (Q1~Q15) 與合格門檻對照總表  ...................................................................................................  12</w:t>
-      </w:r>
-    </w:p>
-    <w:p>
-      <w:pPr>
-        <w:spacing w:after="40"/>
-      </w:pPr>
-      <w:r>
-        <w:rPr>
-          <w:rFonts w:ascii="Arial" w:hAnsi="Arial" w:eastAsia="SimHei" w:cs="Arial"/>
-          <w:color w:val="1E3A8A"/>
-          <w:sz w:val="20"/>
-        </w:rPr>
-        <w:t>表 3-1：AIEC 國防 AI 導入專案 24 個月執行時程規劃表  ...................................................................................................  19</w:t>
-      </w:r>
-    </w:p>
-    <w:p>
-      <w:pPr>
-        <w:spacing w:after="40"/>
-      </w:pPr>
-      <w:r>
-        <w:rPr>
-          <w:rFonts w:ascii="Arial" w:hAnsi="Arial" w:eastAsia="SimHei" w:cs="Arial"/>
-          <w:color w:val="1E3A8A"/>
-          <w:sz w:val="20"/>
-        </w:rPr>
-        <w:t>表 4-1：專案人力、主權算力與軟硬體資源配置表  ...................................................................................................  20</w:t>
-      </w:r>
-    </w:p>
-    <w:p>
-      <w:pPr>
-        <w:spacing w:after="40"/>
-      </w:pPr>
-      <w:r>
-        <w:rPr>
-          <w:rFonts w:ascii="Arial" w:hAnsi="Arial" w:eastAsia="SimHei" w:cs="Arial"/>
-          <w:color w:val="1E3A8A"/>
-          <w:sz w:val="20"/>
-        </w:rPr>
-        <w:t>表 4-2：國防 AI 導入主要風險評估與處置矩陣表  ...................................................................................................  21</w:t>
       </w:r>
     </w:p>
     <w:p>
@@ -781,17 +399,28 @@
     </w:p>
     <w:p>
       <w:pPr>
-        <w:pStyle w:val="Heading3"/>
-        <w:spacing w:before="160" w:after="120"/>
+        <w:pStyle w:val="Caption"/>
+        <w:spacing w:before="160" w:after="80"/>
+        <w:jc w:val="center"/>
       </w:pPr>
       <w:r>
         <w:rPr>
           <w:rFonts w:ascii="Arial" w:hAnsi="Arial" w:eastAsia="SimHei" w:cs="Arial"/>
           <w:b/>
-          <w:color w:val="1E3A8A"/>
-          <w:sz w:val="24"/>
+          <w:color w:val="0C2340"/>
+          <w:sz w:val="20"/>
         </w:rPr>
-        <w:t>表 1-1：傳統軍事戰術 vs. 非對稱 AI 戰術比較表</w:t>
+        <w:t xml:space="preserve">表 </w:t>
+      </w:r>
+      <w:fldSimple w:instr="SEQ 表 \* ARABIC"/>
+      <w:r>
+        <w:rPr>
+          <w:rFonts w:ascii="Arial" w:hAnsi="Arial" w:eastAsia="SimHei" w:cs="Arial"/>
+          <w:b/>
+          <w:color w:val="0C2340"/>
+          <w:sz w:val="20"/>
+        </w:rPr>
+        <w:t>：傳統軍事戰術 vs. 非對稱 AI 戰術比較表</w:t>
       </w:r>
     </w:p>
     <w:tbl>
@@ -1466,17 +1095,28 @@
     </w:p>
     <w:p>
       <w:pPr>
-        <w:pStyle w:val="Heading3"/>
-        <w:spacing w:before="160" w:after="120"/>
+        <w:pStyle w:val="Caption"/>
+        <w:spacing w:before="160" w:after="80"/>
+        <w:jc w:val="center"/>
       </w:pPr>
       <w:r>
         <w:rPr>
           <w:rFonts w:ascii="Arial" w:hAnsi="Arial" w:eastAsia="SimHei" w:cs="Arial"/>
           <w:b/>
-          <w:color w:val="1E3A8A"/>
-          <w:sz w:val="24"/>
+          <w:color w:val="0C2340"/>
+          <w:sz w:val="20"/>
         </w:rPr>
-        <w:t>表 2-1：ISO 42001 (AIMS) 通用標準 vs. AIEC 國防權責分工比較表</w:t>
+        <w:t xml:space="preserve">表 </w:t>
+      </w:r>
+      <w:fldSimple w:instr="SEQ 表 \* ARABIC"/>
+      <w:r>
+        <w:rPr>
+          <w:rFonts w:ascii="Arial" w:hAnsi="Arial" w:eastAsia="SimHei" w:cs="Arial"/>
+          <w:b/>
+          <w:color w:val="0C2340"/>
+          <w:sz w:val="20"/>
+        </w:rPr>
+        <w:t>：ISO 42001 (AIMS) 通用標準 vs. AIEC 國防權責分工比較表</w:t>
       </w:r>
     </w:p>
     <w:tbl>
@@ -1794,17 +1434,28 @@
     </w:tbl>
     <w:p>
       <w:pPr>
-        <w:pStyle w:val="Heading3"/>
-        <w:spacing w:before="160" w:after="120"/>
+        <w:pStyle w:val="Caption"/>
+        <w:spacing w:before="160" w:after="80"/>
+        <w:jc w:val="center"/>
       </w:pPr>
       <w:r>
         <w:rPr>
           <w:rFonts w:ascii="Arial" w:hAnsi="Arial" w:eastAsia="SimHei" w:cs="Arial"/>
           <w:b/>
-          <w:color w:val="1E3A8A"/>
-          <w:sz w:val="24"/>
+          <w:color w:val="0C2340"/>
+          <w:sz w:val="20"/>
         </w:rPr>
-        <w:t>表 2-2：交戰規則 (RoE) 人機授權三階權能邊界比較表 (HITL / HOTL / HOOTL)</w:t>
+        <w:t xml:space="preserve">表 </w:t>
+      </w:r>
+      <w:fldSimple w:instr="SEQ 表 \* ARABIC"/>
+      <w:r>
+        <w:rPr>
+          <w:rFonts w:ascii="Arial" w:hAnsi="Arial" w:eastAsia="SimHei" w:cs="Arial"/>
+          <w:b/>
+          <w:color w:val="0C2340"/>
+          <w:sz w:val="20"/>
+        </w:rPr>
+        <w:t>：交戰規則 (RoE) 人機授權三階權能邊界比較表 (HITL / HOTL / HOOTL)</w:t>
       </w:r>
     </w:p>
     <w:tbl>
@@ -2255,17 +1906,28 @@
     </w:p>
     <w:p>
       <w:pPr>
-        <w:pStyle w:val="Heading3"/>
-        <w:spacing w:before="160" w:after="120"/>
+        <w:pStyle w:val="Caption"/>
+        <w:spacing w:before="160" w:after="80"/>
+        <w:jc w:val="center"/>
       </w:pPr>
       <w:r>
         <w:rPr>
           <w:rFonts w:ascii="Arial" w:hAnsi="Arial" w:eastAsia="SimHei" w:cs="Arial"/>
           <w:b/>
-          <w:color w:val="1E3A8A"/>
-          <w:sz w:val="24"/>
+          <w:color w:val="0C2340"/>
+          <w:sz w:val="20"/>
         </w:rPr>
-        <w:t>圖 2-1：AIEC 國防 AI 評測五大階段標準流程圖 (Nano Banana pro 生成)</w:t>
+        <w:t xml:space="preserve">圖 </w:t>
+      </w:r>
+      <w:fldSimple w:instr="SEQ 圖 \* ARABIC"/>
+      <w:r>
+        <w:rPr>
+          <w:rFonts w:ascii="Arial" w:hAnsi="Arial" w:eastAsia="SimHei" w:cs="Arial"/>
+          <w:b/>
+          <w:color w:val="0C2340"/>
+          <w:sz w:val="20"/>
+        </w:rPr>
+        <w:t>：AIEC 國防 AI 評測五大階段標準流程圖 (Nano Banana pro 生成)</w:t>
       </w:r>
     </w:p>
     <w:p>
@@ -2298,17 +1960,28 @@
     </w:p>
     <w:p>
       <w:pPr>
-        <w:pStyle w:val="Heading3"/>
-        <w:spacing w:before="160" w:after="120"/>
+        <w:pStyle w:val="Caption"/>
+        <w:spacing w:before="160" w:after="80"/>
+        <w:jc w:val="center"/>
       </w:pPr>
       <w:r>
         <w:rPr>
           <w:rFonts w:ascii="Arial" w:hAnsi="Arial" w:eastAsia="SimHei" w:cs="Arial"/>
           <w:b/>
-          <w:color w:val="1E3A8A"/>
-          <w:sz w:val="24"/>
+          <w:color w:val="0C2340"/>
+          <w:sz w:val="20"/>
         </w:rPr>
-        <w:t>表 2-3：AIEC 15 項量化評測指標 (Q1~Q15) 與合格門檻對照總表</w:t>
+        <w:t xml:space="preserve">表 </w:t>
+      </w:r>
+      <w:fldSimple w:instr="SEQ 表 \* ARABIC"/>
+      <w:r>
+        <w:rPr>
+          <w:rFonts w:ascii="Arial" w:hAnsi="Arial" w:eastAsia="SimHei" w:cs="Arial"/>
+          <w:b/>
+          <w:color w:val="0C2340"/>
+          <w:sz w:val="20"/>
+        </w:rPr>
+        <w:t>：AIEC 15 項量化評測指標 (Q1~Q15) 與合格門檻對照總表</w:t>
       </w:r>
     </w:p>
     <w:tbl>
@@ -3920,17 +3593,28 @@
     </w:p>
     <w:p>
       <w:pPr>
-        <w:pStyle w:val="Heading3"/>
-        <w:spacing w:before="160" w:after="120"/>
+        <w:pStyle w:val="Caption"/>
+        <w:spacing w:before="160" w:after="80"/>
+        <w:jc w:val="center"/>
       </w:pPr>
       <w:r>
         <w:rPr>
           <w:rFonts w:ascii="Arial" w:hAnsi="Arial" w:eastAsia="SimHei" w:cs="Arial"/>
           <w:b/>
-          <w:color w:val="1E3A8A"/>
-          <w:sz w:val="24"/>
+          <w:color w:val="0C2340"/>
+          <w:sz w:val="20"/>
         </w:rPr>
-        <w:t>圖 2-2：國防 AI 安全保密審計 3D 縱深防禦矩陣圖 (Nano Banana pro 生成)</w:t>
+        <w:t xml:space="preserve">圖 </w:t>
+      </w:r>
+      <w:fldSimple w:instr="SEQ 圖 \* ARABIC"/>
+      <w:r>
+        <w:rPr>
+          <w:rFonts w:ascii="Arial" w:hAnsi="Arial" w:eastAsia="SimHei" w:cs="Arial"/>
+          <w:b/>
+          <w:color w:val="0C2340"/>
+          <w:sz w:val="20"/>
+        </w:rPr>
+        <w:t>：國防 AI 安全保密審計 3D 縱深防禦矩陣圖 (Nano Banana pro 生成)</w:t>
       </w:r>
     </w:p>
     <w:p>
@@ -4003,17 +3687,28 @@
     </w:p>
     <w:p>
       <w:pPr>
-        <w:pStyle w:val="Heading3"/>
-        <w:spacing w:before="160" w:after="120"/>
+        <w:pStyle w:val="Caption"/>
+        <w:spacing w:before="160" w:after="80"/>
+        <w:jc w:val="center"/>
       </w:pPr>
       <w:r>
         <w:rPr>
           <w:rFonts w:ascii="Arial" w:hAnsi="Arial" w:eastAsia="SimHei" w:cs="Arial"/>
           <w:b/>
-          <w:color w:val="1E3A8A"/>
-          <w:sz w:val="24"/>
+          <w:color w:val="0C2340"/>
+          <w:sz w:val="20"/>
         </w:rPr>
-        <w:t>圖 2-3：民雄院區國家級主權 AI 四層算力堆疊架構圖 (Nano Banana pro 生成)</w:t>
+        <w:t xml:space="preserve">圖 </w:t>
+      </w:r>
+      <w:fldSimple w:instr="SEQ 圖 \* ARABIC"/>
+      <w:r>
+        <w:rPr>
+          <w:rFonts w:ascii="Arial" w:hAnsi="Arial" w:eastAsia="SimHei" w:cs="Arial"/>
+          <w:b/>
+          <w:color w:val="0C2340"/>
+          <w:sz w:val="20"/>
+        </w:rPr>
+        <w:t>：民雄院區國家級主權 AI 四層算力堆疊架構圖 (Nano Banana pro 生成)</w:t>
       </w:r>
     </w:p>
     <w:p>
@@ -4169,17 +3864,28 @@
     </w:p>
     <w:p>
       <w:pPr>
-        <w:pStyle w:val="Heading3"/>
-        <w:spacing w:before="160" w:after="120"/>
+        <w:pStyle w:val="Caption"/>
+        <w:spacing w:before="160" w:after="80"/>
+        <w:jc w:val="center"/>
       </w:pPr>
       <w:r>
         <w:rPr>
           <w:rFonts w:ascii="Arial" w:hAnsi="Arial" w:eastAsia="SimHei" w:cs="Arial"/>
           <w:b/>
-          <w:color w:val="1E3A8A"/>
-          <w:sz w:val="24"/>
+          <w:color w:val="0C2340"/>
+          <w:sz w:val="20"/>
         </w:rPr>
-        <w:t>表 3-1：AIEC 國防 AI 導入專案 24 個月執行時程規劃表</w:t>
+        <w:t xml:space="preserve">表 </w:t>
+      </w:r>
+      <w:fldSimple w:instr="SEQ 表 \* ARABIC"/>
+      <w:r>
+        <w:rPr>
+          <w:rFonts w:ascii="Arial" w:hAnsi="Arial" w:eastAsia="SimHei" w:cs="Arial"/>
+          <w:b/>
+          <w:color w:val="0C2340"/>
+          <w:sz w:val="20"/>
+        </w:rPr>
+        <w:t>：AIEC 國防 AI 導入專案 24 個月執行時程規劃表</w:t>
       </w:r>
     </w:p>
     <w:tbl>
@@ -5317,17 +5023,28 @@
     </w:p>
     <w:p>
       <w:pPr>
-        <w:pStyle w:val="Heading3"/>
-        <w:spacing w:before="160" w:after="120"/>
+        <w:pStyle w:val="Caption"/>
+        <w:spacing w:before="160" w:after="80"/>
+        <w:jc w:val="center"/>
       </w:pPr>
       <w:r>
         <w:rPr>
           <w:rFonts w:ascii="Arial" w:hAnsi="Arial" w:eastAsia="SimHei" w:cs="Arial"/>
           <w:b/>
-          <w:color w:val="1E3A8A"/>
-          <w:sz w:val="24"/>
+          <w:color w:val="0C2340"/>
+          <w:sz w:val="20"/>
         </w:rPr>
-        <w:t>表 4-1：專案人力、主權算力與軟硬體資源配置表</w:t>
+        <w:t xml:space="preserve">表 </w:t>
+      </w:r>
+      <w:fldSimple w:instr="SEQ 表 \* ARABIC"/>
+      <w:r>
+        <w:rPr>
+          <w:rFonts w:ascii="Arial" w:hAnsi="Arial" w:eastAsia="SimHei" w:cs="Arial"/>
+          <w:b/>
+          <w:color w:val="0C2340"/>
+          <w:sz w:val="20"/>
+        </w:rPr>
+        <w:t>：專案人力、主權算力與軟硬體資源配置表</w:t>
       </w:r>
     </w:p>
     <w:tbl>
@@ -5731,17 +5448,28 @@
     </w:p>
     <w:p>
       <w:pPr>
-        <w:pStyle w:val="Heading3"/>
-        <w:spacing w:before="160" w:after="120"/>
+        <w:pStyle w:val="Caption"/>
+        <w:spacing w:before="160" w:after="80"/>
+        <w:jc w:val="center"/>
       </w:pPr>
       <w:r>
         <w:rPr>
           <w:rFonts w:ascii="Arial" w:hAnsi="Arial" w:eastAsia="SimHei" w:cs="Arial"/>
           <w:b/>
-          <w:color w:val="1E3A8A"/>
-          <w:sz w:val="24"/>
+          <w:color w:val="0C2340"/>
+          <w:sz w:val="20"/>
         </w:rPr>
-        <w:t>表 4-2：國防 AI 導入主要風險評估與處置矩陣表</w:t>
+        <w:t xml:space="preserve">表 </w:t>
+      </w:r>
+      <w:fldSimple w:instr="SEQ 表 \* ARABIC"/>
+      <w:r>
+        <w:rPr>
+          <w:rFonts w:ascii="Arial" w:hAnsi="Arial" w:eastAsia="SimHei" w:cs="Arial"/>
+          <w:b/>
+          <w:color w:val="0C2340"/>
+          <w:sz w:val="20"/>
+        </w:rPr>
+        <w:t>：國防 AI 導入主要風險評估與處置矩陣表</w:t>
       </w:r>
     </w:p>
     <w:tbl>
@@ -6388,6 +6116,9 @@
       </w:sdtPr>
       <w:sdtContent>
         <w:p>
+          <w:pPr>
+            <w:pStyle w:val="TOC1"/>
+          </w:pPr>
           <w:fldSimple w:instr="TOC \o &quot;1-3&quot; \h \z \u"/>
         </w:p>
       </w:sdtContent>
@@ -6401,7 +6132,10 @@
       </w:sdtPr>
       <w:sdtContent>
         <w:p>
-          <w:fldSimple w:instr="TOC \t &quot;Heading 3,1&quot; \h \z \u"/>
+          <w:pPr>
+            <w:pStyle w:val="TOC1"/>
+          </w:pPr>
+          <w:fldSimple w:instr="TOC \h \z \c &quot;圖&quot;"/>
         </w:p>
       </w:sdtContent>
     </w:sdt>
@@ -6414,7 +6148,10 @@
       </w:sdtPr>
       <w:sdtContent>
         <w:p>
-          <w:fldSimple w:instr="TOC \t &quot;Heading 3,1&quot; \h \z \u"/>
+          <w:pPr>
+            <w:pStyle w:val="TOC1"/>
+          </w:pPr>
+          <w:fldSimple w:instr="TOC \h \z \c &quot;表&quot;"/>
         </w:p>
       </w:sdtContent>
     </w:sdt>
@@ -7612,10 +7349,11 @@
       <w:spacing w:line="240" w:lineRule="auto"/>
     </w:pPr>
     <w:rPr>
+      <w:rFonts w:ascii="Arial" w:hAnsi="Arial" w:eastAsia="SimHei" w:cs="Arial"/>
       <w:b/>
       <w:bCs/>
-      <w:color w:val="4F81BD" w:themeColor="accent1"/>
-      <w:sz w:val="18"/>
+      <w:color w:val="0C2340"/>
+      <w:sz w:val="20"/>
       <w:szCs w:val="18"/>
     </w:rPr>
   </w:style>

</xml_diff>

<commit_message>
Update AIEC國防領域AI應用導入專案規劃書.docx to use Heading 1=20pt, Heading 2=16pt, Normal Body=14pt, and insert automatic TOC on Page 2
</commit_message>
<xml_diff>
--- a/AIEC國防領域AI應用導入專案規劃書.docx
+++ b/AIEC國防領域AI應用導入專案規劃書.docx
@@ -12,7 +12,7 @@
           <w:rFonts w:ascii="Arial" w:hAnsi="Arial" w:eastAsia="SimHei" w:cs="Arial"/>
           <w:b/>
           <w:color w:val="2563EB"/>
-          <w:sz w:val="28"/>
+          <w:sz w:val="32"/>
         </w:rPr>
         <w:t>🛡️ 國家級主權 AI 國防安全評測與驗證體系</w:t>
         <w:br/>
@@ -37,7 +37,7 @@
           <w:rFonts w:ascii="Arial" w:hAnsi="Arial" w:eastAsia="SimHei" w:cs="Arial"/>
           <w:b/>
           <w:color w:val="475569"/>
-          <w:sz w:val="27"/>
+          <w:sz w:val="28"/>
         </w:rPr>
         <w:t>—— 非對稱作戰態勢下建構可靠、可信任、可解釋與可當責之主權 AI 戰術評測架構 ——</w:t>
       </w:r>
@@ -66,7 +66,7 @@
                 <w:rFonts w:ascii="Arial" w:hAnsi="Arial" w:eastAsia="SimHei" w:cs="Arial"/>
                 <w:b/>
                 <w:color w:val="2563EB"/>
-                <w:sz w:val="21"/>
+                <w:sz w:val="24"/>
               </w:rPr>
               <w:t>專案名稱：</w:t>
             </w:r>
@@ -81,7 +81,7 @@
               <w:rPr>
                 <w:rFonts w:ascii="Arial" w:hAnsi="Arial" w:eastAsia="SimHei" w:cs="Arial"/>
                 <w:color w:val="0C2340"/>
-                <w:sz w:val="21"/>
+                <w:sz w:val="24"/>
               </w:rPr>
               <w:t>AIEC 國防領域 AI 應用導入與 24 個月專案規劃書</w:t>
             </w:r>
@@ -102,7 +102,7 @@
                 <w:rFonts w:ascii="Arial" w:hAnsi="Arial" w:eastAsia="SimHei" w:cs="Arial"/>
                 <w:b/>
                 <w:color w:val="2563EB"/>
-                <w:sz w:val="21"/>
+                <w:sz w:val="24"/>
               </w:rPr>
               <w:t>規劃觀點：</w:t>
             </w:r>
@@ -117,7 +117,7 @@
               <w:rPr>
                 <w:rFonts w:ascii="Arial" w:hAnsi="Arial" w:eastAsia="SimHei" w:cs="Arial"/>
                 <w:color w:val="0C2340"/>
-                <w:sz w:val="21"/>
+                <w:sz w:val="24"/>
               </w:rPr>
               <w:t>國防 AI 應用技術長 (CTO) 暨系統總架構師視角</w:t>
             </w:r>
@@ -138,7 +138,7 @@
                 <w:rFonts w:ascii="Arial" w:hAnsi="Arial" w:eastAsia="SimHei" w:cs="Arial"/>
                 <w:b/>
                 <w:color w:val="2563EB"/>
-                <w:sz w:val="21"/>
+                <w:sz w:val="24"/>
               </w:rPr>
               <w:t>合規標準：</w:t>
             </w:r>
@@ -153,7 +153,7 @@
               <w:rPr>
                 <w:rFonts w:ascii="Arial" w:hAnsi="Arial" w:eastAsia="SimHei" w:cs="Arial"/>
                 <w:color w:val="0C2340"/>
-                <w:sz w:val="21"/>
+                <w:sz w:val="24"/>
               </w:rPr>
               <w:t>ISO 42001 (AIMS)、CMMC Level 2、DoD CDAO T&amp;E、MITRE ATLAS</w:t>
             </w:r>
@@ -174,7 +174,7 @@
                 <w:rFonts w:ascii="Arial" w:hAnsi="Arial" w:eastAsia="SimHei" w:cs="Arial"/>
                 <w:b/>
                 <w:color w:val="2563EB"/>
-                <w:sz w:val="21"/>
+                <w:sz w:val="24"/>
               </w:rPr>
               <w:t>適用戰術：</w:t>
             </w:r>
@@ -189,7 +189,7 @@
               <w:rPr>
                 <w:rFonts w:ascii="Arial" w:hAnsi="Arial" w:eastAsia="SimHei" w:cs="Arial"/>
                 <w:color w:val="0C2340"/>
-                <w:sz w:val="21"/>
+                <w:sz w:val="24"/>
               </w:rPr>
               <w:t>非對稱作戰、無人機/船/潛艦/車/機器狗、Cyber Range 對抗演練</w:t>
             </w:r>
@@ -210,7 +210,7 @@
                 <w:rFonts w:ascii="Arial" w:hAnsi="Arial" w:eastAsia="SimHei" w:cs="Arial"/>
                 <w:b/>
                 <w:color w:val="2563EB"/>
-                <w:sz w:val="21"/>
+                <w:sz w:val="24"/>
               </w:rPr>
               <w:t>發行版本與日期：</w:t>
             </w:r>
@@ -225,7 +225,7 @@
               <w:rPr>
                 <w:rFonts w:ascii="Arial" w:hAnsi="Arial" w:eastAsia="SimHei" w:cs="Arial"/>
                 <w:color w:val="0C2340"/>
-                <w:sz w:val="21"/>
+                <w:sz w:val="24"/>
               </w:rPr>
               <w:t>正式發行版 v1.0  |  2026 年 7 月</w:t>
             </w:r>
@@ -241,7 +241,7 @@
     <w:p>
       <w:pPr>
         <w:pStyle w:val="Heading1"/>
-        <w:spacing w:before="280" w:after="120"/>
+        <w:spacing w:before="320" w:after="160"/>
       </w:pPr>
       <w:r>
         <w:rPr>
@@ -261,14 +261,14 @@
     <w:p>
       <w:pPr>
         <w:pStyle w:val="Heading2"/>
-        <w:spacing w:before="200" w:after="120"/>
+        <w:spacing w:before="240" w:after="160"/>
       </w:pPr>
       <w:r>
         <w:rPr>
           <w:rFonts w:ascii="Arial" w:hAnsi="Arial" w:eastAsia="SimHei" w:cs="Arial"/>
           <w:b/>
           <w:color w:val="2563EB"/>
-          <w:sz w:val="29"/>
+          <w:sz w:val="32"/>
         </w:rPr>
         <w:t>🖼️ 圖目錄 (List of Figures)</w:t>
       </w:r>
@@ -281,14 +281,14 @@
     <w:p>
       <w:pPr>
         <w:pStyle w:val="Heading2"/>
-        <w:spacing w:before="200" w:after="120"/>
+        <w:spacing w:before="240" w:after="160"/>
       </w:pPr>
       <w:r>
         <w:rPr>
           <w:rFonts w:ascii="Arial" w:hAnsi="Arial" w:eastAsia="SimHei" w:cs="Arial"/>
           <w:b/>
           <w:color w:val="2563EB"/>
-          <w:sz w:val="29"/>
+          <w:sz w:val="32"/>
         </w:rPr>
         <w:t>📊 表目錄 (List of Tables)</w:t>
       </w:r>
@@ -301,7 +301,7 @@
     <w:p>
       <w:pPr>
         <w:pStyle w:val="Heading1"/>
-        <w:spacing w:before="280" w:after="120"/>
+        <w:spacing w:before="320" w:after="160"/>
       </w:pPr>
       <w:r>
         <w:rPr>
@@ -316,27 +316,27 @@
     <w:p>
       <w:pPr>
         <w:pStyle w:val="Heading2"/>
-        <w:spacing w:before="200" w:after="120"/>
+        <w:spacing w:before="240" w:after="160"/>
       </w:pPr>
       <w:r>
         <w:rPr>
           <w:rFonts w:ascii="Arial" w:hAnsi="Arial" w:eastAsia="SimHei" w:cs="Arial"/>
           <w:b/>
           <w:color w:val="2563EB"/>
-          <w:sz w:val="29"/>
+          <w:sz w:val="32"/>
         </w:rPr>
         <w:t>1.1 AI 於國防領域應用的必要性與急迫性</w:t>
       </w:r>
     </w:p>
     <w:p>
       <w:pPr>
-        <w:spacing w:before="0" w:after="120" w:line="312" w:lineRule="auto"/>
+        <w:spacing w:before="0" w:after="160" w:line="324" w:lineRule="auto"/>
       </w:pPr>
       <w:r>
         <w:rPr>
           <w:rFonts w:ascii="Arial" w:hAnsi="Arial" w:eastAsia="SimHei" w:cs="Arial"/>
           <w:color w:val="334155"/>
-          <w:sz w:val="22"/>
+          <w:sz w:val="28"/>
         </w:rPr>
         <w:t>當前全球軍事科技正面臨百年未有之大變局。人工智慧 (AI) 已非僅是輔助軍隊行政或後勤維運的資訊工具，而是直接主導數位化戰場「擊殺鏈」(Kill Chain) 閉合速度、情報感知（ISR）精度與指揮管制 (C2) 決策品質的核心戰術作戰要素。在高強度對抗之現代化戰爭中，戰術反應時間已被壓縮至秒級甚至毫秒級，人腦處理海量多源傳感器（雷達、光學籌載、電戰訊號）的極限已成為戰術瓶頸，唯有導入 AI 技術，方能實現預警即反應、目標即摧毀之戰術目標。</w:t>
       </w:r>
@@ -344,27 +344,27 @@
     <w:p>
       <w:pPr>
         <w:pStyle w:val="Heading2"/>
-        <w:spacing w:before="200" w:after="120"/>
+        <w:spacing w:before="240" w:after="160"/>
       </w:pPr>
       <w:r>
         <w:rPr>
           <w:rFonts w:ascii="Arial" w:hAnsi="Arial" w:eastAsia="SimHei" w:cs="Arial"/>
           <w:b/>
           <w:color w:val="2563EB"/>
-          <w:sz w:val="29"/>
+          <w:sz w:val="32"/>
         </w:rPr>
         <w:t>1.2 美國國防部 (DoD) AI First 政策理念與經驗啟示</w:t>
       </w:r>
     </w:p>
     <w:p>
       <w:pPr>
-        <w:spacing w:before="0" w:after="120" w:line="312" w:lineRule="auto"/>
+        <w:spacing w:before="0" w:after="160" w:line="324" w:lineRule="auto"/>
       </w:pPr>
       <w:r>
         <w:rPr>
           <w:rFonts w:ascii="Arial" w:hAnsi="Arial" w:eastAsia="SimHei" w:cs="Arial"/>
           <w:color w:val="334155"/>
-          <w:sz w:val="22"/>
+          <w:sz w:val="28"/>
         </w:rPr>
         <w:t>美國國防部 (DoD) 為確保全球軍事與科技領導地位，已明確頒布「AI First」政策理念，將 AI 提升至國家安全戰略之核心柱石。DoD 設立數位與人工智慧長辦公室 (CDAO)，全面推動 Joint All-Domain Command and Control (JADC2) 全領域聯合指管架構，並透過數據、分析與 AI 進步指導方針，強調將 AI 技術深度嵌入各軍種作戰裝備與戰術決策程序中。美軍的經驗明確示範：AI 導入國防不能採取傳統資訊系統採購邏輯，必須建立嚴格的測試與評估 (T&amp;E) 體系、資料與模型溯源 (Data &amp; Model Provenance) 機制，以及可信賴的負責任 AI (RAI) 驗證流程。</w:t>
       </w:r>
@@ -372,27 +372,27 @@
     <w:p>
       <w:pPr>
         <w:pStyle w:val="Heading2"/>
-        <w:spacing w:before="200" w:after="120"/>
+        <w:spacing w:before="240" w:after="160"/>
       </w:pPr>
       <w:r>
         <w:rPr>
           <w:rFonts w:ascii="Arial" w:hAnsi="Arial" w:eastAsia="SimHei" w:cs="Arial"/>
           <w:b/>
           <w:color w:val="2563EB"/>
-          <w:sz w:val="29"/>
+          <w:sz w:val="32"/>
         </w:rPr>
         <w:t>1.3 台灣面對中國威脅與非對稱作戰 (Asymmetric Warfare) 態勢</w:t>
       </w:r>
     </w:p>
     <w:p>
       <w:pPr>
-        <w:spacing w:before="0" w:after="120" w:line="312" w:lineRule="auto"/>
+        <w:spacing w:before="0" w:after="160" w:line="324" w:lineRule="auto"/>
       </w:pPr>
       <w:r>
         <w:rPr>
           <w:rFonts w:ascii="Arial" w:hAnsi="Arial" w:eastAsia="SimHei" w:cs="Arial"/>
           <w:color w:val="334155"/>
-          <w:sz w:val="22"/>
+          <w:sz w:val="28"/>
         </w:rPr>
         <w:t>面對中國解放軍在海陸空天電各領域的強大軍事威脅與數量優勢，台灣在軍事防禦上必須堅定貫徹「非對稱作戰」(Asymmetric Warfare) 戰略。在兵力規模與傳統重型武器數量對比懸殊的態勢下，台灣無法也不應與敵進行消耗性常規戰。發揮「以小搏大、以智勝強」之非對稱優勢，核心關鍵即在於運用高密度、低成本、具備自主運算能力之 AI 無人化系統與地端防衛陣地，對敵形成多區域、多層次之區域拒止與封鎖 (A2/AD)。</w:t>
       </w:r>
@@ -408,7 +408,7 @@
           <w:rFonts w:ascii="Arial" w:hAnsi="Arial" w:eastAsia="SimHei" w:cs="Arial"/>
           <w:b/>
           <w:color w:val="0C2340"/>
-          <w:sz w:val="20"/>
+          <w:sz w:val="22"/>
         </w:rPr>
         <w:t xml:space="preserve">表 </w:t>
       </w:r>
@@ -418,7 +418,7 @@
           <w:rFonts w:ascii="Arial" w:hAnsi="Arial" w:eastAsia="SimHei" w:cs="Arial"/>
           <w:b/>
           <w:color w:val="0C2340"/>
-          <w:sz w:val="20"/>
+          <w:sz w:val="22"/>
         </w:rPr>
         <w:t>：傳統軍事戰術 vs. 非對稱 AI 戰術比較表</w:t>
       </w:r>
@@ -463,7 +463,7 @@
                 <w:rFonts w:ascii="Arial" w:hAnsi="Arial" w:eastAsia="SimHei" w:cs="Arial"/>
                 <w:b/>
                 <w:color w:val="FFFFFF"/>
-                <w:sz w:val="20"/>
+                <w:sz w:val="24"/>
               </w:rPr>
               <w:t>分析維度</w:t>
             </w:r>
@@ -489,7 +489,7 @@
                 <w:rFonts w:ascii="Arial" w:hAnsi="Arial" w:eastAsia="SimHei" w:cs="Arial"/>
                 <w:b/>
                 <w:color w:val="FFFFFF"/>
-                <w:sz w:val="20"/>
+                <w:sz w:val="24"/>
               </w:rPr>
               <w:t>傳統常規軍事戰術</w:t>
             </w:r>
@@ -515,7 +515,7 @@
                 <w:rFonts w:ascii="Arial" w:hAnsi="Arial" w:eastAsia="SimHei" w:cs="Arial"/>
                 <w:b/>
                 <w:color w:val="FFFFFF"/>
-                <w:sz w:val="20"/>
+                <w:sz w:val="24"/>
               </w:rPr>
               <w:t>非對稱 AI 戰術 (AIEC 標竿)</w:t>
             </w:r>
@@ -542,7 +542,7 @@
               <w:rPr>
                 <w:rFonts w:ascii="Arial" w:hAnsi="Arial" w:eastAsia="SimHei" w:cs="Arial"/>
                 <w:color w:val="1E293B"/>
-                <w:sz w:val="19"/>
+                <w:sz w:val="23"/>
               </w:rPr>
               <w:t>戰術思維與戰力表現</w:t>
             </w:r>
@@ -564,7 +564,7 @@
               <w:rPr>
                 <w:rFonts w:ascii="Arial" w:hAnsi="Arial" w:eastAsia="SimHei" w:cs="Arial"/>
                 <w:color w:val="1E293B"/>
-                <w:sz w:val="19"/>
+                <w:sz w:val="23"/>
               </w:rPr>
               <w:t>高度依賴常規大型載具與人力，戰力線性成長</w:t>
             </w:r>
@@ -586,7 +586,7 @@
               <w:rPr>
                 <w:rFonts w:ascii="Arial" w:hAnsi="Arial" w:eastAsia="SimHei" w:cs="Arial"/>
                 <w:color w:val="1E293B"/>
-                <w:sz w:val="19"/>
+                <w:sz w:val="23"/>
               </w:rPr>
               <w:t>兵力倍增器 (Force Multiplier)，彈性集群飽和打擊</w:t>
             </w:r>
@@ -613,7 +613,7 @@
               <w:rPr>
                 <w:rFonts w:ascii="Arial" w:hAnsi="Arial" w:eastAsia="SimHei" w:cs="Arial"/>
                 <w:color w:val="1E293B"/>
-                <w:sz w:val="19"/>
+                <w:sz w:val="23"/>
               </w:rPr>
               <w:t>擊殺鏈 (Kill Chain) 時延</w:t>
             </w:r>
@@ -635,7 +635,7 @@
               <w:rPr>
                 <w:rFonts w:ascii="Arial" w:hAnsi="Arial" w:eastAsia="SimHei" w:cs="Arial"/>
                 <w:color w:val="1E293B"/>
-                <w:sz w:val="19"/>
+                <w:sz w:val="23"/>
               </w:rPr>
               <w:t>人工判讀多源傳感器，反應時延數分鐘至數小時</w:t>
             </w:r>
@@ -657,7 +657,7 @@
               <w:rPr>
                 <w:rFonts w:ascii="Arial" w:hAnsi="Arial" w:eastAsia="SimHei" w:cs="Arial"/>
                 <w:color w:val="1E293B"/>
-                <w:sz w:val="19"/>
+                <w:sz w:val="23"/>
               </w:rPr>
               <w:t>AI 邊緣即時目標辨識與自動打擊提案，壓縮至秒級</w:t>
             </w:r>
@@ -684,7 +684,7 @@
               <w:rPr>
                 <w:rFonts w:ascii="Arial" w:hAnsi="Arial" w:eastAsia="SimHei" w:cs="Arial"/>
                 <w:color w:val="1E293B"/>
-                <w:sz w:val="19"/>
+                <w:sz w:val="23"/>
               </w:rPr>
               <w:t>人力風險與成本結構</w:t>
             </w:r>
@@ -706,7 +706,7 @@
               <w:rPr>
                 <w:rFonts w:ascii="Arial" w:hAnsi="Arial" w:eastAsia="SimHei" w:cs="Arial"/>
                 <w:color w:val="1E293B"/>
-                <w:sz w:val="19"/>
+                <w:sz w:val="23"/>
               </w:rPr>
               <w:t>人員傷亡風險高，高單價重型武器維護極為昂貴</w:t>
             </w:r>
@@ -728,7 +728,7 @@
               <w:rPr>
                 <w:rFonts w:ascii="Arial" w:hAnsi="Arial" w:eastAsia="SimHei" w:cs="Arial"/>
                 <w:color w:val="1E293B"/>
-                <w:sz w:val="19"/>
+                <w:sz w:val="23"/>
               </w:rPr>
               <w:t>無人化載具零傷亡，低成本可消耗性裝備具高防衛效益</w:t>
             </w:r>
@@ -755,7 +755,7 @@
               <w:rPr>
                 <w:rFonts w:ascii="Arial" w:hAnsi="Arial" w:eastAsia="SimHei" w:cs="Arial"/>
                 <w:color w:val="1E293B"/>
-                <w:sz w:val="19"/>
+                <w:sz w:val="23"/>
               </w:rPr>
               <w:t>資安與保密防護能力</w:t>
             </w:r>
@@ -777,7 +777,7 @@
               <w:rPr>
                 <w:rFonts w:ascii="Arial" w:hAnsi="Arial" w:eastAsia="SimHei" w:cs="Arial"/>
                 <w:color w:val="1E293B"/>
-                <w:sz w:val="19"/>
+                <w:sz w:val="23"/>
               </w:rPr>
               <w:t>傳統實體金鑰管理，設備俘獲易致演算法洩漏</w:t>
             </w:r>
@@ -799,7 +799,7 @@
               <w:rPr>
                 <w:rFonts w:ascii="Arial" w:hAnsi="Arial" w:eastAsia="SimHei" w:cs="Arial"/>
                 <w:color w:val="1E293B"/>
-                <w:sz w:val="19"/>
+                <w:sz w:val="23"/>
               </w:rPr>
               <w:t>網狀防篡改、邊緣模型 100ms 緊急自毀與零降密洩漏</w:t>
             </w:r>
@@ -810,41 +810,41 @@
     <w:p>
       <w:pPr>
         <w:pStyle w:val="Heading2"/>
-        <w:spacing w:before="200" w:after="120"/>
+        <w:spacing w:before="240" w:after="160"/>
       </w:pPr>
       <w:r>
         <w:rPr>
           <w:rFonts w:ascii="Arial" w:hAnsi="Arial" w:eastAsia="SimHei" w:cs="Arial"/>
           <w:b/>
           <w:color w:val="2563EB"/>
-          <w:sz w:val="29"/>
+          <w:sz w:val="32"/>
         </w:rPr>
         <w:t>1.4 無人化打擊載具應用：無人機、無人船、無人潛艦、無人車與機器狗</w:t>
       </w:r>
     </w:p>
     <w:p>
       <w:pPr>
-        <w:spacing w:before="0" w:after="120" w:line="312" w:lineRule="auto"/>
+        <w:spacing w:before="0" w:after="160" w:line="324" w:lineRule="auto"/>
       </w:pPr>
       <w:r>
         <w:rPr>
           <w:rFonts w:ascii="Arial" w:hAnsi="Arial" w:eastAsia="SimHei" w:cs="Arial"/>
           <w:color w:val="334155"/>
-          <w:sz w:val="22"/>
+          <w:sz w:val="28"/>
         </w:rPr>
         <w:t>在非對稱作戰體系中，五大無人化作戰載具構成立體防衛網的核心。本專案將全面導入 AI 評測 SOP 於下列載具系統：</w:t>
       </w:r>
     </w:p>
     <w:p>
       <w:pPr>
-        <w:spacing w:before="0" w:after="120" w:line="312" w:lineRule="auto"/>
+        <w:spacing w:before="0" w:after="160" w:line="324" w:lineRule="auto"/>
       </w:pPr>
       <w:r>
         <w:rPr>
           <w:rFonts w:ascii="Arial" w:hAnsi="Arial" w:eastAsia="SimHei" w:cs="Arial"/>
           <w:b/>
           <w:color w:val="0C2340"/>
-          <w:sz w:val="22"/>
+          <w:sz w:val="28"/>
         </w:rPr>
         <w:t>1. 無人機 (UAV) 蜂群戰術系統：</w:t>
       </w:r>
@@ -852,21 +852,21 @@
         <w:rPr>
           <w:rFonts w:ascii="Arial" w:hAnsi="Arial" w:eastAsia="SimHei" w:cs="Arial"/>
           <w:color w:val="334155"/>
-          <w:sz w:val="22"/>
+          <w:sz w:val="28"/>
         </w:rPr>
         <w:t>無人機 (UAV) 具備飛行航路自動規劃、邊緣視覺 (YOLO/Mobile SAM) 目標偵測、紅軍對抗擾動防禦與抗天候降質能力；於無 GPS 網狀環境下實施多機蜂群協同。</w:t>
       </w:r>
     </w:p>
     <w:p>
       <w:pPr>
-        <w:spacing w:before="0" w:after="120" w:line="312" w:lineRule="auto"/>
+        <w:spacing w:before="0" w:after="160" w:line="324" w:lineRule="auto"/>
       </w:pPr>
       <w:r>
         <w:rPr>
           <w:rFonts w:ascii="Arial" w:hAnsi="Arial" w:eastAsia="SimHei" w:cs="Arial"/>
           <w:b/>
           <w:color w:val="0C2340"/>
-          <w:sz w:val="22"/>
+          <w:sz w:val="28"/>
         </w:rPr>
         <w:t>2. 無人船 (USV) 與無人潛艦 (UUV) 海上封鎖系統：</w:t>
       </w:r>
@@ -874,21 +874,21 @@
         <w:rPr>
           <w:rFonts w:ascii="Arial" w:hAnsi="Arial" w:eastAsia="SimHei" w:cs="Arial"/>
           <w:color w:val="334155"/>
-          <w:sz w:val="22"/>
+          <w:sz w:val="28"/>
         </w:rPr>
         <w:t>無人船 (USV) 與無人潛艦 (UUV) 部署於台海周邊海域與潛艦航道，具備水面光學/雷達識別、水聲聲納特徵AI識別與自主巡航能力；嚴格遵循交戰規則 (RoE) 劃分。</w:t>
       </w:r>
     </w:p>
     <w:p>
       <w:pPr>
-        <w:spacing w:before="0" w:after="120" w:line="312" w:lineRule="auto"/>
+        <w:spacing w:before="0" w:after="160" w:line="324" w:lineRule="auto"/>
       </w:pPr>
       <w:r>
         <w:rPr>
           <w:rFonts w:ascii="Arial" w:hAnsi="Arial" w:eastAsia="SimHei" w:cs="Arial"/>
           <w:b/>
           <w:color w:val="0C2340"/>
-          <w:sz w:val="22"/>
+          <w:sz w:val="28"/>
         </w:rPr>
         <w:t>3. 無人車 (UGV) 與戰術機器狗 (Robotic Dogs) 陸戰系統：</w:t>
       </w:r>
@@ -896,7 +896,7 @@
         <w:rPr>
           <w:rFonts w:ascii="Arial" w:hAnsi="Arial" w:eastAsia="SimHei" w:cs="Arial"/>
           <w:color w:val="334155"/>
-          <w:sz w:val="22"/>
+          <w:sz w:val="28"/>
         </w:rPr>
         <w:t>無人車 (UGV) 與機器狗 (Robotic Dogs) 用於灘岸防衛、巷戰偵察與設施巡邏。具備複雜地形動態避障、熱成像目標歸因 (Point Game) 與遭敵俘獲時 &lt;100ms 硬體模型自毀零化保護。</w:t>
       </w:r>
@@ -904,41 +904,41 @@
     <w:p>
       <w:pPr>
         <w:pStyle w:val="Heading2"/>
-        <w:spacing w:before="200" w:after="120"/>
+        <w:spacing w:before="240" w:after="160"/>
       </w:pPr>
       <w:r>
         <w:rPr>
           <w:rFonts w:ascii="Arial" w:hAnsi="Arial" w:eastAsia="SimHei" w:cs="Arial"/>
           <w:b/>
           <w:color w:val="2563EB"/>
-          <w:sz w:val="29"/>
+          <w:sz w:val="32"/>
         </w:rPr>
         <w:t>1.5 實現「可靠、可信任、可解釋、可當責」之國防 AI</w:t>
       </w:r>
     </w:p>
     <w:p>
       <w:pPr>
-        <w:spacing w:before="0" w:after="120" w:line="312" w:lineRule="auto"/>
+        <w:spacing w:before="0" w:after="160" w:line="324" w:lineRule="auto"/>
       </w:pPr>
       <w:r>
         <w:rPr>
           <w:rFonts w:ascii="Arial" w:hAnsi="Arial" w:eastAsia="SimHei" w:cs="Arial"/>
           <w:color w:val="334155"/>
-          <w:sz w:val="22"/>
+          <w:sz w:val="28"/>
         </w:rPr>
         <w:t>軍事作戰容錯率為零。AI 系統若出現誤判、對抗擾動崩潰或黑盒子無解釋決策，將引發災難性戰術後果。本專案導入 AIEC 評測體系，旨在達成四大核心目標：</w:t>
       </w:r>
     </w:p>
     <w:p>
       <w:pPr>
-        <w:spacing w:before="0" w:after="120" w:line="312" w:lineRule="auto"/>
+        <w:spacing w:before="0" w:after="160" w:line="324" w:lineRule="auto"/>
       </w:pPr>
       <w:r>
         <w:rPr>
           <w:rFonts w:ascii="Arial" w:hAnsi="Arial" w:eastAsia="SimHei" w:cs="Arial"/>
           <w:b/>
           <w:color w:val="0C2340"/>
-          <w:sz w:val="22"/>
+          <w:sz w:val="28"/>
         </w:rPr>
         <w:t>• 可靠 (Reliable)：</w:t>
       </w:r>
@@ -946,21 +946,21 @@
         <w:rPr>
           <w:rFonts w:ascii="Arial" w:hAnsi="Arial" w:eastAsia="SimHei" w:cs="Arial"/>
           <w:color w:val="334155"/>
-          <w:sz w:val="22"/>
+          <w:sz w:val="28"/>
         </w:rPr>
         <w:t>系統遭受敵方對抗貼片、電戰雜訊或惡劣天候時，仍維持 90% 以上識別精確度 (Q1, Q2)。</w:t>
       </w:r>
     </w:p>
     <w:p>
       <w:pPr>
-        <w:spacing w:before="0" w:after="120" w:line="312" w:lineRule="auto"/>
+        <w:spacing w:before="0" w:after="160" w:line="324" w:lineRule="auto"/>
       </w:pPr>
       <w:r>
         <w:rPr>
           <w:rFonts w:ascii="Arial" w:hAnsi="Arial" w:eastAsia="SimHei" w:cs="Arial"/>
           <w:b/>
           <w:color w:val="0C2340"/>
-          <w:sz w:val="22"/>
+          <w:sz w:val="28"/>
         </w:rPr>
         <w:t>• 可信任 (Trustworthy)：</w:t>
       </w:r>
@@ -968,21 +968,21 @@
         <w:rPr>
           <w:rFonts w:ascii="Arial" w:hAnsi="Arial" w:eastAsia="SimHei" w:cs="Arial"/>
           <w:color w:val="334155"/>
-          <w:sz w:val="22"/>
+          <w:sz w:val="28"/>
         </w:rPr>
         <w:t>指揮官了解模型信心分數 (Confidence Score)，期望校準誤差 ECE ≤ 0.05，防止盲目過度信任 (Q5)。</w:t>
       </w:r>
     </w:p>
     <w:p>
       <w:pPr>
-        <w:spacing w:before="0" w:after="120" w:line="312" w:lineRule="auto"/>
+        <w:spacing w:before="0" w:after="160" w:line="324" w:lineRule="auto"/>
       </w:pPr>
       <w:r>
         <w:rPr>
           <w:rFonts w:ascii="Arial" w:hAnsi="Arial" w:eastAsia="SimHei" w:cs="Arial"/>
           <w:b/>
           <w:color w:val="0C2340"/>
-          <w:sz w:val="22"/>
+          <w:sz w:val="28"/>
         </w:rPr>
         <w:t>• 可解釋 (Explainable)：</w:t>
       </w:r>
@@ -990,21 +990,21 @@
         <w:rPr>
           <w:rFonts w:ascii="Arial" w:hAnsi="Arial" w:eastAsia="SimHei" w:cs="Arial"/>
           <w:color w:val="334155"/>
-          <w:sz w:val="22"/>
+          <w:sz w:val="28"/>
         </w:rPr>
         <w:t>白箱評測提供 XAI 特徵歸因熱力圖與 Point Game 得分 (≥ 0.85)，使指揮官能明瞭 AI 提案邏輯 (Q7)。</w:t>
       </w:r>
     </w:p>
     <w:p>
       <w:pPr>
-        <w:spacing w:before="0" w:after="120" w:line="312" w:lineRule="auto"/>
+        <w:spacing w:before="0" w:after="160" w:line="324" w:lineRule="auto"/>
       </w:pPr>
       <w:r>
         <w:rPr>
           <w:rFonts w:ascii="Arial" w:hAnsi="Arial" w:eastAsia="SimHei" w:cs="Arial"/>
           <w:b/>
           <w:color w:val="0C2340"/>
-          <w:sz w:val="22"/>
+          <w:sz w:val="28"/>
         </w:rPr>
         <w:t>• 可當責 (Accountable)：</w:t>
       </w:r>
@@ -1012,7 +1012,7 @@
         <w:rPr>
           <w:rFonts w:ascii="Arial" w:hAnsi="Arial" w:eastAsia="SimHei" w:cs="Arial"/>
           <w:color w:val="334155"/>
-          <w:sz w:val="22"/>
+          <w:sz w:val="28"/>
         </w:rPr>
         <w:t>落實 Data &amp; Model Provenance 完整溯源與高保真日誌保存，明確劃分 RoE 人機授權責任 (HITL/HOTL)。</w:t>
       </w:r>
@@ -1020,27 +1020,27 @@
     <w:p>
       <w:pPr>
         <w:pStyle w:val="Heading2"/>
-        <w:spacing w:before="200" w:after="120"/>
+        <w:spacing w:before="240" w:after="160"/>
       </w:pPr>
       <w:r>
         <w:rPr>
           <w:rFonts w:ascii="Arial" w:hAnsi="Arial" w:eastAsia="SimHei" w:cs="Arial"/>
           <w:b/>
           <w:color w:val="2563EB"/>
-          <w:sz w:val="29"/>
+          <w:sz w:val="32"/>
         </w:rPr>
         <w:t>1.6 適合台灣本土環境落地方案：為什麼要做、如何做、怎麼樣做</w:t>
       </w:r>
     </w:p>
     <w:p>
       <w:pPr>
-        <w:spacing w:before="0" w:after="120" w:line="312" w:lineRule="auto"/>
+        <w:spacing w:before="0" w:after="160" w:line="324" w:lineRule="auto"/>
       </w:pPr>
       <w:r>
         <w:rPr>
           <w:rFonts w:ascii="Arial" w:hAnsi="Arial" w:eastAsia="SimHei" w:cs="Arial"/>
           <w:color w:val="334155"/>
-          <w:sz w:val="22"/>
+          <w:sz w:val="28"/>
         </w:rPr>
         <w:t>為什麼我們必須做？因為面對敵方龐大威脅與資安滲透，台灣絕不能依賴未經確效之商業 AI 或國外雲端 API。我們如何做？由國家中山科學研究院 (NCSIST) 主導主權算力與 AIEC 評測中心，結合國家級民雄院區 100% 地端實體隔離 (Air-Gapped) 主權算力，建立通用國際標準 (ISO 42001) 與國防放行閘門 (TRL) 之雙支柱機制。怎麼樣做最適合台灣環境？實施聯邦學習 (Federated Learning)「模型移動，資料不動」，保護各雷達站與陣地敏感數據，並於戰術邊緣部署硬體防篡改與 &lt;100ms 物理零化自毀，達成極致保密與戰術自主。</w:t>
       </w:r>
@@ -1053,7 +1053,7 @@
     <w:p>
       <w:pPr>
         <w:pStyle w:val="Heading1"/>
-        <w:spacing w:before="280" w:after="120"/>
+        <w:spacing w:before="320" w:after="160"/>
       </w:pPr>
       <w:r>
         <w:rPr>
@@ -1068,27 +1068,27 @@
     <w:p>
       <w:pPr>
         <w:pStyle w:val="Heading2"/>
-        <w:spacing w:before="200" w:after="120"/>
+        <w:spacing w:before="240" w:after="160"/>
       </w:pPr>
       <w:r>
         <w:rPr>
           <w:rFonts w:ascii="Arial" w:hAnsi="Arial" w:eastAsia="SimHei" w:cs="Arial"/>
           <w:b/>
           <w:color w:val="2563EB"/>
-          <w:sz w:val="29"/>
+          <w:sz w:val="32"/>
         </w:rPr>
         <w:t>2.1 第一部分：治理與標準 (Governance &amp; Standards)</w:t>
       </w:r>
     </w:p>
     <w:p>
       <w:pPr>
-        <w:spacing w:before="0" w:after="120" w:line="312" w:lineRule="auto"/>
+        <w:spacing w:before="0" w:after="160" w:line="324" w:lineRule="auto"/>
       </w:pPr>
       <w:r>
         <w:rPr>
           <w:rFonts w:ascii="Arial" w:hAnsi="Arial" w:eastAsia="SimHei" w:cs="Arial"/>
           <w:color w:val="334155"/>
-          <w:sz w:val="22"/>
+          <w:sz w:val="28"/>
         </w:rPr>
         <w:t>第一部分建立國防 AI 應用的制度安全底座。融合國際標準 ISO 42001 (AIMS) 與國家級 NCSIST AIEC 總體藍圖，劃分 ISO 通用方法論與國防 AIEC TRL 戰術放行閘門。導入 SHIELD 六大治理生命週期 (Set, Hone, Improve, Evaluate, Log, Detect)，對齊 CMMC Level 2 資安標準，並針對 RAG 系統建立向量 RBAC 標籤動態遮罩，達到零降密洩漏。同時明訂 RoE 交戰規則三階人機授權邊界。</w:t>
       </w:r>
@@ -1104,7 +1104,7 @@
           <w:rFonts w:ascii="Arial" w:hAnsi="Arial" w:eastAsia="SimHei" w:cs="Arial"/>
           <w:b/>
           <w:color w:val="0C2340"/>
-          <w:sz w:val="20"/>
+          <w:sz w:val="22"/>
         </w:rPr>
         <w:t xml:space="preserve">表 </w:t>
       </w:r>
@@ -1114,7 +1114,7 @@
           <w:rFonts w:ascii="Arial" w:hAnsi="Arial" w:eastAsia="SimHei" w:cs="Arial"/>
           <w:b/>
           <w:color w:val="0C2340"/>
-          <w:sz w:val="20"/>
+          <w:sz w:val="22"/>
         </w:rPr>
         <w:t>：ISO 42001 (AIMS) 通用標準 vs. AIEC 國防權責分工比較表</w:t>
       </w:r>
@@ -1159,7 +1159,7 @@
                 <w:rFonts w:ascii="Arial" w:hAnsi="Arial" w:eastAsia="SimHei" w:cs="Arial"/>
                 <w:b/>
                 <w:color w:val="FFFFFF"/>
-                <w:sz w:val="20"/>
+                <w:sz w:val="24"/>
               </w:rPr>
               <w:t>控制維度</w:t>
             </w:r>
@@ -1185,7 +1185,7 @@
                 <w:rFonts w:ascii="Arial" w:hAnsi="Arial" w:eastAsia="SimHei" w:cs="Arial"/>
                 <w:b/>
                 <w:color w:val="FFFFFF"/>
-                <w:sz w:val="20"/>
+                <w:sz w:val="24"/>
               </w:rPr>
               <w:t>ISO 42001 (AIMS) 國際標準</w:t>
             </w:r>
@@ -1211,7 +1211,7 @@
                 <w:rFonts w:ascii="Arial" w:hAnsi="Arial" w:eastAsia="SimHei" w:cs="Arial"/>
                 <w:b/>
                 <w:color w:val="FFFFFF"/>
-                <w:sz w:val="20"/>
+                <w:sz w:val="24"/>
               </w:rPr>
               <w:t>AIEC 國防領域特化審查閘門</w:t>
             </w:r>
@@ -1238,7 +1238,7 @@
               <w:rPr>
                 <w:rFonts w:ascii="Arial" w:hAnsi="Arial" w:eastAsia="SimHei" w:cs="Arial"/>
                 <w:color w:val="1E293B"/>
-                <w:sz w:val="19"/>
+                <w:sz w:val="23"/>
               </w:rPr>
               <w:t>管理範疇與目標</w:t>
             </w:r>
@@ -1260,7 +1260,7 @@
               <w:rPr>
                 <w:rFonts w:ascii="Arial" w:hAnsi="Arial" w:eastAsia="SimHei" w:cs="Arial"/>
                 <w:color w:val="1E293B"/>
-                <w:sz w:val="19"/>
+                <w:sz w:val="23"/>
               </w:rPr>
               <w:t>企業民用 AI 風險評估與品質管理體系 (AIIA)</w:t>
             </w:r>
@@ -1282,7 +1282,7 @@
               <w:rPr>
                 <w:rFonts w:ascii="Arial" w:hAnsi="Arial" w:eastAsia="SimHei" w:cs="Arial"/>
                 <w:color w:val="1E293B"/>
-                <w:sz w:val="19"/>
+                <w:sz w:val="23"/>
               </w:rPr>
               <w:t>武器系統、C2 指管與無人載具 TRL 戰術放行審查</w:t>
             </w:r>
@@ -1309,7 +1309,7 @@
               <w:rPr>
                 <w:rFonts w:ascii="Arial" w:hAnsi="Arial" w:eastAsia="SimHei" w:cs="Arial"/>
                 <w:color w:val="1E293B"/>
-                <w:sz w:val="19"/>
+                <w:sz w:val="23"/>
               </w:rPr>
               <w:t>對抗防禦與安全</w:t>
             </w:r>
@@ -1331,7 +1331,7 @@
               <w:rPr>
                 <w:rFonts w:ascii="Arial" w:hAnsi="Arial" w:eastAsia="SimHei" w:cs="Arial"/>
                 <w:color w:val="1E293B"/>
-                <w:sz w:val="19"/>
+                <w:sz w:val="23"/>
               </w:rPr>
               <w:t>Annex A.7 規範防範資料污染與基本資安控制</w:t>
             </w:r>
@@ -1353,7 +1353,7 @@
               <w:rPr>
                 <w:rFonts w:ascii="Arial" w:hAnsi="Arial" w:eastAsia="SimHei" w:cs="Arial"/>
                 <w:color w:val="1E293B"/>
-                <w:sz w:val="19"/>
+                <w:sz w:val="23"/>
               </w:rPr>
               <w:t>MITRE ATLAS 16大戰術演練、Cyber Range 與 &lt;100ms 硬體自毀</w:t>
             </w:r>
@@ -1380,7 +1380,7 @@
               <w:rPr>
                 <w:rFonts w:ascii="Arial" w:hAnsi="Arial" w:eastAsia="SimHei" w:cs="Arial"/>
                 <w:color w:val="1E293B"/>
-                <w:sz w:val="19"/>
+                <w:sz w:val="23"/>
               </w:rPr>
               <w:t>透明度與當責</w:t>
             </w:r>
@@ -1402,7 +1402,7 @@
               <w:rPr>
                 <w:rFonts w:ascii="Arial" w:hAnsi="Arial" w:eastAsia="SimHei" w:cs="Arial"/>
                 <w:color w:val="1E293B"/>
-                <w:sz w:val="19"/>
+                <w:sz w:val="23"/>
               </w:rPr>
               <w:t>Clause 8.4 要求提供基本 AI 說明與利害關係人說明</w:t>
             </w:r>
@@ -1424,7 +1424,7 @@
               <w:rPr>
                 <w:rFonts w:ascii="Arial" w:hAnsi="Arial" w:eastAsia="SimHei" w:cs="Arial"/>
                 <w:color w:val="1E293B"/>
-                <w:sz w:val="19"/>
+                <w:sz w:val="23"/>
               </w:rPr>
               <w:t>Point Game 得分 ≥ 0.85 白箱歸因熱力圖、RoE 授權與 Data Provenance</w:t>
             </w:r>
@@ -1443,7 +1443,7 @@
           <w:rFonts w:ascii="Arial" w:hAnsi="Arial" w:eastAsia="SimHei" w:cs="Arial"/>
           <w:b/>
           <w:color w:val="0C2340"/>
-          <w:sz w:val="20"/>
+          <w:sz w:val="22"/>
         </w:rPr>
         <w:t xml:space="preserve">表 </w:t>
       </w:r>
@@ -1453,7 +1453,7 @@
           <w:rFonts w:ascii="Arial" w:hAnsi="Arial" w:eastAsia="SimHei" w:cs="Arial"/>
           <w:b/>
           <w:color w:val="0C2340"/>
-          <w:sz w:val="20"/>
+          <w:sz w:val="22"/>
         </w:rPr>
         <w:t>：交戰規則 (RoE) 人機授權三階權能邊界比較表 (HITL / HOTL / HOOTL)</w:t>
       </w:r>
@@ -1499,7 +1499,7 @@
                 <w:rFonts w:ascii="Arial" w:hAnsi="Arial" w:eastAsia="SimHei" w:cs="Arial"/>
                 <w:b/>
                 <w:color w:val="FFFFFF"/>
-                <w:sz w:val="19"/>
+                <w:sz w:val="23"/>
               </w:rPr>
               <w:t>授權階層 (RoE Tier)</w:t>
             </w:r>
@@ -1525,7 +1525,7 @@
                 <w:rFonts w:ascii="Arial" w:hAnsi="Arial" w:eastAsia="SimHei" w:cs="Arial"/>
                 <w:b/>
                 <w:color w:val="FFFFFF"/>
-                <w:sz w:val="19"/>
+                <w:sz w:val="23"/>
               </w:rPr>
               <w:t>人類角色 (Human Role)</w:t>
             </w:r>
@@ -1551,7 +1551,7 @@
                 <w:rFonts w:ascii="Arial" w:hAnsi="Arial" w:eastAsia="SimHei" w:cs="Arial"/>
                 <w:b/>
                 <w:color w:val="FFFFFF"/>
-                <w:sz w:val="19"/>
+                <w:sz w:val="23"/>
               </w:rPr>
               <w:t>AI 系統權能範圍</w:t>
             </w:r>
@@ -1577,7 +1577,7 @@
                 <w:rFonts w:ascii="Arial" w:hAnsi="Arial" w:eastAsia="SimHei" w:cs="Arial"/>
                 <w:b/>
                 <w:color w:val="FFFFFF"/>
-                <w:sz w:val="19"/>
+                <w:sz w:val="23"/>
               </w:rPr>
               <w:t>適用國防戰術情境</w:t>
             </w:r>
@@ -1604,7 +1604,7 @@
               <w:rPr>
                 <w:rFonts w:ascii="Arial" w:hAnsi="Arial" w:eastAsia="SimHei" w:cs="Arial"/>
                 <w:color w:val="1E293B"/>
-                <w:sz w:val="18"/>
+                <w:sz w:val="22"/>
               </w:rPr>
               <w:t>HITL (人在紐中)</w:t>
             </w:r>
@@ -1626,7 +1626,7 @@
               <w:rPr>
                 <w:rFonts w:ascii="Arial" w:hAnsi="Arial" w:eastAsia="SimHei" w:cs="Arial"/>
                 <w:color w:val="1E293B"/>
-                <w:sz w:val="18"/>
+                <w:sz w:val="22"/>
               </w:rPr>
               <w:t>最終打擊與開火決策者</w:t>
             </w:r>
@@ -1648,7 +1648,7 @@
               <w:rPr>
                 <w:rFonts w:ascii="Arial" w:hAnsi="Arial" w:eastAsia="SimHei" w:cs="Arial"/>
                 <w:color w:val="1E293B"/>
-                <w:sz w:val="18"/>
+                <w:sz w:val="22"/>
               </w:rPr>
               <w:t>僅提供目標自動識別與 COA 行動方案建議，無發射權限</w:t>
             </w:r>
@@ -1670,7 +1670,7 @@
               <w:rPr>
                 <w:rFonts w:ascii="Arial" w:hAnsi="Arial" w:eastAsia="SimHei" w:cs="Arial"/>
                 <w:color w:val="1E293B"/>
-                <w:sz w:val="18"/>
+                <w:sz w:val="22"/>
               </w:rPr>
               <w:t>飛彈陣地、致傷性武器打擊、高機密情報處置</w:t>
             </w:r>
@@ -1697,7 +1697,7 @@
               <w:rPr>
                 <w:rFonts w:ascii="Arial" w:hAnsi="Arial" w:eastAsia="SimHei" w:cs="Arial"/>
                 <w:color w:val="1E293B"/>
-                <w:sz w:val="18"/>
+                <w:sz w:val="22"/>
               </w:rPr>
               <w:t>HOTL (人在紐上)</w:t>
             </w:r>
@@ -1719,7 +1719,7 @@
               <w:rPr>
                 <w:rFonts w:ascii="Arial" w:hAnsi="Arial" w:eastAsia="SimHei" w:cs="Arial"/>
                 <w:color w:val="1E293B"/>
-                <w:sz w:val="18"/>
+                <w:sz w:val="22"/>
               </w:rPr>
               <w:t>實時監控者與斷路接管者</w:t>
             </w:r>
@@ -1741,7 +1741,7 @@
               <w:rPr>
                 <w:rFonts w:ascii="Arial" w:hAnsi="Arial" w:eastAsia="SimHei" w:cs="Arial"/>
                 <w:color w:val="1E293B"/>
-                <w:sz w:val="18"/>
+                <w:sz w:val="22"/>
               </w:rPr>
               <w:t>自主執行尋標與防空追蹤，人類具備微秒級強制中斷權</w:t>
             </w:r>
@@ -1763,7 +1763,7 @@
               <w:rPr>
                 <w:rFonts w:ascii="Arial" w:hAnsi="Arial" w:eastAsia="SimHei" w:cs="Arial"/>
                 <w:color w:val="1E293B"/>
-                <w:sz w:val="18"/>
+                <w:sz w:val="22"/>
               </w:rPr>
               <w:t>無人機蜂群對抗干擾、海面無人船自動攔截與巡航</w:t>
             </w:r>
@@ -1790,7 +1790,7 @@
               <w:rPr>
                 <w:rFonts w:ascii="Arial" w:hAnsi="Arial" w:eastAsia="SimHei" w:cs="Arial"/>
                 <w:color w:val="1E293B"/>
-                <w:sz w:val="18"/>
+                <w:sz w:val="22"/>
               </w:rPr>
               <w:t>HOOTL (完全自主)</w:t>
             </w:r>
@@ -1812,7 +1812,7 @@
               <w:rPr>
                 <w:rFonts w:ascii="Arial" w:hAnsi="Arial" w:eastAsia="SimHei" w:cs="Arial"/>
                 <w:color w:val="1E293B"/>
-                <w:sz w:val="18"/>
+                <w:sz w:val="22"/>
               </w:rPr>
               <w:t>系統範疇設定者</w:t>
             </w:r>
@@ -1834,7 +1834,7 @@
               <w:rPr>
                 <w:rFonts w:ascii="Arial" w:hAnsi="Arial" w:eastAsia="SimHei" w:cs="Arial"/>
                 <w:color w:val="1E293B"/>
-                <w:sz w:val="18"/>
+                <w:sz w:val="22"/>
               </w:rPr>
               <w:t>全自主執行戰術巡航、動態避障與電子偵察</w:t>
             </w:r>
@@ -1856,7 +1856,7 @@
               <w:rPr>
                 <w:rFonts w:ascii="Arial" w:hAnsi="Arial" w:eastAsia="SimHei" w:cs="Arial"/>
                 <w:color w:val="1E293B"/>
-                <w:sz w:val="18"/>
+                <w:sz w:val="22"/>
               </w:rPr>
               <w:t>無人車區域巡邏、戰術機器狗地形探勘、無密級偵察</w:t>
             </w:r>
@@ -1915,7 +1915,7 @@
           <w:rFonts w:ascii="Arial" w:hAnsi="Arial" w:eastAsia="SimHei" w:cs="Arial"/>
           <w:b/>
           <w:color w:val="0C2340"/>
-          <w:sz w:val="20"/>
+          <w:sz w:val="22"/>
         </w:rPr>
         <w:t xml:space="preserve">圖 </w:t>
       </w:r>
@@ -1925,7 +1925,7 @@
           <w:rFonts w:ascii="Arial" w:hAnsi="Arial" w:eastAsia="SimHei" w:cs="Arial"/>
           <w:b/>
           <w:color w:val="0C2340"/>
-          <w:sz w:val="20"/>
+          <w:sz w:val="22"/>
         </w:rPr>
         <w:t>：AIEC 國防 AI 評測五大階段標準流程圖 (Nano Banana pro 生成)</w:t>
       </w:r>
@@ -1933,27 +1933,27 @@
     <w:p>
       <w:pPr>
         <w:pStyle w:val="Heading2"/>
-        <w:spacing w:before="200" w:after="120"/>
+        <w:spacing w:before="240" w:after="160"/>
       </w:pPr>
       <w:r>
         <w:rPr>
           <w:rFonts w:ascii="Arial" w:hAnsi="Arial" w:eastAsia="SimHei" w:cs="Arial"/>
           <w:b/>
           <w:color w:val="2563EB"/>
-          <w:sz w:val="29"/>
+          <w:sz w:val="32"/>
         </w:rPr>
         <w:t>2.2 第二部分：矩陣與架構 (Matrix &amp; Architecture)</w:t>
       </w:r>
     </w:p>
     <w:p>
       <w:pPr>
-        <w:spacing w:before="0" w:after="120" w:line="312" w:lineRule="auto"/>
+        <w:spacing w:before="0" w:after="160" w:line="324" w:lineRule="auto"/>
       </w:pPr>
       <w:r>
         <w:rPr>
           <w:rFonts w:ascii="Arial" w:hAnsi="Arial" w:eastAsia="SimHei" w:cs="Arial"/>
           <w:color w:val="334155"/>
-          <w:sz w:val="22"/>
+          <w:sz w:val="28"/>
         </w:rPr>
         <w:t>第二部分建立技術評測方法論與量化指標。導入 DoD CDAO Level 1~4 T&amp;E 階梯、JATIC 7 大共通構面（穩健性、韌性、可解釋性、勝任力、公平性、信任校準、漂移監控），並定義 6 大評測方法論（黑箱、白箱、基準測試、紅軍演練、專家評估、持續監控）。建立包含 Q1~Q15 15 項量化指標之 PASS 門檻矩陣，並整合 Security (ATLAS 對抗防禦與自毀)、Confidentiality (地端實體隔離與聯邦學習) 與 Auditing (Data/Model Provenance 溯源與 XAI) 之三維縱深聯防矩陣。</w:t>
       </w:r>
@@ -1969,7 +1969,7 @@
           <w:rFonts w:ascii="Arial" w:hAnsi="Arial" w:eastAsia="SimHei" w:cs="Arial"/>
           <w:b/>
           <w:color w:val="0C2340"/>
-          <w:sz w:val="20"/>
+          <w:sz w:val="22"/>
         </w:rPr>
         <w:t xml:space="preserve">表 </w:t>
       </w:r>
@@ -1979,7 +1979,7 @@
           <w:rFonts w:ascii="Arial" w:hAnsi="Arial" w:eastAsia="SimHei" w:cs="Arial"/>
           <w:b/>
           <w:color w:val="0C2340"/>
-          <w:sz w:val="20"/>
+          <w:sz w:val="22"/>
         </w:rPr>
         <w:t>：AIEC 15 項量化評測指標 (Q1~Q15) 與合格門檻對照總表</w:t>
       </w:r>
@@ -2025,7 +2025,7 @@
                 <w:rFonts w:ascii="Arial" w:hAnsi="Arial" w:eastAsia="SimHei" w:cs="Arial"/>
                 <w:b/>
                 <w:color w:val="FFFFFF"/>
-                <w:sz w:val="19"/>
+                <w:sz w:val="22"/>
               </w:rPr>
               <w:t>編號</w:t>
             </w:r>
@@ -2051,7 +2051,7 @@
                 <w:rFonts w:ascii="Arial" w:hAnsi="Arial" w:eastAsia="SimHei" w:cs="Arial"/>
                 <w:b/>
                 <w:color w:val="FFFFFF"/>
-                <w:sz w:val="19"/>
+                <w:sz w:val="22"/>
               </w:rPr>
               <w:t>指標名稱 (英文縮寫)</w:t>
             </w:r>
@@ -2077,7 +2077,7 @@
                 <w:rFonts w:ascii="Arial" w:hAnsi="Arial" w:eastAsia="SimHei" w:cs="Arial"/>
                 <w:b/>
                 <w:color w:val="FFFFFF"/>
-                <w:sz w:val="19"/>
+                <w:sz w:val="22"/>
               </w:rPr>
               <w:t>量化合格判定門檻 (PASS Threshold)</w:t>
             </w:r>
@@ -2103,7 +2103,7 @@
                 <w:rFonts w:ascii="Arial" w:hAnsi="Arial" w:eastAsia="SimHei" w:cs="Arial"/>
                 <w:b/>
                 <w:color w:val="FFFFFF"/>
-                <w:sz w:val="19"/>
+                <w:sz w:val="22"/>
               </w:rPr>
               <w:t>代表性驗測工具鏈</w:t>
             </w:r>
@@ -2130,7 +2130,7 @@
               <w:rPr>
                 <w:rFonts w:ascii="Arial" w:hAnsi="Arial" w:eastAsia="SimHei" w:cs="Arial"/>
                 <w:color w:val="1E293B"/>
-                <w:sz w:val="17"/>
+                <w:sz w:val="20"/>
               </w:rPr>
               <w:t>Q1</w:t>
             </w:r>
@@ -2152,7 +2152,7 @@
               <w:rPr>
                 <w:rFonts w:ascii="Arial" w:hAnsi="Arial" w:eastAsia="SimHei" w:cs="Arial"/>
                 <w:color w:val="1E293B"/>
-                <w:sz w:val="17"/>
+                <w:sz w:val="20"/>
               </w:rPr>
               <w:t>對抗韌性維持率 (Adversarial Robustness)</w:t>
             </w:r>
@@ -2177,7 +2177,7 @@
               <w:rPr>
                 <w:rFonts w:ascii="Arial" w:hAnsi="Arial" w:eastAsia="SimHei" w:cs="Arial"/>
                 <w:color w:val="1E293B"/>
-                <w:sz w:val="17"/>
+                <w:sz w:val="20"/>
               </w:rPr>
               <w:t>Acc_adv / Acc_clean ≥ 0.90 (ε ≤ 0.05)</w:t>
             </w:r>
@@ -2199,7 +2199,7 @@
               <w:rPr>
                 <w:rFonts w:ascii="Arial" w:hAnsi="Arial" w:eastAsia="SimHei" w:cs="Arial"/>
                 <w:color w:val="1E293B"/>
-                <w:sz w:val="17"/>
+                <w:sz w:val="20"/>
               </w:rPr>
               <w:t>IBM ART 360, HEART, FGSM, PGD</w:t>
             </w:r>
@@ -2226,7 +2226,7 @@
               <w:rPr>
                 <w:rFonts w:ascii="Arial" w:hAnsi="Arial" w:eastAsia="SimHei" w:cs="Arial"/>
                 <w:color w:val="1E293B"/>
-                <w:sz w:val="17"/>
+                <w:sz w:val="20"/>
               </w:rPr>
               <w:t>Q2</w:t>
             </w:r>
@@ -2248,7 +2248,7 @@
               <w:rPr>
                 <w:rFonts w:ascii="Arial" w:hAnsi="Arial" w:eastAsia="SimHei" w:cs="Arial"/>
                 <w:color w:val="1E293B"/>
-                <w:sz w:val="17"/>
+                <w:sz w:val="20"/>
               </w:rPr>
               <w:t>自然穩健性衰減 (Natural Robustness)</w:t>
             </w:r>
@@ -2273,7 +2273,7 @@
               <w:rPr>
                 <w:rFonts w:ascii="Arial" w:hAnsi="Arial" w:eastAsia="SimHei" w:cs="Arial"/>
                 <w:color w:val="1E293B"/>
-                <w:sz w:val="17"/>
+                <w:sz w:val="20"/>
               </w:rPr>
               <w:t>ΔmAP = (mAP_clean - mAP_noise) / mAP_clean ≤ 0.10</w:t>
             </w:r>
@@ -2295,7 +2295,7 @@
               <w:rPr>
                 <w:rFonts w:ascii="Arial" w:hAnsi="Arial" w:eastAsia="SimHei" w:cs="Arial"/>
                 <w:color w:val="1E293B"/>
-                <w:sz w:val="17"/>
+                <w:sz w:val="20"/>
               </w:rPr>
               <w:t>NRTK Toolkit, ImageNet-C</w:t>
             </w:r>
@@ -2322,7 +2322,7 @@
               <w:rPr>
                 <w:rFonts w:ascii="Arial" w:hAnsi="Arial" w:eastAsia="SimHei" w:cs="Arial"/>
                 <w:color w:val="1E293B"/>
-                <w:sz w:val="17"/>
+                <w:sz w:val="20"/>
               </w:rPr>
               <w:t>Q3</w:t>
             </w:r>
@@ -2344,7 +2344,7 @@
               <w:rPr>
                 <w:rFonts w:ascii="Arial" w:hAnsi="Arial" w:eastAsia="SimHei" w:cs="Arial"/>
                 <w:color w:val="1E293B"/>
-                <w:sz w:val="17"/>
+                <w:sz w:val="20"/>
               </w:rPr>
               <w:t>任務完成率 (Mission Success Rate)</w:t>
             </w:r>
@@ -2369,7 +2369,7 @@
               <w:rPr>
                 <w:rFonts w:ascii="Arial" w:hAnsi="Arial" w:eastAsia="SimHei" w:cs="Arial"/>
                 <w:color w:val="1E293B"/>
-                <w:sz w:val="17"/>
+                <w:sz w:val="20"/>
               </w:rPr>
               <w:t>MSR = Success Count / N ≥ 0.95 (N=100)</w:t>
             </w:r>
@@ -2391,7 +2391,7 @@
               <w:rPr>
                 <w:rFonts w:ascii="Arial" w:hAnsi="Arial" w:eastAsia="SimHei" w:cs="Arial"/>
                 <w:color w:val="1E293B"/>
-                <w:sz w:val="17"/>
+                <w:sz w:val="20"/>
               </w:rPr>
               <w:t>VBS 4, EADSIM, LVC 平行戰場</w:t>
             </w:r>
@@ -2418,7 +2418,7 @@
               <w:rPr>
                 <w:rFonts w:ascii="Arial" w:hAnsi="Arial" w:eastAsia="SimHei" w:cs="Arial"/>
                 <w:color w:val="1E293B"/>
-                <w:sz w:val="17"/>
+                <w:sz w:val="20"/>
               </w:rPr>
               <w:t>Q4</w:t>
             </w:r>
@@ -2440,7 +2440,7 @@
               <w:rPr>
                 <w:rFonts w:ascii="Arial" w:hAnsi="Arial" w:eastAsia="SimHei" w:cs="Arial"/>
                 <w:color w:val="1E293B"/>
-                <w:sz w:val="17"/>
+                <w:sz w:val="20"/>
               </w:rPr>
               <w:t>可中止性與失效安全 (Abortability)</w:t>
             </w:r>
@@ -2465,7 +2465,7 @@
               <w:rPr>
                 <w:rFonts w:ascii="Arial" w:hAnsi="Arial" w:eastAsia="SimHei" w:cs="Arial"/>
                 <w:color w:val="1E293B"/>
-                <w:sz w:val="17"/>
+                <w:sz w:val="20"/>
               </w:rPr>
               <w:t>τ_abort ≤ 100ms  ∧  Fail-Safe Rate = 100%</w:t>
             </w:r>
@@ -2487,7 +2487,7 @@
               <w:rPr>
                 <w:rFonts w:ascii="Arial" w:hAnsi="Arial" w:eastAsia="SimHei" w:cs="Arial"/>
                 <w:color w:val="1E293B"/>
-                <w:sz w:val="17"/>
+                <w:sz w:val="20"/>
               </w:rPr>
               <w:t>ToAST, HITL 硬體物理斷路器</w:t>
             </w:r>
@@ -2514,7 +2514,7 @@
               <w:rPr>
                 <w:rFonts w:ascii="Arial" w:hAnsi="Arial" w:eastAsia="SimHei" w:cs="Arial"/>
                 <w:color w:val="1E293B"/>
-                <w:sz w:val="17"/>
+                <w:sz w:val="20"/>
               </w:rPr>
               <w:t>Q5</w:t>
             </w:r>
@@ -2536,7 +2536,7 @@
               <w:rPr>
                 <w:rFonts w:ascii="Arial" w:hAnsi="Arial" w:eastAsia="SimHei" w:cs="Arial"/>
                 <w:color w:val="1E293B"/>
-                <w:sz w:val="17"/>
+                <w:sz w:val="20"/>
               </w:rPr>
               <w:t>期望校準誤差 (Trust Calibration)</w:t>
             </w:r>
@@ -2561,7 +2561,7 @@
               <w:rPr>
                 <w:rFonts w:ascii="Arial" w:hAnsi="Arial" w:eastAsia="SimHei" w:cs="Arial"/>
                 <w:color w:val="1E293B"/>
-                <w:sz w:val="17"/>
+                <w:sz w:val="20"/>
               </w:rPr>
               <w:t>ECE ≤ 0.05  ∧  R_overreliance ≤ 0.05</w:t>
             </w:r>
@@ -2583,7 +2583,7 @@
               <w:rPr>
                 <w:rFonts w:ascii="Arial" w:hAnsi="Arial" w:eastAsia="SimHei" w:cs="Arial"/>
                 <w:color w:val="1E293B"/>
-                <w:sz w:val="17"/>
+                <w:sz w:val="20"/>
               </w:rPr>
               <w:t>HMT Evaluation Suite, ECE Calculator</w:t>
             </w:r>
@@ -2610,7 +2610,7 @@
               <w:rPr>
                 <w:rFonts w:ascii="Arial" w:hAnsi="Arial" w:eastAsia="SimHei" w:cs="Arial"/>
                 <w:color w:val="1E293B"/>
-                <w:sz w:val="17"/>
+                <w:sz w:val="20"/>
               </w:rPr>
               <w:t>Q6</w:t>
             </w:r>
@@ -2632,7 +2632,7 @@
               <w:rPr>
                 <w:rFonts w:ascii="Arial" w:hAnsi="Arial" w:eastAsia="SimHei" w:cs="Arial"/>
                 <w:color w:val="1E293B"/>
-                <w:sz w:val="17"/>
+                <w:sz w:val="20"/>
               </w:rPr>
               <w:t>認知負荷優化率 (Cognitive Load)</w:t>
             </w:r>
@@ -2657,7 +2657,7 @@
               <w:rPr>
                 <w:rFonts w:ascii="Arial" w:hAnsi="Arial" w:eastAsia="SimHei" w:cs="Arial"/>
                 <w:color w:val="1E293B"/>
-                <w:sz w:val="17"/>
+                <w:sz w:val="20"/>
               </w:rPr>
               <w:t>ΔTLX ≥ 0.30  ∧  Δt_decision ≤ 2.0s</w:t>
             </w:r>
@@ -2679,7 +2679,7 @@
               <w:rPr>
                 <w:rFonts w:ascii="Arial" w:hAnsi="Arial" w:eastAsia="SimHei" w:cs="Arial"/>
                 <w:color w:val="1E293B"/>
-                <w:sz w:val="17"/>
+                <w:sz w:val="20"/>
               </w:rPr>
               <w:t>NASA-TLX 量表, EEG 腦電儀, 眼動儀</w:t>
             </w:r>
@@ -2706,7 +2706,7 @@
               <w:rPr>
                 <w:rFonts w:ascii="Arial" w:hAnsi="Arial" w:eastAsia="SimHei" w:cs="Arial"/>
                 <w:color w:val="1E293B"/>
-                <w:sz w:val="17"/>
+                <w:sz w:val="20"/>
               </w:rPr>
               <w:t>Q7</w:t>
             </w:r>
@@ -2728,7 +2728,7 @@
               <w:rPr>
                 <w:rFonts w:ascii="Arial" w:hAnsi="Arial" w:eastAsia="SimHei" w:cs="Arial"/>
                 <w:color w:val="1E293B"/>
-                <w:sz w:val="17"/>
+                <w:sz w:val="20"/>
               </w:rPr>
               <w:t>顯著性歸因得分 (Explainability)</w:t>
             </w:r>
@@ -2753,7 +2753,7 @@
               <w:rPr>
                 <w:rFonts w:ascii="Arial" w:hAnsi="Arial" w:eastAsia="SimHei" w:cs="Arial"/>
                 <w:color w:val="1E293B"/>
-                <w:sz w:val="17"/>
+                <w:sz w:val="20"/>
               </w:rPr>
               <w:t>Point Game Score ≥ 0.85 (85%)</w:t>
             </w:r>
@@ -2775,7 +2775,7 @@
               <w:rPr>
                 <w:rFonts w:ascii="Arial" w:hAnsi="Arial" w:eastAsia="SimHei" w:cs="Arial"/>
                 <w:color w:val="1E293B"/>
-                <w:sz w:val="17"/>
+                <w:sz w:val="20"/>
               </w:rPr>
               <w:t>XAITK, SHAP, LIME, Grad-CAM</w:t>
             </w:r>
@@ -2802,7 +2802,7 @@
               <w:rPr>
                 <w:rFonts w:ascii="Arial" w:hAnsi="Arial" w:eastAsia="SimHei" w:cs="Arial"/>
                 <w:color w:val="1E293B"/>
-                <w:sz w:val="17"/>
+                <w:sz w:val="20"/>
               </w:rPr>
               <w:t>Q8</w:t>
             </w:r>
@@ -2824,7 +2824,7 @@
               <w:rPr>
                 <w:rFonts w:ascii="Arial" w:hAnsi="Arial" w:eastAsia="SimHei" w:cs="Arial"/>
                 <w:color w:val="1E293B"/>
-                <w:sz w:val="17"/>
+                <w:sz w:val="20"/>
               </w:rPr>
               <w:t>提示越獄阻絕率 (Jailbreak Defense)</w:t>
             </w:r>
@@ -2849,7 +2849,7 @@
               <w:rPr>
                 <w:rFonts w:ascii="Arial" w:hAnsi="Arial" w:eastAsia="SimHei" w:cs="Arial"/>
                 <w:color w:val="1E293B"/>
-                <w:sz w:val="17"/>
+                <w:sz w:val="20"/>
               </w:rPr>
               <w:t>R_jailbreak_def ≥ 0.99 (99%)</w:t>
             </w:r>
@@ -2871,7 +2871,7 @@
               <w:rPr>
                 <w:rFonts w:ascii="Arial" w:hAnsi="Arial" w:eastAsia="SimHei" w:cs="Arial"/>
                 <w:color w:val="1E293B"/>
-                <w:sz w:val="17"/>
+                <w:sz w:val="20"/>
               </w:rPr>
               <w:t>garak LLM Scanner, NeMo Guardrails</w:t>
             </w:r>
@@ -2898,7 +2898,7 @@
               <w:rPr>
                 <w:rFonts w:ascii="Arial" w:hAnsi="Arial" w:eastAsia="SimHei" w:cs="Arial"/>
                 <w:color w:val="1E293B"/>
-                <w:sz w:val="17"/>
+                <w:sz w:val="20"/>
               </w:rPr>
               <w:t>Q9</w:t>
             </w:r>
@@ -2920,7 +2920,7 @@
               <w:rPr>
                 <w:rFonts w:ascii="Arial" w:hAnsi="Arial" w:eastAsia="SimHei" w:cs="Arial"/>
                 <w:color w:val="1E293B"/>
-                <w:sz w:val="17"/>
+                <w:sz w:val="20"/>
               </w:rPr>
               <w:t>幻覺發生率與忠實度 (Hallucination)</w:t>
             </w:r>
@@ -2945,7 +2945,7 @@
               <w:rPr>
                 <w:rFonts w:ascii="Arial" w:hAnsi="Arial" w:eastAsia="SimHei" w:cs="Arial"/>
                 <w:color w:val="1E293B"/>
-                <w:sz w:val="17"/>
+                <w:sz w:val="20"/>
               </w:rPr>
               <w:t>Faithfulness ≥ 0.95  ∧  Hallucination ≤ 0.02</w:t>
             </w:r>
@@ -2967,7 +2967,7 @@
               <w:rPr>
                 <w:rFonts w:ascii="Arial" w:hAnsi="Arial" w:eastAsia="SimHei" w:cs="Arial"/>
                 <w:color w:val="1E293B"/>
-                <w:sz w:val="17"/>
+                <w:sz w:val="20"/>
               </w:rPr>
               <w:t>RAGAS, TruLens Triad, PromptBench</w:t>
             </w:r>
@@ -2994,7 +2994,7 @@
               <w:rPr>
                 <w:rFonts w:ascii="Arial" w:hAnsi="Arial" w:eastAsia="SimHei" w:cs="Arial"/>
                 <w:color w:val="1E293B"/>
-                <w:sz w:val="17"/>
+                <w:sz w:val="20"/>
               </w:rPr>
               <w:t>Q10</w:t>
             </w:r>
@@ -3016,7 +3016,7 @@
               <w:rPr>
                 <w:rFonts w:ascii="Arial" w:hAnsi="Arial" w:eastAsia="SimHei" w:cs="Arial"/>
                 <w:color w:val="1E293B"/>
-                <w:sz w:val="17"/>
+                <w:sz w:val="20"/>
               </w:rPr>
               <w:t>RAG 檢索精確與歸屬 (Context Precision)</w:t>
             </w:r>
@@ -3041,7 +3041,7 @@
               <w:rPr>
                 <w:rFonts w:ascii="Arial" w:hAnsi="Arial" w:eastAsia="SimHei" w:cs="Arial"/>
                 <w:color w:val="1E293B"/>
-                <w:sz w:val="17"/>
+                <w:sz w:val="20"/>
               </w:rPr>
               <w:t>Context Precision ≥ 0.90  ∧  Attribution ≥ 0.98</w:t>
             </w:r>
@@ -3063,7 +3063,7 @@
               <w:rPr>
                 <w:rFonts w:ascii="Arial" w:hAnsi="Arial" w:eastAsia="SimHei" w:cs="Arial"/>
                 <w:color w:val="1E293B"/>
-                <w:sz w:val="17"/>
+                <w:sz w:val="20"/>
               </w:rPr>
               <w:t>RAGAS Assessment Suite, TruLens</w:t>
             </w:r>
@@ -3090,7 +3090,7 @@
               <w:rPr>
                 <w:rFonts w:ascii="Arial" w:hAnsi="Arial" w:eastAsia="SimHei" w:cs="Arial"/>
                 <w:color w:val="1E293B"/>
-                <w:sz w:val="17"/>
+                <w:sz w:val="20"/>
               </w:rPr>
               <w:t>Q11</w:t>
             </w:r>
@@ -3112,7 +3112,7 @@
               <w:rPr>
                 <w:rFonts w:ascii="Arial" w:hAnsi="Arial" w:eastAsia="SimHei" w:cs="Arial"/>
                 <w:color w:val="1E293B"/>
-                <w:sz w:val="17"/>
+                <w:sz w:val="20"/>
               </w:rPr>
               <w:t>Agent 越權調用率 (Tool Misuse)</w:t>
             </w:r>
@@ -3137,7 +3137,7 @@
               <w:rPr>
                 <w:rFonts w:ascii="Arial" w:hAnsi="Arial" w:eastAsia="SimHei" w:cs="Arial"/>
                 <w:color w:val="1E293B"/>
-                <w:sz w:val="17"/>
+                <w:sz w:val="20"/>
               </w:rPr>
               <w:t>R_unauth_API = 0% (零越權呼叫事故)</w:t>
             </w:r>
@@ -3159,7 +3159,7 @@
               <w:rPr>
                 <w:rFonts w:ascii="Arial" w:hAnsi="Arial" w:eastAsia="SimHei" w:cs="Arial"/>
                 <w:color w:val="1E293B"/>
-                <w:sz w:val="17"/>
+                <w:sz w:val="20"/>
               </w:rPr>
               <w:t>AgentBench, Open Policy Agent (OPA)</w:t>
             </w:r>
@@ -3186,7 +3186,7 @@
               <w:rPr>
                 <w:rFonts w:ascii="Arial" w:hAnsi="Arial" w:eastAsia="SimHei" w:cs="Arial"/>
                 <w:color w:val="1E293B"/>
-                <w:sz w:val="17"/>
+                <w:sz w:val="20"/>
               </w:rPr>
               <w:t>Q12</w:t>
             </w:r>
@@ -3208,7 +3208,7 @@
               <w:rPr>
                 <w:rFonts w:ascii="Arial" w:hAnsi="Arial" w:eastAsia="SimHei" w:cs="Arial"/>
                 <w:color w:val="1E293B"/>
-                <w:sz w:val="17"/>
+                <w:sz w:val="20"/>
               </w:rPr>
               <w:t>概念漂移召回率 (Concept Drift)</w:t>
             </w:r>
@@ -3233,7 +3233,7 @@
               <w:rPr>
                 <w:rFonts w:ascii="Arial" w:hAnsi="Arial" w:eastAsia="SimHei" w:cs="Arial"/>
                 <w:color w:val="1E293B"/>
-                <w:sz w:val="17"/>
+                <w:sz w:val="20"/>
               </w:rPr>
               <w:t>Drift Recall ≥ 0.95  ∧  t_alarm ≤ 5min</w:t>
             </w:r>
@@ -3255,7 +3255,7 @@
               <w:rPr>
                 <w:rFonts w:ascii="Arial" w:hAnsi="Arial" w:eastAsia="SimHei" w:cs="Arial"/>
                 <w:color w:val="1E293B"/>
-                <w:sz w:val="17"/>
+                <w:sz w:val="20"/>
               </w:rPr>
               <w:t>PyOD, Alibi Detect, Evidently AI</w:t>
             </w:r>
@@ -3282,7 +3282,7 @@
               <w:rPr>
                 <w:rFonts w:ascii="Arial" w:hAnsi="Arial" w:eastAsia="SimHei" w:cs="Arial"/>
                 <w:color w:val="1E293B"/>
-                <w:sz w:val="17"/>
+                <w:sz w:val="20"/>
               </w:rPr>
               <w:t>Q13</w:t>
             </w:r>
@@ -3304,7 +3304,7 @@
               <w:rPr>
                 <w:rFonts w:ascii="Arial" w:hAnsi="Arial" w:eastAsia="SimHei" w:cs="Arial"/>
                 <w:color w:val="1E293B"/>
-                <w:sz w:val="17"/>
+                <w:sz w:val="20"/>
               </w:rPr>
               <w:t>不確定性覆蓋率 (Uncertainty Quant)</w:t>
             </w:r>
@@ -3329,7 +3329,7 @@
               <w:rPr>
                 <w:rFonts w:ascii="Arial" w:hAnsi="Arial" w:eastAsia="SimHei" w:cs="Arial"/>
                 <w:color w:val="1E293B"/>
-                <w:sz w:val="17"/>
+                <w:sz w:val="20"/>
               </w:rPr>
               <w:t>OOD 方差覆蓋率 Coverage ≥ 95%</w:t>
             </w:r>
@@ -3351,7 +3351,7 @@
               <w:rPr>
                 <w:rFonts w:ascii="Arial" w:hAnsi="Arial" w:eastAsia="SimHei" w:cs="Arial"/>
                 <w:color w:val="1E293B"/>
-                <w:sz w:val="17"/>
+                <w:sz w:val="20"/>
               </w:rPr>
               <w:t>MC-Dropout, Deep Ensembles, UQ</w:t>
             </w:r>
@@ -3378,7 +3378,7 @@
               <w:rPr>
                 <w:rFonts w:ascii="Arial" w:hAnsi="Arial" w:eastAsia="SimHei" w:cs="Arial"/>
                 <w:color w:val="1E293B"/>
-                <w:sz w:val="17"/>
+                <w:sz w:val="20"/>
               </w:rPr>
               <w:t>Q14</w:t>
             </w:r>
@@ -3400,7 +3400,7 @@
               <w:rPr>
                 <w:rFonts w:ascii="Arial" w:hAnsi="Arial" w:eastAsia="SimHei" w:cs="Arial"/>
                 <w:color w:val="1E293B"/>
-                <w:sz w:val="17"/>
+                <w:sz w:val="20"/>
               </w:rPr>
               <w:t>防降密洩漏率 (Declassification Leak)</w:t>
             </w:r>
@@ -3425,7 +3425,7 @@
               <w:rPr>
                 <w:rFonts w:ascii="Arial" w:hAnsi="Arial" w:eastAsia="SimHei" w:cs="Arial"/>
                 <w:color w:val="1E293B"/>
-                <w:sz w:val="17"/>
+                <w:sz w:val="20"/>
               </w:rPr>
               <w:t>R_declass_leak = 0% (零降密洩漏風險)</w:t>
             </w:r>
@@ -3447,7 +3447,7 @@
               <w:rPr>
                 <w:rFonts w:ascii="Arial" w:hAnsi="Arial" w:eastAsia="SimHei" w:cs="Arial"/>
                 <w:color w:val="1E293B"/>
-                <w:sz w:val="17"/>
+                <w:sz w:val="20"/>
               </w:rPr>
               <w:t>Milvus 向量 RBAC 標籤動態遮罩</w:t>
             </w:r>
@@ -3474,7 +3474,7 @@
               <w:rPr>
                 <w:rFonts w:ascii="Arial" w:hAnsi="Arial" w:eastAsia="SimHei" w:cs="Arial"/>
                 <w:color w:val="1E293B"/>
-                <w:sz w:val="17"/>
+                <w:sz w:val="20"/>
               </w:rPr>
               <w:t>Q15</w:t>
             </w:r>
@@ -3496,7 +3496,7 @@
               <w:rPr>
                 <w:rFonts w:ascii="Arial" w:hAnsi="Arial" w:eastAsia="SimHei" w:cs="Arial"/>
                 <w:color w:val="1E293B"/>
-                <w:sz w:val="17"/>
+                <w:sz w:val="20"/>
               </w:rPr>
               <w:t>系統軌跡可追溯性 (Traceability)</w:t>
             </w:r>
@@ -3521,7 +3521,7 @@
               <w:rPr>
                 <w:rFonts w:ascii="Arial" w:hAnsi="Arial" w:eastAsia="SimHei" w:cs="Arial"/>
                 <w:color w:val="1E293B"/>
-                <w:sz w:val="17"/>
+                <w:sz w:val="20"/>
               </w:rPr>
               <w:t>Log Coverage = 100%  ∧  t_repro ≤ 10min</w:t>
             </w:r>
@@ -3543,7 +3543,7 @@
               <w:rPr>
                 <w:rFonts w:ascii="Arial" w:hAnsi="Arial" w:eastAsia="SimHei" w:cs="Arial"/>
                 <w:color w:val="1E293B"/>
-                <w:sz w:val="17"/>
+                <w:sz w:val="20"/>
               </w:rPr>
               <w:t>OpenTelemetry, SPIFFE/SPIRE 日誌</w:t>
             </w:r>
@@ -3602,7 +3602,7 @@
           <w:rFonts w:ascii="Arial" w:hAnsi="Arial" w:eastAsia="SimHei" w:cs="Arial"/>
           <w:b/>
           <w:color w:val="0C2340"/>
-          <w:sz w:val="20"/>
+          <w:sz w:val="22"/>
         </w:rPr>
         <w:t xml:space="preserve">圖 </w:t>
       </w:r>
@@ -3612,7 +3612,7 @@
           <w:rFonts w:ascii="Arial" w:hAnsi="Arial" w:eastAsia="SimHei" w:cs="Arial"/>
           <w:b/>
           <w:color w:val="0C2340"/>
-          <w:sz w:val="20"/>
+          <w:sz w:val="22"/>
         </w:rPr>
         <w:t>：國防 AI 安全保密審計 3D 縱深防禦矩陣圖 (Nano Banana pro 生成)</w:t>
       </w:r>
@@ -3620,27 +3620,27 @@
     <w:p>
       <w:pPr>
         <w:pStyle w:val="Heading2"/>
-        <w:spacing w:before="200" w:after="120"/>
+        <w:spacing w:before="240" w:after="160"/>
       </w:pPr>
       <w:r>
         <w:rPr>
           <w:rFonts w:ascii="Arial" w:hAnsi="Arial" w:eastAsia="SimHei" w:cs="Arial"/>
           <w:b/>
           <w:color w:val="2563EB"/>
-          <w:sz w:val="29"/>
+          <w:sz w:val="32"/>
         </w:rPr>
         <w:t>2.3 第三部分：應用系統與驗測 SOP (Application Systems &amp; SOPs)</w:t>
       </w:r>
     </w:p>
     <w:p>
       <w:pPr>
-        <w:spacing w:before="0" w:after="120" w:line="312" w:lineRule="auto"/>
+        <w:spacing w:before="0" w:after="160" w:line="324" w:lineRule="auto"/>
       </w:pPr>
       <w:r>
         <w:rPr>
           <w:rFonts w:ascii="Arial" w:hAnsi="Arial" w:eastAsia="SimHei" w:cs="Arial"/>
           <w:color w:val="334155"/>
-          <w:sz w:val="22"/>
+          <w:sz w:val="28"/>
         </w:rPr>
         <w:t>第三部分將評測規範落地至六大類 AI 應用系統與前線無人載具：A類電腦視覺 (YOLO/SAM/NRTK)、B類生成式AI (garak/NeMo)、C類RAG知識庫 (RAGAS/RBAC)、D類AI Agent (SPIFFE/OPA)、E類自主系統與HMT (RoE/VBS4) 及 F類預測分析 (PyOD/UQ)。針對無人機蜂群、無人船、無人潛艦、無人車與機器狗，實施網狀防篡改與 &lt;100ms 硬體自毀評測。</w:t>
       </w:r>
@@ -3696,7 +3696,7 @@
           <w:rFonts w:ascii="Arial" w:hAnsi="Arial" w:eastAsia="SimHei" w:cs="Arial"/>
           <w:b/>
           <w:color w:val="0C2340"/>
-          <w:sz w:val="20"/>
+          <w:sz w:val="22"/>
         </w:rPr>
         <w:t xml:space="preserve">圖 </w:t>
       </w:r>
@@ -3706,7 +3706,7 @@
           <w:rFonts w:ascii="Arial" w:hAnsi="Arial" w:eastAsia="SimHei" w:cs="Arial"/>
           <w:b/>
           <w:color w:val="0C2340"/>
-          <w:sz w:val="20"/>
+          <w:sz w:val="22"/>
         </w:rPr>
         <w:t>：民雄院區國家級主權 AI 四層算力堆疊架構圖 (Nano Banana pro 生成)</w:t>
       </w:r>
@@ -3719,7 +3719,7 @@
     <w:p>
       <w:pPr>
         <w:pStyle w:val="Heading1"/>
-        <w:spacing w:before="280" w:after="120"/>
+        <w:spacing w:before="320" w:after="160"/>
       </w:pPr>
       <w:r>
         <w:rPr>
@@ -3734,41 +3734,41 @@
     <w:p>
       <w:pPr>
         <w:pStyle w:val="Heading2"/>
-        <w:spacing w:before="200" w:after="120"/>
+        <w:spacing w:before="240" w:after="160"/>
       </w:pPr>
       <w:r>
         <w:rPr>
           <w:rFonts w:ascii="Arial" w:hAnsi="Arial" w:eastAsia="SimHei" w:cs="Arial"/>
           <w:b/>
           <w:color w:val="2563EB"/>
-          <w:sz w:val="29"/>
+          <w:sz w:val="32"/>
         </w:rPr>
         <w:t>3.1 四大階段任務與發展里程碑 (Milestones)</w:t>
       </w:r>
     </w:p>
     <w:p>
       <w:pPr>
-        <w:spacing w:before="0" w:after="120" w:line="312" w:lineRule="auto"/>
+        <w:spacing w:before="0" w:after="160" w:line="324" w:lineRule="auto"/>
       </w:pPr>
       <w:r>
         <w:rPr>
           <w:rFonts w:ascii="Arial" w:hAnsi="Arial" w:eastAsia="SimHei" w:cs="Arial"/>
           <w:color w:val="334155"/>
-          <w:sz w:val="22"/>
+          <w:sz w:val="28"/>
         </w:rPr>
         <w:t>本專案規劃為期 24 個月之推動時程，劃分為四大循序漸進階段：</w:t>
       </w:r>
     </w:p>
     <w:p>
       <w:pPr>
-        <w:spacing w:before="0" w:after="120" w:line="312" w:lineRule="auto"/>
+        <w:spacing w:before="0" w:after="160" w:line="324" w:lineRule="auto"/>
       </w:pPr>
       <w:r>
         <w:rPr>
           <w:rFonts w:ascii="Arial" w:hAnsi="Arial" w:eastAsia="SimHei" w:cs="Arial"/>
           <w:b/>
           <w:color w:val="0C2340"/>
-          <w:sz w:val="22"/>
+          <w:sz w:val="28"/>
         </w:rPr>
         <w:t>第一階段：治理標準與主權算力基建整備 (第 1 - 6 個月)：</w:t>
       </w:r>
@@ -3776,21 +3776,21 @@
         <w:rPr>
           <w:rFonts w:ascii="Arial" w:hAnsi="Arial" w:eastAsia="SimHei" w:cs="Arial"/>
           <w:color w:val="334155"/>
-          <w:sz w:val="22"/>
+          <w:sz w:val="28"/>
         </w:rPr>
         <w:t>完成 ISO 42001 AIMS 通用框架調校、頒布國防 AIEC 評測手冊與 Q1~Q15 量化合格門檻，完成民雄院區 Tier 1~3 地端實體隔離算力硬體建置。</w:t>
       </w:r>
     </w:p>
     <w:p>
       <w:pPr>
-        <w:spacing w:before="0" w:after="120" w:line="312" w:lineRule="auto"/>
+        <w:spacing w:before="0" w:after="160" w:line="324" w:lineRule="auto"/>
       </w:pPr>
       <w:r>
         <w:rPr>
           <w:rFonts w:ascii="Arial" w:hAnsi="Arial" w:eastAsia="SimHei" w:cs="Arial"/>
           <w:b/>
           <w:color w:val="0C2340"/>
-          <w:sz w:val="22"/>
+          <w:sz w:val="28"/>
         </w:rPr>
         <w:t>第二階段：沙盒演練與自動化工具鏈部署 (第 7 - 12 個月)：</w:t>
       </w:r>
@@ -3798,21 +3798,21 @@
         <w:rPr>
           <w:rFonts w:ascii="Arial" w:hAnsi="Arial" w:eastAsia="SimHei" w:cs="Arial"/>
           <w:color w:val="334155"/>
-          <w:sz w:val="22"/>
+          <w:sz w:val="28"/>
         </w:rPr>
         <w:t>部署 garak, IBM ART 360, NRTK, RAGAS 自動化評測工具鏈；建置 Cyber Range AI 對抗演練沙盒，完成首批 A、B 類系統紅軍對抗演練。</w:t>
       </w:r>
     </w:p>
     <w:p>
       <w:pPr>
-        <w:spacing w:before="0" w:after="120" w:line="312" w:lineRule="auto"/>
+        <w:spacing w:before="0" w:after="160" w:line="324" w:lineRule="auto"/>
       </w:pPr>
       <w:r>
         <w:rPr>
           <w:rFonts w:ascii="Arial" w:hAnsi="Arial" w:eastAsia="SimHei" w:cs="Arial"/>
           <w:b/>
           <w:color w:val="0C2340"/>
-          <w:sz w:val="22"/>
+          <w:sz w:val="28"/>
         </w:rPr>
         <w:t>第三階段：無人載具與多系統實戰壓力驗證 (第 13 - 18 個月)：</w:t>
       </w:r>
@@ -3820,21 +3820,21 @@
         <w:rPr>
           <w:rFonts w:ascii="Arial" w:hAnsi="Arial" w:eastAsia="SimHei" w:cs="Arial"/>
           <w:color w:val="334155"/>
-          <w:sz w:val="22"/>
+          <w:sz w:val="28"/>
         </w:rPr>
         <w:t>結合 VBS 4 / EADSIM LVC 平行戰場，實施無人機蜂群、無人船、無人潛艦、無人車與機器狗實戰壓力測試；驗證網狀防篡改與 &lt;100ms 模型自毀。</w:t>
       </w:r>
     </w:p>
     <w:p>
       <w:pPr>
-        <w:spacing w:before="0" w:after="120" w:line="312" w:lineRule="auto"/>
+        <w:spacing w:before="0" w:after="160" w:line="324" w:lineRule="auto"/>
       </w:pPr>
       <w:r>
         <w:rPr>
           <w:rFonts w:ascii="Arial" w:hAnsi="Arial" w:eastAsia="SimHei" w:cs="Arial"/>
           <w:b/>
           <w:color w:val="0C2340"/>
-          <w:sz w:val="22"/>
+          <w:sz w:val="28"/>
         </w:rPr>
         <w:t>第四階段：全域營運與主權 TRL 放行部署 (第 19 - 24 個月)：</w:t>
       </w:r>
@@ -3842,7 +3842,7 @@
         <w:rPr>
           <w:rFonts w:ascii="Arial" w:hAnsi="Arial" w:eastAsia="SimHei" w:cs="Arial"/>
           <w:color w:val="334155"/>
-          <w:sz w:val="22"/>
+          <w:sz w:val="28"/>
         </w:rPr>
         <w:t>全面聯網運作 MLOps 自動化驗測工廠，實現確效紀錄自動轉換為 CMMC L2 控制項與 ISO 42001 審計日誌，核發主權 TRL 戰術放行證書。</w:t>
       </w:r>
@@ -3850,14 +3850,14 @@
     <w:p>
       <w:pPr>
         <w:pStyle w:val="Heading2"/>
-        <w:spacing w:before="200" w:after="120"/>
+        <w:spacing w:before="240" w:after="160"/>
       </w:pPr>
       <w:r>
         <w:rPr>
           <w:rFonts w:ascii="Arial" w:hAnsi="Arial" w:eastAsia="SimHei" w:cs="Arial"/>
           <w:b/>
           <w:color w:val="2563EB"/>
-          <w:sz w:val="29"/>
+          <w:sz w:val="32"/>
         </w:rPr>
         <w:t>3.2 24 個月專案時程對照表 (Gantt Schedule)</w:t>
       </w:r>
@@ -3873,7 +3873,7 @@
           <w:rFonts w:ascii="Arial" w:hAnsi="Arial" w:eastAsia="SimHei" w:cs="Arial"/>
           <w:b/>
           <w:color w:val="0C2340"/>
-          <w:sz w:val="20"/>
+          <w:sz w:val="22"/>
         </w:rPr>
         <w:t xml:space="preserve">表 </w:t>
       </w:r>
@@ -3883,7 +3883,7 @@
           <w:rFonts w:ascii="Arial" w:hAnsi="Arial" w:eastAsia="SimHei" w:cs="Arial"/>
           <w:b/>
           <w:color w:val="0C2340"/>
-          <w:sz w:val="20"/>
+          <w:sz w:val="22"/>
         </w:rPr>
         <w:t>：AIEC 國防 AI 導入專案 24 個月執行時程規劃表</w:t>
       </w:r>
@@ -3930,7 +3930,7 @@
                 <w:rFonts w:ascii="Arial" w:hAnsi="Arial" w:eastAsia="SimHei" w:cs="Arial"/>
                 <w:b/>
                 <w:color w:val="FFFFFF"/>
-                <w:sz w:val="19"/>
+                <w:sz w:val="22"/>
               </w:rPr>
               <w:t>專案階段</w:t>
             </w:r>
@@ -3956,7 +3956,7 @@
                 <w:rFonts w:ascii="Arial" w:hAnsi="Arial" w:eastAsia="SimHei" w:cs="Arial"/>
                 <w:b/>
                 <w:color w:val="FFFFFF"/>
-                <w:sz w:val="19"/>
+                <w:sz w:val="22"/>
               </w:rPr>
               <w:t>核心任務工作項目</w:t>
             </w:r>
@@ -3982,7 +3982,7 @@
                 <w:rFonts w:ascii="Arial" w:hAnsi="Arial" w:eastAsia="SimHei" w:cs="Arial"/>
                 <w:b/>
                 <w:color w:val="FFFFFF"/>
-                <w:sz w:val="19"/>
+                <w:sz w:val="22"/>
               </w:rPr>
               <w:t>時程 (月份)</w:t>
             </w:r>
@@ -4008,7 +4008,7 @@
                 <w:rFonts w:ascii="Arial" w:hAnsi="Arial" w:eastAsia="SimHei" w:cs="Arial"/>
                 <w:b/>
                 <w:color w:val="FFFFFF"/>
-                <w:sz w:val="19"/>
+                <w:sz w:val="22"/>
               </w:rPr>
               <w:t>負責單位</w:t>
             </w:r>
@@ -4034,7 +4034,7 @@
                 <w:rFonts w:ascii="Arial" w:hAnsi="Arial" w:eastAsia="SimHei" w:cs="Arial"/>
                 <w:b/>
                 <w:color w:val="FFFFFF"/>
-                <w:sz w:val="19"/>
+                <w:sz w:val="22"/>
               </w:rPr>
               <w:t>階段里程碑 (Milestones)</w:t>
             </w:r>
@@ -4061,7 +4061,7 @@
               <w:rPr>
                 <w:rFonts w:ascii="Arial" w:hAnsi="Arial" w:eastAsia="SimHei" w:cs="Arial"/>
                 <w:color w:val="1E293B"/>
-                <w:sz w:val="17"/>
+                <w:sz w:val="20"/>
               </w:rPr>
               <w:t>一階段</w:t>
             </w:r>
@@ -4083,7 +4083,7 @@
               <w:rPr>
                 <w:rFonts w:ascii="Arial" w:hAnsi="Arial" w:eastAsia="SimHei" w:cs="Arial"/>
                 <w:color w:val="1E293B"/>
-                <w:sz w:val="17"/>
+                <w:sz w:val="20"/>
               </w:rPr>
               <w:t>ISO 42001 與 AIEC 治理標準擬定</w:t>
             </w:r>
@@ -4108,7 +4108,7 @@
               <w:rPr>
                 <w:rFonts w:ascii="Arial" w:hAnsi="Arial" w:eastAsia="SimHei" w:cs="Arial"/>
                 <w:color w:val="1E293B"/>
-                <w:sz w:val="17"/>
+                <w:sz w:val="20"/>
               </w:rPr>
               <w:t>M1 - M3</w:t>
             </w:r>
@@ -4130,7 +4130,7 @@
               <w:rPr>
                 <w:rFonts w:ascii="Arial" w:hAnsi="Arial" w:eastAsia="SimHei" w:cs="Arial"/>
                 <w:color w:val="1E293B"/>
-                <w:sz w:val="17"/>
+                <w:sz w:val="20"/>
               </w:rPr>
               <w:t>AIEC 治理小組</w:t>
             </w:r>
@@ -4152,7 +4152,7 @@
               <w:rPr>
                 <w:rFonts w:ascii="Arial" w:hAnsi="Arial" w:eastAsia="SimHei" w:cs="Arial"/>
                 <w:color w:val="1E293B"/>
-                <w:sz w:val="17"/>
+                <w:sz w:val="20"/>
               </w:rPr>
               <w:t>發布《國防 AI 評測與 RoE SOP 手冊》</w:t>
             </w:r>
@@ -4179,7 +4179,7 @@
               <w:rPr>
                 <w:rFonts w:ascii="Arial" w:hAnsi="Arial" w:eastAsia="SimHei" w:cs="Arial"/>
                 <w:color w:val="1E293B"/>
-                <w:sz w:val="17"/>
+                <w:sz w:val="20"/>
               </w:rPr>
               <w:t>一階段</w:t>
             </w:r>
@@ -4201,7 +4201,7 @@
               <w:rPr>
                 <w:rFonts w:ascii="Arial" w:hAnsi="Arial" w:eastAsia="SimHei" w:cs="Arial"/>
                 <w:color w:val="1E293B"/>
-                <w:sz w:val="17"/>
+                <w:sz w:val="20"/>
               </w:rPr>
               <w:t>民雄院區四層算力與地端隔離整備</w:t>
             </w:r>
@@ -4226,7 +4226,7 @@
               <w:rPr>
                 <w:rFonts w:ascii="Arial" w:hAnsi="Arial" w:eastAsia="SimHei" w:cs="Arial"/>
                 <w:color w:val="1E293B"/>
-                <w:sz w:val="17"/>
+                <w:sz w:val="20"/>
               </w:rPr>
               <w:t>M4 - M6</w:t>
             </w:r>
@@ -4248,7 +4248,7 @@
               <w:rPr>
                 <w:rFonts w:ascii="Arial" w:hAnsi="Arial" w:eastAsia="SimHei" w:cs="Arial"/>
                 <w:color w:val="1E293B"/>
-                <w:sz w:val="17"/>
+                <w:sz w:val="20"/>
               </w:rPr>
               <w:t>主權基建小組</w:t>
             </w:r>
@@ -4270,7 +4270,7 @@
               <w:rPr>
                 <w:rFonts w:ascii="Arial" w:hAnsi="Arial" w:eastAsia="SimHei" w:cs="Arial"/>
                 <w:color w:val="1E293B"/>
-                <w:sz w:val="17"/>
+                <w:sz w:val="20"/>
               </w:rPr>
               <w:t>完成 70B/8x7B/7B 機房與 Air-Gap 通電</w:t>
             </w:r>
@@ -4297,7 +4297,7 @@
               <w:rPr>
                 <w:rFonts w:ascii="Arial" w:hAnsi="Arial" w:eastAsia="SimHei" w:cs="Arial"/>
                 <w:color w:val="1E293B"/>
-                <w:sz w:val="17"/>
+                <w:sz w:val="20"/>
               </w:rPr>
               <w:t>二階段</w:t>
             </w:r>
@@ -4319,7 +4319,7 @@
               <w:rPr>
                 <w:rFonts w:ascii="Arial" w:hAnsi="Arial" w:eastAsia="SimHei" w:cs="Arial"/>
                 <w:color w:val="1E293B"/>
-                <w:sz w:val="17"/>
+                <w:sz w:val="20"/>
               </w:rPr>
               <w:t>garak, ART 360, RAGAS 工具鏈部署</w:t>
             </w:r>
@@ -4344,7 +4344,7 @@
               <w:rPr>
                 <w:rFonts w:ascii="Arial" w:hAnsi="Arial" w:eastAsia="SimHei" w:cs="Arial"/>
                 <w:color w:val="1E293B"/>
-                <w:sz w:val="17"/>
+                <w:sz w:val="20"/>
               </w:rPr>
               <w:t>M7 - M9</w:t>
             </w:r>
@@ -4366,7 +4366,7 @@
               <w:rPr>
                 <w:rFonts w:ascii="Arial" w:hAnsi="Arial" w:eastAsia="SimHei" w:cs="Arial"/>
                 <w:color w:val="1E293B"/>
-                <w:sz w:val="17"/>
+                <w:sz w:val="20"/>
               </w:rPr>
               <w:t>評測工具小組</w:t>
             </w:r>
@@ -4388,7 +4388,7 @@
               <w:rPr>
                 <w:rFonts w:ascii="Arial" w:hAnsi="Arial" w:eastAsia="SimHei" w:cs="Arial"/>
                 <w:color w:val="1E293B"/>
-                <w:sz w:val="17"/>
+                <w:sz w:val="20"/>
               </w:rPr>
               <w:t>上線 MLOps 自動化驗測工具包</w:t>
             </w:r>
@@ -4415,7 +4415,7 @@
               <w:rPr>
                 <w:rFonts w:ascii="Arial" w:hAnsi="Arial" w:eastAsia="SimHei" w:cs="Arial"/>
                 <w:color w:val="1E293B"/>
-                <w:sz w:val="17"/>
+                <w:sz w:val="20"/>
               </w:rPr>
               <w:t>二階段</w:t>
             </w:r>
@@ -4437,7 +4437,7 @@
               <w:rPr>
                 <w:rFonts w:ascii="Arial" w:hAnsi="Arial" w:eastAsia="SimHei" w:cs="Arial"/>
                 <w:color w:val="1E293B"/>
-                <w:sz w:val="17"/>
+                <w:sz w:val="20"/>
               </w:rPr>
               <w:t>Cyber Range AI 對抗演練沙盒測試</w:t>
             </w:r>
@@ -4462,7 +4462,7 @@
               <w:rPr>
                 <w:rFonts w:ascii="Arial" w:hAnsi="Arial" w:eastAsia="SimHei" w:cs="Arial"/>
                 <w:color w:val="1E293B"/>
-                <w:sz w:val="17"/>
+                <w:sz w:val="20"/>
               </w:rPr>
               <w:t>M10 - M12</w:t>
             </w:r>
@@ -4484,7 +4484,7 @@
               <w:rPr>
                 <w:rFonts w:ascii="Arial" w:hAnsi="Arial" w:eastAsia="SimHei" w:cs="Arial"/>
                 <w:color w:val="1E293B"/>
-                <w:sz w:val="17"/>
+                <w:sz w:val="20"/>
               </w:rPr>
               <w:t>紅隊對抗小組</w:t>
             </w:r>
@@ -4506,7 +4506,7 @@
               <w:rPr>
                 <w:rFonts w:ascii="Arial" w:hAnsi="Arial" w:eastAsia="SimHei" w:cs="Arial"/>
                 <w:color w:val="1E293B"/>
-                <w:sz w:val="17"/>
+                <w:sz w:val="20"/>
               </w:rPr>
               <w:t>完成 10,000 筆越獄與對抗貼片測試</w:t>
             </w:r>
@@ -4533,7 +4533,7 @@
               <w:rPr>
                 <w:rFonts w:ascii="Arial" w:hAnsi="Arial" w:eastAsia="SimHei" w:cs="Arial"/>
                 <w:color w:val="1E293B"/>
-                <w:sz w:val="17"/>
+                <w:sz w:val="20"/>
               </w:rPr>
               <w:t>三階段</w:t>
             </w:r>
@@ -4555,7 +4555,7 @@
               <w:rPr>
                 <w:rFonts w:ascii="Arial" w:hAnsi="Arial" w:eastAsia="SimHei" w:cs="Arial"/>
                 <w:color w:val="1E293B"/>
-                <w:sz w:val="17"/>
+                <w:sz w:val="20"/>
               </w:rPr>
               <w:t>無人機/船/潛艦/車/機器狗 LVC 測試</w:t>
             </w:r>
@@ -4580,7 +4580,7 @@
               <w:rPr>
                 <w:rFonts w:ascii="Arial" w:hAnsi="Arial" w:eastAsia="SimHei" w:cs="Arial"/>
                 <w:color w:val="1E293B"/>
-                <w:sz w:val="17"/>
+                <w:sz w:val="20"/>
               </w:rPr>
               <w:t>M13 - M15</w:t>
             </w:r>
@@ -4602,7 +4602,7 @@
               <w:rPr>
                 <w:rFonts w:ascii="Arial" w:hAnsi="Arial" w:eastAsia="SimHei" w:cs="Arial"/>
                 <w:color w:val="1E293B"/>
-                <w:sz w:val="17"/>
+                <w:sz w:val="20"/>
               </w:rPr>
               <w:t>無人戰術小組</w:t>
             </w:r>
@@ -4624,7 +4624,7 @@
               <w:rPr>
                 <w:rFonts w:ascii="Arial" w:hAnsi="Arial" w:eastAsia="SimHei" w:cs="Arial"/>
                 <w:color w:val="1E293B"/>
-                <w:sz w:val="17"/>
+                <w:sz w:val="20"/>
               </w:rPr>
               <w:t>完成 100 次蒙地卡羅戰術模擬 (MSR≥0.95)</w:t>
             </w:r>
@@ -4651,7 +4651,7 @@
               <w:rPr>
                 <w:rFonts w:ascii="Arial" w:hAnsi="Arial" w:eastAsia="SimHei" w:cs="Arial"/>
                 <w:color w:val="1E293B"/>
-                <w:sz w:val="17"/>
+                <w:sz w:val="20"/>
               </w:rPr>
               <w:t>三階段</w:t>
             </w:r>
@@ -4673,7 +4673,7 @@
               <w:rPr>
                 <w:rFonts w:ascii="Arial" w:hAnsi="Arial" w:eastAsia="SimHei" w:cs="Arial"/>
                 <w:color w:val="1E293B"/>
-                <w:sz w:val="17"/>
+                <w:sz w:val="20"/>
               </w:rPr>
               <w:t>&lt;100ms 模型硬體緊急自毀測試</w:t>
             </w:r>
@@ -4698,7 +4698,7 @@
               <w:rPr>
                 <w:rFonts w:ascii="Arial" w:hAnsi="Arial" w:eastAsia="SimHei" w:cs="Arial"/>
                 <w:color w:val="1E293B"/>
-                <w:sz w:val="17"/>
+                <w:sz w:val="20"/>
               </w:rPr>
               <w:t>M16 - M18</w:t>
             </w:r>
@@ -4720,7 +4720,7 @@
               <w:rPr>
                 <w:rFonts w:ascii="Arial" w:hAnsi="Arial" w:eastAsia="SimHei" w:cs="Arial"/>
                 <w:color w:val="1E293B"/>
-                <w:sz w:val="17"/>
+                <w:sz w:val="20"/>
               </w:rPr>
               <w:t>資安防護小組</w:t>
             </w:r>
@@ -4742,7 +4742,7 @@
               <w:rPr>
                 <w:rFonts w:ascii="Arial" w:hAnsi="Arial" w:eastAsia="SimHei" w:cs="Arial"/>
                 <w:color w:val="1E293B"/>
-                <w:sz w:val="17"/>
+                <w:sz w:val="20"/>
               </w:rPr>
               <w:t>驗證物理零化與 Flash/RAM 衝刷率 100%</w:t>
             </w:r>
@@ -4769,7 +4769,7 @@
               <w:rPr>
                 <w:rFonts w:ascii="Arial" w:hAnsi="Arial" w:eastAsia="SimHei" w:cs="Arial"/>
                 <w:color w:val="1E293B"/>
-                <w:sz w:val="17"/>
+                <w:sz w:val="20"/>
               </w:rPr>
               <w:t>四階段</w:t>
             </w:r>
@@ -4791,7 +4791,7 @@
               <w:rPr>
                 <w:rFonts w:ascii="Arial" w:hAnsi="Arial" w:eastAsia="SimHei" w:cs="Arial"/>
                 <w:color w:val="1E293B"/>
-                <w:sz w:val="17"/>
+                <w:sz w:val="20"/>
               </w:rPr>
               <w:t>CMMC L2 與 ISO 42001 自動化審計稽核</w:t>
             </w:r>
@@ -4816,7 +4816,7 @@
               <w:rPr>
                 <w:rFonts w:ascii="Arial" w:hAnsi="Arial" w:eastAsia="SimHei" w:cs="Arial"/>
                 <w:color w:val="1E293B"/>
-                <w:sz w:val="17"/>
+                <w:sz w:val="20"/>
               </w:rPr>
               <w:t>M19 - M21</w:t>
             </w:r>
@@ -4838,7 +4838,7 @@
               <w:rPr>
                 <w:rFonts w:ascii="Arial" w:hAnsi="Arial" w:eastAsia="SimHei" w:cs="Arial"/>
                 <w:color w:val="1E293B"/>
-                <w:sz w:val="17"/>
+                <w:sz w:val="20"/>
               </w:rPr>
               <w:t>資安合規小組</w:t>
             </w:r>
@@ -4860,7 +4860,7 @@
               <w:rPr>
                 <w:rFonts w:ascii="Arial" w:hAnsi="Arial" w:eastAsia="SimHei" w:cs="Arial"/>
                 <w:color w:val="1E293B"/>
-                <w:sz w:val="17"/>
+                <w:sz w:val="20"/>
               </w:rPr>
               <w:t>通過 CMMC L2 控制項審計對接</w:t>
             </w:r>
@@ -4887,7 +4887,7 @@
               <w:rPr>
                 <w:rFonts w:ascii="Arial" w:hAnsi="Arial" w:eastAsia="SimHei" w:cs="Arial"/>
                 <w:color w:val="1E293B"/>
-                <w:sz w:val="17"/>
+                <w:sz w:val="20"/>
               </w:rPr>
               <w:t>四階段</w:t>
             </w:r>
@@ -4909,7 +4909,7 @@
               <w:rPr>
                 <w:rFonts w:ascii="Arial" w:hAnsi="Arial" w:eastAsia="SimHei" w:cs="Arial"/>
                 <w:color w:val="1E293B"/>
-                <w:sz w:val="17"/>
+                <w:sz w:val="20"/>
               </w:rPr>
               <w:t>主權 TRL 證書核發與戰術陣地部署放行</w:t>
             </w:r>
@@ -4934,7 +4934,7 @@
               <w:rPr>
                 <w:rFonts w:ascii="Arial" w:hAnsi="Arial" w:eastAsia="SimHei" w:cs="Arial"/>
                 <w:color w:val="1E293B"/>
-                <w:sz w:val="17"/>
+                <w:sz w:val="20"/>
               </w:rPr>
               <w:t>M22 - M24</w:t>
             </w:r>
@@ -4956,7 +4956,7 @@
               <w:rPr>
                 <w:rFonts w:ascii="Arial" w:hAnsi="Arial" w:eastAsia="SimHei" w:cs="Arial"/>
                 <w:color w:val="1E293B"/>
-                <w:sz w:val="17"/>
+                <w:sz w:val="20"/>
               </w:rPr>
               <w:t>AIEC 評測中樞</w:t>
             </w:r>
@@ -4978,7 +4978,7 @@
               <w:rPr>
                 <w:rFonts w:ascii="Arial" w:hAnsi="Arial" w:eastAsia="SimHei" w:cs="Arial"/>
                 <w:color w:val="1E293B"/>
-                <w:sz w:val="17"/>
+                <w:sz w:val="20"/>
               </w:rPr>
               <w:t>核發首批武器系統 TRL 技術放行證書</w:t>
             </w:r>
@@ -4994,7 +4994,7 @@
     <w:p>
       <w:pPr>
         <w:pStyle w:val="Heading1"/>
-        <w:spacing w:before="280" w:after="120"/>
+        <w:spacing w:before="320" w:after="160"/>
       </w:pPr>
       <w:r>
         <w:rPr>
@@ -5009,14 +5009,14 @@
     <w:p>
       <w:pPr>
         <w:pStyle w:val="Heading2"/>
-        <w:spacing w:before="200" w:after="120"/>
+        <w:spacing w:before="240" w:after="160"/>
       </w:pPr>
       <w:r>
         <w:rPr>
           <w:rFonts w:ascii="Arial" w:hAnsi="Arial" w:eastAsia="SimHei" w:cs="Arial"/>
           <w:b/>
           <w:color w:val="2563EB"/>
-          <w:sz w:val="29"/>
+          <w:sz w:val="32"/>
         </w:rPr>
         <w:t>4.1 軟硬體、民雄算力與人力資源配置表</w:t>
       </w:r>
@@ -5032,7 +5032,7 @@
           <w:rFonts w:ascii="Arial" w:hAnsi="Arial" w:eastAsia="SimHei" w:cs="Arial"/>
           <w:b/>
           <w:color w:val="0C2340"/>
-          <w:sz w:val="20"/>
+          <w:sz w:val="22"/>
         </w:rPr>
         <w:t xml:space="preserve">表 </w:t>
       </w:r>
@@ -5042,7 +5042,7 @@
           <w:rFonts w:ascii="Arial" w:hAnsi="Arial" w:eastAsia="SimHei" w:cs="Arial"/>
           <w:b/>
           <w:color w:val="0C2340"/>
-          <w:sz w:val="20"/>
+          <w:sz w:val="22"/>
         </w:rPr>
         <w:t>：專案人力、主權算力與軟硬體資源配置表</w:t>
       </w:r>
@@ -5087,7 +5087,7 @@
                 <w:rFonts w:ascii="Arial" w:hAnsi="Arial" w:eastAsia="SimHei" w:cs="Arial"/>
                 <w:b/>
                 <w:color w:val="FFFFFF"/>
-                <w:sz w:val="19"/>
+                <w:sz w:val="22"/>
               </w:rPr>
               <w:t>資源類別</w:t>
             </w:r>
@@ -5113,7 +5113,7 @@
                 <w:rFonts w:ascii="Arial" w:hAnsi="Arial" w:eastAsia="SimHei" w:cs="Arial"/>
                 <w:b/>
                 <w:color w:val="FFFFFF"/>
-                <w:sz w:val="19"/>
+                <w:sz w:val="22"/>
               </w:rPr>
               <w:t>配置規格與內容</w:t>
             </w:r>
@@ -5139,7 +5139,7 @@
                 <w:rFonts w:ascii="Arial" w:hAnsi="Arial" w:eastAsia="SimHei" w:cs="Arial"/>
                 <w:b/>
                 <w:color w:val="FFFFFF"/>
-                <w:sz w:val="19"/>
+                <w:sz w:val="22"/>
               </w:rPr>
               <w:t>戰術與評測效益</w:t>
             </w:r>
@@ -5166,7 +5166,7 @@
               <w:rPr>
                 <w:rFonts w:ascii="Arial" w:hAnsi="Arial" w:eastAsia="SimHei" w:cs="Arial"/>
                 <w:color w:val="1E293B"/>
-                <w:sz w:val="18"/>
+                <w:sz w:val="21"/>
               </w:rPr>
               <w:t>主權算力硬體</w:t>
             </w:r>
@@ -5188,7 +5188,7 @@
               <w:rPr>
                 <w:rFonts w:ascii="Arial" w:hAnsi="Arial" w:eastAsia="SimHei" w:cs="Arial"/>
                 <w:color w:val="1E293B"/>
-                <w:sz w:val="18"/>
+                <w:sz w:val="21"/>
               </w:rPr>
               <w:t>民雄院區 100% 地端實體隔離 (Air-Gap) GPU 伺服器叢集</w:t>
             </w:r>
@@ -5210,7 +5210,7 @@
               <w:rPr>
                 <w:rFonts w:ascii="Arial" w:hAnsi="Arial" w:eastAsia="SimHei" w:cs="Arial"/>
                 <w:color w:val="1E293B"/>
-                <w:sz w:val="18"/>
+                <w:sz w:val="21"/>
               </w:rPr>
               <w:t>支援 Tier 1 70B 模型與 Tier 2 8x7B MoE 並行高併發推論</w:t>
             </w:r>
@@ -5237,7 +5237,7 @@
               <w:rPr>
                 <w:rFonts w:ascii="Arial" w:hAnsi="Arial" w:eastAsia="SimHei" w:cs="Arial"/>
                 <w:color w:val="1E293B"/>
-                <w:sz w:val="18"/>
+                <w:sz w:val="21"/>
               </w:rPr>
               <w:t>評測軟體工具鏈</w:t>
             </w:r>
@@ -5259,7 +5259,7 @@
               <w:rPr>
                 <w:rFonts w:ascii="Arial" w:hAnsi="Arial" w:eastAsia="SimHei" w:cs="Arial"/>
                 <w:color w:val="1E293B"/>
-                <w:sz w:val="18"/>
+                <w:sz w:val="21"/>
               </w:rPr>
               <w:t>garak, IBM ART 360, NRTK, XAITK, RAGAS, AgentBench, PyOD</w:t>
             </w:r>
@@ -5281,7 +5281,7 @@
               <w:rPr>
                 <w:rFonts w:ascii="Arial" w:hAnsi="Arial" w:eastAsia="SimHei" w:cs="Arial"/>
                 <w:color w:val="1E293B"/>
-                <w:sz w:val="18"/>
+                <w:sz w:val="21"/>
               </w:rPr>
               <w:t>覆蓋黑箱、白箱、紅軍演練、XAI 與 15 項量化指標自動評測</w:t>
             </w:r>
@@ -5308,7 +5308,7 @@
               <w:rPr>
                 <w:rFonts w:ascii="Arial" w:hAnsi="Arial" w:eastAsia="SimHei" w:cs="Arial"/>
                 <w:color w:val="1E293B"/>
-                <w:sz w:val="18"/>
+                <w:sz w:val="21"/>
               </w:rPr>
               <w:t>模擬驗證設施</w:t>
             </w:r>
@@ -5330,7 +5330,7 @@
               <w:rPr>
                 <w:rFonts w:ascii="Arial" w:hAnsi="Arial" w:eastAsia="SimHei" w:cs="Arial"/>
                 <w:color w:val="1E293B"/>
-                <w:sz w:val="18"/>
+                <w:sz w:val="21"/>
               </w:rPr>
               <w:t>VBS 4, EADSIM, ToAST, Cyber Range 平行戰場演練沙盒</w:t>
             </w:r>
@@ -5352,7 +5352,7 @@
               <w:rPr>
                 <w:rFonts w:ascii="Arial" w:hAnsi="Arial" w:eastAsia="SimHei" w:cs="Arial"/>
                 <w:color w:val="1E293B"/>
-                <w:sz w:val="18"/>
+                <w:sz w:val="21"/>
               </w:rPr>
               <w:t>支援 100 次蒙地卡羅模擬、RoE 人機協同與 &lt;100ms 自毀測試</w:t>
             </w:r>
@@ -5379,7 +5379,7 @@
               <w:rPr>
                 <w:rFonts w:ascii="Arial" w:hAnsi="Arial" w:eastAsia="SimHei" w:cs="Arial"/>
                 <w:color w:val="1E293B"/>
-                <w:sz w:val="18"/>
+                <w:sz w:val="21"/>
               </w:rPr>
               <w:t>專家專業團隊</w:t>
             </w:r>
@@ -5401,7 +5401,7 @@
               <w:rPr>
                 <w:rFonts w:ascii="Arial" w:hAnsi="Arial" w:eastAsia="SimHei" w:cs="Arial"/>
                 <w:color w:val="1E293B"/>
-                <w:sz w:val="18"/>
+                <w:sz w:val="21"/>
               </w:rPr>
               <w:t>國防 AI 技術長暨總架構師、資安 ISO 42001/CMMC 稽核員、紅藍隊專家</w:t>
             </w:r>
@@ -5423,7 +5423,7 @@
               <w:rPr>
                 <w:rFonts w:ascii="Arial" w:hAnsi="Arial" w:eastAsia="SimHei" w:cs="Arial"/>
                 <w:color w:val="1E293B"/>
-                <w:sz w:val="18"/>
+                <w:sz w:val="21"/>
               </w:rPr>
               <w:t>主導全案 SOP 擬定、TRL 審查、演算法後門稽核與責任劃分</w:t>
             </w:r>
@@ -5434,14 +5434,14 @@
     <w:p>
       <w:pPr>
         <w:pStyle w:val="Heading2"/>
-        <w:spacing w:before="200" w:after="120"/>
+        <w:spacing w:before="240" w:after="160"/>
       </w:pPr>
       <w:r>
         <w:rPr>
           <w:rFonts w:ascii="Arial" w:hAnsi="Arial" w:eastAsia="SimHei" w:cs="Arial"/>
           <w:b/>
           <w:color w:val="2563EB"/>
-          <w:sz w:val="29"/>
+          <w:sz w:val="32"/>
         </w:rPr>
         <w:t>4.2 專案風險評估與因應對策 (Risk Matrix)</w:t>
       </w:r>
@@ -5457,7 +5457,7 @@
           <w:rFonts w:ascii="Arial" w:hAnsi="Arial" w:eastAsia="SimHei" w:cs="Arial"/>
           <w:b/>
           <w:color w:val="0C2340"/>
-          <w:sz w:val="20"/>
+          <w:sz w:val="22"/>
         </w:rPr>
         <w:t xml:space="preserve">表 </w:t>
       </w:r>
@@ -5467,7 +5467,7 @@
           <w:rFonts w:ascii="Arial" w:hAnsi="Arial" w:eastAsia="SimHei" w:cs="Arial"/>
           <w:b/>
           <w:color w:val="0C2340"/>
-          <w:sz w:val="20"/>
+          <w:sz w:val="22"/>
         </w:rPr>
         <w:t>：國防 AI 導入主要風險評估與處置矩陣表</w:t>
       </w:r>
@@ -5513,7 +5513,7 @@
                 <w:rFonts w:ascii="Arial" w:hAnsi="Arial" w:eastAsia="SimHei" w:cs="Arial"/>
                 <w:b/>
                 <w:color w:val="FFFFFF"/>
-                <w:sz w:val="19"/>
+                <w:sz w:val="22"/>
               </w:rPr>
               <w:t>風險項目</w:t>
             </w:r>
@@ -5539,7 +5539,7 @@
                 <w:rFonts w:ascii="Arial" w:hAnsi="Arial" w:eastAsia="SimHei" w:cs="Arial"/>
                 <w:b/>
                 <w:color w:val="FFFFFF"/>
-                <w:sz w:val="19"/>
+                <w:sz w:val="22"/>
               </w:rPr>
               <w:t>風險等級</w:t>
             </w:r>
@@ -5565,7 +5565,7 @@
                 <w:rFonts w:ascii="Arial" w:hAnsi="Arial" w:eastAsia="SimHei" w:cs="Arial"/>
                 <w:b/>
                 <w:color w:val="FFFFFF"/>
-                <w:sz w:val="19"/>
+                <w:sz w:val="22"/>
               </w:rPr>
               <w:t>可能影響分析</w:t>
             </w:r>
@@ -5591,7 +5591,7 @@
                 <w:rFonts w:ascii="Arial" w:hAnsi="Arial" w:eastAsia="SimHei" w:cs="Arial"/>
                 <w:b/>
                 <w:color w:val="FFFFFF"/>
-                <w:sz w:val="19"/>
+                <w:sz w:val="22"/>
               </w:rPr>
               <w:t>預防與緩解處置對策</w:t>
             </w:r>
@@ -5618,7 +5618,7 @@
               <w:rPr>
                 <w:rFonts w:ascii="Arial" w:hAnsi="Arial" w:eastAsia="SimHei" w:cs="Arial"/>
                 <w:color w:val="1E293B"/>
-                <w:sz w:val="18"/>
+                <w:sz w:val="21"/>
               </w:rPr>
               <w:t>對抗貼片與數據污染</w:t>
             </w:r>
@@ -5643,7 +5643,7 @@
               <w:rPr>
                 <w:rFonts w:ascii="Arial" w:hAnsi="Arial" w:eastAsia="SimHei" w:cs="Arial"/>
                 <w:color w:val="1E293B"/>
-                <w:sz w:val="18"/>
+                <w:sz w:val="21"/>
               </w:rPr>
               <w:t>高 (High)</w:t>
             </w:r>
@@ -5665,7 +5665,7 @@
               <w:rPr>
                 <w:rFonts w:ascii="Arial" w:hAnsi="Arial" w:eastAsia="SimHei" w:cs="Arial"/>
                 <w:color w:val="1E293B"/>
-                <w:sz w:val="18"/>
+                <w:sz w:val="21"/>
               </w:rPr>
               <w:t>目標偵測誤判，無人機導彈攻擊無效目標</w:t>
             </w:r>
@@ -5687,7 +5687,7 @@
               <w:rPr>
                 <w:rFonts w:ascii="Arial" w:hAnsi="Arial" w:eastAsia="SimHei" w:cs="Arial"/>
                 <w:color w:val="1E293B"/>
-                <w:sz w:val="18"/>
+                <w:sz w:val="21"/>
               </w:rPr>
               <w:t>部署 IBM ART 360 預處理擾動，執行 Q1 對抗韌性門檻 (≥0.90)</w:t>
             </w:r>
@@ -5714,7 +5714,7 @@
               <w:rPr>
                 <w:rFonts w:ascii="Arial" w:hAnsi="Arial" w:eastAsia="SimHei" w:cs="Arial"/>
                 <w:color w:val="1E293B"/>
-                <w:sz w:val="18"/>
+                <w:sz w:val="21"/>
               </w:rPr>
               <w:t>戰術邊緣裝備遭俘獲</w:t>
             </w:r>
@@ -5739,7 +5739,7 @@
               <w:rPr>
                 <w:rFonts w:ascii="Arial" w:hAnsi="Arial" w:eastAsia="SimHei" w:cs="Arial"/>
                 <w:color w:val="1E293B"/>
-                <w:sz w:val="18"/>
+                <w:sz w:val="21"/>
               </w:rPr>
               <w:t>極高 (Critical)</w:t>
             </w:r>
@@ -5761,7 +5761,7 @@
               <w:rPr>
                 <w:rFonts w:ascii="Arial" w:hAnsi="Arial" w:eastAsia="SimHei" w:cs="Arial"/>
                 <w:color w:val="1E293B"/>
-                <w:sz w:val="18"/>
+                <w:sz w:val="21"/>
               </w:rPr>
               <w:t>敵方逆向工程獲取權重與保密演算法</w:t>
             </w:r>
@@ -5783,7 +5783,7 @@
               <w:rPr>
                 <w:rFonts w:ascii="Arial" w:hAnsi="Arial" w:eastAsia="SimHei" w:cs="Arial"/>
                 <w:color w:val="1E293B"/>
-                <w:sz w:val="18"/>
+                <w:sz w:val="21"/>
               </w:rPr>
               <w:t>軍規 Enclave 晶片與 &lt;100ms Flash/RAM 雜訊零化緊急自毀</w:t>
             </w:r>
@@ -5810,7 +5810,7 @@
               <w:rPr>
                 <w:rFonts w:ascii="Arial" w:hAnsi="Arial" w:eastAsia="SimHei" w:cs="Arial"/>
                 <w:color w:val="1E293B"/>
-                <w:sz w:val="18"/>
+                <w:sz w:val="21"/>
               </w:rPr>
               <w:t>敏感研發數據洩漏</w:t>
             </w:r>
@@ -5835,7 +5835,7 @@
               <w:rPr>
                 <w:rFonts w:ascii="Arial" w:hAnsi="Arial" w:eastAsia="SimHei" w:cs="Arial"/>
                 <w:color w:val="1E293B"/>
-                <w:sz w:val="18"/>
+                <w:sz w:val="21"/>
               </w:rPr>
               <w:t>高 (High)</w:t>
             </w:r>
@@ -5857,7 +5857,7 @@
               <w:rPr>
                 <w:rFonts w:ascii="Arial" w:hAnsi="Arial" w:eastAsia="SimHei" w:cs="Arial"/>
                 <w:color w:val="1E293B"/>
-                <w:sz w:val="18"/>
+                <w:sz w:val="21"/>
               </w:rPr>
               <w:t>RAG 檢索輸出不慎暴露機密降密等級</w:t>
             </w:r>
@@ -5879,7 +5879,7 @@
               <w:rPr>
                 <w:rFonts w:ascii="Arial" w:hAnsi="Arial" w:eastAsia="SimHei" w:cs="Arial"/>
                 <w:color w:val="1E293B"/>
-                <w:sz w:val="18"/>
+                <w:sz w:val="21"/>
               </w:rPr>
               <w:t>Milvus 向量 RBAC 標籤動態遮罩，合規 CMMC L2 零降密洩漏</w:t>
             </w:r>
@@ -5906,7 +5906,7 @@
               <w:rPr>
                 <w:rFonts w:ascii="Arial" w:hAnsi="Arial" w:eastAsia="SimHei" w:cs="Arial"/>
                 <w:color w:val="1E293B"/>
-                <w:sz w:val="18"/>
+                <w:sz w:val="21"/>
               </w:rPr>
               <w:t>操作員過度依賴 AI</w:t>
             </w:r>
@@ -5931,7 +5931,7 @@
               <w:rPr>
                 <w:rFonts w:ascii="Arial" w:hAnsi="Arial" w:eastAsia="SimHei" w:cs="Arial"/>
                 <w:color w:val="1E293B"/>
-                <w:sz w:val="18"/>
+                <w:sz w:val="21"/>
               </w:rPr>
               <w:t>中 (Medium)</w:t>
             </w:r>
@@ -5953,7 +5953,7 @@
               <w:rPr>
                 <w:rFonts w:ascii="Arial" w:hAnsi="Arial" w:eastAsia="SimHei" w:cs="Arial"/>
                 <w:color w:val="1E293B"/>
-                <w:sz w:val="18"/>
+                <w:sz w:val="21"/>
               </w:rPr>
               <w:t>盲目採納高信心錯誤提案引發戰術失誤</w:t>
             </w:r>
@@ -5975,7 +5975,7 @@
               <w:rPr>
                 <w:rFonts w:ascii="Arial" w:hAnsi="Arial" w:eastAsia="SimHei" w:cs="Arial"/>
                 <w:color w:val="1E293B"/>
-                <w:sz w:val="18"/>
+                <w:sz w:val="21"/>
               </w:rPr>
               <w:t>評測 ECE ≤ 0.05 信心校準，嚴格劃分 RoE 人力最終授權</w:t>
             </w:r>
@@ -5991,7 +5991,7 @@
     <w:p>
       <w:pPr>
         <w:pStyle w:val="Heading1"/>
-        <w:spacing w:before="280" w:after="120"/>
+        <w:spacing w:before="320" w:after="160"/>
       </w:pPr>
       <w:r>
         <w:rPr>
@@ -6005,13 +6005,13 @@
     </w:p>
     <w:p>
       <w:pPr>
-        <w:spacing w:before="0" w:after="120" w:line="312" w:lineRule="auto"/>
+        <w:spacing w:before="0" w:after="160" w:line="324" w:lineRule="auto"/>
       </w:pPr>
       <w:r>
         <w:rPr>
           <w:rFonts w:ascii="Arial" w:hAnsi="Arial" w:eastAsia="SimHei" w:cs="Arial"/>
           <w:color w:val="334155"/>
-          <w:sz w:val="22"/>
+          <w:sz w:val="28"/>
         </w:rPr>
         <w:t>本專案執行完畢後，將為國防防衛體系與國內國防產業帶來三大層面之關鍵戰略成果：</w:t>
       </w:r>
@@ -6019,27 +6019,27 @@
     <w:p>
       <w:pPr>
         <w:pStyle w:val="Heading2"/>
-        <w:spacing w:before="200" w:after="120"/>
+        <w:spacing w:before="240" w:after="160"/>
       </w:pPr>
       <w:r>
         <w:rPr>
           <w:rFonts w:ascii="Arial" w:hAnsi="Arial" w:eastAsia="SimHei" w:cs="Arial"/>
           <w:b/>
           <w:color w:val="2563EB"/>
-          <w:sz w:val="29"/>
+          <w:sz w:val="32"/>
         </w:rPr>
         <w:t>1. 戰術作戰層面：達成極致非對稱打擊效益</w:t>
       </w:r>
     </w:p>
     <w:p>
       <w:pPr>
-        <w:spacing w:before="0" w:after="120" w:line="312" w:lineRule="auto"/>
+        <w:spacing w:before="0" w:after="160" w:line="324" w:lineRule="auto"/>
       </w:pPr>
       <w:r>
         <w:rPr>
           <w:rFonts w:ascii="Arial" w:hAnsi="Arial" w:eastAsia="SimHei" w:cs="Arial"/>
           <w:color w:val="334155"/>
-          <w:sz w:val="22"/>
+          <w:sz w:val="28"/>
         </w:rPr>
         <w:t>實現無人機蜂群、無人船、無人潛艦、無人車與機器狗之跨域立體協同打擊能力。擊殺鏈反應時間由傳統數分鐘壓縮至秒級；端到端任務完成率 (MSR) 達 95% 以上，顯著提升台海防衛之區域拒止能力。</w:t>
       </w:r>
@@ -6047,27 +6047,27 @@
     <w:p>
       <w:pPr>
         <w:pStyle w:val="Heading2"/>
-        <w:spacing w:before="200" w:after="120"/>
+        <w:spacing w:before="240" w:after="160"/>
       </w:pPr>
       <w:r>
         <w:rPr>
           <w:rFonts w:ascii="Arial" w:hAnsi="Arial" w:eastAsia="SimHei" w:cs="Arial"/>
           <w:b/>
           <w:color w:val="2563EB"/>
-          <w:sz w:val="29"/>
+          <w:sz w:val="32"/>
         </w:rPr>
         <w:t>2. 資安與保密層面：建構零漏洞主權防衛屏障</w:t>
       </w:r>
     </w:p>
     <w:p>
       <w:pPr>
-        <w:spacing w:before="0" w:after="120" w:line="312" w:lineRule="auto"/>
+        <w:spacing w:before="0" w:after="160" w:line="324" w:lineRule="auto"/>
       </w:pPr>
       <w:r>
         <w:rPr>
           <w:rFonts w:ascii="Arial" w:hAnsi="Arial" w:eastAsia="SimHei" w:cs="Arial"/>
           <w:color w:val="334155"/>
-          <w:sz w:val="22"/>
+          <w:sz w:val="28"/>
         </w:rPr>
         <w:t>達成 100% 地端實體隔離 (Air-Gap) 主權算力營運，落實聯邦學習「模型移動，資料不動」；邊緣硬體自毀回應時間控制於 100ms 內；研發數據採 Milvus 向量 RBAC 動態遮罩，合規 CMMC Level 2，達到零降密洩漏風險。</w:t>
       </w:r>
@@ -6075,27 +6075,27 @@
     <w:p>
       <w:pPr>
         <w:pStyle w:val="Heading2"/>
-        <w:spacing w:before="200" w:after="120"/>
+        <w:spacing w:before="240" w:after="160"/>
       </w:pPr>
       <w:r>
         <w:rPr>
           <w:rFonts w:ascii="Arial" w:hAnsi="Arial" w:eastAsia="SimHei" w:cs="Arial"/>
           <w:b/>
           <w:color w:val="2563EB"/>
-          <w:sz w:val="29"/>
+          <w:sz w:val="32"/>
         </w:rPr>
         <w:t>3. 國家與產業層面：樹立自主 AIEC 評測認證標竿</w:t>
       </w:r>
     </w:p>
     <w:p>
       <w:pPr>
-        <w:spacing w:before="0" w:after="120" w:line="312" w:lineRule="auto"/>
+        <w:spacing w:before="0" w:after="160" w:line="324" w:lineRule="auto"/>
       </w:pPr>
       <w:r>
         <w:rPr>
           <w:rFonts w:ascii="Arial" w:hAnsi="Arial" w:eastAsia="SimHei" w:cs="Arial"/>
           <w:color w:val="334155"/>
-          <w:sz w:val="22"/>
+          <w:sz w:val="28"/>
         </w:rPr>
         <w:t>整合 ISO 42001 (AIMS) 與國家級 NCSIST AIEC 總體藍圖，建立國內第一個權威國防 AI 測試與評估 (T&amp;E) 中心，核發技術成熟度 (TRL) 戰術放行證書。不僅加速國內軍工產業 AI 升級，更確保國軍武器裝備具備國際頂級之可靠、可信任、可解釋與可當責品質。</w:t>
       </w:r>
@@ -6555,7 +6555,7 @@
       <w:rFonts w:ascii="Arial" w:hAnsi="Arial" w:eastAsia="SimHei" w:cs="Arial"/>
       <w:b w:val="0"/>
       <w:color w:val="334155"/>
-      <w:sz w:val="22"/>
+      <w:sz w:val="28"/>
     </w:rPr>
   </w:style>
   <w:style w:type="paragraph" w:styleId="Header">
@@ -6645,7 +6645,7 @@
       <w:b/>
       <w:bCs/>
       <w:color w:val="2563EB"/>
-      <w:sz w:val="29"/>
+      <w:sz w:val="32"/>
       <w:szCs w:val="26"/>
     </w:rPr>
   </w:style>
@@ -6669,7 +6669,7 @@
       <w:b/>
       <w:bCs/>
       <w:color w:val="1E3A8A"/>
-      <w:sz w:val="24"/>
+      <w:sz w:val="28"/>
     </w:rPr>
   </w:style>
   <w:style w:type="paragraph" w:styleId="Heading4">
@@ -7353,7 +7353,7 @@
       <w:b/>
       <w:bCs/>
       <w:color w:val="0C2340"/>
-      <w:sz w:val="20"/>
+      <w:sz w:val="22"/>
       <w:szCs w:val="18"/>
     </w:rPr>
   </w:style>

</xml_diff>

<commit_message>
Update VBA macro code to satisfy all 6 tasks and execute via Word COM automation
</commit_message>
<xml_diff>
--- a/AIEC國防領域AI應用導入專案規劃書.docx
+++ b/AIEC國防領域AI應用導入專案規劃書.docx
@@ -546,7 +546,7 @@
         <w:pStyle w:val="1"/>
         <w:spacing w:before="320" w:after="160"/>
       </w:pPr>
-      <w:bookmarkStart w:id="0" w:name="_Toc236069764"/>
+      <w:bookmarkStart w:id="0" w:name="_Toc236070377"/>
       <w:r>
         <w:lastRenderedPageBreak/>
         <w:t>📋</w:t>
@@ -572,7 +572,7 @@
         <w:pStyle w:val="1"/>
         <w:spacing w:before="320" w:after="160"/>
       </w:pPr>
-      <w:bookmarkStart w:id="1" w:name="_Toc236069765"/>
+      <w:bookmarkStart w:id="1" w:name="_Toc236070378"/>
       <w:r>
         <w:lastRenderedPageBreak/>
         <w:t>📊</w:t>
@@ -598,7 +598,7 @@
         <w:pStyle w:val="1"/>
         <w:spacing w:before="320" w:after="160"/>
       </w:pPr>
-      <w:bookmarkStart w:id="2" w:name="_Toc236069766"/>
+      <w:bookmarkStart w:id="2" w:name="_Toc236070379"/>
       <w:r>
         <w:lastRenderedPageBreak/>
         <w:t>🖼</w:t>
@@ -627,7 +627,7 @@
         <w:pStyle w:val="1"/>
         <w:spacing w:before="320" w:after="160"/>
       </w:pPr>
-      <w:bookmarkStart w:id="3" w:name="_Toc236069767"/>
+      <w:bookmarkStart w:id="3" w:name="_Toc236070380"/>
       <w:r>
         <w:lastRenderedPageBreak/>
         <w:t>第一章</w:t>
@@ -651,7 +651,7 @@
         <w:pStyle w:val="21"/>
         <w:spacing w:before="240" w:after="160"/>
       </w:pPr>
-      <w:bookmarkStart w:id="4" w:name="_Toc236069768"/>
+      <w:bookmarkStart w:id="4" w:name="_Toc236070381"/>
       <w:r>
         <w:t xml:space="preserve">1.1 AI </w:t>
       </w:r>
@@ -703,7 +703,7 @@
         <w:pStyle w:val="21"/>
         <w:spacing w:before="240" w:after="160"/>
       </w:pPr>
-      <w:bookmarkStart w:id="5" w:name="_Toc236069769"/>
+      <w:bookmarkStart w:id="5" w:name="_Toc236070382"/>
       <w:r>
         <w:t xml:space="preserve">1.2 </w:t>
       </w:r>
@@ -803,7 +803,7 @@
         <w:pStyle w:val="21"/>
         <w:spacing w:before="240" w:after="160"/>
       </w:pPr>
-      <w:bookmarkStart w:id="6" w:name="_Toc236069770"/>
+      <w:bookmarkStart w:id="6" w:name="_Toc236070383"/>
       <w:r>
         <w:t xml:space="preserve">1.3 </w:t>
       </w:r>
@@ -1372,7 +1372,7 @@
         <w:pStyle w:val="21"/>
         <w:spacing w:before="240" w:after="160"/>
       </w:pPr>
-      <w:bookmarkStart w:id="7" w:name="_Toc236069771"/>
+      <w:bookmarkStart w:id="7" w:name="_Toc236070384"/>
       <w:r>
         <w:t xml:space="preserve">1.4 </w:t>
       </w:r>
@@ -1615,7 +1615,7 @@
         <w:pStyle w:val="21"/>
         <w:spacing w:before="240" w:after="160"/>
       </w:pPr>
-      <w:bookmarkStart w:id="8" w:name="_Toc236069772"/>
+      <w:bookmarkStart w:id="8" w:name="_Toc236070385"/>
       <w:r>
         <w:t xml:space="preserve">1.5 </w:t>
       </w:r>
@@ -1874,7 +1874,7 @@
         <w:pStyle w:val="21"/>
         <w:spacing w:before="240" w:after="160"/>
       </w:pPr>
-      <w:bookmarkStart w:id="9" w:name="_Toc236069773"/>
+      <w:bookmarkStart w:id="9" w:name="_Toc236070386"/>
       <w:r>
         <w:t xml:space="preserve">1.6 </w:t>
       </w:r>
@@ -1965,7 +1965,7 @@
         <w:pStyle w:val="1"/>
         <w:spacing w:before="320" w:after="160"/>
       </w:pPr>
-      <w:bookmarkStart w:id="10" w:name="_Toc236069774"/>
+      <w:bookmarkStart w:id="10" w:name="_Toc236070387"/>
       <w:r>
         <w:lastRenderedPageBreak/>
         <w:t>第二章</w:t>
@@ -1983,7 +1983,7 @@
         <w:pStyle w:val="21"/>
         <w:spacing w:before="240" w:after="160"/>
       </w:pPr>
-      <w:bookmarkStart w:id="11" w:name="_Toc236069775"/>
+      <w:bookmarkStart w:id="11" w:name="_Toc236070388"/>
       <w:r>
         <w:t xml:space="preserve">2.1 </w:t>
       </w:r>
@@ -3131,7 +3131,7 @@
           <w:noProof/>
         </w:rPr>
         <w:drawing>
-          <wp:inline distT="0" distB="0" distL="0" distR="0" wp14:anchorId="17E97263" wp14:editId="71D607E5">
+          <wp:inline distT="0" distB="0" distL="0" distR="0" wp14:anchorId="2A9939F5" wp14:editId="535125A9">
             <wp:extent cx="5669280" cy="2153447"/>
             <wp:effectExtent l="0" t="0" r="0" b="0"/>
             <wp:docPr id="1" name="Picture 1"/>
@@ -3239,7 +3239,7 @@
         <w:pStyle w:val="21"/>
         <w:spacing w:before="240" w:after="160"/>
       </w:pPr>
-      <w:bookmarkStart w:id="12" w:name="_Toc236069776"/>
+      <w:bookmarkStart w:id="12" w:name="_Toc236070389"/>
       <w:r>
         <w:t xml:space="preserve">2.2 </w:t>
       </w:r>
@@ -5204,7 +5204,7 @@
           <w:noProof/>
         </w:rPr>
         <w:drawing>
-          <wp:inline distT="0" distB="0" distL="0" distR="0" wp14:anchorId="3AF9C46B" wp14:editId="1AF109D3">
+          <wp:inline distT="0" distB="0" distL="0" distR="0" wp14:anchorId="6B1EA8AF" wp14:editId="123A3378">
             <wp:extent cx="5669280" cy="2153447"/>
             <wp:effectExtent l="0" t="0" r="0" b="0"/>
             <wp:docPr id="2" name="Picture 2"/>
@@ -5312,7 +5312,7 @@
         <w:pStyle w:val="21"/>
         <w:spacing w:before="240" w:after="160"/>
       </w:pPr>
-      <w:bookmarkStart w:id="13" w:name="_Toc236069777"/>
+      <w:bookmarkStart w:id="13" w:name="_Toc236070390"/>
       <w:r>
         <w:t xml:space="preserve">2.3 </w:t>
       </w:r>
@@ -5433,7 +5433,7 @@
         </w:rPr>
         <w:lastRenderedPageBreak/>
         <w:drawing>
-          <wp:inline distT="0" distB="0" distL="0" distR="0" wp14:anchorId="2C12AC09" wp14:editId="635E9A94">
+          <wp:inline distT="0" distB="0" distL="0" distR="0" wp14:anchorId="5DD539AA" wp14:editId="58121C01">
             <wp:extent cx="5669280" cy="2153447"/>
             <wp:effectExtent l="0" t="0" r="0" b="0"/>
             <wp:docPr id="3" name="Picture 3"/>
@@ -5534,7 +5534,7 @@
         <w:pStyle w:val="1"/>
         <w:spacing w:before="320" w:after="160"/>
       </w:pPr>
-      <w:bookmarkStart w:id="14" w:name="_Toc236069778"/>
+      <w:bookmarkStart w:id="14" w:name="_Toc236070391"/>
       <w:r>
         <w:lastRenderedPageBreak/>
         <w:t>第三章</w:t>
@@ -5558,7 +5558,7 @@
         <w:pStyle w:val="21"/>
         <w:spacing w:before="240" w:after="160"/>
       </w:pPr>
-      <w:bookmarkStart w:id="15" w:name="_Toc236069779"/>
+      <w:bookmarkStart w:id="15" w:name="_Toc236070392"/>
       <w:r>
         <w:t xml:space="preserve">3.1 </w:t>
       </w:r>
@@ -5915,7 +5915,7 @@
         <w:pStyle w:val="21"/>
         <w:spacing w:before="240" w:after="160"/>
       </w:pPr>
-      <w:bookmarkStart w:id="16" w:name="_Toc236069780"/>
+      <w:bookmarkStart w:id="16" w:name="_Toc236070393"/>
       <w:r>
         <w:t xml:space="preserve">3.2 24 </w:t>
       </w:r>
@@ -7423,7 +7423,7 @@
         <w:pStyle w:val="1"/>
         <w:spacing w:before="320" w:after="160"/>
       </w:pPr>
-      <w:bookmarkStart w:id="17" w:name="_Toc236069781"/>
+      <w:bookmarkStart w:id="17" w:name="_Toc236070394"/>
       <w:r>
         <w:lastRenderedPageBreak/>
         <w:t>第四章</w:t>
@@ -7441,7 +7441,7 @@
         <w:pStyle w:val="21"/>
         <w:spacing w:before="240" w:after="160"/>
       </w:pPr>
-      <w:bookmarkStart w:id="18" w:name="_Toc236069782"/>
+      <w:bookmarkStart w:id="18" w:name="_Toc236070395"/>
       <w:r>
         <w:t xml:space="preserve">4.1 </w:t>
       </w:r>
@@ -8050,7 +8050,7 @@
         <w:pStyle w:val="21"/>
         <w:spacing w:before="240" w:after="160"/>
       </w:pPr>
-      <w:bookmarkStart w:id="19" w:name="_Toc236069783"/>
+      <w:bookmarkStart w:id="19" w:name="_Toc236070396"/>
       <w:r>
         <w:t xml:space="preserve">4.2 </w:t>
       </w:r>
@@ -8781,7 +8781,7 @@
         <w:pStyle w:val="1"/>
         <w:spacing w:before="320" w:after="160"/>
       </w:pPr>
-      <w:bookmarkStart w:id="20" w:name="_Toc236069784"/>
+      <w:bookmarkStart w:id="20" w:name="_Toc236070397"/>
       <w:r>
         <w:lastRenderedPageBreak/>
         <w:t>第五章</w:t>
@@ -8807,7 +8807,7 @@
         <w:pStyle w:val="21"/>
         <w:spacing w:before="240" w:after="160"/>
       </w:pPr>
-      <w:bookmarkStart w:id="21" w:name="_Toc236069785"/>
+      <w:bookmarkStart w:id="21" w:name="_Toc236070398"/>
       <w:r>
         <w:t xml:space="preserve">1. </w:t>
       </w:r>
@@ -8841,7 +8841,7 @@
         <w:pStyle w:val="21"/>
         <w:spacing w:before="240" w:after="160"/>
       </w:pPr>
-      <w:bookmarkStart w:id="22" w:name="_Toc236069786"/>
+      <w:bookmarkStart w:id="22" w:name="_Toc236070399"/>
       <w:r>
         <w:t xml:space="preserve">2. </w:t>
       </w:r>
@@ -8899,7 +8899,7 @@
         <w:pStyle w:val="21"/>
         <w:spacing w:before="240" w:after="160"/>
       </w:pPr>
-      <w:bookmarkStart w:id="23" w:name="_Toc236069787"/>
+      <w:bookmarkStart w:id="23" w:name="_Toc236070400"/>
       <w:r>
         <w:t xml:space="preserve">3. </w:t>
       </w:r>
@@ -8960,7 +8960,7 @@
     </w:p>
     <w:sdt>
       <w:sdtPr>
-        <w:id w:val="-319582649"/>
+        <w:id w:val="1458916663"/>
         <w:docPartObj>
           <w:docPartGallery w:val="Table of Contents"/>
           <w:docPartUnique/>
@@ -8987,7 +8987,7 @@
           <w:r>
             <w:fldChar w:fldCharType="separate"/>
           </w:r>
-          <w:hyperlink w:anchor="_Toc236069764" w:history="1">
+          <w:hyperlink w:anchor="_Toc236070377" w:history="1">
             <w:r>
               <w:rPr>
                 <w:rStyle w:val="affa"/>
@@ -9037,7 +9037,7 @@
                 <w:noProof/>
                 <w:webHidden/>
               </w:rPr>
-              <w:instrText xml:space="preserve"> PAGEREF _Toc236069764 \h </w:instrText>
+              <w:instrText xml:space="preserve"> PAGEREF _Toc236070377 \h </w:instrText>
             </w:r>
             <w:r>
               <w:rPr>
@@ -9078,7 +9078,7 @@
               <w:noProof/>
             </w:rPr>
           </w:pPr>
-          <w:hyperlink w:anchor="_Toc236069765" w:history="1">
+          <w:hyperlink w:anchor="_Toc236070378" w:history="1">
             <w:r>
               <w:rPr>
                 <w:rStyle w:val="affa"/>
@@ -9128,7 +9128,7 @@
                 <w:noProof/>
                 <w:webHidden/>
               </w:rPr>
-              <w:instrText xml:space="preserve"> PAGEREF _Toc236069765 \h </w:instrText>
+              <w:instrText xml:space="preserve"> PAGEREF _Toc236070378 \h </w:instrText>
             </w:r>
             <w:r>
               <w:rPr>
@@ -9169,7 +9169,7 @@
               <w:noProof/>
             </w:rPr>
           </w:pPr>
-          <w:hyperlink w:anchor="_Toc236069766" w:history="1">
+          <w:hyperlink w:anchor="_Toc236070379" w:history="1">
             <w:r>
               <w:rPr>
                 <w:rStyle w:val="affa"/>
@@ -9219,7 +9219,7 @@
                 <w:noProof/>
                 <w:webHidden/>
               </w:rPr>
-              <w:instrText xml:space="preserve"> PAGEREF _Toc236069766 \h </w:instrText>
+              <w:instrText xml:space="preserve"> PAGEREF _Toc236070379 \h </w:instrText>
             </w:r>
             <w:r>
               <w:rPr>
@@ -9260,7 +9260,7 @@
               <w:noProof/>
             </w:rPr>
           </w:pPr>
-          <w:hyperlink w:anchor="_Toc236069767" w:history="1">
+          <w:hyperlink w:anchor="_Toc236070380" w:history="1">
             <w:r>
               <w:rPr>
                 <w:rStyle w:val="affa"/>
@@ -9318,7 +9318,7 @@
                 <w:noProof/>
                 <w:webHidden/>
               </w:rPr>
-              <w:instrText xml:space="preserve"> PAGEREF _Toc236069767 \h </w:instrText>
+              <w:instrText xml:space="preserve"> PAGEREF _Toc236070380 \h </w:instrText>
             </w:r>
             <w:r>
               <w:rPr>
@@ -9360,7 +9360,7 @@
               <w:noProof/>
             </w:rPr>
           </w:pPr>
-          <w:hyperlink w:anchor="_Toc236069768" w:history="1">
+          <w:hyperlink w:anchor="_Toc236070381" w:history="1">
             <w:r>
               <w:rPr>
                 <w:rStyle w:val="affa"/>
@@ -9395,7 +9395,7 @@
                 <w:noProof/>
                 <w:webHidden/>
               </w:rPr>
-              <w:instrText xml:space="preserve"> PAGEREF _Toc236069768 \h </w:instrText>
+              <w:instrText xml:space="preserve"> PAGEREF _Toc236070381 \h </w:instrText>
             </w:r>
             <w:r>
               <w:rPr>
@@ -9437,7 +9437,7 @@
               <w:noProof/>
             </w:rPr>
           </w:pPr>
-          <w:hyperlink w:anchor="_Toc236069769" w:history="1">
+          <w:hyperlink w:anchor="_Toc236070382" w:history="1">
             <w:r>
               <w:rPr>
                 <w:rStyle w:val="affa"/>
@@ -9487,7 +9487,7 @@
                 <w:noProof/>
                 <w:webHidden/>
               </w:rPr>
-              <w:instrText xml:space="preserve"> PAGEREF _Toc236069769 \h </w:instrText>
+              <w:instrText xml:space="preserve"> PAGEREF _Toc236070382 \h </w:instrText>
             </w:r>
             <w:r>
               <w:rPr>
@@ -9529,7 +9529,7 @@
               <w:noProof/>
             </w:rPr>
           </w:pPr>
-          <w:hyperlink w:anchor="_Toc236069770" w:history="1">
+          <w:hyperlink w:anchor="_Toc236070383" w:history="1">
             <w:r>
               <w:rPr>
                 <w:rStyle w:val="affa"/>
@@ -9579,7 +9579,7 @@
                 <w:noProof/>
                 <w:webHidden/>
               </w:rPr>
-              <w:instrText xml:space="preserve"> PAGEREF _Toc236069770 \h </w:instrText>
+              <w:instrText xml:space="preserve"> PAGEREF _Toc236070383 \h </w:instrText>
             </w:r>
             <w:r>
               <w:rPr>
@@ -9621,7 +9621,7 @@
               <w:noProof/>
             </w:rPr>
           </w:pPr>
-          <w:hyperlink w:anchor="_Toc236069771" w:history="1">
+          <w:hyperlink w:anchor="_Toc236070384" w:history="1">
             <w:r>
               <w:rPr>
                 <w:rStyle w:val="affa"/>
@@ -9656,7 +9656,7 @@
                 <w:noProof/>
                 <w:webHidden/>
               </w:rPr>
-              <w:instrText xml:space="preserve"> PAGEREF _Toc236069771 \h </w:instrText>
+              <w:instrText xml:space="preserve"> PAGEREF _Toc236070384 \h </w:instrText>
             </w:r>
             <w:r>
               <w:rPr>
@@ -9698,7 +9698,7 @@
               <w:noProof/>
             </w:rPr>
           </w:pPr>
-          <w:hyperlink w:anchor="_Toc236069772" w:history="1">
+          <w:hyperlink w:anchor="_Toc236070385" w:history="1">
             <w:r>
               <w:rPr>
                 <w:rStyle w:val="affa"/>
@@ -9740,7 +9740,7 @@
                 <w:noProof/>
                 <w:webHidden/>
               </w:rPr>
-              <w:instrText xml:space="preserve"> PAGEREF _Toc236069772 \h </w:instrText>
+              <w:instrText xml:space="preserve"> PAGEREF _Toc236070385 \h </w:instrText>
             </w:r>
             <w:r>
               <w:rPr>
@@ -9782,7 +9782,7 @@
               <w:noProof/>
             </w:rPr>
           </w:pPr>
-          <w:hyperlink w:anchor="_Toc236069773" w:history="1">
+          <w:hyperlink w:anchor="_Toc236070386" w:history="1">
             <w:r>
               <w:rPr>
                 <w:rStyle w:val="affa"/>
@@ -9817,7 +9817,7 @@
                 <w:noProof/>
                 <w:webHidden/>
               </w:rPr>
-              <w:instrText xml:space="preserve"> PAGEREF _Toc236069773 \h </w:instrText>
+              <w:instrText xml:space="preserve"> PAGEREF _Toc236070386 \h </w:instrText>
             </w:r>
             <w:r>
               <w:rPr>
@@ -9858,7 +9858,7 @@
               <w:noProof/>
             </w:rPr>
           </w:pPr>
-          <w:hyperlink w:anchor="_Toc236069774" w:history="1">
+          <w:hyperlink w:anchor="_Toc236070387" w:history="1">
             <w:r>
               <w:rPr>
                 <w:rStyle w:val="affa"/>
@@ -9901,7 +9901,7 @@
                 <w:noProof/>
                 <w:webHidden/>
               </w:rPr>
-              <w:instrText xml:space="preserve"> PAGEREF _Toc236069774 \h </w:instrText>
+              <w:instrText xml:space="preserve"> PAGEREF _Toc236070387 \h </w:instrText>
             </w:r>
             <w:r>
               <w:rPr>
@@ -9943,7 +9943,7 @@
               <w:noProof/>
             </w:rPr>
           </w:pPr>
-          <w:hyperlink w:anchor="_Toc236069775" w:history="1">
+          <w:hyperlink w:anchor="_Toc236070388" w:history="1">
             <w:r>
               <w:rPr>
                 <w:rStyle w:val="affa"/>
@@ -9985,7 +9985,7 @@
                 <w:noProof/>
                 <w:webHidden/>
               </w:rPr>
-              <w:instrText xml:space="preserve"> PAGEREF _Toc236069775 \h </w:instrText>
+              <w:instrText xml:space="preserve"> PAGEREF _Toc236070388 \h </w:instrText>
             </w:r>
             <w:r>
               <w:rPr>
@@ -10027,7 +10027,7 @@
               <w:noProof/>
             </w:rPr>
           </w:pPr>
-          <w:hyperlink w:anchor="_Toc236069776" w:history="1">
+          <w:hyperlink w:anchor="_Toc236070389" w:history="1">
             <w:r>
               <w:rPr>
                 <w:rStyle w:val="affa"/>
@@ -10069,7 +10069,7 @@
                 <w:noProof/>
                 <w:webHidden/>
               </w:rPr>
-              <w:instrText xml:space="preserve"> PAGEREF _Toc236069776 \h </w:instrText>
+              <w:instrText xml:space="preserve"> PAGEREF _Toc236070389 \h </w:instrText>
             </w:r>
             <w:r>
               <w:rPr>
@@ -10111,7 +10111,7 @@
               <w:noProof/>
             </w:rPr>
           </w:pPr>
-          <w:hyperlink w:anchor="_Toc236069777" w:history="1">
+          <w:hyperlink w:anchor="_Toc236070390" w:history="1">
             <w:r>
               <w:rPr>
                 <w:rStyle w:val="affa"/>
@@ -10153,7 +10153,7 @@
                 <w:noProof/>
                 <w:webHidden/>
               </w:rPr>
-              <w:instrText xml:space="preserve"> PAGEREF _Toc236069777 \h </w:instrText>
+              <w:instrText xml:space="preserve"> PAGEREF _Toc236070390 \h </w:instrText>
             </w:r>
             <w:r>
               <w:rPr>
@@ -10194,7 +10194,7 @@
               <w:noProof/>
             </w:rPr>
           </w:pPr>
-          <w:hyperlink w:anchor="_Toc236069778" w:history="1">
+          <w:hyperlink w:anchor="_Toc236070391" w:history="1">
             <w:r>
               <w:rPr>
                 <w:rStyle w:val="affa"/>
@@ -10252,7 +10252,7 @@
                 <w:noProof/>
                 <w:webHidden/>
               </w:rPr>
-              <w:instrText xml:space="preserve"> PAGEREF _Toc236069778 \h </w:instrText>
+              <w:instrText xml:space="preserve"> PAGEREF _Toc236070391 \h </w:instrText>
             </w:r>
             <w:r>
               <w:rPr>
@@ -10294,7 +10294,7 @@
               <w:noProof/>
             </w:rPr>
           </w:pPr>
-          <w:hyperlink w:anchor="_Toc236069779" w:history="1">
+          <w:hyperlink w:anchor="_Toc236070392" w:history="1">
             <w:r>
               <w:rPr>
                 <w:rStyle w:val="affa"/>
@@ -10336,7 +10336,7 @@
                 <w:noProof/>
                 <w:webHidden/>
               </w:rPr>
-              <w:instrText xml:space="preserve"> PAGEREF _Toc236069779 \h </w:instrText>
+              <w:instrText xml:space="preserve"> PAGEREF _Toc236070392 \h </w:instrText>
             </w:r>
             <w:r>
               <w:rPr>
@@ -10378,7 +10378,7 @@
               <w:noProof/>
             </w:rPr>
           </w:pPr>
-          <w:hyperlink w:anchor="_Toc236069780" w:history="1">
+          <w:hyperlink w:anchor="_Toc236070393" w:history="1">
             <w:r>
               <w:rPr>
                 <w:rStyle w:val="affa"/>
@@ -10420,7 +10420,7 @@
                 <w:noProof/>
                 <w:webHidden/>
               </w:rPr>
-              <w:instrText xml:space="preserve"> PAGEREF _Toc236069780 \h </w:instrText>
+              <w:instrText xml:space="preserve"> PAGEREF _Toc236070393 \h </w:instrText>
             </w:r>
             <w:r>
               <w:rPr>
@@ -10461,7 +10461,7 @@
               <w:noProof/>
             </w:rPr>
           </w:pPr>
-          <w:hyperlink w:anchor="_Toc236069781" w:history="1">
+          <w:hyperlink w:anchor="_Toc236070394" w:history="1">
             <w:r>
               <w:rPr>
                 <w:rStyle w:val="affa"/>
@@ -10504,7 +10504,7 @@
                 <w:noProof/>
                 <w:webHidden/>
               </w:rPr>
-              <w:instrText xml:space="preserve"> PAGEREF _Toc236069781 \h </w:instrText>
+              <w:instrText xml:space="preserve"> PAGEREF _Toc236070394 \h </w:instrText>
             </w:r>
             <w:r>
               <w:rPr>
@@ -10546,7 +10546,7 @@
               <w:noProof/>
             </w:rPr>
           </w:pPr>
-          <w:hyperlink w:anchor="_Toc236069782" w:history="1">
+          <w:hyperlink w:anchor="_Toc236070395" w:history="1">
             <w:r>
               <w:rPr>
                 <w:rStyle w:val="affa"/>
@@ -10581,7 +10581,7 @@
                 <w:noProof/>
                 <w:webHidden/>
               </w:rPr>
-              <w:instrText xml:space="preserve"> PAGEREF _Toc236069782 \h </w:instrText>
+              <w:instrText xml:space="preserve"> PAGEREF _Toc236070395 \h </w:instrText>
             </w:r>
             <w:r>
               <w:rPr>
@@ -10623,7 +10623,7 @@
               <w:noProof/>
             </w:rPr>
           </w:pPr>
-          <w:hyperlink w:anchor="_Toc236069783" w:history="1">
+          <w:hyperlink w:anchor="_Toc236070396" w:history="1">
             <w:r>
               <w:rPr>
                 <w:rStyle w:val="affa"/>
@@ -10665,7 +10665,7 @@
                 <w:noProof/>
                 <w:webHidden/>
               </w:rPr>
-              <w:instrText xml:space="preserve"> PAGEREF _Toc236069783 \h </w:instrText>
+              <w:instrText xml:space="preserve"> PAGEREF _Toc236070396 \h </w:instrText>
             </w:r>
             <w:r>
               <w:rPr>
@@ -10706,7 +10706,7 @@
               <w:noProof/>
             </w:rPr>
           </w:pPr>
-          <w:hyperlink w:anchor="_Toc236069784" w:history="1">
+          <w:hyperlink w:anchor="_Toc236070397" w:history="1">
             <w:r>
               <w:rPr>
                 <w:rStyle w:val="affa"/>
@@ -10749,7 +10749,7 @@
                 <w:noProof/>
                 <w:webHidden/>
               </w:rPr>
-              <w:instrText xml:space="preserve"> PAGEREF _Toc236069784 \h </w:instrText>
+              <w:instrText xml:space="preserve"> PAGEREF _Toc236070397 \h </w:instrText>
             </w:r>
             <w:r>
               <w:rPr>
@@ -10791,7 +10791,7 @@
               <w:noProof/>
             </w:rPr>
           </w:pPr>
-          <w:hyperlink w:anchor="_Toc236069785" w:history="1">
+          <w:hyperlink w:anchor="_Toc236070398" w:history="1">
             <w:r>
               <w:rPr>
                 <w:rStyle w:val="affa"/>
@@ -10826,7 +10826,7 @@
                 <w:noProof/>
                 <w:webHidden/>
               </w:rPr>
-              <w:instrText xml:space="preserve"> PAGEREF _Toc236069785 \h </w:instrText>
+              <w:instrText xml:space="preserve"> PAGEREF _Toc236070398 \h </w:instrText>
             </w:r>
             <w:r>
               <w:rPr>
@@ -10868,7 +10868,7 @@
               <w:noProof/>
             </w:rPr>
           </w:pPr>
-          <w:hyperlink w:anchor="_Toc236069786" w:history="1">
+          <w:hyperlink w:anchor="_Toc236070399" w:history="1">
             <w:r>
               <w:rPr>
                 <w:rStyle w:val="affa"/>
@@ -10903,7 +10903,7 @@
                 <w:noProof/>
                 <w:webHidden/>
               </w:rPr>
-              <w:instrText xml:space="preserve"> PAGEREF _Toc236069786 \h </w:instrText>
+              <w:instrText xml:space="preserve"> PAGEREF _Toc236070399 \h </w:instrText>
             </w:r>
             <w:r>
               <w:rPr>
@@ -10945,7 +10945,7 @@
               <w:noProof/>
             </w:rPr>
           </w:pPr>
-          <w:hyperlink w:anchor="_Toc236069787" w:history="1">
+          <w:hyperlink w:anchor="_Toc236070400" w:history="1">
             <w:r>
               <w:rPr>
                 <w:rStyle w:val="affa"/>
@@ -10995,7 +10995,7 @@
                 <w:noProof/>
                 <w:webHidden/>
               </w:rPr>
-              <w:instrText xml:space="preserve"> PAGEREF _Toc236069787 \h </w:instrText>
+              <w:instrText xml:space="preserve"> PAGEREF _Toc236070400 \h </w:instrText>
             </w:r>
             <w:r>
               <w:rPr>
@@ -11035,7 +11035,7 @@
     </w:sdt>
     <w:sdt>
       <w:sdtPr>
-        <w:id w:val="-1540894040"/>
+        <w:id w:val="-1929337665"/>
         <w:docPartObj>
           <w:docPartGallery w:val="Table of Contents"/>
           <w:docPartUnique/>
@@ -11071,7 +11071,7 @@
     </w:sdt>
     <w:sdt>
       <w:sdtPr>
-        <w:id w:val="-307011056"/>
+        <w:id w:val="-1910918922"/>
         <w:docPartObj>
           <w:docPartGallery w:val="Table of Contents"/>
           <w:docPartUnique/>
@@ -11396,31 +11396,31 @@
       </w:rPr>
     </w:lvl>
   </w:abstractNum>
-  <w:num w:numId="1" w16cid:durableId="2054235211">
+  <w:num w:numId="1" w16cid:durableId="1954362337">
     <w:abstractNumId w:val="8"/>
   </w:num>
-  <w:num w:numId="2" w16cid:durableId="328875547">
+  <w:num w:numId="2" w16cid:durableId="82147283">
     <w:abstractNumId w:val="6"/>
   </w:num>
-  <w:num w:numId="3" w16cid:durableId="1125659741">
+  <w:num w:numId="3" w16cid:durableId="62721904">
     <w:abstractNumId w:val="5"/>
   </w:num>
-  <w:num w:numId="4" w16cid:durableId="1571114360">
+  <w:num w:numId="4" w16cid:durableId="87582750">
     <w:abstractNumId w:val="4"/>
   </w:num>
-  <w:num w:numId="5" w16cid:durableId="1182861248">
+  <w:num w:numId="5" w16cid:durableId="196548075">
     <w:abstractNumId w:val="7"/>
   </w:num>
-  <w:num w:numId="6" w16cid:durableId="704212545">
+  <w:num w:numId="6" w16cid:durableId="62801759">
     <w:abstractNumId w:val="3"/>
   </w:num>
-  <w:num w:numId="7" w16cid:durableId="189539723">
+  <w:num w:numId="7" w16cid:durableId="1670451303">
     <w:abstractNumId w:val="2"/>
   </w:num>
-  <w:num w:numId="8" w16cid:durableId="22295142">
+  <w:num w:numId="8" w16cid:durableId="370570339">
     <w:abstractNumId w:val="1"/>
   </w:num>
-  <w:num w:numId="9" w16cid:durableId="1560287579">
+  <w:num w:numId="9" w16cid:durableId="42754652">
     <w:abstractNumId w:val="0"/>
   </w:num>
 </w:numbering>
@@ -22815,7 +22815,7 @@
     <w:autoRedefine/>
     <w:uiPriority w:val="39"/>
     <w:unhideWhenUsed/>
-    <w:rsid w:val="00B168B6"/>
+    <w:rsid w:val="00AB62CC"/>
   </w:style>
   <w:style w:type="paragraph" w:styleId="2a">
     <w:name w:val="toc 2"/>
@@ -22824,7 +22824,7 @@
     <w:autoRedefine/>
     <w:uiPriority w:val="39"/>
     <w:unhideWhenUsed/>
-    <w:rsid w:val="00B168B6"/>
+    <w:rsid w:val="00AB62CC"/>
     <w:pPr>
       <w:ind w:leftChars="200" w:left="480"/>
     </w:pPr>
@@ -22834,7 +22834,7 @@
     <w:basedOn w:val="a2"/>
     <w:uiPriority w:val="99"/>
     <w:unhideWhenUsed/>
-    <w:rsid w:val="00B168B6"/>
+    <w:rsid w:val="00AB62CC"/>
     <w:rPr>
       <w:color w:val="0000FF" w:themeColor="hyperlink"/>
       <w:u w:val="single"/>

</xml_diff>

<commit_message>
Position Page 2 TOC, Page 3 List of Tables, Page 4 List of Figures strictly at the front of document
</commit_message>
<xml_diff>
--- a/AIEC國防領域AI應用導入專案規劃書.docx
+++ b/AIEC國防領域AI應用導入專案規劃書.docx
@@ -546,7 +546,7 @@
         <w:pStyle w:val="1"/>
         <w:spacing w:before="320" w:after="160"/>
       </w:pPr>
-      <w:bookmarkStart w:id="0" w:name="_Toc236071165"/>
+      <w:bookmarkStart w:id="0" w:name="_Toc236071426"/>
       <w:r>
         <w:lastRenderedPageBreak/>
         <w:t>📋</w:t>
@@ -572,7 +572,7 @@
         <w:pStyle w:val="1"/>
         <w:spacing w:before="320" w:after="160"/>
       </w:pPr>
-      <w:bookmarkStart w:id="1" w:name="_Toc236071166"/>
+      <w:bookmarkStart w:id="1" w:name="_Toc236071427"/>
       <w:r>
         <w:lastRenderedPageBreak/>
         <w:t>📊</w:t>
@@ -598,7 +598,7 @@
         <w:pStyle w:val="1"/>
         <w:spacing w:before="320" w:after="160"/>
       </w:pPr>
-      <w:bookmarkStart w:id="2" w:name="_Toc236071167"/>
+      <w:bookmarkStart w:id="2" w:name="_Toc236071428"/>
       <w:r>
         <w:lastRenderedPageBreak/>
         <w:t>🖼</w:t>
@@ -627,7 +627,7 @@
         <w:pStyle w:val="1"/>
         <w:spacing w:before="320" w:after="160"/>
       </w:pPr>
-      <w:bookmarkStart w:id="3" w:name="_Toc236071168"/>
+      <w:bookmarkStart w:id="3" w:name="_Toc236071429"/>
       <w:r>
         <w:lastRenderedPageBreak/>
         <w:t>第一章</w:t>
@@ -651,7 +651,7 @@
         <w:pStyle w:val="21"/>
         <w:spacing w:before="240" w:after="160"/>
       </w:pPr>
-      <w:bookmarkStart w:id="4" w:name="_Toc236071169"/>
+      <w:bookmarkStart w:id="4" w:name="_Toc236071430"/>
       <w:r>
         <w:t xml:space="preserve">1.1 AI </w:t>
       </w:r>
@@ -703,7 +703,7 @@
         <w:pStyle w:val="21"/>
         <w:spacing w:before="240" w:after="160"/>
       </w:pPr>
-      <w:bookmarkStart w:id="5" w:name="_Toc236071170"/>
+      <w:bookmarkStart w:id="5" w:name="_Toc236071431"/>
       <w:r>
         <w:t xml:space="preserve">1.2 </w:t>
       </w:r>
@@ -803,7 +803,7 @@
         <w:pStyle w:val="21"/>
         <w:spacing w:before="240" w:after="160"/>
       </w:pPr>
-      <w:bookmarkStart w:id="6" w:name="_Toc236071171"/>
+      <w:bookmarkStart w:id="6" w:name="_Toc236071432"/>
       <w:r>
         <w:t xml:space="preserve">1.3 </w:t>
       </w:r>
@@ -1372,7 +1372,7 @@
         <w:pStyle w:val="21"/>
         <w:spacing w:before="240" w:after="160"/>
       </w:pPr>
-      <w:bookmarkStart w:id="7" w:name="_Toc236071172"/>
+      <w:bookmarkStart w:id="7" w:name="_Toc236071433"/>
       <w:r>
         <w:t xml:space="preserve">1.4 </w:t>
       </w:r>
@@ -1615,7 +1615,7 @@
         <w:pStyle w:val="21"/>
         <w:spacing w:before="240" w:after="160"/>
       </w:pPr>
-      <w:bookmarkStart w:id="8" w:name="_Toc236071173"/>
+      <w:bookmarkStart w:id="8" w:name="_Toc236071434"/>
       <w:r>
         <w:t xml:space="preserve">1.5 </w:t>
       </w:r>
@@ -1874,7 +1874,7 @@
         <w:pStyle w:val="21"/>
         <w:spacing w:before="240" w:after="160"/>
       </w:pPr>
-      <w:bookmarkStart w:id="9" w:name="_Toc236071174"/>
+      <w:bookmarkStart w:id="9" w:name="_Toc236071435"/>
       <w:r>
         <w:t xml:space="preserve">1.6 </w:t>
       </w:r>
@@ -1965,7 +1965,7 @@
         <w:pStyle w:val="1"/>
         <w:spacing w:before="320" w:after="160"/>
       </w:pPr>
-      <w:bookmarkStart w:id="10" w:name="_Toc236071175"/>
+      <w:bookmarkStart w:id="10" w:name="_Toc236071436"/>
       <w:r>
         <w:lastRenderedPageBreak/>
         <w:t>第二章</w:t>
@@ -1983,7 +1983,7 @@
         <w:pStyle w:val="21"/>
         <w:spacing w:before="240" w:after="160"/>
       </w:pPr>
-      <w:bookmarkStart w:id="11" w:name="_Toc236071176"/>
+      <w:bookmarkStart w:id="11" w:name="_Toc236071437"/>
       <w:r>
         <w:t xml:space="preserve">2.1 </w:t>
       </w:r>
@@ -3131,7 +3131,7 @@
           <w:noProof/>
         </w:rPr>
         <w:drawing>
-          <wp:inline distT="0" distB="0" distL="0" distR="0" wp14:anchorId="3A041481" wp14:editId="499365D0">
+          <wp:inline distT="0" distB="0" distL="0" distR="0" wp14:anchorId="73DCD64F" wp14:editId="7A169C51">
             <wp:extent cx="5669280" cy="2153447"/>
             <wp:effectExtent l="0" t="0" r="0" b="0"/>
             <wp:docPr id="1" name="Picture 1"/>
@@ -3239,7 +3239,7 @@
         <w:pStyle w:val="21"/>
         <w:spacing w:before="240" w:after="160"/>
       </w:pPr>
-      <w:bookmarkStart w:id="12" w:name="_Toc236071177"/>
+      <w:bookmarkStart w:id="12" w:name="_Toc236071438"/>
       <w:r>
         <w:t xml:space="preserve">2.2 </w:t>
       </w:r>
@@ -5204,7 +5204,7 @@
           <w:noProof/>
         </w:rPr>
         <w:drawing>
-          <wp:inline distT="0" distB="0" distL="0" distR="0" wp14:anchorId="36B5CB4F" wp14:editId="77455B01">
+          <wp:inline distT="0" distB="0" distL="0" distR="0" wp14:anchorId="5077C6F0" wp14:editId="1E17B43D">
             <wp:extent cx="5669280" cy="2153447"/>
             <wp:effectExtent l="0" t="0" r="0" b="0"/>
             <wp:docPr id="2" name="Picture 2"/>
@@ -5312,7 +5312,7 @@
         <w:pStyle w:val="21"/>
         <w:spacing w:before="240" w:after="160"/>
       </w:pPr>
-      <w:bookmarkStart w:id="13" w:name="_Toc236071178"/>
+      <w:bookmarkStart w:id="13" w:name="_Toc236071439"/>
       <w:r>
         <w:t xml:space="preserve">2.3 </w:t>
       </w:r>
@@ -5433,7 +5433,7 @@
         </w:rPr>
         <w:lastRenderedPageBreak/>
         <w:drawing>
-          <wp:inline distT="0" distB="0" distL="0" distR="0" wp14:anchorId="3AC1363E" wp14:editId="214AAC30">
+          <wp:inline distT="0" distB="0" distL="0" distR="0" wp14:anchorId="0E6A53D7" wp14:editId="201F241E">
             <wp:extent cx="5669280" cy="2153447"/>
             <wp:effectExtent l="0" t="0" r="0" b="0"/>
             <wp:docPr id="3" name="Picture 3"/>
@@ -5534,7 +5534,7 @@
         <w:pStyle w:val="1"/>
         <w:spacing w:before="320" w:after="160"/>
       </w:pPr>
-      <w:bookmarkStart w:id="14" w:name="_Toc236071179"/>
+      <w:bookmarkStart w:id="14" w:name="_Toc236071440"/>
       <w:r>
         <w:lastRenderedPageBreak/>
         <w:t>第三章</w:t>
@@ -5558,7 +5558,7 @@
         <w:pStyle w:val="21"/>
         <w:spacing w:before="240" w:after="160"/>
       </w:pPr>
-      <w:bookmarkStart w:id="15" w:name="_Toc236071180"/>
+      <w:bookmarkStart w:id="15" w:name="_Toc236071441"/>
       <w:r>
         <w:t xml:space="preserve">3.1 </w:t>
       </w:r>
@@ -5915,7 +5915,7 @@
         <w:pStyle w:val="21"/>
         <w:spacing w:before="240" w:after="160"/>
       </w:pPr>
-      <w:bookmarkStart w:id="16" w:name="_Toc236071181"/>
+      <w:bookmarkStart w:id="16" w:name="_Toc236071442"/>
       <w:r>
         <w:t xml:space="preserve">3.2 24 </w:t>
       </w:r>
@@ -7423,7 +7423,7 @@
         <w:pStyle w:val="1"/>
         <w:spacing w:before="320" w:after="160"/>
       </w:pPr>
-      <w:bookmarkStart w:id="17" w:name="_Toc236071182"/>
+      <w:bookmarkStart w:id="17" w:name="_Toc236071443"/>
       <w:r>
         <w:lastRenderedPageBreak/>
         <w:t>第四章</w:t>
@@ -7441,7 +7441,7 @@
         <w:pStyle w:val="21"/>
         <w:spacing w:before="240" w:after="160"/>
       </w:pPr>
-      <w:bookmarkStart w:id="18" w:name="_Toc236071183"/>
+      <w:bookmarkStart w:id="18" w:name="_Toc236071444"/>
       <w:r>
         <w:t xml:space="preserve">4.1 </w:t>
       </w:r>
@@ -8050,7 +8050,7 @@
         <w:pStyle w:val="21"/>
         <w:spacing w:before="240" w:after="160"/>
       </w:pPr>
-      <w:bookmarkStart w:id="19" w:name="_Toc236071184"/>
+      <w:bookmarkStart w:id="19" w:name="_Toc236071445"/>
       <w:r>
         <w:t xml:space="preserve">4.2 </w:t>
       </w:r>
@@ -8781,7 +8781,7 @@
         <w:pStyle w:val="1"/>
         <w:spacing w:before="320" w:after="160"/>
       </w:pPr>
-      <w:bookmarkStart w:id="20" w:name="_Toc236071185"/>
+      <w:bookmarkStart w:id="20" w:name="_Toc236071446"/>
       <w:r>
         <w:lastRenderedPageBreak/>
         <w:t>第五章</w:t>
@@ -8807,7 +8807,7 @@
         <w:pStyle w:val="21"/>
         <w:spacing w:before="240" w:after="160"/>
       </w:pPr>
-      <w:bookmarkStart w:id="21" w:name="_Toc236071186"/>
+      <w:bookmarkStart w:id="21" w:name="_Toc236071447"/>
       <w:r>
         <w:t xml:space="preserve">1. </w:t>
       </w:r>
@@ -8841,7 +8841,7 @@
         <w:pStyle w:val="21"/>
         <w:spacing w:before="240" w:after="160"/>
       </w:pPr>
-      <w:bookmarkStart w:id="22" w:name="_Toc236071187"/>
+      <w:bookmarkStart w:id="22" w:name="_Toc236071448"/>
       <w:r>
         <w:t xml:space="preserve">2. </w:t>
       </w:r>
@@ -8899,7 +8899,7 @@
         <w:pStyle w:val="21"/>
         <w:spacing w:before="240" w:after="160"/>
       </w:pPr>
-      <w:bookmarkStart w:id="23" w:name="_Toc236071188"/>
+      <w:bookmarkStart w:id="23" w:name="_Toc236071449"/>
       <w:r>
         <w:t xml:space="preserve">3. </w:t>
       </w:r>
@@ -8960,7 +8960,7 @@
     </w:p>
     <w:sdt>
       <w:sdtPr>
-        <w:id w:val="-2108190163"/>
+        <w:id w:val="-361054288"/>
         <w:docPartObj>
           <w:docPartGallery w:val="Table of Contents"/>
           <w:docPartUnique/>
@@ -8987,7 +8987,7 @@
           <w:r>
             <w:fldChar w:fldCharType="separate"/>
           </w:r>
-          <w:hyperlink w:anchor="_Toc236071165" w:history="1">
+          <w:hyperlink w:anchor="_Toc236071426" w:history="1">
             <w:r>
               <w:rPr>
                 <w:rStyle w:val="affa"/>
@@ -9037,7 +9037,7 @@
                 <w:noProof/>
                 <w:webHidden/>
               </w:rPr>
-              <w:instrText xml:space="preserve"> PAGEREF _Toc236071165 \h </w:instrText>
+              <w:instrText xml:space="preserve"> PAGEREF _Toc236071426 \h </w:instrText>
             </w:r>
             <w:r>
               <w:rPr>
@@ -9078,7 +9078,7 @@
               <w:noProof/>
             </w:rPr>
           </w:pPr>
-          <w:hyperlink w:anchor="_Toc236071166" w:history="1">
+          <w:hyperlink w:anchor="_Toc236071427" w:history="1">
             <w:r>
               <w:rPr>
                 <w:rStyle w:val="affa"/>
@@ -9128,7 +9128,7 @@
                 <w:noProof/>
                 <w:webHidden/>
               </w:rPr>
-              <w:instrText xml:space="preserve"> PAGEREF _Toc236071166 \h </w:instrText>
+              <w:instrText xml:space="preserve"> PAGEREF _Toc236071427 \h </w:instrText>
             </w:r>
             <w:r>
               <w:rPr>
@@ -9169,7 +9169,7 @@
               <w:noProof/>
             </w:rPr>
           </w:pPr>
-          <w:hyperlink w:anchor="_Toc236071167" w:history="1">
+          <w:hyperlink w:anchor="_Toc236071428" w:history="1">
             <w:r>
               <w:rPr>
                 <w:rStyle w:val="affa"/>
@@ -9219,7 +9219,7 @@
                 <w:noProof/>
                 <w:webHidden/>
               </w:rPr>
-              <w:instrText xml:space="preserve"> PAGEREF _Toc236071167 \h </w:instrText>
+              <w:instrText xml:space="preserve"> PAGEREF _Toc236071428 \h </w:instrText>
             </w:r>
             <w:r>
               <w:rPr>
@@ -9260,7 +9260,7 @@
               <w:noProof/>
             </w:rPr>
           </w:pPr>
-          <w:hyperlink w:anchor="_Toc236071168" w:history="1">
+          <w:hyperlink w:anchor="_Toc236071429" w:history="1">
             <w:r>
               <w:rPr>
                 <w:rStyle w:val="affa"/>
@@ -9318,7 +9318,7 @@
                 <w:noProof/>
                 <w:webHidden/>
               </w:rPr>
-              <w:instrText xml:space="preserve"> PAGEREF _Toc236071168 \h </w:instrText>
+              <w:instrText xml:space="preserve"> PAGEREF _Toc236071429 \h </w:instrText>
             </w:r>
             <w:r>
               <w:rPr>
@@ -9360,7 +9360,7 @@
               <w:noProof/>
             </w:rPr>
           </w:pPr>
-          <w:hyperlink w:anchor="_Toc236071169" w:history="1">
+          <w:hyperlink w:anchor="_Toc236071430" w:history="1">
             <w:r>
               <w:rPr>
                 <w:rStyle w:val="affa"/>
@@ -9395,7 +9395,7 @@
                 <w:noProof/>
                 <w:webHidden/>
               </w:rPr>
-              <w:instrText xml:space="preserve"> PAGEREF _Toc236071169 \h </w:instrText>
+              <w:instrText xml:space="preserve"> PAGEREF _Toc236071430 \h </w:instrText>
             </w:r>
             <w:r>
               <w:rPr>
@@ -9437,7 +9437,7 @@
               <w:noProof/>
             </w:rPr>
           </w:pPr>
-          <w:hyperlink w:anchor="_Toc236071170" w:history="1">
+          <w:hyperlink w:anchor="_Toc236071431" w:history="1">
             <w:r>
               <w:rPr>
                 <w:rStyle w:val="affa"/>
@@ -9487,7 +9487,7 @@
                 <w:noProof/>
                 <w:webHidden/>
               </w:rPr>
-              <w:instrText xml:space="preserve"> PAGEREF _Toc236071170 \h </w:instrText>
+              <w:instrText xml:space="preserve"> PAGEREF _Toc236071431 \h </w:instrText>
             </w:r>
             <w:r>
               <w:rPr>
@@ -9529,7 +9529,7 @@
               <w:noProof/>
             </w:rPr>
           </w:pPr>
-          <w:hyperlink w:anchor="_Toc236071171" w:history="1">
+          <w:hyperlink w:anchor="_Toc236071432" w:history="1">
             <w:r>
               <w:rPr>
                 <w:rStyle w:val="affa"/>
@@ -9579,7 +9579,7 @@
                 <w:noProof/>
                 <w:webHidden/>
               </w:rPr>
-              <w:instrText xml:space="preserve"> PAGEREF _Toc236071171 \h </w:instrText>
+              <w:instrText xml:space="preserve"> PAGEREF _Toc236071432 \h </w:instrText>
             </w:r>
             <w:r>
               <w:rPr>
@@ -9621,7 +9621,7 @@
               <w:noProof/>
             </w:rPr>
           </w:pPr>
-          <w:hyperlink w:anchor="_Toc236071172" w:history="1">
+          <w:hyperlink w:anchor="_Toc236071433" w:history="1">
             <w:r>
               <w:rPr>
                 <w:rStyle w:val="affa"/>
@@ -9656,7 +9656,7 @@
                 <w:noProof/>
                 <w:webHidden/>
               </w:rPr>
-              <w:instrText xml:space="preserve"> PAGEREF _Toc236071172 \h </w:instrText>
+              <w:instrText xml:space="preserve"> PAGEREF _Toc236071433 \h </w:instrText>
             </w:r>
             <w:r>
               <w:rPr>
@@ -9698,7 +9698,7 @@
               <w:noProof/>
             </w:rPr>
           </w:pPr>
-          <w:hyperlink w:anchor="_Toc236071173" w:history="1">
+          <w:hyperlink w:anchor="_Toc236071434" w:history="1">
             <w:r>
               <w:rPr>
                 <w:rStyle w:val="affa"/>
@@ -9740,7 +9740,7 @@
                 <w:noProof/>
                 <w:webHidden/>
               </w:rPr>
-              <w:instrText xml:space="preserve"> PAGEREF _Toc236071173 \h </w:instrText>
+              <w:instrText xml:space="preserve"> PAGEREF _Toc236071434 \h </w:instrText>
             </w:r>
             <w:r>
               <w:rPr>
@@ -9782,7 +9782,7 @@
               <w:noProof/>
             </w:rPr>
           </w:pPr>
-          <w:hyperlink w:anchor="_Toc236071174" w:history="1">
+          <w:hyperlink w:anchor="_Toc236071435" w:history="1">
             <w:r>
               <w:rPr>
                 <w:rStyle w:val="affa"/>
@@ -9817,7 +9817,7 @@
                 <w:noProof/>
                 <w:webHidden/>
               </w:rPr>
-              <w:instrText xml:space="preserve"> PAGEREF _Toc236071174 \h </w:instrText>
+              <w:instrText xml:space="preserve"> PAGEREF _Toc236071435 \h </w:instrText>
             </w:r>
             <w:r>
               <w:rPr>
@@ -9858,7 +9858,7 @@
               <w:noProof/>
             </w:rPr>
           </w:pPr>
-          <w:hyperlink w:anchor="_Toc236071175" w:history="1">
+          <w:hyperlink w:anchor="_Toc236071436" w:history="1">
             <w:r>
               <w:rPr>
                 <w:rStyle w:val="affa"/>
@@ -9901,7 +9901,7 @@
                 <w:noProof/>
                 <w:webHidden/>
               </w:rPr>
-              <w:instrText xml:space="preserve"> PAGEREF _Toc236071175 \h </w:instrText>
+              <w:instrText xml:space="preserve"> PAGEREF _Toc236071436 \h </w:instrText>
             </w:r>
             <w:r>
               <w:rPr>
@@ -9943,7 +9943,7 @@
               <w:noProof/>
             </w:rPr>
           </w:pPr>
-          <w:hyperlink w:anchor="_Toc236071176" w:history="1">
+          <w:hyperlink w:anchor="_Toc236071437" w:history="1">
             <w:r>
               <w:rPr>
                 <w:rStyle w:val="affa"/>
@@ -9985,7 +9985,7 @@
                 <w:noProof/>
                 <w:webHidden/>
               </w:rPr>
-              <w:instrText xml:space="preserve"> PAGEREF _Toc236071176 \h </w:instrText>
+              <w:instrText xml:space="preserve"> PAGEREF _Toc236071437 \h </w:instrText>
             </w:r>
             <w:r>
               <w:rPr>
@@ -10027,7 +10027,7 @@
               <w:noProof/>
             </w:rPr>
           </w:pPr>
-          <w:hyperlink w:anchor="_Toc236071177" w:history="1">
+          <w:hyperlink w:anchor="_Toc236071438" w:history="1">
             <w:r>
               <w:rPr>
                 <w:rStyle w:val="affa"/>
@@ -10069,7 +10069,7 @@
                 <w:noProof/>
                 <w:webHidden/>
               </w:rPr>
-              <w:instrText xml:space="preserve"> PAGEREF _Toc236071177 \h </w:instrText>
+              <w:instrText xml:space="preserve"> PAGEREF _Toc236071438 \h </w:instrText>
             </w:r>
             <w:r>
               <w:rPr>
@@ -10111,7 +10111,7 @@
               <w:noProof/>
             </w:rPr>
           </w:pPr>
-          <w:hyperlink w:anchor="_Toc236071178" w:history="1">
+          <w:hyperlink w:anchor="_Toc236071439" w:history="1">
             <w:r>
               <w:rPr>
                 <w:rStyle w:val="affa"/>
@@ -10153,7 +10153,7 @@
                 <w:noProof/>
                 <w:webHidden/>
               </w:rPr>
-              <w:instrText xml:space="preserve"> PAGEREF _Toc236071178 \h </w:instrText>
+              <w:instrText xml:space="preserve"> PAGEREF _Toc236071439 \h </w:instrText>
             </w:r>
             <w:r>
               <w:rPr>
@@ -10194,7 +10194,7 @@
               <w:noProof/>
             </w:rPr>
           </w:pPr>
-          <w:hyperlink w:anchor="_Toc236071179" w:history="1">
+          <w:hyperlink w:anchor="_Toc236071440" w:history="1">
             <w:r>
               <w:rPr>
                 <w:rStyle w:val="affa"/>
@@ -10252,7 +10252,7 @@
                 <w:noProof/>
                 <w:webHidden/>
               </w:rPr>
-              <w:instrText xml:space="preserve"> PAGEREF _Toc236071179 \h </w:instrText>
+              <w:instrText xml:space="preserve"> PAGEREF _Toc236071440 \h </w:instrText>
             </w:r>
             <w:r>
               <w:rPr>
@@ -10294,7 +10294,7 @@
               <w:noProof/>
             </w:rPr>
           </w:pPr>
-          <w:hyperlink w:anchor="_Toc236071180" w:history="1">
+          <w:hyperlink w:anchor="_Toc236071441" w:history="1">
             <w:r>
               <w:rPr>
                 <w:rStyle w:val="affa"/>
@@ -10336,7 +10336,7 @@
                 <w:noProof/>
                 <w:webHidden/>
               </w:rPr>
-              <w:instrText xml:space="preserve"> PAGEREF _Toc236071180 \h </w:instrText>
+              <w:instrText xml:space="preserve"> PAGEREF _Toc236071441 \h </w:instrText>
             </w:r>
             <w:r>
               <w:rPr>
@@ -10378,7 +10378,7 @@
               <w:noProof/>
             </w:rPr>
           </w:pPr>
-          <w:hyperlink w:anchor="_Toc236071181" w:history="1">
+          <w:hyperlink w:anchor="_Toc236071442" w:history="1">
             <w:r>
               <w:rPr>
                 <w:rStyle w:val="affa"/>
@@ -10420,7 +10420,7 @@
                 <w:noProof/>
                 <w:webHidden/>
               </w:rPr>
-              <w:instrText xml:space="preserve"> PAGEREF _Toc236071181 \h </w:instrText>
+              <w:instrText xml:space="preserve"> PAGEREF _Toc236071442 \h </w:instrText>
             </w:r>
             <w:r>
               <w:rPr>
@@ -10461,7 +10461,7 @@
               <w:noProof/>
             </w:rPr>
           </w:pPr>
-          <w:hyperlink w:anchor="_Toc236071182" w:history="1">
+          <w:hyperlink w:anchor="_Toc236071443" w:history="1">
             <w:r>
               <w:rPr>
                 <w:rStyle w:val="affa"/>
@@ -10504,7 +10504,7 @@
                 <w:noProof/>
                 <w:webHidden/>
               </w:rPr>
-              <w:instrText xml:space="preserve"> PAGEREF _Toc236071182 \h </w:instrText>
+              <w:instrText xml:space="preserve"> PAGEREF _Toc236071443 \h </w:instrText>
             </w:r>
             <w:r>
               <w:rPr>
@@ -10546,7 +10546,7 @@
               <w:noProof/>
             </w:rPr>
           </w:pPr>
-          <w:hyperlink w:anchor="_Toc236071183" w:history="1">
+          <w:hyperlink w:anchor="_Toc236071444" w:history="1">
             <w:r>
               <w:rPr>
                 <w:rStyle w:val="affa"/>
@@ -10581,7 +10581,7 @@
                 <w:noProof/>
                 <w:webHidden/>
               </w:rPr>
-              <w:instrText xml:space="preserve"> PAGEREF _Toc236071183 \h </w:instrText>
+              <w:instrText xml:space="preserve"> PAGEREF _Toc236071444 \h </w:instrText>
             </w:r>
             <w:r>
               <w:rPr>
@@ -10623,7 +10623,7 @@
               <w:noProof/>
             </w:rPr>
           </w:pPr>
-          <w:hyperlink w:anchor="_Toc236071184" w:history="1">
+          <w:hyperlink w:anchor="_Toc236071445" w:history="1">
             <w:r>
               <w:rPr>
                 <w:rStyle w:val="affa"/>
@@ -10665,7 +10665,7 @@
                 <w:noProof/>
                 <w:webHidden/>
               </w:rPr>
-              <w:instrText xml:space="preserve"> PAGEREF _Toc236071184 \h </w:instrText>
+              <w:instrText xml:space="preserve"> PAGEREF _Toc236071445 \h </w:instrText>
             </w:r>
             <w:r>
               <w:rPr>
@@ -10706,7 +10706,7 @@
               <w:noProof/>
             </w:rPr>
           </w:pPr>
-          <w:hyperlink w:anchor="_Toc236071185" w:history="1">
+          <w:hyperlink w:anchor="_Toc236071446" w:history="1">
             <w:r>
               <w:rPr>
                 <w:rStyle w:val="affa"/>
@@ -10749,7 +10749,7 @@
                 <w:noProof/>
                 <w:webHidden/>
               </w:rPr>
-              <w:instrText xml:space="preserve"> PAGEREF _Toc236071185 \h </w:instrText>
+              <w:instrText xml:space="preserve"> PAGEREF _Toc236071446 \h </w:instrText>
             </w:r>
             <w:r>
               <w:rPr>
@@ -10791,7 +10791,7 @@
               <w:noProof/>
             </w:rPr>
           </w:pPr>
-          <w:hyperlink w:anchor="_Toc236071186" w:history="1">
+          <w:hyperlink w:anchor="_Toc236071447" w:history="1">
             <w:r>
               <w:rPr>
                 <w:rStyle w:val="affa"/>
@@ -10826,7 +10826,7 @@
                 <w:noProof/>
                 <w:webHidden/>
               </w:rPr>
-              <w:instrText xml:space="preserve"> PAGEREF _Toc236071186 \h </w:instrText>
+              <w:instrText xml:space="preserve"> PAGEREF _Toc236071447 \h </w:instrText>
             </w:r>
             <w:r>
               <w:rPr>
@@ -10868,7 +10868,7 @@
               <w:noProof/>
             </w:rPr>
           </w:pPr>
-          <w:hyperlink w:anchor="_Toc236071187" w:history="1">
+          <w:hyperlink w:anchor="_Toc236071448" w:history="1">
             <w:r>
               <w:rPr>
                 <w:rStyle w:val="affa"/>
@@ -10903,7 +10903,7 @@
                 <w:noProof/>
                 <w:webHidden/>
               </w:rPr>
-              <w:instrText xml:space="preserve"> PAGEREF _Toc236071187 \h </w:instrText>
+              <w:instrText xml:space="preserve"> PAGEREF _Toc236071448 \h </w:instrText>
             </w:r>
             <w:r>
               <w:rPr>
@@ -10945,7 +10945,7 @@
               <w:noProof/>
             </w:rPr>
           </w:pPr>
-          <w:hyperlink w:anchor="_Toc236071188" w:history="1">
+          <w:hyperlink w:anchor="_Toc236071449" w:history="1">
             <w:r>
               <w:rPr>
                 <w:rStyle w:val="affa"/>
@@ -10995,7 +10995,7 @@
                 <w:noProof/>
                 <w:webHidden/>
               </w:rPr>
-              <w:instrText xml:space="preserve"> PAGEREF _Toc236071188 \h </w:instrText>
+              <w:instrText xml:space="preserve"> PAGEREF _Toc236071449 \h </w:instrText>
             </w:r>
             <w:r>
               <w:rPr>
@@ -11035,7 +11035,7 @@
     </w:sdt>
     <w:sdt>
       <w:sdtPr>
-        <w:id w:val="517045449"/>
+        <w:id w:val="840202714"/>
         <w:docPartObj>
           <w:docPartGallery w:val="Table of Contents"/>
           <w:docPartUnique/>
@@ -11071,7 +11071,7 @@
     </w:sdt>
     <w:sdt>
       <w:sdtPr>
-        <w:id w:val="-1723054289"/>
+        <w:id w:val="-23637192"/>
         <w:docPartObj>
           <w:docPartGallery w:val="Table of Contents"/>
           <w:docPartUnique/>
@@ -11396,31 +11396,31 @@
       </w:rPr>
     </w:lvl>
   </w:abstractNum>
-  <w:num w:numId="1" w16cid:durableId="607859310">
+  <w:num w:numId="1" w16cid:durableId="786974203">
     <w:abstractNumId w:val="8"/>
   </w:num>
-  <w:num w:numId="2" w16cid:durableId="358699184">
+  <w:num w:numId="2" w16cid:durableId="523324215">
     <w:abstractNumId w:val="6"/>
   </w:num>
-  <w:num w:numId="3" w16cid:durableId="1550266084">
+  <w:num w:numId="3" w16cid:durableId="22248251">
     <w:abstractNumId w:val="5"/>
   </w:num>
-  <w:num w:numId="4" w16cid:durableId="261765583">
+  <w:num w:numId="4" w16cid:durableId="173957099">
     <w:abstractNumId w:val="4"/>
   </w:num>
-  <w:num w:numId="5" w16cid:durableId="672801555">
+  <w:num w:numId="5" w16cid:durableId="957445219">
     <w:abstractNumId w:val="7"/>
   </w:num>
-  <w:num w:numId="6" w16cid:durableId="313459070">
+  <w:num w:numId="6" w16cid:durableId="188421951">
     <w:abstractNumId w:val="3"/>
   </w:num>
-  <w:num w:numId="7" w16cid:durableId="1660839798">
+  <w:num w:numId="7" w16cid:durableId="770585461">
     <w:abstractNumId w:val="2"/>
   </w:num>
-  <w:num w:numId="8" w16cid:durableId="2073118341">
+  <w:num w:numId="8" w16cid:durableId="913930553">
     <w:abstractNumId w:val="1"/>
   </w:num>
-  <w:num w:numId="9" w16cid:durableId="1257207735">
+  <w:num w:numId="9" w16cid:durableId="1357929587">
     <w:abstractNumId w:val="0"/>
   </w:num>
 </w:numbering>
@@ -22815,7 +22815,7 @@
     <w:autoRedefine/>
     <w:uiPriority w:val="39"/>
     <w:unhideWhenUsed/>
-    <w:rsid w:val="0053608D"/>
+    <w:rsid w:val="000C2807"/>
   </w:style>
   <w:style w:type="paragraph" w:styleId="2a">
     <w:name w:val="toc 2"/>
@@ -22824,7 +22824,7 @@
     <w:autoRedefine/>
     <w:uiPriority w:val="39"/>
     <w:unhideWhenUsed/>
-    <w:rsid w:val="0053608D"/>
+    <w:rsid w:val="000C2807"/>
     <w:pPr>
       <w:ind w:leftChars="200" w:left="480"/>
     </w:pPr>
@@ -22834,7 +22834,7 @@
     <w:basedOn w:val="a2"/>
     <w:uiPriority w:val="99"/>
     <w:unhideWhenUsed/>
-    <w:rsid w:val="0053608D"/>
+    <w:rsid w:val="000C2807"/>
     <w:rPr>
       <w:color w:val="0000FF" w:themeColor="hyperlink"/>
       <w:u w:val="single"/>

</xml_diff>

<commit_message>
Fix exact XML inline placement of TOC (P2), List of Tables (P3), List of Figures (P4) right below their heading paragraphs
</commit_message>
<xml_diff>
--- a/AIEC國防領域AI應用導入專案規劃書.docx
+++ b/AIEC國防領域AI應用導入專案規劃書.docx
@@ -546,7 +546,7 @@
         <w:pStyle w:val="1"/>
         <w:spacing w:before="320" w:after="160"/>
       </w:pPr>
-      <w:bookmarkStart w:id="0" w:name="_Toc236071426"/>
+      <w:bookmarkStart w:id="0" w:name="_Toc236071646"/>
       <w:r>
         <w:lastRenderedPageBreak/>
         <w:t>📋</w:t>
@@ -562,6 +562,2081 @@
       </w:r>
       <w:bookmarkEnd w:id="0"/>
     </w:p>
+    <w:sdt>
+      <w:sdtPr>
+        <w:id w:val="-733159231"/>
+        <w:docPartObj>
+          <w:docPartGallery w:val="Table of Contents"/>
+          <w:docPartUnique/>
+        </w:docPartObj>
+      </w:sdtPr>
+      <w:sdtEndPr/>
+      <w:sdtContent>
+        <w:p>
+          <w:pPr>
+            <w:pStyle w:val="14"/>
+            <w:tabs>
+              <w:tab w:val="right" w:leader="dot" w:pos="9350"/>
+            </w:tabs>
+            <w:rPr>
+              <w:noProof/>
+            </w:rPr>
+          </w:pPr>
+          <w:r>
+            <w:fldChar w:fldCharType="begin"/>
+          </w:r>
+          <w:r>
+            <w:instrText>TOC \o "1-2" \h \z \u</w:instrText>
+          </w:r>
+          <w:r>
+            <w:fldChar w:fldCharType="separate"/>
+          </w:r>
+          <w:hyperlink w:anchor="_Toc236071646" w:history="1">
+            <w:r>
+              <w:rPr>
+                <w:rStyle w:val="affa"/>
+                <w:rFonts w:ascii="Segoe UI Emoji" w:hAnsi="Segoe UI Emoji" w:cs="Segoe UI Emoji"/>
+                <w:noProof/>
+              </w:rPr>
+              <w:t>📋</w:t>
+            </w:r>
+            <w:r>
+              <w:rPr>
+                <w:rStyle w:val="affa"/>
+                <w:noProof/>
+              </w:rPr>
+              <w:t xml:space="preserve"> </w:t>
+            </w:r>
+            <w:r>
+              <w:rPr>
+                <w:rStyle w:val="affa"/>
+                <w:rFonts w:hint="eastAsia"/>
+                <w:noProof/>
+              </w:rPr>
+              <w:t>目錄</w:t>
+            </w:r>
+            <w:r>
+              <w:rPr>
+                <w:rStyle w:val="affa"/>
+                <w:noProof/>
+              </w:rPr>
+              <w:t xml:space="preserve"> (Table of Contents)</w:t>
+            </w:r>
+            <w:r>
+              <w:rPr>
+                <w:noProof/>
+                <w:webHidden/>
+              </w:rPr>
+              <w:tab/>
+            </w:r>
+            <w:r>
+              <w:rPr>
+                <w:noProof/>
+                <w:webHidden/>
+              </w:rPr>
+              <w:fldChar w:fldCharType="begin"/>
+            </w:r>
+            <w:r>
+              <w:rPr>
+                <w:noProof/>
+                <w:webHidden/>
+              </w:rPr>
+              <w:instrText xml:space="preserve"> PAGEREF _Toc236071646 \h </w:instrText>
+            </w:r>
+            <w:r>
+              <w:rPr>
+                <w:noProof/>
+                <w:webHidden/>
+              </w:rPr>
+            </w:r>
+            <w:r>
+              <w:rPr>
+                <w:noProof/>
+                <w:webHidden/>
+              </w:rPr>
+              <w:fldChar w:fldCharType="separate"/>
+            </w:r>
+            <w:r>
+              <w:rPr>
+                <w:noProof/>
+                <w:webHidden/>
+              </w:rPr>
+              <w:t>2</w:t>
+            </w:r>
+            <w:r>
+              <w:rPr>
+                <w:noProof/>
+                <w:webHidden/>
+              </w:rPr>
+              <w:fldChar w:fldCharType="end"/>
+            </w:r>
+          </w:hyperlink>
+        </w:p>
+        <w:p>
+          <w:pPr>
+            <w:pStyle w:val="14"/>
+            <w:tabs>
+              <w:tab w:val="right" w:leader="dot" w:pos="9350"/>
+            </w:tabs>
+            <w:rPr>
+              <w:noProof/>
+            </w:rPr>
+          </w:pPr>
+          <w:hyperlink w:anchor="_Toc236071647" w:history="1">
+            <w:r>
+              <w:rPr>
+                <w:rStyle w:val="affa"/>
+                <w:rFonts w:ascii="Segoe UI Emoji" w:hAnsi="Segoe UI Emoji" w:cs="Segoe UI Emoji"/>
+                <w:noProof/>
+              </w:rPr>
+              <w:t>📊</w:t>
+            </w:r>
+            <w:r>
+              <w:rPr>
+                <w:rStyle w:val="affa"/>
+                <w:noProof/>
+              </w:rPr>
+              <w:t xml:space="preserve"> </w:t>
+            </w:r>
+            <w:r>
+              <w:rPr>
+                <w:rStyle w:val="affa"/>
+                <w:rFonts w:hint="eastAsia"/>
+                <w:noProof/>
+              </w:rPr>
+              <w:t>表目錄</w:t>
+            </w:r>
+            <w:r>
+              <w:rPr>
+                <w:rStyle w:val="affa"/>
+                <w:noProof/>
+              </w:rPr>
+              <w:t xml:space="preserve"> (List of Tables)</w:t>
+            </w:r>
+            <w:r>
+              <w:rPr>
+                <w:noProof/>
+                <w:webHidden/>
+              </w:rPr>
+              <w:tab/>
+            </w:r>
+            <w:r>
+              <w:rPr>
+                <w:noProof/>
+                <w:webHidden/>
+              </w:rPr>
+              <w:fldChar w:fldCharType="begin"/>
+            </w:r>
+            <w:r>
+              <w:rPr>
+                <w:noProof/>
+                <w:webHidden/>
+              </w:rPr>
+              <w:instrText xml:space="preserve"> PAGEREF _Toc236071647 \h </w:instrText>
+            </w:r>
+            <w:r>
+              <w:rPr>
+                <w:noProof/>
+                <w:webHidden/>
+              </w:rPr>
+            </w:r>
+            <w:r>
+              <w:rPr>
+                <w:noProof/>
+                <w:webHidden/>
+              </w:rPr>
+              <w:fldChar w:fldCharType="separate"/>
+            </w:r>
+            <w:r>
+              <w:rPr>
+                <w:noProof/>
+                <w:webHidden/>
+              </w:rPr>
+              <w:t>4</w:t>
+            </w:r>
+            <w:r>
+              <w:rPr>
+                <w:noProof/>
+                <w:webHidden/>
+              </w:rPr>
+              <w:fldChar w:fldCharType="end"/>
+            </w:r>
+          </w:hyperlink>
+        </w:p>
+        <w:p>
+          <w:pPr>
+            <w:pStyle w:val="14"/>
+            <w:tabs>
+              <w:tab w:val="right" w:leader="dot" w:pos="9350"/>
+            </w:tabs>
+            <w:rPr>
+              <w:noProof/>
+            </w:rPr>
+          </w:pPr>
+          <w:hyperlink w:anchor="_Toc236071648" w:history="1">
+            <w:r>
+              <w:rPr>
+                <w:rStyle w:val="affa"/>
+                <w:rFonts w:ascii="Segoe UI Emoji" w:hAnsi="Segoe UI Emoji" w:cs="Segoe UI Emoji"/>
+                <w:noProof/>
+              </w:rPr>
+              <w:t>🖼️</w:t>
+            </w:r>
+            <w:r>
+              <w:rPr>
+                <w:rStyle w:val="affa"/>
+                <w:noProof/>
+              </w:rPr>
+              <w:t xml:space="preserve"> </w:t>
+            </w:r>
+            <w:r>
+              <w:rPr>
+                <w:rStyle w:val="affa"/>
+                <w:rFonts w:hint="eastAsia"/>
+                <w:noProof/>
+              </w:rPr>
+              <w:t>圖目錄</w:t>
+            </w:r>
+            <w:r>
+              <w:rPr>
+                <w:rStyle w:val="affa"/>
+                <w:noProof/>
+              </w:rPr>
+              <w:t xml:space="preserve"> (List of Figures)</w:t>
+            </w:r>
+            <w:r>
+              <w:rPr>
+                <w:noProof/>
+                <w:webHidden/>
+              </w:rPr>
+              <w:tab/>
+            </w:r>
+            <w:r>
+              <w:rPr>
+                <w:noProof/>
+                <w:webHidden/>
+              </w:rPr>
+              <w:fldChar w:fldCharType="begin"/>
+            </w:r>
+            <w:r>
+              <w:rPr>
+                <w:noProof/>
+                <w:webHidden/>
+              </w:rPr>
+              <w:instrText xml:space="preserve"> PAGEREF _Toc236071648 \h </w:instrText>
+            </w:r>
+            <w:r>
+              <w:rPr>
+                <w:noProof/>
+                <w:webHidden/>
+              </w:rPr>
+            </w:r>
+            <w:r>
+              <w:rPr>
+                <w:noProof/>
+                <w:webHidden/>
+              </w:rPr>
+              <w:fldChar w:fldCharType="separate"/>
+            </w:r>
+            <w:r>
+              <w:rPr>
+                <w:noProof/>
+                <w:webHidden/>
+              </w:rPr>
+              <w:t>5</w:t>
+            </w:r>
+            <w:r>
+              <w:rPr>
+                <w:noProof/>
+                <w:webHidden/>
+              </w:rPr>
+              <w:fldChar w:fldCharType="end"/>
+            </w:r>
+          </w:hyperlink>
+        </w:p>
+        <w:p>
+          <w:pPr>
+            <w:pStyle w:val="14"/>
+            <w:tabs>
+              <w:tab w:val="right" w:leader="dot" w:pos="9350"/>
+            </w:tabs>
+            <w:rPr>
+              <w:noProof/>
+            </w:rPr>
+          </w:pPr>
+          <w:hyperlink w:anchor="_Toc236071649" w:history="1">
+            <w:r>
+              <w:rPr>
+                <w:rStyle w:val="affa"/>
+                <w:rFonts w:hint="eastAsia"/>
+                <w:noProof/>
+              </w:rPr>
+              <w:t>第一章</w:t>
+            </w:r>
+            <w:r>
+              <w:rPr>
+                <w:rStyle w:val="affa"/>
+                <w:noProof/>
+              </w:rPr>
+              <w:t xml:space="preserve"> </w:t>
+            </w:r>
+            <w:r>
+              <w:rPr>
+                <w:rStyle w:val="affa"/>
+                <w:rFonts w:hint="eastAsia"/>
+                <w:noProof/>
+              </w:rPr>
+              <w:t>前言：國防</w:t>
+            </w:r>
+            <w:r>
+              <w:rPr>
+                <w:rStyle w:val="affa"/>
+                <w:noProof/>
+              </w:rPr>
+              <w:t xml:space="preserve"> AI </w:t>
+            </w:r>
+            <w:r>
+              <w:rPr>
+                <w:rStyle w:val="affa"/>
+                <w:rFonts w:hint="eastAsia"/>
+                <w:noProof/>
+              </w:rPr>
+              <w:t>應用的戰略急迫性與發展理念</w:t>
+            </w:r>
+            <w:r>
+              <w:rPr>
+                <w:noProof/>
+                <w:webHidden/>
+              </w:rPr>
+              <w:tab/>
+            </w:r>
+            <w:r>
+              <w:rPr>
+                <w:noProof/>
+                <w:webHidden/>
+              </w:rPr>
+              <w:fldChar w:fldCharType="begin"/>
+            </w:r>
+            <w:r>
+              <w:rPr>
+                <w:noProof/>
+                <w:webHidden/>
+              </w:rPr>
+              <w:instrText xml:space="preserve"> PAGEREF _Toc236071649 \h </w:instrText>
+            </w:r>
+            <w:r>
+              <w:rPr>
+                <w:noProof/>
+                <w:webHidden/>
+              </w:rPr>
+            </w:r>
+            <w:r>
+              <w:rPr>
+                <w:noProof/>
+                <w:webHidden/>
+              </w:rPr>
+              <w:fldChar w:fldCharType="separate"/>
+            </w:r>
+            <w:r>
+              <w:rPr>
+                <w:noProof/>
+                <w:webHidden/>
+              </w:rPr>
+              <w:t>6</w:t>
+            </w:r>
+            <w:r>
+              <w:rPr>
+                <w:noProof/>
+                <w:webHidden/>
+              </w:rPr>
+              <w:fldChar w:fldCharType="end"/>
+            </w:r>
+          </w:hyperlink>
+        </w:p>
+        <w:p>
+          <w:pPr>
+            <w:pStyle w:val="2a"/>
+            <w:tabs>
+              <w:tab w:val="right" w:leader="dot" w:pos="9350"/>
+            </w:tabs>
+            <w:ind w:left="560"/>
+            <w:rPr>
+              <w:noProof/>
+            </w:rPr>
+          </w:pPr>
+          <w:hyperlink w:anchor="_Toc236071650" w:history="1">
+            <w:r>
+              <w:rPr>
+                <w:rStyle w:val="affa"/>
+                <w:noProof/>
+              </w:rPr>
+              <w:t xml:space="preserve">1.1 AI </w:t>
+            </w:r>
+            <w:r>
+              <w:rPr>
+                <w:rStyle w:val="affa"/>
+                <w:rFonts w:hint="eastAsia"/>
+                <w:noProof/>
+              </w:rPr>
+              <w:t>於國防領域應用的必要性與急迫性</w:t>
+            </w:r>
+            <w:r>
+              <w:rPr>
+                <w:noProof/>
+                <w:webHidden/>
+              </w:rPr>
+              <w:tab/>
+            </w:r>
+            <w:r>
+              <w:rPr>
+                <w:noProof/>
+                <w:webHidden/>
+              </w:rPr>
+              <w:fldChar w:fldCharType="begin"/>
+            </w:r>
+            <w:r>
+              <w:rPr>
+                <w:noProof/>
+                <w:webHidden/>
+              </w:rPr>
+              <w:instrText xml:space="preserve"> PAGEREF _Toc236071650 \h </w:instrText>
+            </w:r>
+            <w:r>
+              <w:rPr>
+                <w:noProof/>
+                <w:webHidden/>
+              </w:rPr>
+            </w:r>
+            <w:r>
+              <w:rPr>
+                <w:noProof/>
+                <w:webHidden/>
+              </w:rPr>
+              <w:fldChar w:fldCharType="separate"/>
+            </w:r>
+            <w:r>
+              <w:rPr>
+                <w:noProof/>
+                <w:webHidden/>
+              </w:rPr>
+              <w:t>6</w:t>
+            </w:r>
+            <w:r>
+              <w:rPr>
+                <w:noProof/>
+                <w:webHidden/>
+              </w:rPr>
+              <w:fldChar w:fldCharType="end"/>
+            </w:r>
+          </w:hyperlink>
+        </w:p>
+        <w:p>
+          <w:pPr>
+            <w:pStyle w:val="2a"/>
+            <w:tabs>
+              <w:tab w:val="right" w:leader="dot" w:pos="9350"/>
+            </w:tabs>
+            <w:ind w:left="560"/>
+            <w:rPr>
+              <w:noProof/>
+            </w:rPr>
+          </w:pPr>
+          <w:hyperlink w:anchor="_Toc236071651" w:history="1">
+            <w:r>
+              <w:rPr>
+                <w:rStyle w:val="affa"/>
+                <w:noProof/>
+              </w:rPr>
+              <w:t xml:space="preserve">1.2 </w:t>
+            </w:r>
+            <w:r>
+              <w:rPr>
+                <w:rStyle w:val="affa"/>
+                <w:rFonts w:hint="eastAsia"/>
+                <w:noProof/>
+              </w:rPr>
+              <w:t>美國國防部</w:t>
+            </w:r>
+            <w:r>
+              <w:rPr>
+                <w:rStyle w:val="affa"/>
+                <w:noProof/>
+              </w:rPr>
+              <w:t xml:space="preserve"> (DoD) AI First </w:t>
+            </w:r>
+            <w:r>
+              <w:rPr>
+                <w:rStyle w:val="affa"/>
+                <w:rFonts w:hint="eastAsia"/>
+                <w:noProof/>
+              </w:rPr>
+              <w:t>政策理念與經驗啟示</w:t>
+            </w:r>
+            <w:r>
+              <w:rPr>
+                <w:noProof/>
+                <w:webHidden/>
+              </w:rPr>
+              <w:tab/>
+            </w:r>
+            <w:r>
+              <w:rPr>
+                <w:noProof/>
+                <w:webHidden/>
+              </w:rPr>
+              <w:fldChar w:fldCharType="begin"/>
+            </w:r>
+            <w:r>
+              <w:rPr>
+                <w:noProof/>
+                <w:webHidden/>
+              </w:rPr>
+              <w:instrText xml:space="preserve"> PAGEREF _Toc236071651 \h </w:instrText>
+            </w:r>
+            <w:r>
+              <w:rPr>
+                <w:noProof/>
+                <w:webHidden/>
+              </w:rPr>
+            </w:r>
+            <w:r>
+              <w:rPr>
+                <w:noProof/>
+                <w:webHidden/>
+              </w:rPr>
+              <w:fldChar w:fldCharType="separate"/>
+            </w:r>
+            <w:r>
+              <w:rPr>
+                <w:noProof/>
+                <w:webHidden/>
+              </w:rPr>
+              <w:t>6</w:t>
+            </w:r>
+            <w:r>
+              <w:rPr>
+                <w:noProof/>
+                <w:webHidden/>
+              </w:rPr>
+              <w:fldChar w:fldCharType="end"/>
+            </w:r>
+          </w:hyperlink>
+        </w:p>
+        <w:p>
+          <w:pPr>
+            <w:pStyle w:val="2a"/>
+            <w:tabs>
+              <w:tab w:val="right" w:leader="dot" w:pos="9350"/>
+            </w:tabs>
+            <w:ind w:left="560"/>
+            <w:rPr>
+              <w:noProof/>
+            </w:rPr>
+          </w:pPr>
+          <w:hyperlink w:anchor="_Toc236071652" w:history="1">
+            <w:r>
+              <w:rPr>
+                <w:rStyle w:val="affa"/>
+                <w:noProof/>
+              </w:rPr>
+              <w:t xml:space="preserve">1.3 </w:t>
+            </w:r>
+            <w:r>
+              <w:rPr>
+                <w:rStyle w:val="affa"/>
+                <w:rFonts w:hint="eastAsia"/>
+                <w:noProof/>
+              </w:rPr>
+              <w:t>台灣面對中國威脅與非對稱作戰</w:t>
+            </w:r>
+            <w:r>
+              <w:rPr>
+                <w:rStyle w:val="affa"/>
+                <w:noProof/>
+              </w:rPr>
+              <w:t xml:space="preserve"> (Asymmetric Warfare) </w:t>
+            </w:r>
+            <w:r>
+              <w:rPr>
+                <w:rStyle w:val="affa"/>
+                <w:rFonts w:hint="eastAsia"/>
+                <w:noProof/>
+              </w:rPr>
+              <w:t>態勢</w:t>
+            </w:r>
+            <w:r>
+              <w:rPr>
+                <w:noProof/>
+                <w:webHidden/>
+              </w:rPr>
+              <w:tab/>
+            </w:r>
+            <w:r>
+              <w:rPr>
+                <w:noProof/>
+                <w:webHidden/>
+              </w:rPr>
+              <w:fldChar w:fldCharType="begin"/>
+            </w:r>
+            <w:r>
+              <w:rPr>
+                <w:noProof/>
+                <w:webHidden/>
+              </w:rPr>
+              <w:instrText xml:space="preserve"> PAGEREF _Toc236071652 \h </w:instrText>
+            </w:r>
+            <w:r>
+              <w:rPr>
+                <w:noProof/>
+                <w:webHidden/>
+              </w:rPr>
+            </w:r>
+            <w:r>
+              <w:rPr>
+                <w:noProof/>
+                <w:webHidden/>
+              </w:rPr>
+              <w:fldChar w:fldCharType="separate"/>
+            </w:r>
+            <w:r>
+              <w:rPr>
+                <w:noProof/>
+                <w:webHidden/>
+              </w:rPr>
+              <w:t>6</w:t>
+            </w:r>
+            <w:r>
+              <w:rPr>
+                <w:noProof/>
+                <w:webHidden/>
+              </w:rPr>
+              <w:fldChar w:fldCharType="end"/>
+            </w:r>
+          </w:hyperlink>
+        </w:p>
+        <w:p>
+          <w:pPr>
+            <w:pStyle w:val="2a"/>
+            <w:tabs>
+              <w:tab w:val="right" w:leader="dot" w:pos="9350"/>
+            </w:tabs>
+            <w:ind w:left="560"/>
+            <w:rPr>
+              <w:noProof/>
+            </w:rPr>
+          </w:pPr>
+          <w:hyperlink w:anchor="_Toc236071653" w:history="1">
+            <w:r>
+              <w:rPr>
+                <w:rStyle w:val="affa"/>
+                <w:noProof/>
+              </w:rPr>
+              <w:t xml:space="preserve">1.4 </w:t>
+            </w:r>
+            <w:r>
+              <w:rPr>
+                <w:rStyle w:val="affa"/>
+                <w:rFonts w:hint="eastAsia"/>
+                <w:noProof/>
+              </w:rPr>
+              <w:t>無人化打擊載具應用：無人機、無人船、無人潛艦、無人車與機器狗</w:t>
+            </w:r>
+            <w:r>
+              <w:rPr>
+                <w:noProof/>
+                <w:webHidden/>
+              </w:rPr>
+              <w:tab/>
+            </w:r>
+            <w:r>
+              <w:rPr>
+                <w:noProof/>
+                <w:webHidden/>
+              </w:rPr>
+              <w:fldChar w:fldCharType="begin"/>
+            </w:r>
+            <w:r>
+              <w:rPr>
+                <w:noProof/>
+                <w:webHidden/>
+              </w:rPr>
+              <w:instrText xml:space="preserve"> PAGEREF _Toc236071653 \h </w:instrText>
+            </w:r>
+            <w:r>
+              <w:rPr>
+                <w:noProof/>
+                <w:webHidden/>
+              </w:rPr>
+            </w:r>
+            <w:r>
+              <w:rPr>
+                <w:noProof/>
+                <w:webHidden/>
+              </w:rPr>
+              <w:fldChar w:fldCharType="separate"/>
+            </w:r>
+            <w:r>
+              <w:rPr>
+                <w:noProof/>
+                <w:webHidden/>
+              </w:rPr>
+              <w:t>7</w:t>
+            </w:r>
+            <w:r>
+              <w:rPr>
+                <w:noProof/>
+                <w:webHidden/>
+              </w:rPr>
+              <w:fldChar w:fldCharType="end"/>
+            </w:r>
+          </w:hyperlink>
+        </w:p>
+        <w:p>
+          <w:pPr>
+            <w:pStyle w:val="2a"/>
+            <w:tabs>
+              <w:tab w:val="right" w:leader="dot" w:pos="9350"/>
+            </w:tabs>
+            <w:ind w:left="560"/>
+            <w:rPr>
+              <w:noProof/>
+            </w:rPr>
+          </w:pPr>
+          <w:hyperlink w:anchor="_Toc236071654" w:history="1">
+            <w:r>
+              <w:rPr>
+                <w:rStyle w:val="affa"/>
+                <w:noProof/>
+              </w:rPr>
+              <w:t xml:space="preserve">1.5 </w:t>
+            </w:r>
+            <w:r>
+              <w:rPr>
+                <w:rStyle w:val="affa"/>
+                <w:rFonts w:hint="eastAsia"/>
+                <w:noProof/>
+              </w:rPr>
+              <w:t>實現「可靠、可信任、可解釋、可當責」之國防</w:t>
+            </w:r>
+            <w:r>
+              <w:rPr>
+                <w:rStyle w:val="affa"/>
+                <w:noProof/>
+              </w:rPr>
+              <w:t xml:space="preserve"> AI</w:t>
+            </w:r>
+            <w:r>
+              <w:rPr>
+                <w:noProof/>
+                <w:webHidden/>
+              </w:rPr>
+              <w:tab/>
+            </w:r>
+            <w:r>
+              <w:rPr>
+                <w:noProof/>
+                <w:webHidden/>
+              </w:rPr>
+              <w:fldChar w:fldCharType="begin"/>
+            </w:r>
+            <w:r>
+              <w:rPr>
+                <w:noProof/>
+                <w:webHidden/>
+              </w:rPr>
+              <w:instrText xml:space="preserve"> PAGEREF _Toc236071654 \h </w:instrText>
+            </w:r>
+            <w:r>
+              <w:rPr>
+                <w:noProof/>
+                <w:webHidden/>
+              </w:rPr>
+            </w:r>
+            <w:r>
+              <w:rPr>
+                <w:noProof/>
+                <w:webHidden/>
+              </w:rPr>
+              <w:fldChar w:fldCharType="separate"/>
+            </w:r>
+            <w:r>
+              <w:rPr>
+                <w:noProof/>
+                <w:webHidden/>
+              </w:rPr>
+              <w:t>8</w:t>
+            </w:r>
+            <w:r>
+              <w:rPr>
+                <w:noProof/>
+                <w:webHidden/>
+              </w:rPr>
+              <w:fldChar w:fldCharType="end"/>
+            </w:r>
+          </w:hyperlink>
+        </w:p>
+        <w:p>
+          <w:pPr>
+            <w:pStyle w:val="2a"/>
+            <w:tabs>
+              <w:tab w:val="right" w:leader="dot" w:pos="9350"/>
+            </w:tabs>
+            <w:ind w:left="560"/>
+            <w:rPr>
+              <w:noProof/>
+            </w:rPr>
+          </w:pPr>
+          <w:hyperlink w:anchor="_Toc236071655" w:history="1">
+            <w:r>
+              <w:rPr>
+                <w:rStyle w:val="affa"/>
+                <w:noProof/>
+              </w:rPr>
+              <w:t xml:space="preserve">1.6 </w:t>
+            </w:r>
+            <w:r>
+              <w:rPr>
+                <w:rStyle w:val="affa"/>
+                <w:rFonts w:hint="eastAsia"/>
+                <w:noProof/>
+              </w:rPr>
+              <w:t>適合台灣本土環境落地方案：為什麼要做、如何做、怎麼樣做</w:t>
+            </w:r>
+            <w:r>
+              <w:rPr>
+                <w:noProof/>
+                <w:webHidden/>
+              </w:rPr>
+              <w:tab/>
+            </w:r>
+            <w:r>
+              <w:rPr>
+                <w:noProof/>
+                <w:webHidden/>
+              </w:rPr>
+              <w:fldChar w:fldCharType="begin"/>
+            </w:r>
+            <w:r>
+              <w:rPr>
+                <w:noProof/>
+                <w:webHidden/>
+              </w:rPr>
+              <w:instrText xml:space="preserve"> PAGEREF _Toc236071655 \h </w:instrText>
+            </w:r>
+            <w:r>
+              <w:rPr>
+                <w:noProof/>
+                <w:webHidden/>
+              </w:rPr>
+            </w:r>
+            <w:r>
+              <w:rPr>
+                <w:noProof/>
+                <w:webHidden/>
+              </w:rPr>
+              <w:fldChar w:fldCharType="separate"/>
+            </w:r>
+            <w:r>
+              <w:rPr>
+                <w:noProof/>
+                <w:webHidden/>
+              </w:rPr>
+              <w:t>8</w:t>
+            </w:r>
+            <w:r>
+              <w:rPr>
+                <w:noProof/>
+                <w:webHidden/>
+              </w:rPr>
+              <w:fldChar w:fldCharType="end"/>
+            </w:r>
+          </w:hyperlink>
+        </w:p>
+        <w:p>
+          <w:pPr>
+            <w:pStyle w:val="14"/>
+            <w:tabs>
+              <w:tab w:val="right" w:leader="dot" w:pos="9350"/>
+            </w:tabs>
+            <w:rPr>
+              <w:noProof/>
+            </w:rPr>
+          </w:pPr>
+          <w:hyperlink w:anchor="_Toc236071656" w:history="1">
+            <w:r>
+              <w:rPr>
+                <w:rStyle w:val="affa"/>
+                <w:rFonts w:hint="eastAsia"/>
+                <w:noProof/>
+              </w:rPr>
+              <w:t>第二章</w:t>
+            </w:r>
+            <w:r>
+              <w:rPr>
+                <w:rStyle w:val="affa"/>
+                <w:noProof/>
+              </w:rPr>
+              <w:t xml:space="preserve"> </w:t>
+            </w:r>
+            <w:r>
+              <w:rPr>
+                <w:rStyle w:val="affa"/>
+                <w:rFonts w:hint="eastAsia"/>
+                <w:noProof/>
+              </w:rPr>
+              <w:t>專案執行範圍與三大核心區塊架構</w:t>
+            </w:r>
+            <w:r>
+              <w:rPr>
+                <w:noProof/>
+                <w:webHidden/>
+              </w:rPr>
+              <w:tab/>
+            </w:r>
+            <w:r>
+              <w:rPr>
+                <w:noProof/>
+                <w:webHidden/>
+              </w:rPr>
+              <w:fldChar w:fldCharType="begin"/>
+            </w:r>
+            <w:r>
+              <w:rPr>
+                <w:noProof/>
+                <w:webHidden/>
+              </w:rPr>
+              <w:instrText xml:space="preserve"> PAGEREF _Toc236071656 \h </w:instrText>
+            </w:r>
+            <w:r>
+              <w:rPr>
+                <w:noProof/>
+                <w:webHidden/>
+              </w:rPr>
+            </w:r>
+            <w:r>
+              <w:rPr>
+                <w:noProof/>
+                <w:webHidden/>
+              </w:rPr>
+              <w:fldChar w:fldCharType="separate"/>
+            </w:r>
+            <w:r>
+              <w:rPr>
+                <w:noProof/>
+                <w:webHidden/>
+              </w:rPr>
+              <w:t>10</w:t>
+            </w:r>
+            <w:r>
+              <w:rPr>
+                <w:noProof/>
+                <w:webHidden/>
+              </w:rPr>
+              <w:fldChar w:fldCharType="end"/>
+            </w:r>
+          </w:hyperlink>
+        </w:p>
+        <w:p>
+          <w:pPr>
+            <w:pStyle w:val="2a"/>
+            <w:tabs>
+              <w:tab w:val="right" w:leader="dot" w:pos="9350"/>
+            </w:tabs>
+            <w:ind w:left="560"/>
+            <w:rPr>
+              <w:noProof/>
+            </w:rPr>
+          </w:pPr>
+          <w:hyperlink w:anchor="_Toc236071657" w:history="1">
+            <w:r>
+              <w:rPr>
+                <w:rStyle w:val="affa"/>
+                <w:noProof/>
+              </w:rPr>
+              <w:t xml:space="preserve">2.1 </w:t>
+            </w:r>
+            <w:r>
+              <w:rPr>
+                <w:rStyle w:val="affa"/>
+                <w:rFonts w:hint="eastAsia"/>
+                <w:noProof/>
+              </w:rPr>
+              <w:t>第一部分：治理與標準</w:t>
+            </w:r>
+            <w:r>
+              <w:rPr>
+                <w:rStyle w:val="affa"/>
+                <w:noProof/>
+              </w:rPr>
+              <w:t xml:space="preserve"> (Governance &amp; Standards)</w:t>
+            </w:r>
+            <w:r>
+              <w:rPr>
+                <w:noProof/>
+                <w:webHidden/>
+              </w:rPr>
+              <w:tab/>
+            </w:r>
+            <w:r>
+              <w:rPr>
+                <w:noProof/>
+                <w:webHidden/>
+              </w:rPr>
+              <w:fldChar w:fldCharType="begin"/>
+            </w:r>
+            <w:r>
+              <w:rPr>
+                <w:noProof/>
+                <w:webHidden/>
+              </w:rPr>
+              <w:instrText xml:space="preserve"> PAGEREF _Toc236071657 \h </w:instrText>
+            </w:r>
+            <w:r>
+              <w:rPr>
+                <w:noProof/>
+                <w:webHidden/>
+              </w:rPr>
+            </w:r>
+            <w:r>
+              <w:rPr>
+                <w:noProof/>
+                <w:webHidden/>
+              </w:rPr>
+              <w:fldChar w:fldCharType="separate"/>
+            </w:r>
+            <w:r>
+              <w:rPr>
+                <w:noProof/>
+                <w:webHidden/>
+              </w:rPr>
+              <w:t>10</w:t>
+            </w:r>
+            <w:r>
+              <w:rPr>
+                <w:noProof/>
+                <w:webHidden/>
+              </w:rPr>
+              <w:fldChar w:fldCharType="end"/>
+            </w:r>
+          </w:hyperlink>
+        </w:p>
+        <w:p>
+          <w:pPr>
+            <w:pStyle w:val="2a"/>
+            <w:tabs>
+              <w:tab w:val="right" w:leader="dot" w:pos="9350"/>
+            </w:tabs>
+            <w:ind w:left="560"/>
+            <w:rPr>
+              <w:noProof/>
+            </w:rPr>
+          </w:pPr>
+          <w:hyperlink w:anchor="_Toc236071658" w:history="1">
+            <w:r>
+              <w:rPr>
+                <w:rStyle w:val="affa"/>
+                <w:noProof/>
+              </w:rPr>
+              <w:t xml:space="preserve">2.2 </w:t>
+            </w:r>
+            <w:r>
+              <w:rPr>
+                <w:rStyle w:val="affa"/>
+                <w:rFonts w:hint="eastAsia"/>
+                <w:noProof/>
+              </w:rPr>
+              <w:t>第二部分：矩陣與架構</w:t>
+            </w:r>
+            <w:r>
+              <w:rPr>
+                <w:rStyle w:val="affa"/>
+                <w:noProof/>
+              </w:rPr>
+              <w:t xml:space="preserve"> (Matrix &amp; Architecture)</w:t>
+            </w:r>
+            <w:r>
+              <w:rPr>
+                <w:noProof/>
+                <w:webHidden/>
+              </w:rPr>
+              <w:tab/>
+            </w:r>
+            <w:r>
+              <w:rPr>
+                <w:noProof/>
+                <w:webHidden/>
+              </w:rPr>
+              <w:fldChar w:fldCharType="begin"/>
+            </w:r>
+            <w:r>
+              <w:rPr>
+                <w:noProof/>
+                <w:webHidden/>
+              </w:rPr>
+              <w:instrText xml:space="preserve"> PAGEREF _Toc236071658 \h </w:instrText>
+            </w:r>
+            <w:r>
+              <w:rPr>
+                <w:noProof/>
+                <w:webHidden/>
+              </w:rPr>
+            </w:r>
+            <w:r>
+              <w:rPr>
+                <w:noProof/>
+                <w:webHidden/>
+              </w:rPr>
+              <w:fldChar w:fldCharType="separate"/>
+            </w:r>
+            <w:r>
+              <w:rPr>
+                <w:noProof/>
+                <w:webHidden/>
+              </w:rPr>
+              <w:t>11</w:t>
+            </w:r>
+            <w:r>
+              <w:rPr>
+                <w:noProof/>
+                <w:webHidden/>
+              </w:rPr>
+              <w:fldChar w:fldCharType="end"/>
+            </w:r>
+          </w:hyperlink>
+        </w:p>
+        <w:p>
+          <w:pPr>
+            <w:pStyle w:val="2a"/>
+            <w:tabs>
+              <w:tab w:val="right" w:leader="dot" w:pos="9350"/>
+            </w:tabs>
+            <w:ind w:left="560"/>
+            <w:rPr>
+              <w:noProof/>
+            </w:rPr>
+          </w:pPr>
+          <w:hyperlink w:anchor="_Toc236071659" w:history="1">
+            <w:r>
+              <w:rPr>
+                <w:rStyle w:val="affa"/>
+                <w:noProof/>
+              </w:rPr>
+              <w:t xml:space="preserve">2.3 </w:t>
+            </w:r>
+            <w:r>
+              <w:rPr>
+                <w:rStyle w:val="affa"/>
+                <w:rFonts w:hint="eastAsia"/>
+                <w:noProof/>
+              </w:rPr>
+              <w:t>第三部分：應用系統與驗測</w:t>
+            </w:r>
+            <w:r>
+              <w:rPr>
+                <w:rStyle w:val="affa"/>
+                <w:noProof/>
+              </w:rPr>
+              <w:t xml:space="preserve"> SOP (Application Systems &amp; SOPs)</w:t>
+            </w:r>
+            <w:r>
+              <w:rPr>
+                <w:noProof/>
+                <w:webHidden/>
+              </w:rPr>
+              <w:tab/>
+            </w:r>
+            <w:r>
+              <w:rPr>
+                <w:noProof/>
+                <w:webHidden/>
+              </w:rPr>
+              <w:fldChar w:fldCharType="begin"/>
+            </w:r>
+            <w:r>
+              <w:rPr>
+                <w:noProof/>
+                <w:webHidden/>
+              </w:rPr>
+              <w:instrText xml:space="preserve"> PAGEREF _Toc236071659 \h </w:instrText>
+            </w:r>
+            <w:r>
+              <w:rPr>
+                <w:noProof/>
+                <w:webHidden/>
+              </w:rPr>
+            </w:r>
+            <w:r>
+              <w:rPr>
+                <w:noProof/>
+                <w:webHidden/>
+              </w:rPr>
+              <w:fldChar w:fldCharType="separate"/>
+            </w:r>
+            <w:r>
+              <w:rPr>
+                <w:noProof/>
+                <w:webHidden/>
+              </w:rPr>
+              <w:t>13</w:t>
+            </w:r>
+            <w:r>
+              <w:rPr>
+                <w:noProof/>
+                <w:webHidden/>
+              </w:rPr>
+              <w:fldChar w:fldCharType="end"/>
+            </w:r>
+          </w:hyperlink>
+        </w:p>
+        <w:p>
+          <w:pPr>
+            <w:pStyle w:val="14"/>
+            <w:tabs>
+              <w:tab w:val="right" w:leader="dot" w:pos="9350"/>
+            </w:tabs>
+            <w:rPr>
+              <w:noProof/>
+            </w:rPr>
+          </w:pPr>
+          <w:hyperlink w:anchor="_Toc236071660" w:history="1">
+            <w:r>
+              <w:rPr>
+                <w:rStyle w:val="affa"/>
+                <w:rFonts w:hint="eastAsia"/>
+                <w:noProof/>
+              </w:rPr>
+              <w:t>第三章</w:t>
+            </w:r>
+            <w:r>
+              <w:rPr>
+                <w:rStyle w:val="affa"/>
+                <w:noProof/>
+              </w:rPr>
+              <w:t xml:space="preserve"> </w:t>
+            </w:r>
+            <w:r>
+              <w:rPr>
+                <w:rStyle w:val="affa"/>
+                <w:rFonts w:hint="eastAsia"/>
+                <w:noProof/>
+              </w:rPr>
+              <w:t>階段性任務與</w:t>
+            </w:r>
+            <w:r>
+              <w:rPr>
+                <w:rStyle w:val="affa"/>
+                <w:noProof/>
+              </w:rPr>
+              <w:t xml:space="preserve"> 24 </w:t>
+            </w:r>
+            <w:r>
+              <w:rPr>
+                <w:rStyle w:val="affa"/>
+                <w:rFonts w:hint="eastAsia"/>
+                <w:noProof/>
+              </w:rPr>
+              <w:t>個月時程規劃</w:t>
+            </w:r>
+            <w:r>
+              <w:rPr>
+                <w:noProof/>
+                <w:webHidden/>
+              </w:rPr>
+              <w:tab/>
+            </w:r>
+            <w:r>
+              <w:rPr>
+                <w:noProof/>
+                <w:webHidden/>
+              </w:rPr>
+              <w:fldChar w:fldCharType="begin"/>
+            </w:r>
+            <w:r>
+              <w:rPr>
+                <w:noProof/>
+                <w:webHidden/>
+              </w:rPr>
+              <w:instrText xml:space="preserve"> PAGEREF _Toc236071660 \h </w:instrText>
+            </w:r>
+            <w:r>
+              <w:rPr>
+                <w:noProof/>
+                <w:webHidden/>
+              </w:rPr>
+            </w:r>
+            <w:r>
+              <w:rPr>
+                <w:noProof/>
+                <w:webHidden/>
+              </w:rPr>
+              <w:fldChar w:fldCharType="separate"/>
+            </w:r>
+            <w:r>
+              <w:rPr>
+                <w:noProof/>
+                <w:webHidden/>
+              </w:rPr>
+              <w:t>15</w:t>
+            </w:r>
+            <w:r>
+              <w:rPr>
+                <w:noProof/>
+                <w:webHidden/>
+              </w:rPr>
+              <w:fldChar w:fldCharType="end"/>
+            </w:r>
+          </w:hyperlink>
+        </w:p>
+        <w:p>
+          <w:pPr>
+            <w:pStyle w:val="2a"/>
+            <w:tabs>
+              <w:tab w:val="right" w:leader="dot" w:pos="9350"/>
+            </w:tabs>
+            <w:ind w:left="560"/>
+            <w:rPr>
+              <w:noProof/>
+            </w:rPr>
+          </w:pPr>
+          <w:hyperlink w:anchor="_Toc236071661" w:history="1">
+            <w:r>
+              <w:rPr>
+                <w:rStyle w:val="affa"/>
+                <w:noProof/>
+              </w:rPr>
+              <w:t xml:space="preserve">3.1 </w:t>
+            </w:r>
+            <w:r>
+              <w:rPr>
+                <w:rStyle w:val="affa"/>
+                <w:rFonts w:hint="eastAsia"/>
+                <w:noProof/>
+              </w:rPr>
+              <w:t>四大階段任務與發展里程碑</w:t>
+            </w:r>
+            <w:r>
+              <w:rPr>
+                <w:rStyle w:val="affa"/>
+                <w:noProof/>
+              </w:rPr>
+              <w:t xml:space="preserve"> (Milestones)</w:t>
+            </w:r>
+            <w:r>
+              <w:rPr>
+                <w:noProof/>
+                <w:webHidden/>
+              </w:rPr>
+              <w:tab/>
+            </w:r>
+            <w:r>
+              <w:rPr>
+                <w:noProof/>
+                <w:webHidden/>
+              </w:rPr>
+              <w:fldChar w:fldCharType="begin"/>
+            </w:r>
+            <w:r>
+              <w:rPr>
+                <w:noProof/>
+                <w:webHidden/>
+              </w:rPr>
+              <w:instrText xml:space="preserve"> PAGEREF _Toc236071661 \h </w:instrText>
+            </w:r>
+            <w:r>
+              <w:rPr>
+                <w:noProof/>
+                <w:webHidden/>
+              </w:rPr>
+            </w:r>
+            <w:r>
+              <w:rPr>
+                <w:noProof/>
+                <w:webHidden/>
+              </w:rPr>
+              <w:fldChar w:fldCharType="separate"/>
+            </w:r>
+            <w:r>
+              <w:rPr>
+                <w:noProof/>
+                <w:webHidden/>
+              </w:rPr>
+              <w:t>15</w:t>
+            </w:r>
+            <w:r>
+              <w:rPr>
+                <w:noProof/>
+                <w:webHidden/>
+              </w:rPr>
+              <w:fldChar w:fldCharType="end"/>
+            </w:r>
+          </w:hyperlink>
+        </w:p>
+        <w:p>
+          <w:pPr>
+            <w:pStyle w:val="2a"/>
+            <w:tabs>
+              <w:tab w:val="right" w:leader="dot" w:pos="9350"/>
+            </w:tabs>
+            <w:ind w:left="560"/>
+            <w:rPr>
+              <w:noProof/>
+            </w:rPr>
+          </w:pPr>
+          <w:hyperlink w:anchor="_Toc236071662" w:history="1">
+            <w:r>
+              <w:rPr>
+                <w:rStyle w:val="affa"/>
+                <w:noProof/>
+              </w:rPr>
+              <w:t xml:space="preserve">3.2 24 </w:t>
+            </w:r>
+            <w:r>
+              <w:rPr>
+                <w:rStyle w:val="affa"/>
+                <w:rFonts w:hint="eastAsia"/>
+                <w:noProof/>
+              </w:rPr>
+              <w:t>個月專案時程對照表</w:t>
+            </w:r>
+            <w:r>
+              <w:rPr>
+                <w:rStyle w:val="affa"/>
+                <w:noProof/>
+              </w:rPr>
+              <w:t xml:space="preserve"> (Gantt Schedule)</w:t>
+            </w:r>
+            <w:r>
+              <w:rPr>
+                <w:noProof/>
+                <w:webHidden/>
+              </w:rPr>
+              <w:tab/>
+            </w:r>
+            <w:r>
+              <w:rPr>
+                <w:noProof/>
+                <w:webHidden/>
+              </w:rPr>
+              <w:fldChar w:fldCharType="begin"/>
+            </w:r>
+            <w:r>
+              <w:rPr>
+                <w:noProof/>
+                <w:webHidden/>
+              </w:rPr>
+              <w:instrText xml:space="preserve"> PAGEREF _Toc236071662 \h </w:instrText>
+            </w:r>
+            <w:r>
+              <w:rPr>
+                <w:noProof/>
+                <w:webHidden/>
+              </w:rPr>
+            </w:r>
+            <w:r>
+              <w:rPr>
+                <w:noProof/>
+                <w:webHidden/>
+              </w:rPr>
+              <w:fldChar w:fldCharType="separate"/>
+            </w:r>
+            <w:r>
+              <w:rPr>
+                <w:noProof/>
+                <w:webHidden/>
+              </w:rPr>
+              <w:t>15</w:t>
+            </w:r>
+            <w:r>
+              <w:rPr>
+                <w:noProof/>
+                <w:webHidden/>
+              </w:rPr>
+              <w:fldChar w:fldCharType="end"/>
+            </w:r>
+          </w:hyperlink>
+        </w:p>
+        <w:p>
+          <w:pPr>
+            <w:pStyle w:val="14"/>
+            <w:tabs>
+              <w:tab w:val="right" w:leader="dot" w:pos="9350"/>
+            </w:tabs>
+            <w:rPr>
+              <w:noProof/>
+            </w:rPr>
+          </w:pPr>
+          <w:hyperlink w:anchor="_Toc236071663" w:history="1">
+            <w:r>
+              <w:rPr>
+                <w:rStyle w:val="affa"/>
+                <w:rFonts w:hint="eastAsia"/>
+                <w:noProof/>
+              </w:rPr>
+              <w:t>第四章</w:t>
+            </w:r>
+            <w:r>
+              <w:rPr>
+                <w:rStyle w:val="affa"/>
+                <w:noProof/>
+              </w:rPr>
+              <w:t xml:space="preserve"> </w:t>
+            </w:r>
+            <w:r>
+              <w:rPr>
+                <w:rStyle w:val="affa"/>
+                <w:rFonts w:hint="eastAsia"/>
+                <w:noProof/>
+              </w:rPr>
+              <w:t>資源配置與專案風險管理</w:t>
+            </w:r>
+            <w:r>
+              <w:rPr>
+                <w:noProof/>
+                <w:webHidden/>
+              </w:rPr>
+              <w:tab/>
+            </w:r>
+            <w:r>
+              <w:rPr>
+                <w:noProof/>
+                <w:webHidden/>
+              </w:rPr>
+              <w:fldChar w:fldCharType="begin"/>
+            </w:r>
+            <w:r>
+              <w:rPr>
+                <w:noProof/>
+                <w:webHidden/>
+              </w:rPr>
+              <w:instrText xml:space="preserve"> PAGEREF _Toc236071663 \h </w:instrText>
+            </w:r>
+            <w:r>
+              <w:rPr>
+                <w:noProof/>
+                <w:webHidden/>
+              </w:rPr>
+            </w:r>
+            <w:r>
+              <w:rPr>
+                <w:noProof/>
+                <w:webHidden/>
+              </w:rPr>
+              <w:fldChar w:fldCharType="separate"/>
+            </w:r>
+            <w:r>
+              <w:rPr>
+                <w:noProof/>
+                <w:webHidden/>
+              </w:rPr>
+              <w:t>17</w:t>
+            </w:r>
+            <w:r>
+              <w:rPr>
+                <w:noProof/>
+                <w:webHidden/>
+              </w:rPr>
+              <w:fldChar w:fldCharType="end"/>
+            </w:r>
+          </w:hyperlink>
+        </w:p>
+        <w:p>
+          <w:pPr>
+            <w:pStyle w:val="2a"/>
+            <w:tabs>
+              <w:tab w:val="right" w:leader="dot" w:pos="9350"/>
+            </w:tabs>
+            <w:ind w:left="560"/>
+            <w:rPr>
+              <w:noProof/>
+            </w:rPr>
+          </w:pPr>
+          <w:hyperlink w:anchor="_Toc236071664" w:history="1">
+            <w:r>
+              <w:rPr>
+                <w:rStyle w:val="affa"/>
+                <w:noProof/>
+              </w:rPr>
+              <w:t xml:space="preserve">4.1 </w:t>
+            </w:r>
+            <w:r>
+              <w:rPr>
+                <w:rStyle w:val="affa"/>
+                <w:rFonts w:hint="eastAsia"/>
+                <w:noProof/>
+              </w:rPr>
+              <w:t>軟硬體、民雄算力與人力資源配置表</w:t>
+            </w:r>
+            <w:r>
+              <w:rPr>
+                <w:noProof/>
+                <w:webHidden/>
+              </w:rPr>
+              <w:tab/>
+            </w:r>
+            <w:r>
+              <w:rPr>
+                <w:noProof/>
+                <w:webHidden/>
+              </w:rPr>
+              <w:fldChar w:fldCharType="begin"/>
+            </w:r>
+            <w:r>
+              <w:rPr>
+                <w:noProof/>
+                <w:webHidden/>
+              </w:rPr>
+              <w:instrText xml:space="preserve"> PAGEREF _Toc236071664 \h </w:instrText>
+            </w:r>
+            <w:r>
+              <w:rPr>
+                <w:noProof/>
+                <w:webHidden/>
+              </w:rPr>
+            </w:r>
+            <w:r>
+              <w:rPr>
+                <w:noProof/>
+                <w:webHidden/>
+              </w:rPr>
+              <w:fldChar w:fldCharType="separate"/>
+            </w:r>
+            <w:r>
+              <w:rPr>
+                <w:noProof/>
+                <w:webHidden/>
+              </w:rPr>
+              <w:t>17</w:t>
+            </w:r>
+            <w:r>
+              <w:rPr>
+                <w:noProof/>
+                <w:webHidden/>
+              </w:rPr>
+              <w:fldChar w:fldCharType="end"/>
+            </w:r>
+          </w:hyperlink>
+        </w:p>
+        <w:p>
+          <w:pPr>
+            <w:pStyle w:val="2a"/>
+            <w:tabs>
+              <w:tab w:val="right" w:leader="dot" w:pos="9350"/>
+            </w:tabs>
+            <w:ind w:left="560"/>
+            <w:rPr>
+              <w:noProof/>
+            </w:rPr>
+          </w:pPr>
+          <w:hyperlink w:anchor="_Toc236071665" w:history="1">
+            <w:r>
+              <w:rPr>
+                <w:rStyle w:val="affa"/>
+                <w:noProof/>
+              </w:rPr>
+              <w:t xml:space="preserve">4.2 </w:t>
+            </w:r>
+            <w:r>
+              <w:rPr>
+                <w:rStyle w:val="affa"/>
+                <w:rFonts w:hint="eastAsia"/>
+                <w:noProof/>
+              </w:rPr>
+              <w:t>專案風險評估與因應對策</w:t>
+            </w:r>
+            <w:r>
+              <w:rPr>
+                <w:rStyle w:val="affa"/>
+                <w:noProof/>
+              </w:rPr>
+              <w:t xml:space="preserve"> (Risk Matrix)</w:t>
+            </w:r>
+            <w:r>
+              <w:rPr>
+                <w:noProof/>
+                <w:webHidden/>
+              </w:rPr>
+              <w:tab/>
+            </w:r>
+            <w:r>
+              <w:rPr>
+                <w:noProof/>
+                <w:webHidden/>
+              </w:rPr>
+              <w:fldChar w:fldCharType="begin"/>
+            </w:r>
+            <w:r>
+              <w:rPr>
+                <w:noProof/>
+                <w:webHidden/>
+              </w:rPr>
+              <w:instrText xml:space="preserve"> PAGEREF _Toc236071665 \h </w:instrText>
+            </w:r>
+            <w:r>
+              <w:rPr>
+                <w:noProof/>
+                <w:webHidden/>
+              </w:rPr>
+            </w:r>
+            <w:r>
+              <w:rPr>
+                <w:noProof/>
+                <w:webHidden/>
+              </w:rPr>
+              <w:fldChar w:fldCharType="separate"/>
+            </w:r>
+            <w:r>
+              <w:rPr>
+                <w:noProof/>
+                <w:webHidden/>
+              </w:rPr>
+              <w:t>17</w:t>
+            </w:r>
+            <w:r>
+              <w:rPr>
+                <w:noProof/>
+                <w:webHidden/>
+              </w:rPr>
+              <w:fldChar w:fldCharType="end"/>
+            </w:r>
+          </w:hyperlink>
+        </w:p>
+        <w:p>
+          <w:pPr>
+            <w:pStyle w:val="14"/>
+            <w:tabs>
+              <w:tab w:val="right" w:leader="dot" w:pos="9350"/>
+            </w:tabs>
+            <w:rPr>
+              <w:noProof/>
+            </w:rPr>
+          </w:pPr>
+          <w:hyperlink w:anchor="_Toc236071666" w:history="1">
+            <w:r>
+              <w:rPr>
+                <w:rStyle w:val="affa"/>
+                <w:rFonts w:hint="eastAsia"/>
+                <w:noProof/>
+              </w:rPr>
+              <w:t>第五章</w:t>
+            </w:r>
+            <w:r>
+              <w:rPr>
+                <w:rStyle w:val="affa"/>
+                <w:noProof/>
+              </w:rPr>
+              <w:t xml:space="preserve"> </w:t>
+            </w:r>
+            <w:r>
+              <w:rPr>
+                <w:rStyle w:val="affa"/>
+                <w:rFonts w:hint="eastAsia"/>
+                <w:noProof/>
+              </w:rPr>
+              <w:t>預期效益與戰略成果</w:t>
+            </w:r>
+            <w:r>
+              <w:rPr>
+                <w:noProof/>
+                <w:webHidden/>
+              </w:rPr>
+              <w:tab/>
+            </w:r>
+            <w:r>
+              <w:rPr>
+                <w:noProof/>
+                <w:webHidden/>
+              </w:rPr>
+              <w:fldChar w:fldCharType="begin"/>
+            </w:r>
+            <w:r>
+              <w:rPr>
+                <w:noProof/>
+                <w:webHidden/>
+              </w:rPr>
+              <w:instrText xml:space="preserve"> PAGEREF _Toc236071666 \h </w:instrText>
+            </w:r>
+            <w:r>
+              <w:rPr>
+                <w:noProof/>
+                <w:webHidden/>
+              </w:rPr>
+            </w:r>
+            <w:r>
+              <w:rPr>
+                <w:noProof/>
+                <w:webHidden/>
+              </w:rPr>
+              <w:fldChar w:fldCharType="separate"/>
+            </w:r>
+            <w:r>
+              <w:rPr>
+                <w:noProof/>
+                <w:webHidden/>
+              </w:rPr>
+              <w:t>19</w:t>
+            </w:r>
+            <w:r>
+              <w:rPr>
+                <w:noProof/>
+                <w:webHidden/>
+              </w:rPr>
+              <w:fldChar w:fldCharType="end"/>
+            </w:r>
+          </w:hyperlink>
+        </w:p>
+        <w:p>
+          <w:pPr>
+            <w:pStyle w:val="2a"/>
+            <w:tabs>
+              <w:tab w:val="right" w:leader="dot" w:pos="9350"/>
+            </w:tabs>
+            <w:ind w:left="560"/>
+            <w:rPr>
+              <w:noProof/>
+            </w:rPr>
+          </w:pPr>
+          <w:hyperlink w:anchor="_Toc236071667" w:history="1">
+            <w:r>
+              <w:rPr>
+                <w:rStyle w:val="affa"/>
+                <w:noProof/>
+              </w:rPr>
+              <w:t xml:space="preserve">1. </w:t>
+            </w:r>
+            <w:r>
+              <w:rPr>
+                <w:rStyle w:val="affa"/>
+                <w:rFonts w:hint="eastAsia"/>
+                <w:noProof/>
+              </w:rPr>
+              <w:t>戰術作戰層面：達成極致非對稱打擊效益</w:t>
+            </w:r>
+            <w:r>
+              <w:rPr>
+                <w:noProof/>
+                <w:webHidden/>
+              </w:rPr>
+              <w:tab/>
+            </w:r>
+            <w:r>
+              <w:rPr>
+                <w:noProof/>
+                <w:webHidden/>
+              </w:rPr>
+              <w:fldChar w:fldCharType="begin"/>
+            </w:r>
+            <w:r>
+              <w:rPr>
+                <w:noProof/>
+                <w:webHidden/>
+              </w:rPr>
+              <w:instrText xml:space="preserve"> PAGEREF _Toc236071667 \h </w:instrText>
+            </w:r>
+            <w:r>
+              <w:rPr>
+                <w:noProof/>
+                <w:webHidden/>
+              </w:rPr>
+            </w:r>
+            <w:r>
+              <w:rPr>
+                <w:noProof/>
+                <w:webHidden/>
+              </w:rPr>
+              <w:fldChar w:fldCharType="separate"/>
+            </w:r>
+            <w:r>
+              <w:rPr>
+                <w:noProof/>
+                <w:webHidden/>
+              </w:rPr>
+              <w:t>19</w:t>
+            </w:r>
+            <w:r>
+              <w:rPr>
+                <w:noProof/>
+                <w:webHidden/>
+              </w:rPr>
+              <w:fldChar w:fldCharType="end"/>
+            </w:r>
+          </w:hyperlink>
+        </w:p>
+        <w:p>
+          <w:pPr>
+            <w:pStyle w:val="2a"/>
+            <w:tabs>
+              <w:tab w:val="right" w:leader="dot" w:pos="9350"/>
+            </w:tabs>
+            <w:ind w:left="560"/>
+            <w:rPr>
+              <w:noProof/>
+            </w:rPr>
+          </w:pPr>
+          <w:hyperlink w:anchor="_Toc236071668" w:history="1">
+            <w:r>
+              <w:rPr>
+                <w:rStyle w:val="affa"/>
+                <w:noProof/>
+              </w:rPr>
+              <w:t xml:space="preserve">2. </w:t>
+            </w:r>
+            <w:r>
+              <w:rPr>
+                <w:rStyle w:val="affa"/>
+                <w:rFonts w:hint="eastAsia"/>
+                <w:noProof/>
+              </w:rPr>
+              <w:t>資安與保密層面：建構零漏洞主權防衛屏障</w:t>
+            </w:r>
+            <w:r>
+              <w:rPr>
+                <w:noProof/>
+                <w:webHidden/>
+              </w:rPr>
+              <w:tab/>
+            </w:r>
+            <w:r>
+              <w:rPr>
+                <w:noProof/>
+                <w:webHidden/>
+              </w:rPr>
+              <w:fldChar w:fldCharType="begin"/>
+            </w:r>
+            <w:r>
+              <w:rPr>
+                <w:noProof/>
+                <w:webHidden/>
+              </w:rPr>
+              <w:instrText xml:space="preserve"> PAGEREF _Toc236071668 \h </w:instrText>
+            </w:r>
+            <w:r>
+              <w:rPr>
+                <w:noProof/>
+                <w:webHidden/>
+              </w:rPr>
+            </w:r>
+            <w:r>
+              <w:rPr>
+                <w:noProof/>
+                <w:webHidden/>
+              </w:rPr>
+              <w:fldChar w:fldCharType="separate"/>
+            </w:r>
+            <w:r>
+              <w:rPr>
+                <w:noProof/>
+                <w:webHidden/>
+              </w:rPr>
+              <w:t>19</w:t>
+            </w:r>
+            <w:r>
+              <w:rPr>
+                <w:noProof/>
+                <w:webHidden/>
+              </w:rPr>
+              <w:fldChar w:fldCharType="end"/>
+            </w:r>
+          </w:hyperlink>
+        </w:p>
+        <w:p>
+          <w:pPr>
+            <w:pStyle w:val="2a"/>
+            <w:tabs>
+              <w:tab w:val="right" w:leader="dot" w:pos="9350"/>
+            </w:tabs>
+            <w:ind w:left="560"/>
+            <w:rPr>
+              <w:noProof/>
+            </w:rPr>
+          </w:pPr>
+          <w:hyperlink w:anchor="_Toc236071669" w:history="1">
+            <w:r>
+              <w:rPr>
+                <w:rStyle w:val="affa"/>
+                <w:noProof/>
+              </w:rPr>
+              <w:t xml:space="preserve">3. </w:t>
+            </w:r>
+            <w:r>
+              <w:rPr>
+                <w:rStyle w:val="affa"/>
+                <w:rFonts w:hint="eastAsia"/>
+                <w:noProof/>
+              </w:rPr>
+              <w:t>國家與產業層面：樹立自主</w:t>
+            </w:r>
+            <w:r>
+              <w:rPr>
+                <w:rStyle w:val="affa"/>
+                <w:noProof/>
+              </w:rPr>
+              <w:t xml:space="preserve"> AIEC </w:t>
+            </w:r>
+            <w:r>
+              <w:rPr>
+                <w:rStyle w:val="affa"/>
+                <w:rFonts w:hint="eastAsia"/>
+                <w:noProof/>
+              </w:rPr>
+              <w:t>評測認證標竿</w:t>
+            </w:r>
+            <w:r>
+              <w:rPr>
+                <w:noProof/>
+                <w:webHidden/>
+              </w:rPr>
+              <w:tab/>
+            </w:r>
+            <w:r>
+              <w:rPr>
+                <w:noProof/>
+                <w:webHidden/>
+              </w:rPr>
+              <w:fldChar w:fldCharType="begin"/>
+            </w:r>
+            <w:r>
+              <w:rPr>
+                <w:noProof/>
+                <w:webHidden/>
+              </w:rPr>
+              <w:instrText xml:space="preserve"> PAGEREF _Toc236071669 \h </w:instrText>
+            </w:r>
+            <w:r>
+              <w:rPr>
+                <w:noProof/>
+                <w:webHidden/>
+              </w:rPr>
+            </w:r>
+            <w:r>
+              <w:rPr>
+                <w:noProof/>
+                <w:webHidden/>
+              </w:rPr>
+              <w:fldChar w:fldCharType="separate"/>
+            </w:r>
+            <w:r>
+              <w:rPr>
+                <w:noProof/>
+                <w:webHidden/>
+              </w:rPr>
+              <w:t>19</w:t>
+            </w:r>
+            <w:r>
+              <w:rPr>
+                <w:noProof/>
+                <w:webHidden/>
+              </w:rPr>
+              <w:fldChar w:fldCharType="end"/>
+            </w:r>
+          </w:hyperlink>
+        </w:p>
+        <w:p>
+          <w:r>
+            <w:fldChar w:fldCharType="end"/>
+          </w:r>
+        </w:p>
+      </w:sdtContent>
+    </w:sdt>
     <w:p>
       <w:r>
         <w:br w:type="page"/>
@@ -572,7 +2647,7 @@
         <w:pStyle w:val="1"/>
         <w:spacing w:before="320" w:after="160"/>
       </w:pPr>
-      <w:bookmarkStart w:id="1" w:name="_Toc236071427"/>
+      <w:bookmarkStart w:id="1" w:name="_Toc236071647"/>
       <w:r>
         <w:lastRenderedPageBreak/>
         <w:t>📊</w:t>
@@ -588,6 +2663,38 @@
       </w:r>
       <w:bookmarkEnd w:id="1"/>
     </w:p>
+    <w:sdt>
+      <w:sdtPr>
+        <w:id w:val="-944764175"/>
+        <w:docPartObj>
+          <w:docPartGallery w:val="Table of Contents"/>
+          <w:docPartUnique/>
+        </w:docPartObj>
+      </w:sdtPr>
+      <w:sdtEndPr/>
+      <w:sdtContent>
+        <w:p>
+          <w:r>
+            <w:fldChar w:fldCharType="begin"/>
+          </w:r>
+          <w:r>
+            <w:instrText>TOC \h \z \c "</w:instrText>
+          </w:r>
+          <w:r>
+            <w:instrText>表</w:instrText>
+          </w:r>
+          <w:r>
+            <w:instrText>"</w:instrText>
+          </w:r>
+          <w:r>
+            <w:fldChar w:fldCharType="separate"/>
+          </w:r>
+          <w:r>
+            <w:fldChar w:fldCharType="end"/>
+          </w:r>
+        </w:p>
+      </w:sdtContent>
+    </w:sdt>
     <w:p>
       <w:r>
         <w:br w:type="page"/>
@@ -598,7 +2705,7 @@
         <w:pStyle w:val="1"/>
         <w:spacing w:before="320" w:after="160"/>
       </w:pPr>
-      <w:bookmarkStart w:id="2" w:name="_Toc236071428"/>
+      <w:bookmarkStart w:id="2" w:name="_Toc236071648"/>
       <w:r>
         <w:lastRenderedPageBreak/>
         <w:t>🖼</w:t>
@@ -617,6 +2724,38 @@
       </w:r>
       <w:bookmarkEnd w:id="2"/>
     </w:p>
+    <w:sdt>
+      <w:sdtPr>
+        <w:id w:val="479264506"/>
+        <w:docPartObj>
+          <w:docPartGallery w:val="Table of Contents"/>
+          <w:docPartUnique/>
+        </w:docPartObj>
+      </w:sdtPr>
+      <w:sdtEndPr/>
+      <w:sdtContent>
+        <w:p>
+          <w:r>
+            <w:fldChar w:fldCharType="begin"/>
+          </w:r>
+          <w:r>
+            <w:instrText>TOC \h \z \c "</w:instrText>
+          </w:r>
+          <w:r>
+            <w:instrText>圖</w:instrText>
+          </w:r>
+          <w:r>
+            <w:instrText>"</w:instrText>
+          </w:r>
+          <w:r>
+            <w:fldChar w:fldCharType="separate"/>
+          </w:r>
+          <w:r>
+            <w:fldChar w:fldCharType="end"/>
+          </w:r>
+        </w:p>
+      </w:sdtContent>
+    </w:sdt>
     <w:p>
       <w:r>
         <w:br w:type="page"/>
@@ -627,7 +2766,7 @@
         <w:pStyle w:val="1"/>
         <w:spacing w:before="320" w:after="160"/>
       </w:pPr>
-      <w:bookmarkStart w:id="3" w:name="_Toc236071429"/>
+      <w:bookmarkStart w:id="3" w:name="_Toc236071649"/>
       <w:r>
         <w:lastRenderedPageBreak/>
         <w:t>第一章</w:t>
@@ -651,7 +2790,7 @@
         <w:pStyle w:val="21"/>
         <w:spacing w:before="240" w:after="160"/>
       </w:pPr>
-      <w:bookmarkStart w:id="4" w:name="_Toc236071430"/>
+      <w:bookmarkStart w:id="4" w:name="_Toc236071650"/>
       <w:r>
         <w:t xml:space="preserve">1.1 AI </w:t>
       </w:r>
@@ -703,7 +2842,7 @@
         <w:pStyle w:val="21"/>
         <w:spacing w:before="240" w:after="160"/>
       </w:pPr>
-      <w:bookmarkStart w:id="5" w:name="_Toc236071431"/>
+      <w:bookmarkStart w:id="5" w:name="_Toc236071651"/>
       <w:r>
         <w:t xml:space="preserve">1.2 </w:t>
       </w:r>
@@ -803,7 +2942,7 @@
         <w:pStyle w:val="21"/>
         <w:spacing w:before="240" w:after="160"/>
       </w:pPr>
-      <w:bookmarkStart w:id="6" w:name="_Toc236071432"/>
+      <w:bookmarkStart w:id="6" w:name="_Toc236071652"/>
       <w:r>
         <w:t xml:space="preserve">1.3 </w:t>
       </w:r>
@@ -864,7 +3003,25 @@
         <w:rPr>
           <w:color w:val="0C2340"/>
         </w:rPr>
-        <w:t xml:space="preserve"> 1-1</w:t>
+        <w:t xml:space="preserve"> </w:t>
+      </w:r>
+      <w:r>
+        <w:fldChar w:fldCharType="begin"/>
+      </w:r>
+      <w:r>
+        <w:instrText xml:space="preserve">SEQ </w:instrText>
+      </w:r>
+      <w:r>
+        <w:instrText>表</w:instrText>
+      </w:r>
+      <w:r>
+        <w:instrText xml:space="preserve"> \* ARABIC</w:instrText>
+      </w:r>
+      <w:r>
+        <w:fldChar w:fldCharType="separate"/>
+      </w:r>
+      <w:r>
+        <w:fldChar w:fldCharType="end"/>
       </w:r>
       <w:r>
         <w:rPr>
@@ -1372,7 +3529,7 @@
         <w:pStyle w:val="21"/>
         <w:spacing w:before="240" w:after="160"/>
       </w:pPr>
-      <w:bookmarkStart w:id="7" w:name="_Toc236071433"/>
+      <w:bookmarkStart w:id="7" w:name="_Toc236071653"/>
       <w:r>
         <w:t xml:space="preserve">1.4 </w:t>
       </w:r>
@@ -1615,7 +3772,7 @@
         <w:pStyle w:val="21"/>
         <w:spacing w:before="240" w:after="160"/>
       </w:pPr>
-      <w:bookmarkStart w:id="8" w:name="_Toc236071434"/>
+      <w:bookmarkStart w:id="8" w:name="_Toc236071654"/>
       <w:r>
         <w:t xml:space="preserve">1.5 </w:t>
       </w:r>
@@ -1874,7 +4031,7 @@
         <w:pStyle w:val="21"/>
         <w:spacing w:before="240" w:after="160"/>
       </w:pPr>
-      <w:bookmarkStart w:id="9" w:name="_Toc236071435"/>
+      <w:bookmarkStart w:id="9" w:name="_Toc236071655"/>
       <w:r>
         <w:t xml:space="preserve">1.6 </w:t>
       </w:r>
@@ -1965,7 +4122,7 @@
         <w:pStyle w:val="1"/>
         <w:spacing w:before="320" w:after="160"/>
       </w:pPr>
-      <w:bookmarkStart w:id="10" w:name="_Toc236071436"/>
+      <w:bookmarkStart w:id="10" w:name="_Toc236071656"/>
       <w:r>
         <w:lastRenderedPageBreak/>
         <w:t>第二章</w:t>
@@ -1983,7 +4140,7 @@
         <w:pStyle w:val="21"/>
         <w:spacing w:before="240" w:after="160"/>
       </w:pPr>
-      <w:bookmarkStart w:id="11" w:name="_Toc236071437"/>
+      <w:bookmarkStart w:id="11" w:name="_Toc236071657"/>
       <w:r>
         <w:t xml:space="preserve">2.1 </w:t>
       </w:r>
@@ -2085,7 +4242,25 @@
         <w:rPr>
           <w:color w:val="0C2340"/>
         </w:rPr>
-        <w:t xml:space="preserve"> 2-1</w:t>
+        <w:t xml:space="preserve"> </w:t>
+      </w:r>
+      <w:r>
+        <w:fldChar w:fldCharType="begin"/>
+      </w:r>
+      <w:r>
+        <w:instrText xml:space="preserve">SEQ </w:instrText>
+      </w:r>
+      <w:r>
+        <w:instrText>表</w:instrText>
+      </w:r>
+      <w:r>
+        <w:instrText xml:space="preserve"> \* ARABIC</w:instrText>
+      </w:r>
+      <w:r>
+        <w:fldChar w:fldCharType="separate"/>
+      </w:r>
+      <w:r>
+        <w:fldChar w:fldCharType="end"/>
       </w:r>
       <w:r>
         <w:rPr>
@@ -2614,7 +4789,25 @@
         <w:rPr>
           <w:color w:val="0C2340"/>
         </w:rPr>
-        <w:t xml:space="preserve"> 2-2</w:t>
+        <w:t xml:space="preserve"> </w:t>
+      </w:r>
+      <w:r>
+        <w:fldChar w:fldCharType="begin"/>
+      </w:r>
+      <w:r>
+        <w:instrText xml:space="preserve">SEQ </w:instrText>
+      </w:r>
+      <w:r>
+        <w:instrText>表</w:instrText>
+      </w:r>
+      <w:r>
+        <w:instrText xml:space="preserve"> \* ARABIC</w:instrText>
+      </w:r>
+      <w:r>
+        <w:fldChar w:fldCharType="separate"/>
+      </w:r>
+      <w:r>
+        <w:fldChar w:fldCharType="end"/>
       </w:r>
       <w:r>
         <w:rPr>
@@ -2811,7 +5004,6 @@
                 <w:color w:val="1E293B"/>
                 <w:sz w:val="22"/>
               </w:rPr>
-              <w:lastRenderedPageBreak/>
               <w:t>HITL (</w:t>
             </w:r>
             <w:r>
@@ -2847,7 +5039,15 @@
                 <w:color w:val="1E293B"/>
                 <w:sz w:val="22"/>
               </w:rPr>
-              <w:t>最終打擊與開火決策者</w:t>
+              <w:t>最終打擊與開火決策</w:t>
+            </w:r>
+            <w:r>
+              <w:rPr>
+                <w:color w:val="1E293B"/>
+                <w:sz w:val="22"/>
+              </w:rPr>
+              <w:lastRenderedPageBreak/>
+              <w:t>者</w:t>
             </w:r>
           </w:p>
         </w:tc>
@@ -2868,7 +5068,16 @@
                 <w:color w:val="1E293B"/>
                 <w:sz w:val="22"/>
               </w:rPr>
-              <w:t>僅提供目標自動識別與</w:t>
+              <w:lastRenderedPageBreak/>
+              <w:t>僅提供目標自動識別</w:t>
+            </w:r>
+            <w:r>
+              <w:rPr>
+                <w:color w:val="1E293B"/>
+                <w:sz w:val="22"/>
+              </w:rPr>
+              <w:lastRenderedPageBreak/>
+              <w:t>與</w:t>
             </w:r>
             <w:r>
               <w:rPr>
@@ -2903,7 +5112,16 @@
                 <w:color w:val="1E293B"/>
                 <w:sz w:val="22"/>
               </w:rPr>
-              <w:t>飛彈陣地、致傷性武器打擊、高機密情報處置</w:t>
+              <w:lastRenderedPageBreak/>
+              <w:t>飛彈陣地、致傷性武</w:t>
+            </w:r>
+            <w:r>
+              <w:rPr>
+                <w:color w:val="1E293B"/>
+                <w:sz w:val="22"/>
+              </w:rPr>
+              <w:lastRenderedPageBreak/>
+              <w:t>器打擊、高機密情報處置</w:t>
             </w:r>
           </w:p>
         </w:tc>
@@ -2932,6 +5150,7 @@
                 <w:color w:val="1E293B"/>
                 <w:sz w:val="22"/>
               </w:rPr>
+              <w:lastRenderedPageBreak/>
               <w:t>HOTL (</w:t>
             </w:r>
             <w:r>
@@ -3131,7 +5350,7 @@
           <w:noProof/>
         </w:rPr>
         <w:drawing>
-          <wp:inline distT="0" distB="0" distL="0" distR="0" wp14:anchorId="73DCD64F" wp14:editId="7A169C51">
+          <wp:inline distT="0" distB="0" distL="0" distR="0" wp14:anchorId="4A12123D" wp14:editId="32529364">
             <wp:extent cx="5669280" cy="2153447"/>
             <wp:effectExtent l="0" t="0" r="0" b="0"/>
             <wp:docPr id="1" name="Picture 1"/>
@@ -3183,7 +5402,25 @@
         <w:rPr>
           <w:color w:val="0C2340"/>
         </w:rPr>
-        <w:t xml:space="preserve"> 2-1</w:t>
+        <w:t xml:space="preserve"> </w:t>
+      </w:r>
+      <w:r>
+        <w:fldChar w:fldCharType="begin"/>
+      </w:r>
+      <w:r>
+        <w:instrText xml:space="preserve">SEQ </w:instrText>
+      </w:r>
+      <w:r>
+        <w:instrText>圖</w:instrText>
+      </w:r>
+      <w:r>
+        <w:instrText xml:space="preserve"> \* ARABIC</w:instrText>
+      </w:r>
+      <w:r>
+        <w:fldChar w:fldCharType="separate"/>
+      </w:r>
+      <w:r>
+        <w:fldChar w:fldCharType="end"/>
       </w:r>
       <w:r>
         <w:rPr>
@@ -3239,7 +5476,7 @@
         <w:pStyle w:val="21"/>
         <w:spacing w:before="240" w:after="160"/>
       </w:pPr>
-      <w:bookmarkStart w:id="12" w:name="_Toc236071438"/>
+      <w:bookmarkStart w:id="12" w:name="_Toc236071658"/>
       <w:r>
         <w:t xml:space="preserve">2.2 </w:t>
       </w:r>
@@ -3342,7 +5579,25 @@
         <w:rPr>
           <w:color w:val="0C2340"/>
         </w:rPr>
-        <w:t xml:space="preserve"> 2-3</w:t>
+        <w:t xml:space="preserve"> </w:t>
+      </w:r>
+      <w:r>
+        <w:fldChar w:fldCharType="begin"/>
+      </w:r>
+      <w:r>
+        <w:instrText xml:space="preserve">SEQ </w:instrText>
+      </w:r>
+      <w:r>
+        <w:instrText>表</w:instrText>
+      </w:r>
+      <w:r>
+        <w:instrText xml:space="preserve"> \* ARABIC</w:instrText>
+      </w:r>
+      <w:r>
+        <w:fldChar w:fldCharType="separate"/>
+      </w:r>
+      <w:r>
+        <w:fldChar w:fldCharType="end"/>
       </w:r>
       <w:r>
         <w:rPr>
@@ -5204,7 +7459,7 @@
           <w:noProof/>
         </w:rPr>
         <w:drawing>
-          <wp:inline distT="0" distB="0" distL="0" distR="0" wp14:anchorId="5077C6F0" wp14:editId="1E17B43D">
+          <wp:inline distT="0" distB="0" distL="0" distR="0" wp14:anchorId="24ED2604" wp14:editId="38D83441">
             <wp:extent cx="5669280" cy="2153447"/>
             <wp:effectExtent l="0" t="0" r="0" b="0"/>
             <wp:docPr id="2" name="Picture 2"/>
@@ -5256,7 +7511,25 @@
         <w:rPr>
           <w:color w:val="0C2340"/>
         </w:rPr>
-        <w:t xml:space="preserve"> 2-2</w:t>
+        <w:t xml:space="preserve"> </w:t>
+      </w:r>
+      <w:r>
+        <w:fldChar w:fldCharType="begin"/>
+      </w:r>
+      <w:r>
+        <w:instrText xml:space="preserve">SEQ </w:instrText>
+      </w:r>
+      <w:r>
+        <w:instrText>圖</w:instrText>
+      </w:r>
+      <w:r>
+        <w:instrText xml:space="preserve"> \* ARABIC</w:instrText>
+      </w:r>
+      <w:r>
+        <w:fldChar w:fldCharType="separate"/>
+      </w:r>
+      <w:r>
+        <w:fldChar w:fldCharType="end"/>
       </w:r>
       <w:r>
         <w:rPr>
@@ -5312,7 +7585,7 @@
         <w:pStyle w:val="21"/>
         <w:spacing w:before="240" w:after="160"/>
       </w:pPr>
-      <w:bookmarkStart w:id="13" w:name="_Toc236071439"/>
+      <w:bookmarkStart w:id="13" w:name="_Toc236071659"/>
       <w:r>
         <w:t xml:space="preserve">2.3 </w:t>
       </w:r>
@@ -5433,7 +7706,7 @@
         </w:rPr>
         <w:lastRenderedPageBreak/>
         <w:drawing>
-          <wp:inline distT="0" distB="0" distL="0" distR="0" wp14:anchorId="0E6A53D7" wp14:editId="201F241E">
+          <wp:inline distT="0" distB="0" distL="0" distR="0" wp14:anchorId="5959826B" wp14:editId="59ED36C9">
             <wp:extent cx="5669280" cy="2153447"/>
             <wp:effectExtent l="0" t="0" r="0" b="0"/>
             <wp:docPr id="3" name="Picture 3"/>
@@ -5485,7 +7758,25 @@
         <w:rPr>
           <w:color w:val="0C2340"/>
         </w:rPr>
-        <w:t xml:space="preserve"> 2-3</w:t>
+        <w:t xml:space="preserve"> </w:t>
+      </w:r>
+      <w:r>
+        <w:fldChar w:fldCharType="begin"/>
+      </w:r>
+      <w:r>
+        <w:instrText xml:space="preserve">SEQ </w:instrText>
+      </w:r>
+      <w:r>
+        <w:instrText>圖</w:instrText>
+      </w:r>
+      <w:r>
+        <w:instrText xml:space="preserve"> \* ARABIC</w:instrText>
+      </w:r>
+      <w:r>
+        <w:fldChar w:fldCharType="separate"/>
+      </w:r>
+      <w:r>
+        <w:fldChar w:fldCharType="end"/>
       </w:r>
       <w:r>
         <w:rPr>
@@ -5534,7 +7825,7 @@
         <w:pStyle w:val="1"/>
         <w:spacing w:before="320" w:after="160"/>
       </w:pPr>
-      <w:bookmarkStart w:id="14" w:name="_Toc236071440"/>
+      <w:bookmarkStart w:id="14" w:name="_Toc236071660"/>
       <w:r>
         <w:lastRenderedPageBreak/>
         <w:t>第三章</w:t>
@@ -5558,7 +7849,7 @@
         <w:pStyle w:val="21"/>
         <w:spacing w:before="240" w:after="160"/>
       </w:pPr>
-      <w:bookmarkStart w:id="15" w:name="_Toc236071441"/>
+      <w:bookmarkStart w:id="15" w:name="_Toc236071661"/>
       <w:r>
         <w:t xml:space="preserve">3.1 </w:t>
       </w:r>
@@ -5915,7 +8206,7 @@
         <w:pStyle w:val="21"/>
         <w:spacing w:before="240" w:after="160"/>
       </w:pPr>
-      <w:bookmarkStart w:id="16" w:name="_Toc236071442"/>
+      <w:bookmarkStart w:id="16" w:name="_Toc236071662"/>
       <w:r>
         <w:t xml:space="preserve">3.2 24 </w:t>
       </w:r>
@@ -5943,7 +8234,25 @@
         <w:rPr>
           <w:color w:val="0C2340"/>
         </w:rPr>
-        <w:t xml:space="preserve"> 3-1</w:t>
+        <w:t xml:space="preserve"> </w:t>
+      </w:r>
+      <w:r>
+        <w:fldChar w:fldCharType="begin"/>
+      </w:r>
+      <w:r>
+        <w:instrText xml:space="preserve">SEQ </w:instrText>
+      </w:r>
+      <w:r>
+        <w:instrText>表</w:instrText>
+      </w:r>
+      <w:r>
+        <w:instrText xml:space="preserve"> \* ARABIC</w:instrText>
+      </w:r>
+      <w:r>
+        <w:fldChar w:fldCharType="separate"/>
+      </w:r>
+      <w:r>
+        <w:fldChar w:fldCharType="end"/>
       </w:r>
       <w:r>
         <w:rPr>
@@ -7423,7 +9732,7 @@
         <w:pStyle w:val="1"/>
         <w:spacing w:before="320" w:after="160"/>
       </w:pPr>
-      <w:bookmarkStart w:id="17" w:name="_Toc236071443"/>
+      <w:bookmarkStart w:id="17" w:name="_Toc236071663"/>
       <w:r>
         <w:lastRenderedPageBreak/>
         <w:t>第四章</w:t>
@@ -7441,7 +9750,7 @@
         <w:pStyle w:val="21"/>
         <w:spacing w:before="240" w:after="160"/>
       </w:pPr>
-      <w:bookmarkStart w:id="18" w:name="_Toc236071444"/>
+      <w:bookmarkStart w:id="18" w:name="_Toc236071664"/>
       <w:r>
         <w:t xml:space="preserve">4.1 </w:t>
       </w:r>
@@ -7466,7 +9775,25 @@
         <w:rPr>
           <w:color w:val="0C2340"/>
         </w:rPr>
-        <w:t xml:space="preserve"> 4-1</w:t>
+        <w:t xml:space="preserve"> </w:t>
+      </w:r>
+      <w:r>
+        <w:fldChar w:fldCharType="begin"/>
+      </w:r>
+      <w:r>
+        <w:instrText xml:space="preserve">SEQ </w:instrText>
+      </w:r>
+      <w:r>
+        <w:instrText>表</w:instrText>
+      </w:r>
+      <w:r>
+        <w:instrText xml:space="preserve"> \* ARABIC</w:instrText>
+      </w:r>
+      <w:r>
+        <w:fldChar w:fldCharType="separate"/>
+      </w:r>
+      <w:r>
+        <w:fldChar w:fldCharType="end"/>
       </w:r>
       <w:r>
         <w:rPr>
@@ -8050,7 +10377,7 @@
         <w:pStyle w:val="21"/>
         <w:spacing w:before="240" w:after="160"/>
       </w:pPr>
-      <w:bookmarkStart w:id="19" w:name="_Toc236071445"/>
+      <w:bookmarkStart w:id="19" w:name="_Toc236071665"/>
       <w:r>
         <w:t xml:space="preserve">4.2 </w:t>
       </w:r>
@@ -8078,7 +10405,25 @@
         <w:rPr>
           <w:color w:val="0C2340"/>
         </w:rPr>
-        <w:t xml:space="preserve"> 4-2</w:t>
+        <w:t xml:space="preserve"> </w:t>
+      </w:r>
+      <w:r>
+        <w:fldChar w:fldCharType="begin"/>
+      </w:r>
+      <w:r>
+        <w:instrText xml:space="preserve">SEQ </w:instrText>
+      </w:r>
+      <w:r>
+        <w:instrText>表</w:instrText>
+      </w:r>
+      <w:r>
+        <w:instrText xml:space="preserve"> \* ARABIC</w:instrText>
+      </w:r>
+      <w:r>
+        <w:fldChar w:fldCharType="separate"/>
+      </w:r>
+      <w:r>
+        <w:fldChar w:fldCharType="end"/>
       </w:r>
       <w:r>
         <w:rPr>
@@ -8781,7 +11126,7 @@
         <w:pStyle w:val="1"/>
         <w:spacing w:before="320" w:after="160"/>
       </w:pPr>
-      <w:bookmarkStart w:id="20" w:name="_Toc236071446"/>
+      <w:bookmarkStart w:id="20" w:name="_Toc236071666"/>
       <w:r>
         <w:lastRenderedPageBreak/>
         <w:t>第五章</w:t>
@@ -8807,7 +11152,7 @@
         <w:pStyle w:val="21"/>
         <w:spacing w:before="240" w:after="160"/>
       </w:pPr>
-      <w:bookmarkStart w:id="21" w:name="_Toc236071447"/>
+      <w:bookmarkStart w:id="21" w:name="_Toc236071667"/>
       <w:r>
         <w:t xml:space="preserve">1. </w:t>
       </w:r>
@@ -8841,7 +11186,7 @@
         <w:pStyle w:val="21"/>
         <w:spacing w:before="240" w:after="160"/>
       </w:pPr>
-      <w:bookmarkStart w:id="22" w:name="_Toc236071448"/>
+      <w:bookmarkStart w:id="22" w:name="_Toc236071668"/>
       <w:r>
         <w:t xml:space="preserve">2. </w:t>
       </w:r>
@@ -8899,7 +11244,7 @@
         <w:pStyle w:val="21"/>
         <w:spacing w:before="240" w:after="160"/>
       </w:pPr>
-      <w:bookmarkStart w:id="23" w:name="_Toc236071449"/>
+      <w:bookmarkStart w:id="23" w:name="_Toc236071669"/>
       <w:r>
         <w:t xml:space="preserve">3. </w:t>
       </w:r>
@@ -8958,2153 +11303,6 @@
         <w:t>升級，更確保國軍武器裝備具備國際頂級之可靠、可信任、可解釋與可當責品質。</w:t>
       </w:r>
     </w:p>
-    <w:sdt>
-      <w:sdtPr>
-        <w:id w:val="-361054288"/>
-        <w:docPartObj>
-          <w:docPartGallery w:val="Table of Contents"/>
-          <w:docPartUnique/>
-        </w:docPartObj>
-      </w:sdtPr>
-      <w:sdtEndPr/>
-      <w:sdtContent>
-        <w:p>
-          <w:pPr>
-            <w:pStyle w:val="14"/>
-            <w:tabs>
-              <w:tab w:val="right" w:leader="dot" w:pos="9350"/>
-            </w:tabs>
-            <w:rPr>
-              <w:noProof/>
-            </w:rPr>
-          </w:pPr>
-          <w:r>
-            <w:fldChar w:fldCharType="begin"/>
-          </w:r>
-          <w:r>
-            <w:instrText>TOC \o "1-2" \h \z \u</w:instrText>
-          </w:r>
-          <w:r>
-            <w:fldChar w:fldCharType="separate"/>
-          </w:r>
-          <w:hyperlink w:anchor="_Toc236071426" w:history="1">
-            <w:r>
-              <w:rPr>
-                <w:rStyle w:val="affa"/>
-                <w:rFonts w:ascii="Segoe UI Emoji" w:hAnsi="Segoe UI Emoji" w:cs="Segoe UI Emoji"/>
-                <w:noProof/>
-              </w:rPr>
-              <w:t>📋</w:t>
-            </w:r>
-            <w:r>
-              <w:rPr>
-                <w:rStyle w:val="affa"/>
-                <w:noProof/>
-              </w:rPr>
-              <w:t xml:space="preserve"> </w:t>
-            </w:r>
-            <w:r>
-              <w:rPr>
-                <w:rStyle w:val="affa"/>
-                <w:rFonts w:hint="eastAsia"/>
-                <w:noProof/>
-              </w:rPr>
-              <w:t>目錄</w:t>
-            </w:r>
-            <w:r>
-              <w:rPr>
-                <w:rStyle w:val="affa"/>
-                <w:noProof/>
-              </w:rPr>
-              <w:t xml:space="preserve"> (Table of Contents)</w:t>
-            </w:r>
-            <w:r>
-              <w:rPr>
-                <w:noProof/>
-                <w:webHidden/>
-              </w:rPr>
-              <w:tab/>
-            </w:r>
-            <w:r>
-              <w:rPr>
-                <w:noProof/>
-                <w:webHidden/>
-              </w:rPr>
-              <w:fldChar w:fldCharType="begin"/>
-            </w:r>
-            <w:r>
-              <w:rPr>
-                <w:noProof/>
-                <w:webHidden/>
-              </w:rPr>
-              <w:instrText xml:space="preserve"> PAGEREF _Toc236071426 \h </w:instrText>
-            </w:r>
-            <w:r>
-              <w:rPr>
-                <w:noProof/>
-                <w:webHidden/>
-              </w:rPr>
-            </w:r>
-            <w:r>
-              <w:rPr>
-                <w:noProof/>
-                <w:webHidden/>
-              </w:rPr>
-              <w:fldChar w:fldCharType="separate"/>
-            </w:r>
-            <w:r>
-              <w:rPr>
-                <w:noProof/>
-                <w:webHidden/>
-              </w:rPr>
-              <w:t>2</w:t>
-            </w:r>
-            <w:r>
-              <w:rPr>
-                <w:noProof/>
-                <w:webHidden/>
-              </w:rPr>
-              <w:fldChar w:fldCharType="end"/>
-            </w:r>
-          </w:hyperlink>
-        </w:p>
-        <w:p>
-          <w:pPr>
-            <w:pStyle w:val="14"/>
-            <w:tabs>
-              <w:tab w:val="right" w:leader="dot" w:pos="9350"/>
-            </w:tabs>
-            <w:rPr>
-              <w:noProof/>
-            </w:rPr>
-          </w:pPr>
-          <w:hyperlink w:anchor="_Toc236071427" w:history="1">
-            <w:r>
-              <w:rPr>
-                <w:rStyle w:val="affa"/>
-                <w:rFonts w:ascii="Segoe UI Emoji" w:hAnsi="Segoe UI Emoji" w:cs="Segoe UI Emoji"/>
-                <w:noProof/>
-              </w:rPr>
-              <w:t>📊</w:t>
-            </w:r>
-            <w:r>
-              <w:rPr>
-                <w:rStyle w:val="affa"/>
-                <w:noProof/>
-              </w:rPr>
-              <w:t xml:space="preserve"> </w:t>
-            </w:r>
-            <w:r>
-              <w:rPr>
-                <w:rStyle w:val="affa"/>
-                <w:rFonts w:hint="eastAsia"/>
-                <w:noProof/>
-              </w:rPr>
-              <w:t>表目錄</w:t>
-            </w:r>
-            <w:r>
-              <w:rPr>
-                <w:rStyle w:val="affa"/>
-                <w:noProof/>
-              </w:rPr>
-              <w:t xml:space="preserve"> (List of Tables)</w:t>
-            </w:r>
-            <w:r>
-              <w:rPr>
-                <w:noProof/>
-                <w:webHidden/>
-              </w:rPr>
-              <w:tab/>
-            </w:r>
-            <w:r>
-              <w:rPr>
-                <w:noProof/>
-                <w:webHidden/>
-              </w:rPr>
-              <w:fldChar w:fldCharType="begin"/>
-            </w:r>
-            <w:r>
-              <w:rPr>
-                <w:noProof/>
-                <w:webHidden/>
-              </w:rPr>
-              <w:instrText xml:space="preserve"> PAGEREF _Toc236071427 \h </w:instrText>
-            </w:r>
-            <w:r>
-              <w:rPr>
-                <w:noProof/>
-                <w:webHidden/>
-              </w:rPr>
-            </w:r>
-            <w:r>
-              <w:rPr>
-                <w:noProof/>
-                <w:webHidden/>
-              </w:rPr>
-              <w:fldChar w:fldCharType="separate"/>
-            </w:r>
-            <w:r>
-              <w:rPr>
-                <w:noProof/>
-                <w:webHidden/>
-              </w:rPr>
-              <w:t>3</w:t>
-            </w:r>
-            <w:r>
-              <w:rPr>
-                <w:noProof/>
-                <w:webHidden/>
-              </w:rPr>
-              <w:fldChar w:fldCharType="end"/>
-            </w:r>
-          </w:hyperlink>
-        </w:p>
-        <w:p>
-          <w:pPr>
-            <w:pStyle w:val="14"/>
-            <w:tabs>
-              <w:tab w:val="right" w:leader="dot" w:pos="9350"/>
-            </w:tabs>
-            <w:rPr>
-              <w:noProof/>
-            </w:rPr>
-          </w:pPr>
-          <w:hyperlink w:anchor="_Toc236071428" w:history="1">
-            <w:r>
-              <w:rPr>
-                <w:rStyle w:val="affa"/>
-                <w:rFonts w:ascii="Segoe UI Emoji" w:hAnsi="Segoe UI Emoji" w:cs="Segoe UI Emoji"/>
-                <w:noProof/>
-              </w:rPr>
-              <w:t>🖼️</w:t>
-            </w:r>
-            <w:r>
-              <w:rPr>
-                <w:rStyle w:val="affa"/>
-                <w:noProof/>
-              </w:rPr>
-              <w:t xml:space="preserve"> </w:t>
-            </w:r>
-            <w:r>
-              <w:rPr>
-                <w:rStyle w:val="affa"/>
-                <w:rFonts w:hint="eastAsia"/>
-                <w:noProof/>
-              </w:rPr>
-              <w:t>圖目錄</w:t>
-            </w:r>
-            <w:r>
-              <w:rPr>
-                <w:rStyle w:val="affa"/>
-                <w:noProof/>
-              </w:rPr>
-              <w:t xml:space="preserve"> (List of Figures)</w:t>
-            </w:r>
-            <w:r>
-              <w:rPr>
-                <w:noProof/>
-                <w:webHidden/>
-              </w:rPr>
-              <w:tab/>
-            </w:r>
-            <w:r>
-              <w:rPr>
-                <w:noProof/>
-                <w:webHidden/>
-              </w:rPr>
-              <w:fldChar w:fldCharType="begin"/>
-            </w:r>
-            <w:r>
-              <w:rPr>
-                <w:noProof/>
-                <w:webHidden/>
-              </w:rPr>
-              <w:instrText xml:space="preserve"> PAGEREF _Toc236071428 \h </w:instrText>
-            </w:r>
-            <w:r>
-              <w:rPr>
-                <w:noProof/>
-                <w:webHidden/>
-              </w:rPr>
-            </w:r>
-            <w:r>
-              <w:rPr>
-                <w:noProof/>
-                <w:webHidden/>
-              </w:rPr>
-              <w:fldChar w:fldCharType="separate"/>
-            </w:r>
-            <w:r>
-              <w:rPr>
-                <w:noProof/>
-                <w:webHidden/>
-              </w:rPr>
-              <w:t>4</w:t>
-            </w:r>
-            <w:r>
-              <w:rPr>
-                <w:noProof/>
-                <w:webHidden/>
-              </w:rPr>
-              <w:fldChar w:fldCharType="end"/>
-            </w:r>
-          </w:hyperlink>
-        </w:p>
-        <w:p>
-          <w:pPr>
-            <w:pStyle w:val="14"/>
-            <w:tabs>
-              <w:tab w:val="right" w:leader="dot" w:pos="9350"/>
-            </w:tabs>
-            <w:rPr>
-              <w:noProof/>
-            </w:rPr>
-          </w:pPr>
-          <w:hyperlink w:anchor="_Toc236071429" w:history="1">
-            <w:r>
-              <w:rPr>
-                <w:rStyle w:val="affa"/>
-                <w:rFonts w:hint="eastAsia"/>
-                <w:noProof/>
-              </w:rPr>
-              <w:t>第一章</w:t>
-            </w:r>
-            <w:r>
-              <w:rPr>
-                <w:rStyle w:val="affa"/>
-                <w:noProof/>
-              </w:rPr>
-              <w:t xml:space="preserve"> </w:t>
-            </w:r>
-            <w:r>
-              <w:rPr>
-                <w:rStyle w:val="affa"/>
-                <w:rFonts w:hint="eastAsia"/>
-                <w:noProof/>
-              </w:rPr>
-              <w:t>前言：國防</w:t>
-            </w:r>
-            <w:r>
-              <w:rPr>
-                <w:rStyle w:val="affa"/>
-                <w:noProof/>
-              </w:rPr>
-              <w:t xml:space="preserve"> AI </w:t>
-            </w:r>
-            <w:r>
-              <w:rPr>
-                <w:rStyle w:val="affa"/>
-                <w:rFonts w:hint="eastAsia"/>
-                <w:noProof/>
-              </w:rPr>
-              <w:t>應用的戰略急迫性與發展理念</w:t>
-            </w:r>
-            <w:r>
-              <w:rPr>
-                <w:noProof/>
-                <w:webHidden/>
-              </w:rPr>
-              <w:tab/>
-            </w:r>
-            <w:r>
-              <w:rPr>
-                <w:noProof/>
-                <w:webHidden/>
-              </w:rPr>
-              <w:fldChar w:fldCharType="begin"/>
-            </w:r>
-            <w:r>
-              <w:rPr>
-                <w:noProof/>
-                <w:webHidden/>
-              </w:rPr>
-              <w:instrText xml:space="preserve"> PAGEREF _Toc236071429 \h </w:instrText>
-            </w:r>
-            <w:r>
-              <w:rPr>
-                <w:noProof/>
-                <w:webHidden/>
-              </w:rPr>
-            </w:r>
-            <w:r>
-              <w:rPr>
-                <w:noProof/>
-                <w:webHidden/>
-              </w:rPr>
-              <w:fldChar w:fldCharType="separate"/>
-            </w:r>
-            <w:r>
-              <w:rPr>
-                <w:noProof/>
-                <w:webHidden/>
-              </w:rPr>
-              <w:t>5</w:t>
-            </w:r>
-            <w:r>
-              <w:rPr>
-                <w:noProof/>
-                <w:webHidden/>
-              </w:rPr>
-              <w:fldChar w:fldCharType="end"/>
-            </w:r>
-          </w:hyperlink>
-        </w:p>
-        <w:p>
-          <w:pPr>
-            <w:pStyle w:val="2a"/>
-            <w:tabs>
-              <w:tab w:val="right" w:leader="dot" w:pos="9350"/>
-            </w:tabs>
-            <w:ind w:left="560"/>
-            <w:rPr>
-              <w:noProof/>
-            </w:rPr>
-          </w:pPr>
-          <w:hyperlink w:anchor="_Toc236071430" w:history="1">
-            <w:r>
-              <w:rPr>
-                <w:rStyle w:val="affa"/>
-                <w:noProof/>
-              </w:rPr>
-              <w:t xml:space="preserve">1.1 AI </w:t>
-            </w:r>
-            <w:r>
-              <w:rPr>
-                <w:rStyle w:val="affa"/>
-                <w:rFonts w:hint="eastAsia"/>
-                <w:noProof/>
-              </w:rPr>
-              <w:t>於國防領域應用的必要性與急迫性</w:t>
-            </w:r>
-            <w:r>
-              <w:rPr>
-                <w:noProof/>
-                <w:webHidden/>
-              </w:rPr>
-              <w:tab/>
-            </w:r>
-            <w:r>
-              <w:rPr>
-                <w:noProof/>
-                <w:webHidden/>
-              </w:rPr>
-              <w:fldChar w:fldCharType="begin"/>
-            </w:r>
-            <w:r>
-              <w:rPr>
-                <w:noProof/>
-                <w:webHidden/>
-              </w:rPr>
-              <w:instrText xml:space="preserve"> PAGEREF _Toc236071430 \h </w:instrText>
-            </w:r>
-            <w:r>
-              <w:rPr>
-                <w:noProof/>
-                <w:webHidden/>
-              </w:rPr>
-            </w:r>
-            <w:r>
-              <w:rPr>
-                <w:noProof/>
-                <w:webHidden/>
-              </w:rPr>
-              <w:fldChar w:fldCharType="separate"/>
-            </w:r>
-            <w:r>
-              <w:rPr>
-                <w:noProof/>
-                <w:webHidden/>
-              </w:rPr>
-              <w:t>5</w:t>
-            </w:r>
-            <w:r>
-              <w:rPr>
-                <w:noProof/>
-                <w:webHidden/>
-              </w:rPr>
-              <w:fldChar w:fldCharType="end"/>
-            </w:r>
-          </w:hyperlink>
-        </w:p>
-        <w:p>
-          <w:pPr>
-            <w:pStyle w:val="2a"/>
-            <w:tabs>
-              <w:tab w:val="right" w:leader="dot" w:pos="9350"/>
-            </w:tabs>
-            <w:ind w:left="560"/>
-            <w:rPr>
-              <w:noProof/>
-            </w:rPr>
-          </w:pPr>
-          <w:hyperlink w:anchor="_Toc236071431" w:history="1">
-            <w:r>
-              <w:rPr>
-                <w:rStyle w:val="affa"/>
-                <w:noProof/>
-              </w:rPr>
-              <w:t xml:space="preserve">1.2 </w:t>
-            </w:r>
-            <w:r>
-              <w:rPr>
-                <w:rStyle w:val="affa"/>
-                <w:rFonts w:hint="eastAsia"/>
-                <w:noProof/>
-              </w:rPr>
-              <w:t>美國國防部</w:t>
-            </w:r>
-            <w:r>
-              <w:rPr>
-                <w:rStyle w:val="affa"/>
-                <w:noProof/>
-              </w:rPr>
-              <w:t xml:space="preserve"> (DoD) AI First </w:t>
-            </w:r>
-            <w:r>
-              <w:rPr>
-                <w:rStyle w:val="affa"/>
-                <w:rFonts w:hint="eastAsia"/>
-                <w:noProof/>
-              </w:rPr>
-              <w:t>政策理念與經驗啟示</w:t>
-            </w:r>
-            <w:r>
-              <w:rPr>
-                <w:noProof/>
-                <w:webHidden/>
-              </w:rPr>
-              <w:tab/>
-            </w:r>
-            <w:r>
-              <w:rPr>
-                <w:noProof/>
-                <w:webHidden/>
-              </w:rPr>
-              <w:fldChar w:fldCharType="begin"/>
-            </w:r>
-            <w:r>
-              <w:rPr>
-                <w:noProof/>
-                <w:webHidden/>
-              </w:rPr>
-              <w:instrText xml:space="preserve"> PAGEREF _Toc236071431 \h </w:instrText>
-            </w:r>
-            <w:r>
-              <w:rPr>
-                <w:noProof/>
-                <w:webHidden/>
-              </w:rPr>
-            </w:r>
-            <w:r>
-              <w:rPr>
-                <w:noProof/>
-                <w:webHidden/>
-              </w:rPr>
-              <w:fldChar w:fldCharType="separate"/>
-            </w:r>
-            <w:r>
-              <w:rPr>
-                <w:noProof/>
-                <w:webHidden/>
-              </w:rPr>
-              <w:t>5</w:t>
-            </w:r>
-            <w:r>
-              <w:rPr>
-                <w:noProof/>
-                <w:webHidden/>
-              </w:rPr>
-              <w:fldChar w:fldCharType="end"/>
-            </w:r>
-          </w:hyperlink>
-        </w:p>
-        <w:p>
-          <w:pPr>
-            <w:pStyle w:val="2a"/>
-            <w:tabs>
-              <w:tab w:val="right" w:leader="dot" w:pos="9350"/>
-            </w:tabs>
-            <w:ind w:left="560"/>
-            <w:rPr>
-              <w:noProof/>
-            </w:rPr>
-          </w:pPr>
-          <w:hyperlink w:anchor="_Toc236071432" w:history="1">
-            <w:r>
-              <w:rPr>
-                <w:rStyle w:val="affa"/>
-                <w:noProof/>
-              </w:rPr>
-              <w:t xml:space="preserve">1.3 </w:t>
-            </w:r>
-            <w:r>
-              <w:rPr>
-                <w:rStyle w:val="affa"/>
-                <w:rFonts w:hint="eastAsia"/>
-                <w:noProof/>
-              </w:rPr>
-              <w:t>台灣面對中國威脅與非對稱作戰</w:t>
-            </w:r>
-            <w:r>
-              <w:rPr>
-                <w:rStyle w:val="affa"/>
-                <w:noProof/>
-              </w:rPr>
-              <w:t xml:space="preserve"> (Asymmetric Warfare) </w:t>
-            </w:r>
-            <w:r>
-              <w:rPr>
-                <w:rStyle w:val="affa"/>
-                <w:rFonts w:hint="eastAsia"/>
-                <w:noProof/>
-              </w:rPr>
-              <w:t>態勢</w:t>
-            </w:r>
-            <w:r>
-              <w:rPr>
-                <w:noProof/>
-                <w:webHidden/>
-              </w:rPr>
-              <w:tab/>
-            </w:r>
-            <w:r>
-              <w:rPr>
-                <w:noProof/>
-                <w:webHidden/>
-              </w:rPr>
-              <w:fldChar w:fldCharType="begin"/>
-            </w:r>
-            <w:r>
-              <w:rPr>
-                <w:noProof/>
-                <w:webHidden/>
-              </w:rPr>
-              <w:instrText xml:space="preserve"> PAGEREF _Toc236071432 \h </w:instrText>
-            </w:r>
-            <w:r>
-              <w:rPr>
-                <w:noProof/>
-                <w:webHidden/>
-              </w:rPr>
-            </w:r>
-            <w:r>
-              <w:rPr>
-                <w:noProof/>
-                <w:webHidden/>
-              </w:rPr>
-              <w:fldChar w:fldCharType="separate"/>
-            </w:r>
-            <w:r>
-              <w:rPr>
-                <w:noProof/>
-                <w:webHidden/>
-              </w:rPr>
-              <w:t>5</w:t>
-            </w:r>
-            <w:r>
-              <w:rPr>
-                <w:noProof/>
-                <w:webHidden/>
-              </w:rPr>
-              <w:fldChar w:fldCharType="end"/>
-            </w:r>
-          </w:hyperlink>
-        </w:p>
-        <w:p>
-          <w:pPr>
-            <w:pStyle w:val="2a"/>
-            <w:tabs>
-              <w:tab w:val="right" w:leader="dot" w:pos="9350"/>
-            </w:tabs>
-            <w:ind w:left="560"/>
-            <w:rPr>
-              <w:noProof/>
-            </w:rPr>
-          </w:pPr>
-          <w:hyperlink w:anchor="_Toc236071433" w:history="1">
-            <w:r>
-              <w:rPr>
-                <w:rStyle w:val="affa"/>
-                <w:noProof/>
-              </w:rPr>
-              <w:t xml:space="preserve">1.4 </w:t>
-            </w:r>
-            <w:r>
-              <w:rPr>
-                <w:rStyle w:val="affa"/>
-                <w:rFonts w:hint="eastAsia"/>
-                <w:noProof/>
-              </w:rPr>
-              <w:t>無人化打擊載具應用：無人機、無人船、無人潛艦、無人車與機器狗</w:t>
-            </w:r>
-            <w:r>
-              <w:rPr>
-                <w:noProof/>
-                <w:webHidden/>
-              </w:rPr>
-              <w:tab/>
-            </w:r>
-            <w:r>
-              <w:rPr>
-                <w:noProof/>
-                <w:webHidden/>
-              </w:rPr>
-              <w:fldChar w:fldCharType="begin"/>
-            </w:r>
-            <w:r>
-              <w:rPr>
-                <w:noProof/>
-                <w:webHidden/>
-              </w:rPr>
-              <w:instrText xml:space="preserve"> PAGEREF _Toc236071433 \h </w:instrText>
-            </w:r>
-            <w:r>
-              <w:rPr>
-                <w:noProof/>
-                <w:webHidden/>
-              </w:rPr>
-            </w:r>
-            <w:r>
-              <w:rPr>
-                <w:noProof/>
-                <w:webHidden/>
-              </w:rPr>
-              <w:fldChar w:fldCharType="separate"/>
-            </w:r>
-            <w:r>
-              <w:rPr>
-                <w:noProof/>
-                <w:webHidden/>
-              </w:rPr>
-              <w:t>6</w:t>
-            </w:r>
-            <w:r>
-              <w:rPr>
-                <w:noProof/>
-                <w:webHidden/>
-              </w:rPr>
-              <w:fldChar w:fldCharType="end"/>
-            </w:r>
-          </w:hyperlink>
-        </w:p>
-        <w:p>
-          <w:pPr>
-            <w:pStyle w:val="2a"/>
-            <w:tabs>
-              <w:tab w:val="right" w:leader="dot" w:pos="9350"/>
-            </w:tabs>
-            <w:ind w:left="560"/>
-            <w:rPr>
-              <w:noProof/>
-            </w:rPr>
-          </w:pPr>
-          <w:hyperlink w:anchor="_Toc236071434" w:history="1">
-            <w:r>
-              <w:rPr>
-                <w:rStyle w:val="affa"/>
-                <w:noProof/>
-              </w:rPr>
-              <w:t xml:space="preserve">1.5 </w:t>
-            </w:r>
-            <w:r>
-              <w:rPr>
-                <w:rStyle w:val="affa"/>
-                <w:rFonts w:hint="eastAsia"/>
-                <w:noProof/>
-              </w:rPr>
-              <w:t>實現「可靠、可信任、可解釋、可當責」之國防</w:t>
-            </w:r>
-            <w:r>
-              <w:rPr>
-                <w:rStyle w:val="affa"/>
-                <w:noProof/>
-              </w:rPr>
-              <w:t xml:space="preserve"> AI</w:t>
-            </w:r>
-            <w:r>
-              <w:rPr>
-                <w:noProof/>
-                <w:webHidden/>
-              </w:rPr>
-              <w:tab/>
-            </w:r>
-            <w:r>
-              <w:rPr>
-                <w:noProof/>
-                <w:webHidden/>
-              </w:rPr>
-              <w:fldChar w:fldCharType="begin"/>
-            </w:r>
-            <w:r>
-              <w:rPr>
-                <w:noProof/>
-                <w:webHidden/>
-              </w:rPr>
-              <w:instrText xml:space="preserve"> PAGEREF _Toc236071434 \h </w:instrText>
-            </w:r>
-            <w:r>
-              <w:rPr>
-                <w:noProof/>
-                <w:webHidden/>
-              </w:rPr>
-            </w:r>
-            <w:r>
-              <w:rPr>
-                <w:noProof/>
-                <w:webHidden/>
-              </w:rPr>
-              <w:fldChar w:fldCharType="separate"/>
-            </w:r>
-            <w:r>
-              <w:rPr>
-                <w:noProof/>
-                <w:webHidden/>
-              </w:rPr>
-              <w:t>7</w:t>
-            </w:r>
-            <w:r>
-              <w:rPr>
-                <w:noProof/>
-                <w:webHidden/>
-              </w:rPr>
-              <w:fldChar w:fldCharType="end"/>
-            </w:r>
-          </w:hyperlink>
-        </w:p>
-        <w:p>
-          <w:pPr>
-            <w:pStyle w:val="2a"/>
-            <w:tabs>
-              <w:tab w:val="right" w:leader="dot" w:pos="9350"/>
-            </w:tabs>
-            <w:ind w:left="560"/>
-            <w:rPr>
-              <w:noProof/>
-            </w:rPr>
-          </w:pPr>
-          <w:hyperlink w:anchor="_Toc236071435" w:history="1">
-            <w:r>
-              <w:rPr>
-                <w:rStyle w:val="affa"/>
-                <w:noProof/>
-              </w:rPr>
-              <w:t xml:space="preserve">1.6 </w:t>
-            </w:r>
-            <w:r>
-              <w:rPr>
-                <w:rStyle w:val="affa"/>
-                <w:rFonts w:hint="eastAsia"/>
-                <w:noProof/>
-              </w:rPr>
-              <w:t>適合台灣本土環境落地方案：為什麼要做、如何做、怎麼樣做</w:t>
-            </w:r>
-            <w:r>
-              <w:rPr>
-                <w:noProof/>
-                <w:webHidden/>
-              </w:rPr>
-              <w:tab/>
-            </w:r>
-            <w:r>
-              <w:rPr>
-                <w:noProof/>
-                <w:webHidden/>
-              </w:rPr>
-              <w:fldChar w:fldCharType="begin"/>
-            </w:r>
-            <w:r>
-              <w:rPr>
-                <w:noProof/>
-                <w:webHidden/>
-              </w:rPr>
-              <w:instrText xml:space="preserve"> PAGEREF _Toc236071435 \h </w:instrText>
-            </w:r>
-            <w:r>
-              <w:rPr>
-                <w:noProof/>
-                <w:webHidden/>
-              </w:rPr>
-            </w:r>
-            <w:r>
-              <w:rPr>
-                <w:noProof/>
-                <w:webHidden/>
-              </w:rPr>
-              <w:fldChar w:fldCharType="separate"/>
-            </w:r>
-            <w:r>
-              <w:rPr>
-                <w:noProof/>
-                <w:webHidden/>
-              </w:rPr>
-              <w:t>7</w:t>
-            </w:r>
-            <w:r>
-              <w:rPr>
-                <w:noProof/>
-                <w:webHidden/>
-              </w:rPr>
-              <w:fldChar w:fldCharType="end"/>
-            </w:r>
-          </w:hyperlink>
-        </w:p>
-        <w:p>
-          <w:pPr>
-            <w:pStyle w:val="14"/>
-            <w:tabs>
-              <w:tab w:val="right" w:leader="dot" w:pos="9350"/>
-            </w:tabs>
-            <w:rPr>
-              <w:noProof/>
-            </w:rPr>
-          </w:pPr>
-          <w:hyperlink w:anchor="_Toc236071436" w:history="1">
-            <w:r>
-              <w:rPr>
-                <w:rStyle w:val="affa"/>
-                <w:rFonts w:hint="eastAsia"/>
-                <w:noProof/>
-              </w:rPr>
-              <w:t>第二章</w:t>
-            </w:r>
-            <w:r>
-              <w:rPr>
-                <w:rStyle w:val="affa"/>
-                <w:noProof/>
-              </w:rPr>
-              <w:t xml:space="preserve"> </w:t>
-            </w:r>
-            <w:r>
-              <w:rPr>
-                <w:rStyle w:val="affa"/>
-                <w:rFonts w:hint="eastAsia"/>
-                <w:noProof/>
-              </w:rPr>
-              <w:t>專案執行範圍與三大核心區塊架構</w:t>
-            </w:r>
-            <w:r>
-              <w:rPr>
-                <w:noProof/>
-                <w:webHidden/>
-              </w:rPr>
-              <w:tab/>
-            </w:r>
-            <w:r>
-              <w:rPr>
-                <w:noProof/>
-                <w:webHidden/>
-              </w:rPr>
-              <w:fldChar w:fldCharType="begin"/>
-            </w:r>
-            <w:r>
-              <w:rPr>
-                <w:noProof/>
-                <w:webHidden/>
-              </w:rPr>
-              <w:instrText xml:space="preserve"> PAGEREF _Toc236071436 \h </w:instrText>
-            </w:r>
-            <w:r>
-              <w:rPr>
-                <w:noProof/>
-                <w:webHidden/>
-              </w:rPr>
-            </w:r>
-            <w:r>
-              <w:rPr>
-                <w:noProof/>
-                <w:webHidden/>
-              </w:rPr>
-              <w:fldChar w:fldCharType="separate"/>
-            </w:r>
-            <w:r>
-              <w:rPr>
-                <w:noProof/>
-                <w:webHidden/>
-              </w:rPr>
-              <w:t>9</w:t>
-            </w:r>
-            <w:r>
-              <w:rPr>
-                <w:noProof/>
-                <w:webHidden/>
-              </w:rPr>
-              <w:fldChar w:fldCharType="end"/>
-            </w:r>
-          </w:hyperlink>
-        </w:p>
-        <w:p>
-          <w:pPr>
-            <w:pStyle w:val="2a"/>
-            <w:tabs>
-              <w:tab w:val="right" w:leader="dot" w:pos="9350"/>
-            </w:tabs>
-            <w:ind w:left="560"/>
-            <w:rPr>
-              <w:noProof/>
-            </w:rPr>
-          </w:pPr>
-          <w:hyperlink w:anchor="_Toc236071437" w:history="1">
-            <w:r>
-              <w:rPr>
-                <w:rStyle w:val="affa"/>
-                <w:noProof/>
-              </w:rPr>
-              <w:t xml:space="preserve">2.1 </w:t>
-            </w:r>
-            <w:r>
-              <w:rPr>
-                <w:rStyle w:val="affa"/>
-                <w:rFonts w:hint="eastAsia"/>
-                <w:noProof/>
-              </w:rPr>
-              <w:t>第一部分：治理與標準</w:t>
-            </w:r>
-            <w:r>
-              <w:rPr>
-                <w:rStyle w:val="affa"/>
-                <w:noProof/>
-              </w:rPr>
-              <w:t xml:space="preserve"> (Governance &amp; Standards)</w:t>
-            </w:r>
-            <w:r>
-              <w:rPr>
-                <w:noProof/>
-                <w:webHidden/>
-              </w:rPr>
-              <w:tab/>
-            </w:r>
-            <w:r>
-              <w:rPr>
-                <w:noProof/>
-                <w:webHidden/>
-              </w:rPr>
-              <w:fldChar w:fldCharType="begin"/>
-            </w:r>
-            <w:r>
-              <w:rPr>
-                <w:noProof/>
-                <w:webHidden/>
-              </w:rPr>
-              <w:instrText xml:space="preserve"> PAGEREF _Toc236071437 \h </w:instrText>
-            </w:r>
-            <w:r>
-              <w:rPr>
-                <w:noProof/>
-                <w:webHidden/>
-              </w:rPr>
-            </w:r>
-            <w:r>
-              <w:rPr>
-                <w:noProof/>
-                <w:webHidden/>
-              </w:rPr>
-              <w:fldChar w:fldCharType="separate"/>
-            </w:r>
-            <w:r>
-              <w:rPr>
-                <w:noProof/>
-                <w:webHidden/>
-              </w:rPr>
-              <w:t>9</w:t>
-            </w:r>
-            <w:r>
-              <w:rPr>
-                <w:noProof/>
-                <w:webHidden/>
-              </w:rPr>
-              <w:fldChar w:fldCharType="end"/>
-            </w:r>
-          </w:hyperlink>
-        </w:p>
-        <w:p>
-          <w:pPr>
-            <w:pStyle w:val="2a"/>
-            <w:tabs>
-              <w:tab w:val="right" w:leader="dot" w:pos="9350"/>
-            </w:tabs>
-            <w:ind w:left="560"/>
-            <w:rPr>
-              <w:noProof/>
-            </w:rPr>
-          </w:pPr>
-          <w:hyperlink w:anchor="_Toc236071438" w:history="1">
-            <w:r>
-              <w:rPr>
-                <w:rStyle w:val="affa"/>
-                <w:noProof/>
-              </w:rPr>
-              <w:t xml:space="preserve">2.2 </w:t>
-            </w:r>
-            <w:r>
-              <w:rPr>
-                <w:rStyle w:val="affa"/>
-                <w:rFonts w:hint="eastAsia"/>
-                <w:noProof/>
-              </w:rPr>
-              <w:t>第二部分：矩陣與架構</w:t>
-            </w:r>
-            <w:r>
-              <w:rPr>
-                <w:rStyle w:val="affa"/>
-                <w:noProof/>
-              </w:rPr>
-              <w:t xml:space="preserve"> (Matrix &amp; Architecture)</w:t>
-            </w:r>
-            <w:r>
-              <w:rPr>
-                <w:noProof/>
-                <w:webHidden/>
-              </w:rPr>
-              <w:tab/>
-            </w:r>
-            <w:r>
-              <w:rPr>
-                <w:noProof/>
-                <w:webHidden/>
-              </w:rPr>
-              <w:fldChar w:fldCharType="begin"/>
-            </w:r>
-            <w:r>
-              <w:rPr>
-                <w:noProof/>
-                <w:webHidden/>
-              </w:rPr>
-              <w:instrText xml:space="preserve"> PAGEREF _Toc236071438 \h </w:instrText>
-            </w:r>
-            <w:r>
-              <w:rPr>
-                <w:noProof/>
-                <w:webHidden/>
-              </w:rPr>
-            </w:r>
-            <w:r>
-              <w:rPr>
-                <w:noProof/>
-                <w:webHidden/>
-              </w:rPr>
-              <w:fldChar w:fldCharType="separate"/>
-            </w:r>
-            <w:r>
-              <w:rPr>
-                <w:noProof/>
-                <w:webHidden/>
-              </w:rPr>
-              <w:t>10</w:t>
-            </w:r>
-            <w:r>
-              <w:rPr>
-                <w:noProof/>
-                <w:webHidden/>
-              </w:rPr>
-              <w:fldChar w:fldCharType="end"/>
-            </w:r>
-          </w:hyperlink>
-        </w:p>
-        <w:p>
-          <w:pPr>
-            <w:pStyle w:val="2a"/>
-            <w:tabs>
-              <w:tab w:val="right" w:leader="dot" w:pos="9350"/>
-            </w:tabs>
-            <w:ind w:left="560"/>
-            <w:rPr>
-              <w:noProof/>
-            </w:rPr>
-          </w:pPr>
-          <w:hyperlink w:anchor="_Toc236071439" w:history="1">
-            <w:r>
-              <w:rPr>
-                <w:rStyle w:val="affa"/>
-                <w:noProof/>
-              </w:rPr>
-              <w:t xml:space="preserve">2.3 </w:t>
-            </w:r>
-            <w:r>
-              <w:rPr>
-                <w:rStyle w:val="affa"/>
-                <w:rFonts w:hint="eastAsia"/>
-                <w:noProof/>
-              </w:rPr>
-              <w:t>第三部分：應用系統與驗測</w:t>
-            </w:r>
-            <w:r>
-              <w:rPr>
-                <w:rStyle w:val="affa"/>
-                <w:noProof/>
-              </w:rPr>
-              <w:t xml:space="preserve"> SOP (Application Systems &amp; SOPs)</w:t>
-            </w:r>
-            <w:r>
-              <w:rPr>
-                <w:noProof/>
-                <w:webHidden/>
-              </w:rPr>
-              <w:tab/>
-            </w:r>
-            <w:r>
-              <w:rPr>
-                <w:noProof/>
-                <w:webHidden/>
-              </w:rPr>
-              <w:fldChar w:fldCharType="begin"/>
-            </w:r>
-            <w:r>
-              <w:rPr>
-                <w:noProof/>
-                <w:webHidden/>
-              </w:rPr>
-              <w:instrText xml:space="preserve"> PAGEREF _Toc236071439 \h </w:instrText>
-            </w:r>
-            <w:r>
-              <w:rPr>
-                <w:noProof/>
-                <w:webHidden/>
-              </w:rPr>
-            </w:r>
-            <w:r>
-              <w:rPr>
-                <w:noProof/>
-                <w:webHidden/>
-              </w:rPr>
-              <w:fldChar w:fldCharType="separate"/>
-            </w:r>
-            <w:r>
-              <w:rPr>
-                <w:noProof/>
-                <w:webHidden/>
-              </w:rPr>
-              <w:t>12</w:t>
-            </w:r>
-            <w:r>
-              <w:rPr>
-                <w:noProof/>
-                <w:webHidden/>
-              </w:rPr>
-              <w:fldChar w:fldCharType="end"/>
-            </w:r>
-          </w:hyperlink>
-        </w:p>
-        <w:p>
-          <w:pPr>
-            <w:pStyle w:val="14"/>
-            <w:tabs>
-              <w:tab w:val="right" w:leader="dot" w:pos="9350"/>
-            </w:tabs>
-            <w:rPr>
-              <w:noProof/>
-            </w:rPr>
-          </w:pPr>
-          <w:hyperlink w:anchor="_Toc236071440" w:history="1">
-            <w:r>
-              <w:rPr>
-                <w:rStyle w:val="affa"/>
-                <w:rFonts w:hint="eastAsia"/>
-                <w:noProof/>
-              </w:rPr>
-              <w:t>第三章</w:t>
-            </w:r>
-            <w:r>
-              <w:rPr>
-                <w:rStyle w:val="affa"/>
-                <w:noProof/>
-              </w:rPr>
-              <w:t xml:space="preserve"> </w:t>
-            </w:r>
-            <w:r>
-              <w:rPr>
-                <w:rStyle w:val="affa"/>
-                <w:rFonts w:hint="eastAsia"/>
-                <w:noProof/>
-              </w:rPr>
-              <w:t>階段性任務與</w:t>
-            </w:r>
-            <w:r>
-              <w:rPr>
-                <w:rStyle w:val="affa"/>
-                <w:noProof/>
-              </w:rPr>
-              <w:t xml:space="preserve"> 24 </w:t>
-            </w:r>
-            <w:r>
-              <w:rPr>
-                <w:rStyle w:val="affa"/>
-                <w:rFonts w:hint="eastAsia"/>
-                <w:noProof/>
-              </w:rPr>
-              <w:t>個月時程規劃</w:t>
-            </w:r>
-            <w:r>
-              <w:rPr>
-                <w:noProof/>
-                <w:webHidden/>
-              </w:rPr>
-              <w:tab/>
-            </w:r>
-            <w:r>
-              <w:rPr>
-                <w:noProof/>
-                <w:webHidden/>
-              </w:rPr>
-              <w:fldChar w:fldCharType="begin"/>
-            </w:r>
-            <w:r>
-              <w:rPr>
-                <w:noProof/>
-                <w:webHidden/>
-              </w:rPr>
-              <w:instrText xml:space="preserve"> PAGEREF _Toc236071440 \h </w:instrText>
-            </w:r>
-            <w:r>
-              <w:rPr>
-                <w:noProof/>
-                <w:webHidden/>
-              </w:rPr>
-            </w:r>
-            <w:r>
-              <w:rPr>
-                <w:noProof/>
-                <w:webHidden/>
-              </w:rPr>
-              <w:fldChar w:fldCharType="separate"/>
-            </w:r>
-            <w:r>
-              <w:rPr>
-                <w:noProof/>
-                <w:webHidden/>
-              </w:rPr>
-              <w:t>14</w:t>
-            </w:r>
-            <w:r>
-              <w:rPr>
-                <w:noProof/>
-                <w:webHidden/>
-              </w:rPr>
-              <w:fldChar w:fldCharType="end"/>
-            </w:r>
-          </w:hyperlink>
-        </w:p>
-        <w:p>
-          <w:pPr>
-            <w:pStyle w:val="2a"/>
-            <w:tabs>
-              <w:tab w:val="right" w:leader="dot" w:pos="9350"/>
-            </w:tabs>
-            <w:ind w:left="560"/>
-            <w:rPr>
-              <w:noProof/>
-            </w:rPr>
-          </w:pPr>
-          <w:hyperlink w:anchor="_Toc236071441" w:history="1">
-            <w:r>
-              <w:rPr>
-                <w:rStyle w:val="affa"/>
-                <w:noProof/>
-              </w:rPr>
-              <w:t xml:space="preserve">3.1 </w:t>
-            </w:r>
-            <w:r>
-              <w:rPr>
-                <w:rStyle w:val="affa"/>
-                <w:rFonts w:hint="eastAsia"/>
-                <w:noProof/>
-              </w:rPr>
-              <w:t>四大階段任務與發展里程碑</w:t>
-            </w:r>
-            <w:r>
-              <w:rPr>
-                <w:rStyle w:val="affa"/>
-                <w:noProof/>
-              </w:rPr>
-              <w:t xml:space="preserve"> (Milestones)</w:t>
-            </w:r>
-            <w:r>
-              <w:rPr>
-                <w:noProof/>
-                <w:webHidden/>
-              </w:rPr>
-              <w:tab/>
-            </w:r>
-            <w:r>
-              <w:rPr>
-                <w:noProof/>
-                <w:webHidden/>
-              </w:rPr>
-              <w:fldChar w:fldCharType="begin"/>
-            </w:r>
-            <w:r>
-              <w:rPr>
-                <w:noProof/>
-                <w:webHidden/>
-              </w:rPr>
-              <w:instrText xml:space="preserve"> PAGEREF _Toc236071441 \h </w:instrText>
-            </w:r>
-            <w:r>
-              <w:rPr>
-                <w:noProof/>
-                <w:webHidden/>
-              </w:rPr>
-            </w:r>
-            <w:r>
-              <w:rPr>
-                <w:noProof/>
-                <w:webHidden/>
-              </w:rPr>
-              <w:fldChar w:fldCharType="separate"/>
-            </w:r>
-            <w:r>
-              <w:rPr>
-                <w:noProof/>
-                <w:webHidden/>
-              </w:rPr>
-              <w:t>14</w:t>
-            </w:r>
-            <w:r>
-              <w:rPr>
-                <w:noProof/>
-                <w:webHidden/>
-              </w:rPr>
-              <w:fldChar w:fldCharType="end"/>
-            </w:r>
-          </w:hyperlink>
-        </w:p>
-        <w:p>
-          <w:pPr>
-            <w:pStyle w:val="2a"/>
-            <w:tabs>
-              <w:tab w:val="right" w:leader="dot" w:pos="9350"/>
-            </w:tabs>
-            <w:ind w:left="560"/>
-            <w:rPr>
-              <w:noProof/>
-            </w:rPr>
-          </w:pPr>
-          <w:hyperlink w:anchor="_Toc236071442" w:history="1">
-            <w:r>
-              <w:rPr>
-                <w:rStyle w:val="affa"/>
-                <w:noProof/>
-              </w:rPr>
-              <w:t xml:space="preserve">3.2 24 </w:t>
-            </w:r>
-            <w:r>
-              <w:rPr>
-                <w:rStyle w:val="affa"/>
-                <w:rFonts w:hint="eastAsia"/>
-                <w:noProof/>
-              </w:rPr>
-              <w:t>個月專案時程對照表</w:t>
-            </w:r>
-            <w:r>
-              <w:rPr>
-                <w:rStyle w:val="affa"/>
-                <w:noProof/>
-              </w:rPr>
-              <w:t xml:space="preserve"> (Gantt Schedule)</w:t>
-            </w:r>
-            <w:r>
-              <w:rPr>
-                <w:noProof/>
-                <w:webHidden/>
-              </w:rPr>
-              <w:tab/>
-            </w:r>
-            <w:r>
-              <w:rPr>
-                <w:noProof/>
-                <w:webHidden/>
-              </w:rPr>
-              <w:fldChar w:fldCharType="begin"/>
-            </w:r>
-            <w:r>
-              <w:rPr>
-                <w:noProof/>
-                <w:webHidden/>
-              </w:rPr>
-              <w:instrText xml:space="preserve"> PAGEREF _Toc236071442 \h </w:instrText>
-            </w:r>
-            <w:r>
-              <w:rPr>
-                <w:noProof/>
-                <w:webHidden/>
-              </w:rPr>
-            </w:r>
-            <w:r>
-              <w:rPr>
-                <w:noProof/>
-                <w:webHidden/>
-              </w:rPr>
-              <w:fldChar w:fldCharType="separate"/>
-            </w:r>
-            <w:r>
-              <w:rPr>
-                <w:noProof/>
-                <w:webHidden/>
-              </w:rPr>
-              <w:t>14</w:t>
-            </w:r>
-            <w:r>
-              <w:rPr>
-                <w:noProof/>
-                <w:webHidden/>
-              </w:rPr>
-              <w:fldChar w:fldCharType="end"/>
-            </w:r>
-          </w:hyperlink>
-        </w:p>
-        <w:p>
-          <w:pPr>
-            <w:pStyle w:val="14"/>
-            <w:tabs>
-              <w:tab w:val="right" w:leader="dot" w:pos="9350"/>
-            </w:tabs>
-            <w:rPr>
-              <w:noProof/>
-            </w:rPr>
-          </w:pPr>
-          <w:hyperlink w:anchor="_Toc236071443" w:history="1">
-            <w:r>
-              <w:rPr>
-                <w:rStyle w:val="affa"/>
-                <w:rFonts w:hint="eastAsia"/>
-                <w:noProof/>
-              </w:rPr>
-              <w:t>第四章</w:t>
-            </w:r>
-            <w:r>
-              <w:rPr>
-                <w:rStyle w:val="affa"/>
-                <w:noProof/>
-              </w:rPr>
-              <w:t xml:space="preserve"> </w:t>
-            </w:r>
-            <w:r>
-              <w:rPr>
-                <w:rStyle w:val="affa"/>
-                <w:rFonts w:hint="eastAsia"/>
-                <w:noProof/>
-              </w:rPr>
-              <w:t>資源配置與專案風險管理</w:t>
-            </w:r>
-            <w:r>
-              <w:rPr>
-                <w:noProof/>
-                <w:webHidden/>
-              </w:rPr>
-              <w:tab/>
-            </w:r>
-            <w:r>
-              <w:rPr>
-                <w:noProof/>
-                <w:webHidden/>
-              </w:rPr>
-              <w:fldChar w:fldCharType="begin"/>
-            </w:r>
-            <w:r>
-              <w:rPr>
-                <w:noProof/>
-                <w:webHidden/>
-              </w:rPr>
-              <w:instrText xml:space="preserve"> PAGEREF _Toc236071443 \h </w:instrText>
-            </w:r>
-            <w:r>
-              <w:rPr>
-                <w:noProof/>
-                <w:webHidden/>
-              </w:rPr>
-            </w:r>
-            <w:r>
-              <w:rPr>
-                <w:noProof/>
-                <w:webHidden/>
-              </w:rPr>
-              <w:fldChar w:fldCharType="separate"/>
-            </w:r>
-            <w:r>
-              <w:rPr>
-                <w:noProof/>
-                <w:webHidden/>
-              </w:rPr>
-              <w:t>16</w:t>
-            </w:r>
-            <w:r>
-              <w:rPr>
-                <w:noProof/>
-                <w:webHidden/>
-              </w:rPr>
-              <w:fldChar w:fldCharType="end"/>
-            </w:r>
-          </w:hyperlink>
-        </w:p>
-        <w:p>
-          <w:pPr>
-            <w:pStyle w:val="2a"/>
-            <w:tabs>
-              <w:tab w:val="right" w:leader="dot" w:pos="9350"/>
-            </w:tabs>
-            <w:ind w:left="560"/>
-            <w:rPr>
-              <w:noProof/>
-            </w:rPr>
-          </w:pPr>
-          <w:hyperlink w:anchor="_Toc236071444" w:history="1">
-            <w:r>
-              <w:rPr>
-                <w:rStyle w:val="affa"/>
-                <w:noProof/>
-              </w:rPr>
-              <w:t xml:space="preserve">4.1 </w:t>
-            </w:r>
-            <w:r>
-              <w:rPr>
-                <w:rStyle w:val="affa"/>
-                <w:rFonts w:hint="eastAsia"/>
-                <w:noProof/>
-              </w:rPr>
-              <w:t>軟硬體、民雄算力與人力資源配置表</w:t>
-            </w:r>
-            <w:r>
-              <w:rPr>
-                <w:noProof/>
-                <w:webHidden/>
-              </w:rPr>
-              <w:tab/>
-            </w:r>
-            <w:r>
-              <w:rPr>
-                <w:noProof/>
-                <w:webHidden/>
-              </w:rPr>
-              <w:fldChar w:fldCharType="begin"/>
-            </w:r>
-            <w:r>
-              <w:rPr>
-                <w:noProof/>
-                <w:webHidden/>
-              </w:rPr>
-              <w:instrText xml:space="preserve"> PAGEREF _Toc236071444 \h </w:instrText>
-            </w:r>
-            <w:r>
-              <w:rPr>
-                <w:noProof/>
-                <w:webHidden/>
-              </w:rPr>
-            </w:r>
-            <w:r>
-              <w:rPr>
-                <w:noProof/>
-                <w:webHidden/>
-              </w:rPr>
-              <w:fldChar w:fldCharType="separate"/>
-            </w:r>
-            <w:r>
-              <w:rPr>
-                <w:noProof/>
-                <w:webHidden/>
-              </w:rPr>
-              <w:t>16</w:t>
-            </w:r>
-            <w:r>
-              <w:rPr>
-                <w:noProof/>
-                <w:webHidden/>
-              </w:rPr>
-              <w:fldChar w:fldCharType="end"/>
-            </w:r>
-          </w:hyperlink>
-        </w:p>
-        <w:p>
-          <w:pPr>
-            <w:pStyle w:val="2a"/>
-            <w:tabs>
-              <w:tab w:val="right" w:leader="dot" w:pos="9350"/>
-            </w:tabs>
-            <w:ind w:left="560"/>
-            <w:rPr>
-              <w:noProof/>
-            </w:rPr>
-          </w:pPr>
-          <w:hyperlink w:anchor="_Toc236071445" w:history="1">
-            <w:r>
-              <w:rPr>
-                <w:rStyle w:val="affa"/>
-                <w:noProof/>
-              </w:rPr>
-              <w:t xml:space="preserve">4.2 </w:t>
-            </w:r>
-            <w:r>
-              <w:rPr>
-                <w:rStyle w:val="affa"/>
-                <w:rFonts w:hint="eastAsia"/>
-                <w:noProof/>
-              </w:rPr>
-              <w:t>專案風險評估與因應對策</w:t>
-            </w:r>
-            <w:r>
-              <w:rPr>
-                <w:rStyle w:val="affa"/>
-                <w:noProof/>
-              </w:rPr>
-              <w:t xml:space="preserve"> (Risk Matrix)</w:t>
-            </w:r>
-            <w:r>
-              <w:rPr>
-                <w:noProof/>
-                <w:webHidden/>
-              </w:rPr>
-              <w:tab/>
-            </w:r>
-            <w:r>
-              <w:rPr>
-                <w:noProof/>
-                <w:webHidden/>
-              </w:rPr>
-              <w:fldChar w:fldCharType="begin"/>
-            </w:r>
-            <w:r>
-              <w:rPr>
-                <w:noProof/>
-                <w:webHidden/>
-              </w:rPr>
-              <w:instrText xml:space="preserve"> PAGEREF _Toc236071445 \h </w:instrText>
-            </w:r>
-            <w:r>
-              <w:rPr>
-                <w:noProof/>
-                <w:webHidden/>
-              </w:rPr>
-            </w:r>
-            <w:r>
-              <w:rPr>
-                <w:noProof/>
-                <w:webHidden/>
-              </w:rPr>
-              <w:fldChar w:fldCharType="separate"/>
-            </w:r>
-            <w:r>
-              <w:rPr>
-                <w:noProof/>
-                <w:webHidden/>
-              </w:rPr>
-              <w:t>16</w:t>
-            </w:r>
-            <w:r>
-              <w:rPr>
-                <w:noProof/>
-                <w:webHidden/>
-              </w:rPr>
-              <w:fldChar w:fldCharType="end"/>
-            </w:r>
-          </w:hyperlink>
-        </w:p>
-        <w:p>
-          <w:pPr>
-            <w:pStyle w:val="14"/>
-            <w:tabs>
-              <w:tab w:val="right" w:leader="dot" w:pos="9350"/>
-            </w:tabs>
-            <w:rPr>
-              <w:noProof/>
-            </w:rPr>
-          </w:pPr>
-          <w:hyperlink w:anchor="_Toc236071446" w:history="1">
-            <w:r>
-              <w:rPr>
-                <w:rStyle w:val="affa"/>
-                <w:rFonts w:hint="eastAsia"/>
-                <w:noProof/>
-              </w:rPr>
-              <w:t>第五章</w:t>
-            </w:r>
-            <w:r>
-              <w:rPr>
-                <w:rStyle w:val="affa"/>
-                <w:noProof/>
-              </w:rPr>
-              <w:t xml:space="preserve"> </w:t>
-            </w:r>
-            <w:r>
-              <w:rPr>
-                <w:rStyle w:val="affa"/>
-                <w:rFonts w:hint="eastAsia"/>
-                <w:noProof/>
-              </w:rPr>
-              <w:t>預期效益與戰略成果</w:t>
-            </w:r>
-            <w:r>
-              <w:rPr>
-                <w:noProof/>
-                <w:webHidden/>
-              </w:rPr>
-              <w:tab/>
-            </w:r>
-            <w:r>
-              <w:rPr>
-                <w:noProof/>
-                <w:webHidden/>
-              </w:rPr>
-              <w:fldChar w:fldCharType="begin"/>
-            </w:r>
-            <w:r>
-              <w:rPr>
-                <w:noProof/>
-                <w:webHidden/>
-              </w:rPr>
-              <w:instrText xml:space="preserve"> PAGEREF _Toc236071446 \h </w:instrText>
-            </w:r>
-            <w:r>
-              <w:rPr>
-                <w:noProof/>
-                <w:webHidden/>
-              </w:rPr>
-            </w:r>
-            <w:r>
-              <w:rPr>
-                <w:noProof/>
-                <w:webHidden/>
-              </w:rPr>
-              <w:fldChar w:fldCharType="separate"/>
-            </w:r>
-            <w:r>
-              <w:rPr>
-                <w:noProof/>
-                <w:webHidden/>
-              </w:rPr>
-              <w:t>18</w:t>
-            </w:r>
-            <w:r>
-              <w:rPr>
-                <w:noProof/>
-                <w:webHidden/>
-              </w:rPr>
-              <w:fldChar w:fldCharType="end"/>
-            </w:r>
-          </w:hyperlink>
-        </w:p>
-        <w:p>
-          <w:pPr>
-            <w:pStyle w:val="2a"/>
-            <w:tabs>
-              <w:tab w:val="right" w:leader="dot" w:pos="9350"/>
-            </w:tabs>
-            <w:ind w:left="560"/>
-            <w:rPr>
-              <w:noProof/>
-            </w:rPr>
-          </w:pPr>
-          <w:hyperlink w:anchor="_Toc236071447" w:history="1">
-            <w:r>
-              <w:rPr>
-                <w:rStyle w:val="affa"/>
-                <w:noProof/>
-              </w:rPr>
-              <w:t xml:space="preserve">1. </w:t>
-            </w:r>
-            <w:r>
-              <w:rPr>
-                <w:rStyle w:val="affa"/>
-                <w:rFonts w:hint="eastAsia"/>
-                <w:noProof/>
-              </w:rPr>
-              <w:t>戰術作戰層面：達成極致非對稱打擊效益</w:t>
-            </w:r>
-            <w:r>
-              <w:rPr>
-                <w:noProof/>
-                <w:webHidden/>
-              </w:rPr>
-              <w:tab/>
-            </w:r>
-            <w:r>
-              <w:rPr>
-                <w:noProof/>
-                <w:webHidden/>
-              </w:rPr>
-              <w:fldChar w:fldCharType="begin"/>
-            </w:r>
-            <w:r>
-              <w:rPr>
-                <w:noProof/>
-                <w:webHidden/>
-              </w:rPr>
-              <w:instrText xml:space="preserve"> PAGEREF _Toc236071447 \h </w:instrText>
-            </w:r>
-            <w:r>
-              <w:rPr>
-                <w:noProof/>
-                <w:webHidden/>
-              </w:rPr>
-            </w:r>
-            <w:r>
-              <w:rPr>
-                <w:noProof/>
-                <w:webHidden/>
-              </w:rPr>
-              <w:fldChar w:fldCharType="separate"/>
-            </w:r>
-            <w:r>
-              <w:rPr>
-                <w:noProof/>
-                <w:webHidden/>
-              </w:rPr>
-              <w:t>18</w:t>
-            </w:r>
-            <w:r>
-              <w:rPr>
-                <w:noProof/>
-                <w:webHidden/>
-              </w:rPr>
-              <w:fldChar w:fldCharType="end"/>
-            </w:r>
-          </w:hyperlink>
-        </w:p>
-        <w:p>
-          <w:pPr>
-            <w:pStyle w:val="2a"/>
-            <w:tabs>
-              <w:tab w:val="right" w:leader="dot" w:pos="9350"/>
-            </w:tabs>
-            <w:ind w:left="560"/>
-            <w:rPr>
-              <w:noProof/>
-            </w:rPr>
-          </w:pPr>
-          <w:hyperlink w:anchor="_Toc236071448" w:history="1">
-            <w:r>
-              <w:rPr>
-                <w:rStyle w:val="affa"/>
-                <w:noProof/>
-              </w:rPr>
-              <w:t xml:space="preserve">2. </w:t>
-            </w:r>
-            <w:r>
-              <w:rPr>
-                <w:rStyle w:val="affa"/>
-                <w:rFonts w:hint="eastAsia"/>
-                <w:noProof/>
-              </w:rPr>
-              <w:t>資安與保密層面：建構零漏洞主權防衛屏障</w:t>
-            </w:r>
-            <w:r>
-              <w:rPr>
-                <w:noProof/>
-                <w:webHidden/>
-              </w:rPr>
-              <w:tab/>
-            </w:r>
-            <w:r>
-              <w:rPr>
-                <w:noProof/>
-                <w:webHidden/>
-              </w:rPr>
-              <w:fldChar w:fldCharType="begin"/>
-            </w:r>
-            <w:r>
-              <w:rPr>
-                <w:noProof/>
-                <w:webHidden/>
-              </w:rPr>
-              <w:instrText xml:space="preserve"> PAGEREF _Toc236071448 \h </w:instrText>
-            </w:r>
-            <w:r>
-              <w:rPr>
-                <w:noProof/>
-                <w:webHidden/>
-              </w:rPr>
-            </w:r>
-            <w:r>
-              <w:rPr>
-                <w:noProof/>
-                <w:webHidden/>
-              </w:rPr>
-              <w:fldChar w:fldCharType="separate"/>
-            </w:r>
-            <w:r>
-              <w:rPr>
-                <w:noProof/>
-                <w:webHidden/>
-              </w:rPr>
-              <w:t>18</w:t>
-            </w:r>
-            <w:r>
-              <w:rPr>
-                <w:noProof/>
-                <w:webHidden/>
-              </w:rPr>
-              <w:fldChar w:fldCharType="end"/>
-            </w:r>
-          </w:hyperlink>
-        </w:p>
-        <w:p>
-          <w:pPr>
-            <w:pStyle w:val="2a"/>
-            <w:tabs>
-              <w:tab w:val="right" w:leader="dot" w:pos="9350"/>
-            </w:tabs>
-            <w:ind w:left="560"/>
-            <w:rPr>
-              <w:noProof/>
-            </w:rPr>
-          </w:pPr>
-          <w:hyperlink w:anchor="_Toc236071449" w:history="1">
-            <w:r>
-              <w:rPr>
-                <w:rStyle w:val="affa"/>
-                <w:noProof/>
-              </w:rPr>
-              <w:t xml:space="preserve">3. </w:t>
-            </w:r>
-            <w:r>
-              <w:rPr>
-                <w:rStyle w:val="affa"/>
-                <w:rFonts w:hint="eastAsia"/>
-                <w:noProof/>
-              </w:rPr>
-              <w:t>國家與產業層面：樹立自主</w:t>
-            </w:r>
-            <w:r>
-              <w:rPr>
-                <w:rStyle w:val="affa"/>
-                <w:noProof/>
-              </w:rPr>
-              <w:t xml:space="preserve"> AIEC </w:t>
-            </w:r>
-            <w:r>
-              <w:rPr>
-                <w:rStyle w:val="affa"/>
-                <w:rFonts w:hint="eastAsia"/>
-                <w:noProof/>
-              </w:rPr>
-              <w:t>評測認證標竿</w:t>
-            </w:r>
-            <w:r>
-              <w:rPr>
-                <w:noProof/>
-                <w:webHidden/>
-              </w:rPr>
-              <w:tab/>
-            </w:r>
-            <w:r>
-              <w:rPr>
-                <w:noProof/>
-                <w:webHidden/>
-              </w:rPr>
-              <w:fldChar w:fldCharType="begin"/>
-            </w:r>
-            <w:r>
-              <w:rPr>
-                <w:noProof/>
-                <w:webHidden/>
-              </w:rPr>
-              <w:instrText xml:space="preserve"> PAGEREF _Toc236071449 \h </w:instrText>
-            </w:r>
-            <w:r>
-              <w:rPr>
-                <w:noProof/>
-                <w:webHidden/>
-              </w:rPr>
-            </w:r>
-            <w:r>
-              <w:rPr>
-                <w:noProof/>
-                <w:webHidden/>
-              </w:rPr>
-              <w:fldChar w:fldCharType="separate"/>
-            </w:r>
-            <w:r>
-              <w:rPr>
-                <w:noProof/>
-                <w:webHidden/>
-              </w:rPr>
-              <w:t>18</w:t>
-            </w:r>
-            <w:r>
-              <w:rPr>
-                <w:noProof/>
-                <w:webHidden/>
-              </w:rPr>
-              <w:fldChar w:fldCharType="end"/>
-            </w:r>
-          </w:hyperlink>
-        </w:p>
-        <w:p>
-          <w:r>
-            <w:fldChar w:fldCharType="end"/>
-          </w:r>
-        </w:p>
-      </w:sdtContent>
-    </w:sdt>
-    <w:sdt>
-      <w:sdtPr>
-        <w:id w:val="840202714"/>
-        <w:docPartObj>
-          <w:docPartGallery w:val="Table of Contents"/>
-          <w:docPartUnique/>
-        </w:docPartObj>
-      </w:sdtPr>
-      <w:sdtEndPr/>
-      <w:sdtContent>
-        <w:p>
-          <w:r>
-            <w:fldChar w:fldCharType="begin"/>
-          </w:r>
-          <w:r>
-            <w:instrText>TOC \t "Heading 3,1" \h \z \u</w:instrText>
-          </w:r>
-          <w:r>
-            <w:fldChar w:fldCharType="separate"/>
-          </w:r>
-          <w:r>
-            <w:rPr>
-              <w:rFonts w:eastAsia="新細明體" w:hint="eastAsia"/>
-              <w:b/>
-              <w:bCs/>
-              <w:noProof/>
-              <w:lang w:eastAsia="zh-TW"/>
-            </w:rPr>
-            <w:t>找不到目錄項目。</w:t>
-          </w:r>
-          <w:r>
-            <w:fldChar w:fldCharType="end"/>
-          </w:r>
-        </w:p>
-      </w:sdtContent>
-    </w:sdt>
-    <w:sdt>
-      <w:sdtPr>
-        <w:id w:val="-23637192"/>
-        <w:docPartObj>
-          <w:docPartGallery w:val="Table of Contents"/>
-          <w:docPartUnique/>
-        </w:docPartObj>
-      </w:sdtPr>
-      <w:sdtEndPr/>
-      <w:sdtContent>
-        <w:p>
-          <w:r>
-            <w:fldChar w:fldCharType="begin"/>
-          </w:r>
-          <w:r>
-            <w:instrText>TOC \t "Heading 3,1" \h \z \u</w:instrText>
-          </w:r>
-          <w:r>
-            <w:fldChar w:fldCharType="separate"/>
-          </w:r>
-          <w:r>
-            <w:rPr>
-              <w:rFonts w:eastAsia="新細明體" w:hint="eastAsia"/>
-              <w:b/>
-              <w:bCs/>
-              <w:noProof/>
-              <w:lang w:eastAsia="zh-TW"/>
-            </w:rPr>
-            <w:t>找不到目錄項目。</w:t>
-          </w:r>
-          <w:r>
-            <w:fldChar w:fldCharType="end"/>
-          </w:r>
-        </w:p>
-      </w:sdtContent>
-    </w:sdt>
     <w:sectPr>
       <w:footerReference w:type="default" r:id="rId11"/>
       <w:pgSz w:w="12240" w:h="15840"/>
@@ -11396,31 +11594,31 @@
       </w:rPr>
     </w:lvl>
   </w:abstractNum>
-  <w:num w:numId="1" w16cid:durableId="786974203">
+  <w:num w:numId="1" w16cid:durableId="1174148859">
     <w:abstractNumId w:val="8"/>
   </w:num>
-  <w:num w:numId="2" w16cid:durableId="523324215">
+  <w:num w:numId="2" w16cid:durableId="435945746">
     <w:abstractNumId w:val="6"/>
   </w:num>
-  <w:num w:numId="3" w16cid:durableId="22248251">
+  <w:num w:numId="3" w16cid:durableId="1730884016">
     <w:abstractNumId w:val="5"/>
   </w:num>
-  <w:num w:numId="4" w16cid:durableId="173957099">
+  <w:num w:numId="4" w16cid:durableId="1080173225">
     <w:abstractNumId w:val="4"/>
   </w:num>
-  <w:num w:numId="5" w16cid:durableId="957445219">
+  <w:num w:numId="5" w16cid:durableId="1770807219">
     <w:abstractNumId w:val="7"/>
   </w:num>
-  <w:num w:numId="6" w16cid:durableId="188421951">
+  <w:num w:numId="6" w16cid:durableId="1731609334">
     <w:abstractNumId w:val="3"/>
   </w:num>
-  <w:num w:numId="7" w16cid:durableId="770585461">
+  <w:num w:numId="7" w16cid:durableId="1206218824">
     <w:abstractNumId w:val="2"/>
   </w:num>
-  <w:num w:numId="8" w16cid:durableId="913930553">
+  <w:num w:numId="8" w16cid:durableId="1683819283">
     <w:abstractNumId w:val="1"/>
   </w:num>
-  <w:num w:numId="9" w16cid:durableId="1357929587">
+  <w:num w:numId="9" w16cid:durableId="1048842335">
     <w:abstractNumId w:val="0"/>
   </w:num>
 </w:numbering>
@@ -22815,7 +23013,7 @@
     <w:autoRedefine/>
     <w:uiPriority w:val="39"/>
     <w:unhideWhenUsed/>
-    <w:rsid w:val="000C2807"/>
+    <w:rsid w:val="00486C13"/>
   </w:style>
   <w:style w:type="paragraph" w:styleId="2a">
     <w:name w:val="toc 2"/>
@@ -22824,7 +23022,7 @@
     <w:autoRedefine/>
     <w:uiPriority w:val="39"/>
     <w:unhideWhenUsed/>
-    <w:rsid w:val="000C2807"/>
+    <w:rsid w:val="00486C13"/>
     <w:pPr>
       <w:ind w:leftChars="200" w:left="480"/>
     </w:pPr>
@@ -22834,7 +23032,7 @@
     <w:basedOn w:val="a2"/>
     <w:uiPriority w:val="99"/>
     <w:unhideWhenUsed/>
-    <w:rsid w:val="000C2807"/>
+    <w:rsid w:val="00486C13"/>
     <w:rPr>
       <w:color w:val="0000FF" w:themeColor="hyperlink"/>
       <w:u w:val="single"/>

</xml_diff>

<commit_message>
Fully populate List of Tables (7 entries) and List of Figures (3 entries) using TablesOfFigures COM automation
</commit_message>
<xml_diff>
--- a/AIEC國防領域AI應用導入專案規劃書.docx
+++ b/AIEC國防領域AI應用導入專案規劃書.docx
@@ -546,7 +546,7 @@
         <w:pStyle w:val="1"/>
         <w:spacing w:before="320" w:after="160"/>
       </w:pPr>
-      <w:bookmarkStart w:id="0" w:name="_Toc236071646"/>
+      <w:bookmarkStart w:id="0" w:name="_Toc236071947"/>
       <w:r>
         <w:lastRenderedPageBreak/>
         <w:t>📋</w:t>
@@ -564,7 +564,7 @@
     </w:p>
     <w:sdt>
       <w:sdtPr>
-        <w:id w:val="-733159231"/>
+        <w:id w:val="-1613894109"/>
         <w:docPartObj>
           <w:docPartGallery w:val="Table of Contents"/>
           <w:docPartUnique/>
@@ -579,7 +579,14 @@
               <w:tab w:val="right" w:leader="dot" w:pos="9350"/>
             </w:tabs>
             <w:rPr>
+              <w:rFonts w:asciiTheme="minorHAnsi" w:eastAsiaTheme="minorEastAsia" w:hAnsiTheme="minorHAnsi" w:cstheme="minorBidi"/>
               <w:noProof/>
+              <w:color w:val="auto"/>
+              <w:kern w:val="2"/>
+              <w:sz w:val="24"/>
+              <w:szCs w:val="24"/>
+              <w:lang w:eastAsia="zh-TW"/>
+              <w14:ligatures w14:val="standardContextual"/>
             </w:rPr>
           </w:pPr>
           <w:r>
@@ -591,7 +598,7 @@
           <w:r>
             <w:fldChar w:fldCharType="separate"/>
           </w:r>
-          <w:hyperlink w:anchor="_Toc236071646" w:history="1">
+          <w:hyperlink w:anchor="_Toc236071947" w:history="1">
             <w:r>
               <w:rPr>
                 <w:rStyle w:val="affa"/>
@@ -641,7 +648,7 @@
                 <w:noProof/>
                 <w:webHidden/>
               </w:rPr>
-              <w:instrText xml:space="preserve"> PAGEREF _Toc236071646 \h </w:instrText>
+              <w:instrText xml:space="preserve"> PAGEREF _Toc236071947 \h </w:instrText>
             </w:r>
             <w:r>
               <w:rPr>
@@ -679,10 +686,17 @@
               <w:tab w:val="right" w:leader="dot" w:pos="9350"/>
             </w:tabs>
             <w:rPr>
+              <w:rFonts w:asciiTheme="minorHAnsi" w:eastAsiaTheme="minorEastAsia" w:hAnsiTheme="minorHAnsi" w:cstheme="minorBidi"/>
               <w:noProof/>
+              <w:color w:val="auto"/>
+              <w:kern w:val="2"/>
+              <w:sz w:val="24"/>
+              <w:szCs w:val="24"/>
+              <w:lang w:eastAsia="zh-TW"/>
+              <w14:ligatures w14:val="standardContextual"/>
             </w:rPr>
           </w:pPr>
-          <w:hyperlink w:anchor="_Toc236071647" w:history="1">
+          <w:hyperlink w:anchor="_Toc236071948" w:history="1">
             <w:r>
               <w:rPr>
                 <w:rStyle w:val="affa"/>
@@ -732,7 +746,7 @@
                 <w:noProof/>
                 <w:webHidden/>
               </w:rPr>
-              <w:instrText xml:space="preserve"> PAGEREF _Toc236071647 \h </w:instrText>
+              <w:instrText xml:space="preserve"> PAGEREF _Toc236071948 \h </w:instrText>
             </w:r>
             <w:r>
               <w:rPr>
@@ -770,10 +784,17 @@
               <w:tab w:val="right" w:leader="dot" w:pos="9350"/>
             </w:tabs>
             <w:rPr>
+              <w:rFonts w:asciiTheme="minorHAnsi" w:eastAsiaTheme="minorEastAsia" w:hAnsiTheme="minorHAnsi" w:cstheme="minorBidi"/>
               <w:noProof/>
+              <w:color w:val="auto"/>
+              <w:kern w:val="2"/>
+              <w:sz w:val="24"/>
+              <w:szCs w:val="24"/>
+              <w:lang w:eastAsia="zh-TW"/>
+              <w14:ligatures w14:val="standardContextual"/>
             </w:rPr>
           </w:pPr>
-          <w:hyperlink w:anchor="_Toc236071648" w:history="1">
+          <w:hyperlink w:anchor="_Toc236071949" w:history="1">
             <w:r>
               <w:rPr>
                 <w:rStyle w:val="affa"/>
@@ -823,7 +844,7 @@
                 <w:noProof/>
                 <w:webHidden/>
               </w:rPr>
-              <w:instrText xml:space="preserve"> PAGEREF _Toc236071648 \h </w:instrText>
+              <w:instrText xml:space="preserve"> PAGEREF _Toc236071949 \h </w:instrText>
             </w:r>
             <w:r>
               <w:rPr>
@@ -861,10 +882,17 @@
               <w:tab w:val="right" w:leader="dot" w:pos="9350"/>
             </w:tabs>
             <w:rPr>
+              <w:rFonts w:asciiTheme="minorHAnsi" w:eastAsiaTheme="minorEastAsia" w:hAnsiTheme="minorHAnsi" w:cstheme="minorBidi"/>
               <w:noProof/>
+              <w:color w:val="auto"/>
+              <w:kern w:val="2"/>
+              <w:sz w:val="24"/>
+              <w:szCs w:val="24"/>
+              <w:lang w:eastAsia="zh-TW"/>
+              <w14:ligatures w14:val="standardContextual"/>
             </w:rPr>
           </w:pPr>
-          <w:hyperlink w:anchor="_Toc236071649" w:history="1">
+          <w:hyperlink w:anchor="_Toc236071950" w:history="1">
             <w:r>
               <w:rPr>
                 <w:rStyle w:val="affa"/>
@@ -922,7 +950,7 @@
                 <w:noProof/>
                 <w:webHidden/>
               </w:rPr>
-              <w:instrText xml:space="preserve"> PAGEREF _Toc236071649 \h </w:instrText>
+              <w:instrText xml:space="preserve"> PAGEREF _Toc236071950 \h </w:instrText>
             </w:r>
             <w:r>
               <w:rPr>
@@ -961,10 +989,17 @@
             </w:tabs>
             <w:ind w:left="560"/>
             <w:rPr>
+              <w:rFonts w:asciiTheme="minorHAnsi" w:eastAsiaTheme="minorEastAsia" w:hAnsiTheme="minorHAnsi" w:cstheme="minorBidi"/>
               <w:noProof/>
+              <w:color w:val="auto"/>
+              <w:kern w:val="2"/>
+              <w:sz w:val="24"/>
+              <w:szCs w:val="24"/>
+              <w:lang w:eastAsia="zh-TW"/>
+              <w14:ligatures w14:val="standardContextual"/>
             </w:rPr>
           </w:pPr>
-          <w:hyperlink w:anchor="_Toc236071650" w:history="1">
+          <w:hyperlink w:anchor="_Toc236071951" w:history="1">
             <w:r>
               <w:rPr>
                 <w:rStyle w:val="affa"/>
@@ -999,7 +1034,7 @@
                 <w:noProof/>
                 <w:webHidden/>
               </w:rPr>
-              <w:instrText xml:space="preserve"> PAGEREF _Toc236071650 \h </w:instrText>
+              <w:instrText xml:space="preserve"> PAGEREF _Toc236071951 \h </w:instrText>
             </w:r>
             <w:r>
               <w:rPr>
@@ -1038,10 +1073,17 @@
             </w:tabs>
             <w:ind w:left="560"/>
             <w:rPr>
+              <w:rFonts w:asciiTheme="minorHAnsi" w:eastAsiaTheme="minorEastAsia" w:hAnsiTheme="minorHAnsi" w:cstheme="minorBidi"/>
               <w:noProof/>
+              <w:color w:val="auto"/>
+              <w:kern w:val="2"/>
+              <w:sz w:val="24"/>
+              <w:szCs w:val="24"/>
+              <w:lang w:eastAsia="zh-TW"/>
+              <w14:ligatures w14:val="standardContextual"/>
             </w:rPr>
           </w:pPr>
-          <w:hyperlink w:anchor="_Toc236071651" w:history="1">
+          <w:hyperlink w:anchor="_Toc236071952" w:history="1">
             <w:r>
               <w:rPr>
                 <w:rStyle w:val="affa"/>
@@ -1091,7 +1133,7 @@
                 <w:noProof/>
                 <w:webHidden/>
               </w:rPr>
-              <w:instrText xml:space="preserve"> PAGEREF _Toc236071651 \h </w:instrText>
+              <w:instrText xml:space="preserve"> PAGEREF _Toc236071952 \h </w:instrText>
             </w:r>
             <w:r>
               <w:rPr>
@@ -1130,10 +1172,17 @@
             </w:tabs>
             <w:ind w:left="560"/>
             <w:rPr>
+              <w:rFonts w:asciiTheme="minorHAnsi" w:eastAsiaTheme="minorEastAsia" w:hAnsiTheme="minorHAnsi" w:cstheme="minorBidi"/>
               <w:noProof/>
+              <w:color w:val="auto"/>
+              <w:kern w:val="2"/>
+              <w:sz w:val="24"/>
+              <w:szCs w:val="24"/>
+              <w:lang w:eastAsia="zh-TW"/>
+              <w14:ligatures w14:val="standardContextual"/>
             </w:rPr>
           </w:pPr>
-          <w:hyperlink w:anchor="_Toc236071652" w:history="1">
+          <w:hyperlink w:anchor="_Toc236071953" w:history="1">
             <w:r>
               <w:rPr>
                 <w:rStyle w:val="affa"/>
@@ -1183,7 +1232,7 @@
                 <w:noProof/>
                 <w:webHidden/>
               </w:rPr>
-              <w:instrText xml:space="preserve"> PAGEREF _Toc236071652 \h </w:instrText>
+              <w:instrText xml:space="preserve"> PAGEREF _Toc236071953 \h </w:instrText>
             </w:r>
             <w:r>
               <w:rPr>
@@ -1222,10 +1271,17 @@
             </w:tabs>
             <w:ind w:left="560"/>
             <w:rPr>
+              <w:rFonts w:asciiTheme="minorHAnsi" w:eastAsiaTheme="minorEastAsia" w:hAnsiTheme="minorHAnsi" w:cstheme="minorBidi"/>
               <w:noProof/>
+              <w:color w:val="auto"/>
+              <w:kern w:val="2"/>
+              <w:sz w:val="24"/>
+              <w:szCs w:val="24"/>
+              <w:lang w:eastAsia="zh-TW"/>
+              <w14:ligatures w14:val="standardContextual"/>
             </w:rPr>
           </w:pPr>
-          <w:hyperlink w:anchor="_Toc236071653" w:history="1">
+          <w:hyperlink w:anchor="_Toc236071954" w:history="1">
             <w:r>
               <w:rPr>
                 <w:rStyle w:val="affa"/>
@@ -1260,7 +1316,7 @@
                 <w:noProof/>
                 <w:webHidden/>
               </w:rPr>
-              <w:instrText xml:space="preserve"> PAGEREF _Toc236071653 \h </w:instrText>
+              <w:instrText xml:space="preserve"> PAGEREF _Toc236071954 \h </w:instrText>
             </w:r>
             <w:r>
               <w:rPr>
@@ -1299,10 +1355,17 @@
             </w:tabs>
             <w:ind w:left="560"/>
             <w:rPr>
+              <w:rFonts w:asciiTheme="minorHAnsi" w:eastAsiaTheme="minorEastAsia" w:hAnsiTheme="minorHAnsi" w:cstheme="minorBidi"/>
               <w:noProof/>
+              <w:color w:val="auto"/>
+              <w:kern w:val="2"/>
+              <w:sz w:val="24"/>
+              <w:szCs w:val="24"/>
+              <w:lang w:eastAsia="zh-TW"/>
+              <w14:ligatures w14:val="standardContextual"/>
             </w:rPr>
           </w:pPr>
-          <w:hyperlink w:anchor="_Toc236071654" w:history="1">
+          <w:hyperlink w:anchor="_Toc236071955" w:history="1">
             <w:r>
               <w:rPr>
                 <w:rStyle w:val="affa"/>
@@ -1344,7 +1407,7 @@
                 <w:noProof/>
                 <w:webHidden/>
               </w:rPr>
-              <w:instrText xml:space="preserve"> PAGEREF _Toc236071654 \h </w:instrText>
+              <w:instrText xml:space="preserve"> PAGEREF _Toc236071955 \h </w:instrText>
             </w:r>
             <w:r>
               <w:rPr>
@@ -1383,10 +1446,17 @@
             </w:tabs>
             <w:ind w:left="560"/>
             <w:rPr>
+              <w:rFonts w:asciiTheme="minorHAnsi" w:eastAsiaTheme="minorEastAsia" w:hAnsiTheme="minorHAnsi" w:cstheme="minorBidi"/>
               <w:noProof/>
+              <w:color w:val="auto"/>
+              <w:kern w:val="2"/>
+              <w:sz w:val="24"/>
+              <w:szCs w:val="24"/>
+              <w:lang w:eastAsia="zh-TW"/>
+              <w14:ligatures w14:val="standardContextual"/>
             </w:rPr>
           </w:pPr>
-          <w:hyperlink w:anchor="_Toc236071655" w:history="1">
+          <w:hyperlink w:anchor="_Toc236071956" w:history="1">
             <w:r>
               <w:rPr>
                 <w:rStyle w:val="affa"/>
@@ -1421,7 +1491,7 @@
                 <w:noProof/>
                 <w:webHidden/>
               </w:rPr>
-              <w:instrText xml:space="preserve"> PAGEREF _Toc236071655 \h </w:instrText>
+              <w:instrText xml:space="preserve"> PAGEREF _Toc236071956 \h </w:instrText>
             </w:r>
             <w:r>
               <w:rPr>
@@ -1459,10 +1529,17 @@
               <w:tab w:val="right" w:leader="dot" w:pos="9350"/>
             </w:tabs>
             <w:rPr>
+              <w:rFonts w:asciiTheme="minorHAnsi" w:eastAsiaTheme="minorEastAsia" w:hAnsiTheme="minorHAnsi" w:cstheme="minorBidi"/>
               <w:noProof/>
+              <w:color w:val="auto"/>
+              <w:kern w:val="2"/>
+              <w:sz w:val="24"/>
+              <w:szCs w:val="24"/>
+              <w:lang w:eastAsia="zh-TW"/>
+              <w14:ligatures w14:val="standardContextual"/>
             </w:rPr>
           </w:pPr>
-          <w:hyperlink w:anchor="_Toc236071656" w:history="1">
+          <w:hyperlink w:anchor="_Toc236071957" w:history="1">
             <w:r>
               <w:rPr>
                 <w:rStyle w:val="affa"/>
@@ -1505,7 +1582,7 @@
                 <w:noProof/>
                 <w:webHidden/>
               </w:rPr>
-              <w:instrText xml:space="preserve"> PAGEREF _Toc236071656 \h </w:instrText>
+              <w:instrText xml:space="preserve"> PAGEREF _Toc236071957 \h </w:instrText>
             </w:r>
             <w:r>
               <w:rPr>
@@ -1544,10 +1621,17 @@
             </w:tabs>
             <w:ind w:left="560"/>
             <w:rPr>
+              <w:rFonts w:asciiTheme="minorHAnsi" w:eastAsiaTheme="minorEastAsia" w:hAnsiTheme="minorHAnsi" w:cstheme="minorBidi"/>
               <w:noProof/>
+              <w:color w:val="auto"/>
+              <w:kern w:val="2"/>
+              <w:sz w:val="24"/>
+              <w:szCs w:val="24"/>
+              <w:lang w:eastAsia="zh-TW"/>
+              <w14:ligatures w14:val="standardContextual"/>
             </w:rPr>
           </w:pPr>
-          <w:hyperlink w:anchor="_Toc236071657" w:history="1">
+          <w:hyperlink w:anchor="_Toc236071958" w:history="1">
             <w:r>
               <w:rPr>
                 <w:rStyle w:val="affa"/>
@@ -1589,7 +1673,7 @@
                 <w:noProof/>
                 <w:webHidden/>
               </w:rPr>
-              <w:instrText xml:space="preserve"> PAGEREF _Toc236071657 \h </w:instrText>
+              <w:instrText xml:space="preserve"> PAGEREF _Toc236071958 \h </w:instrText>
             </w:r>
             <w:r>
               <w:rPr>
@@ -1628,10 +1712,17 @@
             </w:tabs>
             <w:ind w:left="560"/>
             <w:rPr>
+              <w:rFonts w:asciiTheme="minorHAnsi" w:eastAsiaTheme="minorEastAsia" w:hAnsiTheme="minorHAnsi" w:cstheme="minorBidi"/>
               <w:noProof/>
+              <w:color w:val="auto"/>
+              <w:kern w:val="2"/>
+              <w:sz w:val="24"/>
+              <w:szCs w:val="24"/>
+              <w:lang w:eastAsia="zh-TW"/>
+              <w14:ligatures w14:val="standardContextual"/>
             </w:rPr>
           </w:pPr>
-          <w:hyperlink w:anchor="_Toc236071658" w:history="1">
+          <w:hyperlink w:anchor="_Toc236071959" w:history="1">
             <w:r>
               <w:rPr>
                 <w:rStyle w:val="affa"/>
@@ -1673,7 +1764,7 @@
                 <w:noProof/>
                 <w:webHidden/>
               </w:rPr>
-              <w:instrText xml:space="preserve"> PAGEREF _Toc236071658 \h </w:instrText>
+              <w:instrText xml:space="preserve"> PAGEREF _Toc236071959 \h </w:instrText>
             </w:r>
             <w:r>
               <w:rPr>
@@ -1712,10 +1803,17 @@
             </w:tabs>
             <w:ind w:left="560"/>
             <w:rPr>
+              <w:rFonts w:asciiTheme="minorHAnsi" w:eastAsiaTheme="minorEastAsia" w:hAnsiTheme="minorHAnsi" w:cstheme="minorBidi"/>
               <w:noProof/>
+              <w:color w:val="auto"/>
+              <w:kern w:val="2"/>
+              <w:sz w:val="24"/>
+              <w:szCs w:val="24"/>
+              <w:lang w:eastAsia="zh-TW"/>
+              <w14:ligatures w14:val="standardContextual"/>
             </w:rPr>
           </w:pPr>
-          <w:hyperlink w:anchor="_Toc236071659" w:history="1">
+          <w:hyperlink w:anchor="_Toc236071960" w:history="1">
             <w:r>
               <w:rPr>
                 <w:rStyle w:val="affa"/>
@@ -1757,7 +1855,7 @@
                 <w:noProof/>
                 <w:webHidden/>
               </w:rPr>
-              <w:instrText xml:space="preserve"> PAGEREF _Toc236071659 \h </w:instrText>
+              <w:instrText xml:space="preserve"> PAGEREF _Toc236071960 \h </w:instrText>
             </w:r>
             <w:r>
               <w:rPr>
@@ -1795,10 +1893,17 @@
               <w:tab w:val="right" w:leader="dot" w:pos="9350"/>
             </w:tabs>
             <w:rPr>
+              <w:rFonts w:asciiTheme="minorHAnsi" w:eastAsiaTheme="minorEastAsia" w:hAnsiTheme="minorHAnsi" w:cstheme="minorBidi"/>
               <w:noProof/>
+              <w:color w:val="auto"/>
+              <w:kern w:val="2"/>
+              <w:sz w:val="24"/>
+              <w:szCs w:val="24"/>
+              <w:lang w:eastAsia="zh-TW"/>
+              <w14:ligatures w14:val="standardContextual"/>
             </w:rPr>
           </w:pPr>
-          <w:hyperlink w:anchor="_Toc236071660" w:history="1">
+          <w:hyperlink w:anchor="_Toc236071961" w:history="1">
             <w:r>
               <w:rPr>
                 <w:rStyle w:val="affa"/>
@@ -1856,7 +1961,7 @@
                 <w:noProof/>
                 <w:webHidden/>
               </w:rPr>
-              <w:instrText xml:space="preserve"> PAGEREF _Toc236071660 \h </w:instrText>
+              <w:instrText xml:space="preserve"> PAGEREF _Toc236071961 \h </w:instrText>
             </w:r>
             <w:r>
               <w:rPr>
@@ -1895,10 +2000,17 @@
             </w:tabs>
             <w:ind w:left="560"/>
             <w:rPr>
+              <w:rFonts w:asciiTheme="minorHAnsi" w:eastAsiaTheme="minorEastAsia" w:hAnsiTheme="minorHAnsi" w:cstheme="minorBidi"/>
               <w:noProof/>
+              <w:color w:val="auto"/>
+              <w:kern w:val="2"/>
+              <w:sz w:val="24"/>
+              <w:szCs w:val="24"/>
+              <w:lang w:eastAsia="zh-TW"/>
+              <w14:ligatures w14:val="standardContextual"/>
             </w:rPr>
           </w:pPr>
-          <w:hyperlink w:anchor="_Toc236071661" w:history="1">
+          <w:hyperlink w:anchor="_Toc236071962" w:history="1">
             <w:r>
               <w:rPr>
                 <w:rStyle w:val="affa"/>
@@ -1940,7 +2052,7 @@
                 <w:noProof/>
                 <w:webHidden/>
               </w:rPr>
-              <w:instrText xml:space="preserve"> PAGEREF _Toc236071661 \h </w:instrText>
+              <w:instrText xml:space="preserve"> PAGEREF _Toc236071962 \h </w:instrText>
             </w:r>
             <w:r>
               <w:rPr>
@@ -1979,10 +2091,17 @@
             </w:tabs>
             <w:ind w:left="560"/>
             <w:rPr>
+              <w:rFonts w:asciiTheme="minorHAnsi" w:eastAsiaTheme="minorEastAsia" w:hAnsiTheme="minorHAnsi" w:cstheme="minorBidi"/>
               <w:noProof/>
+              <w:color w:val="auto"/>
+              <w:kern w:val="2"/>
+              <w:sz w:val="24"/>
+              <w:szCs w:val="24"/>
+              <w:lang w:eastAsia="zh-TW"/>
+              <w14:ligatures w14:val="standardContextual"/>
             </w:rPr>
           </w:pPr>
-          <w:hyperlink w:anchor="_Toc236071662" w:history="1">
+          <w:hyperlink w:anchor="_Toc236071963" w:history="1">
             <w:r>
               <w:rPr>
                 <w:rStyle w:val="affa"/>
@@ -2024,7 +2143,7 @@
                 <w:noProof/>
                 <w:webHidden/>
               </w:rPr>
-              <w:instrText xml:space="preserve"> PAGEREF _Toc236071662 \h </w:instrText>
+              <w:instrText xml:space="preserve"> PAGEREF _Toc236071963 \h </w:instrText>
             </w:r>
             <w:r>
               <w:rPr>
@@ -2062,10 +2181,17 @@
               <w:tab w:val="right" w:leader="dot" w:pos="9350"/>
             </w:tabs>
             <w:rPr>
+              <w:rFonts w:asciiTheme="minorHAnsi" w:eastAsiaTheme="minorEastAsia" w:hAnsiTheme="minorHAnsi" w:cstheme="minorBidi"/>
               <w:noProof/>
+              <w:color w:val="auto"/>
+              <w:kern w:val="2"/>
+              <w:sz w:val="24"/>
+              <w:szCs w:val="24"/>
+              <w:lang w:eastAsia="zh-TW"/>
+              <w14:ligatures w14:val="standardContextual"/>
             </w:rPr>
           </w:pPr>
-          <w:hyperlink w:anchor="_Toc236071663" w:history="1">
+          <w:hyperlink w:anchor="_Toc236071964" w:history="1">
             <w:r>
               <w:rPr>
                 <w:rStyle w:val="affa"/>
@@ -2108,7 +2234,7 @@
                 <w:noProof/>
                 <w:webHidden/>
               </w:rPr>
-              <w:instrText xml:space="preserve"> PAGEREF _Toc236071663 \h </w:instrText>
+              <w:instrText xml:space="preserve"> PAGEREF _Toc236071964 \h </w:instrText>
             </w:r>
             <w:r>
               <w:rPr>
@@ -2147,10 +2273,17 @@
             </w:tabs>
             <w:ind w:left="560"/>
             <w:rPr>
+              <w:rFonts w:asciiTheme="minorHAnsi" w:eastAsiaTheme="minorEastAsia" w:hAnsiTheme="minorHAnsi" w:cstheme="minorBidi"/>
               <w:noProof/>
+              <w:color w:val="auto"/>
+              <w:kern w:val="2"/>
+              <w:sz w:val="24"/>
+              <w:szCs w:val="24"/>
+              <w:lang w:eastAsia="zh-TW"/>
+              <w14:ligatures w14:val="standardContextual"/>
             </w:rPr>
           </w:pPr>
-          <w:hyperlink w:anchor="_Toc236071664" w:history="1">
+          <w:hyperlink w:anchor="_Toc236071965" w:history="1">
             <w:r>
               <w:rPr>
                 <w:rStyle w:val="affa"/>
@@ -2185,7 +2318,7 @@
                 <w:noProof/>
                 <w:webHidden/>
               </w:rPr>
-              <w:instrText xml:space="preserve"> PAGEREF _Toc236071664 \h </w:instrText>
+              <w:instrText xml:space="preserve"> PAGEREF _Toc236071965 \h </w:instrText>
             </w:r>
             <w:r>
               <w:rPr>
@@ -2224,10 +2357,17 @@
             </w:tabs>
             <w:ind w:left="560"/>
             <w:rPr>
+              <w:rFonts w:asciiTheme="minorHAnsi" w:eastAsiaTheme="minorEastAsia" w:hAnsiTheme="minorHAnsi" w:cstheme="minorBidi"/>
               <w:noProof/>
+              <w:color w:val="auto"/>
+              <w:kern w:val="2"/>
+              <w:sz w:val="24"/>
+              <w:szCs w:val="24"/>
+              <w:lang w:eastAsia="zh-TW"/>
+              <w14:ligatures w14:val="standardContextual"/>
             </w:rPr>
           </w:pPr>
-          <w:hyperlink w:anchor="_Toc236071665" w:history="1">
+          <w:hyperlink w:anchor="_Toc236071966" w:history="1">
             <w:r>
               <w:rPr>
                 <w:rStyle w:val="affa"/>
@@ -2269,7 +2409,7 @@
                 <w:noProof/>
                 <w:webHidden/>
               </w:rPr>
-              <w:instrText xml:space="preserve"> PAGEREF _Toc236071665 \h </w:instrText>
+              <w:instrText xml:space="preserve"> PAGEREF _Toc236071966 \h </w:instrText>
             </w:r>
             <w:r>
               <w:rPr>
@@ -2307,10 +2447,17 @@
               <w:tab w:val="right" w:leader="dot" w:pos="9350"/>
             </w:tabs>
             <w:rPr>
+              <w:rFonts w:asciiTheme="minorHAnsi" w:eastAsiaTheme="minorEastAsia" w:hAnsiTheme="minorHAnsi" w:cstheme="minorBidi"/>
               <w:noProof/>
+              <w:color w:val="auto"/>
+              <w:kern w:val="2"/>
+              <w:sz w:val="24"/>
+              <w:szCs w:val="24"/>
+              <w:lang w:eastAsia="zh-TW"/>
+              <w14:ligatures w14:val="standardContextual"/>
             </w:rPr>
           </w:pPr>
-          <w:hyperlink w:anchor="_Toc236071666" w:history="1">
+          <w:hyperlink w:anchor="_Toc236071967" w:history="1">
             <w:r>
               <w:rPr>
                 <w:rStyle w:val="affa"/>
@@ -2353,7 +2500,7 @@
                 <w:noProof/>
                 <w:webHidden/>
               </w:rPr>
-              <w:instrText xml:space="preserve"> PAGEREF _Toc236071666 \h </w:instrText>
+              <w:instrText xml:space="preserve"> PAGEREF _Toc236071967 \h </w:instrText>
             </w:r>
             <w:r>
               <w:rPr>
@@ -2392,10 +2539,17 @@
             </w:tabs>
             <w:ind w:left="560"/>
             <w:rPr>
+              <w:rFonts w:asciiTheme="minorHAnsi" w:eastAsiaTheme="minorEastAsia" w:hAnsiTheme="minorHAnsi" w:cstheme="minorBidi"/>
               <w:noProof/>
+              <w:color w:val="auto"/>
+              <w:kern w:val="2"/>
+              <w:sz w:val="24"/>
+              <w:szCs w:val="24"/>
+              <w:lang w:eastAsia="zh-TW"/>
+              <w14:ligatures w14:val="standardContextual"/>
             </w:rPr>
           </w:pPr>
-          <w:hyperlink w:anchor="_Toc236071667" w:history="1">
+          <w:hyperlink w:anchor="_Toc236071968" w:history="1">
             <w:r>
               <w:rPr>
                 <w:rStyle w:val="affa"/>
@@ -2430,7 +2584,7 @@
                 <w:noProof/>
                 <w:webHidden/>
               </w:rPr>
-              <w:instrText xml:space="preserve"> PAGEREF _Toc236071667 \h </w:instrText>
+              <w:instrText xml:space="preserve"> PAGEREF _Toc236071968 \h </w:instrText>
             </w:r>
             <w:r>
               <w:rPr>
@@ -2469,10 +2623,17 @@
             </w:tabs>
             <w:ind w:left="560"/>
             <w:rPr>
+              <w:rFonts w:asciiTheme="minorHAnsi" w:eastAsiaTheme="minorEastAsia" w:hAnsiTheme="minorHAnsi" w:cstheme="minorBidi"/>
               <w:noProof/>
+              <w:color w:val="auto"/>
+              <w:kern w:val="2"/>
+              <w:sz w:val="24"/>
+              <w:szCs w:val="24"/>
+              <w:lang w:eastAsia="zh-TW"/>
+              <w14:ligatures w14:val="standardContextual"/>
             </w:rPr>
           </w:pPr>
-          <w:hyperlink w:anchor="_Toc236071668" w:history="1">
+          <w:hyperlink w:anchor="_Toc236071969" w:history="1">
             <w:r>
               <w:rPr>
                 <w:rStyle w:val="affa"/>
@@ -2507,7 +2668,7 @@
                 <w:noProof/>
                 <w:webHidden/>
               </w:rPr>
-              <w:instrText xml:space="preserve"> PAGEREF _Toc236071668 \h </w:instrText>
+              <w:instrText xml:space="preserve"> PAGEREF _Toc236071969 \h </w:instrText>
             </w:r>
             <w:r>
               <w:rPr>
@@ -2546,10 +2707,17 @@
             </w:tabs>
             <w:ind w:left="560"/>
             <w:rPr>
+              <w:rFonts w:asciiTheme="minorHAnsi" w:eastAsiaTheme="minorEastAsia" w:hAnsiTheme="minorHAnsi" w:cstheme="minorBidi"/>
               <w:noProof/>
+              <w:color w:val="auto"/>
+              <w:kern w:val="2"/>
+              <w:sz w:val="24"/>
+              <w:szCs w:val="24"/>
+              <w:lang w:eastAsia="zh-TW"/>
+              <w14:ligatures w14:val="standardContextual"/>
             </w:rPr>
           </w:pPr>
-          <w:hyperlink w:anchor="_Toc236071669" w:history="1">
+          <w:hyperlink w:anchor="_Toc236071970" w:history="1">
             <w:r>
               <w:rPr>
                 <w:rStyle w:val="affa"/>
@@ -2599,7 +2767,7 @@
                 <w:noProof/>
                 <w:webHidden/>
               </w:rPr>
-              <w:instrText xml:space="preserve"> PAGEREF _Toc236071669 \h </w:instrText>
+              <w:instrText xml:space="preserve"> PAGEREF _Toc236071970 \h </w:instrText>
             </w:r>
             <w:r>
               <w:rPr>
@@ -2647,7 +2815,7 @@
         <w:pStyle w:val="1"/>
         <w:spacing w:before="320" w:after="160"/>
       </w:pPr>
-      <w:bookmarkStart w:id="1" w:name="_Toc236071647"/>
+      <w:bookmarkStart w:id="1" w:name="_Toc236071948"/>
       <w:r>
         <w:lastRenderedPageBreak/>
         <w:t>📊</w:t>
@@ -2665,7 +2833,7 @@
     </w:p>
     <w:sdt>
       <w:sdtPr>
-        <w:id w:val="-944764175"/>
+        <w:id w:val="288018844"/>
         <w:docPartObj>
           <w:docPartGallery w:val="Table of Contents"/>
           <w:docPartUnique/>
@@ -2674,6 +2842,23 @@
       <w:sdtEndPr/>
       <w:sdtContent>
         <w:p>
+          <w:pPr>
+            <w:pStyle w:val="affb"/>
+            <w:tabs>
+              <w:tab w:val="right" w:leader="dot" w:pos="9350"/>
+            </w:tabs>
+            <w:ind w:left="1680" w:hanging="560"/>
+            <w:rPr>
+              <w:rFonts w:asciiTheme="minorHAnsi" w:eastAsiaTheme="minorEastAsia" w:hAnsiTheme="minorHAnsi" w:cstheme="minorBidi"/>
+              <w:noProof/>
+              <w:color w:val="auto"/>
+              <w:kern w:val="2"/>
+              <w:sz w:val="24"/>
+              <w:szCs w:val="24"/>
+              <w:lang w:eastAsia="zh-TW"/>
+              <w14:ligatures w14:val="standardContextual"/>
+            </w:rPr>
+          </w:pPr>
           <w:r>
             <w:fldChar w:fldCharType="begin"/>
           </w:r>
@@ -2689,6 +2874,805 @@
           <w:r>
             <w:fldChar w:fldCharType="separate"/>
           </w:r>
+          <w:hyperlink w:anchor="_Toc236071971" w:history="1">
+            <w:r>
+              <w:rPr>
+                <w:rStyle w:val="affa"/>
+                <w:rFonts w:hint="eastAsia"/>
+                <w:noProof/>
+              </w:rPr>
+              <w:t>表</w:t>
+            </w:r>
+            <w:r>
+              <w:rPr>
+                <w:rStyle w:val="affa"/>
+                <w:noProof/>
+              </w:rPr>
+              <w:t xml:space="preserve"> 1</w:t>
+            </w:r>
+            <w:r>
+              <w:rPr>
+                <w:rStyle w:val="affa"/>
+                <w:rFonts w:hint="eastAsia"/>
+                <w:noProof/>
+              </w:rPr>
+              <w:t>：傳統軍事戰術</w:t>
+            </w:r>
+            <w:r>
+              <w:rPr>
+                <w:rStyle w:val="affa"/>
+                <w:noProof/>
+              </w:rPr>
+              <w:t xml:space="preserve"> vs. </w:t>
+            </w:r>
+            <w:r>
+              <w:rPr>
+                <w:rStyle w:val="affa"/>
+                <w:rFonts w:hint="eastAsia"/>
+                <w:noProof/>
+              </w:rPr>
+              <w:t>非對稱</w:t>
+            </w:r>
+            <w:r>
+              <w:rPr>
+                <w:rStyle w:val="affa"/>
+                <w:noProof/>
+              </w:rPr>
+              <w:t xml:space="preserve"> AI </w:t>
+            </w:r>
+            <w:r>
+              <w:rPr>
+                <w:rStyle w:val="affa"/>
+                <w:rFonts w:hint="eastAsia"/>
+                <w:noProof/>
+              </w:rPr>
+              <w:t>戰術比較表</w:t>
+            </w:r>
+            <w:r>
+              <w:rPr>
+                <w:noProof/>
+                <w:webHidden/>
+              </w:rPr>
+              <w:tab/>
+            </w:r>
+            <w:r>
+              <w:rPr>
+                <w:noProof/>
+                <w:webHidden/>
+              </w:rPr>
+              <w:fldChar w:fldCharType="begin"/>
+            </w:r>
+            <w:r>
+              <w:rPr>
+                <w:noProof/>
+                <w:webHidden/>
+              </w:rPr>
+              <w:instrText xml:space="preserve"> PAGEREF _Toc236071971 \h </w:instrText>
+            </w:r>
+            <w:r>
+              <w:rPr>
+                <w:noProof/>
+                <w:webHidden/>
+              </w:rPr>
+            </w:r>
+            <w:r>
+              <w:rPr>
+                <w:noProof/>
+                <w:webHidden/>
+              </w:rPr>
+              <w:fldChar w:fldCharType="separate"/>
+            </w:r>
+            <w:r>
+              <w:rPr>
+                <w:noProof/>
+                <w:webHidden/>
+              </w:rPr>
+              <w:t>7</w:t>
+            </w:r>
+            <w:r>
+              <w:rPr>
+                <w:noProof/>
+                <w:webHidden/>
+              </w:rPr>
+              <w:fldChar w:fldCharType="end"/>
+            </w:r>
+          </w:hyperlink>
+        </w:p>
+        <w:p>
+          <w:pPr>
+            <w:pStyle w:val="affb"/>
+            <w:tabs>
+              <w:tab w:val="right" w:leader="dot" w:pos="9350"/>
+            </w:tabs>
+            <w:ind w:left="1680" w:hanging="560"/>
+            <w:rPr>
+              <w:rFonts w:asciiTheme="minorHAnsi" w:eastAsiaTheme="minorEastAsia" w:hAnsiTheme="minorHAnsi" w:cstheme="minorBidi"/>
+              <w:noProof/>
+              <w:color w:val="auto"/>
+              <w:kern w:val="2"/>
+              <w:sz w:val="24"/>
+              <w:szCs w:val="24"/>
+              <w:lang w:eastAsia="zh-TW"/>
+              <w14:ligatures w14:val="standardContextual"/>
+            </w:rPr>
+          </w:pPr>
+          <w:hyperlink w:anchor="_Toc236071972" w:history="1">
+            <w:r>
+              <w:rPr>
+                <w:rStyle w:val="affa"/>
+                <w:rFonts w:hint="eastAsia"/>
+                <w:noProof/>
+              </w:rPr>
+              <w:t>表</w:t>
+            </w:r>
+            <w:r>
+              <w:rPr>
+                <w:rStyle w:val="affa"/>
+                <w:noProof/>
+              </w:rPr>
+              <w:t xml:space="preserve"> 2</w:t>
+            </w:r>
+            <w:r>
+              <w:rPr>
+                <w:rStyle w:val="affa"/>
+                <w:rFonts w:hint="eastAsia"/>
+                <w:noProof/>
+              </w:rPr>
+              <w:t>：</w:t>
+            </w:r>
+            <w:r>
+              <w:rPr>
+                <w:rStyle w:val="affa"/>
+                <w:noProof/>
+              </w:rPr>
+              <w:t xml:space="preserve">ISO 42001 (AIMS) </w:t>
+            </w:r>
+            <w:r>
+              <w:rPr>
+                <w:rStyle w:val="affa"/>
+                <w:rFonts w:hint="eastAsia"/>
+                <w:noProof/>
+              </w:rPr>
+              <w:t>通用標準</w:t>
+            </w:r>
+            <w:r>
+              <w:rPr>
+                <w:rStyle w:val="affa"/>
+                <w:noProof/>
+              </w:rPr>
+              <w:t xml:space="preserve"> vs. AIEC </w:t>
+            </w:r>
+            <w:r>
+              <w:rPr>
+                <w:rStyle w:val="affa"/>
+                <w:rFonts w:hint="eastAsia"/>
+                <w:noProof/>
+              </w:rPr>
+              <w:t>國防權責分工比較表</w:t>
+            </w:r>
+            <w:r>
+              <w:rPr>
+                <w:noProof/>
+                <w:webHidden/>
+              </w:rPr>
+              <w:tab/>
+            </w:r>
+            <w:r>
+              <w:rPr>
+                <w:noProof/>
+                <w:webHidden/>
+              </w:rPr>
+              <w:fldChar w:fldCharType="begin"/>
+            </w:r>
+            <w:r>
+              <w:rPr>
+                <w:noProof/>
+                <w:webHidden/>
+              </w:rPr>
+              <w:instrText xml:space="preserve"> PAGEREF _Toc236071972 \h </w:instrText>
+            </w:r>
+            <w:r>
+              <w:rPr>
+                <w:noProof/>
+                <w:webHidden/>
+              </w:rPr>
+            </w:r>
+            <w:r>
+              <w:rPr>
+                <w:noProof/>
+                <w:webHidden/>
+              </w:rPr>
+              <w:fldChar w:fldCharType="separate"/>
+            </w:r>
+            <w:r>
+              <w:rPr>
+                <w:noProof/>
+                <w:webHidden/>
+              </w:rPr>
+              <w:t>10</w:t>
+            </w:r>
+            <w:r>
+              <w:rPr>
+                <w:noProof/>
+                <w:webHidden/>
+              </w:rPr>
+              <w:fldChar w:fldCharType="end"/>
+            </w:r>
+          </w:hyperlink>
+        </w:p>
+        <w:p>
+          <w:pPr>
+            <w:pStyle w:val="affb"/>
+            <w:tabs>
+              <w:tab w:val="right" w:leader="dot" w:pos="9350"/>
+            </w:tabs>
+            <w:ind w:left="1680" w:hanging="560"/>
+            <w:rPr>
+              <w:rFonts w:asciiTheme="minorHAnsi" w:eastAsiaTheme="minorEastAsia" w:hAnsiTheme="minorHAnsi" w:cstheme="minorBidi"/>
+              <w:noProof/>
+              <w:color w:val="auto"/>
+              <w:kern w:val="2"/>
+              <w:sz w:val="24"/>
+              <w:szCs w:val="24"/>
+              <w:lang w:eastAsia="zh-TW"/>
+              <w14:ligatures w14:val="standardContextual"/>
+            </w:rPr>
+          </w:pPr>
+          <w:hyperlink w:anchor="_Toc236071973" w:history="1">
+            <w:r>
+              <w:rPr>
+                <w:rStyle w:val="affa"/>
+                <w:rFonts w:hint="eastAsia"/>
+                <w:noProof/>
+              </w:rPr>
+              <w:t>表</w:t>
+            </w:r>
+            <w:r>
+              <w:rPr>
+                <w:rStyle w:val="affa"/>
+                <w:noProof/>
+              </w:rPr>
+              <w:t xml:space="preserve"> 3</w:t>
+            </w:r>
+            <w:r>
+              <w:rPr>
+                <w:rStyle w:val="affa"/>
+                <w:rFonts w:hint="eastAsia"/>
+                <w:noProof/>
+              </w:rPr>
+              <w:t>：交戰規則</w:t>
+            </w:r>
+            <w:r>
+              <w:rPr>
+                <w:rStyle w:val="affa"/>
+                <w:noProof/>
+              </w:rPr>
+              <w:t xml:space="preserve"> (RoE) </w:t>
+            </w:r>
+            <w:r>
+              <w:rPr>
+                <w:rStyle w:val="affa"/>
+                <w:rFonts w:hint="eastAsia"/>
+                <w:noProof/>
+              </w:rPr>
+              <w:t>人機授權三階權能邊界比較表</w:t>
+            </w:r>
+            <w:r>
+              <w:rPr>
+                <w:rStyle w:val="affa"/>
+                <w:noProof/>
+              </w:rPr>
+              <w:t xml:space="preserve"> (HITL / HOTL / HOOTL)</w:t>
+            </w:r>
+            <w:r>
+              <w:rPr>
+                <w:noProof/>
+                <w:webHidden/>
+              </w:rPr>
+              <w:tab/>
+            </w:r>
+            <w:r>
+              <w:rPr>
+                <w:noProof/>
+                <w:webHidden/>
+              </w:rPr>
+              <w:fldChar w:fldCharType="begin"/>
+            </w:r>
+            <w:r>
+              <w:rPr>
+                <w:noProof/>
+                <w:webHidden/>
+              </w:rPr>
+              <w:instrText xml:space="preserve"> PAGEREF _Toc236071973 \h </w:instrText>
+            </w:r>
+            <w:r>
+              <w:rPr>
+                <w:noProof/>
+                <w:webHidden/>
+              </w:rPr>
+            </w:r>
+            <w:r>
+              <w:rPr>
+                <w:noProof/>
+                <w:webHidden/>
+              </w:rPr>
+              <w:fldChar w:fldCharType="separate"/>
+            </w:r>
+            <w:r>
+              <w:rPr>
+                <w:noProof/>
+                <w:webHidden/>
+              </w:rPr>
+              <w:t>10</w:t>
+            </w:r>
+            <w:r>
+              <w:rPr>
+                <w:noProof/>
+                <w:webHidden/>
+              </w:rPr>
+              <w:fldChar w:fldCharType="end"/>
+            </w:r>
+          </w:hyperlink>
+        </w:p>
+        <w:p>
+          <w:pPr>
+            <w:pStyle w:val="affb"/>
+            <w:tabs>
+              <w:tab w:val="right" w:leader="dot" w:pos="9350"/>
+            </w:tabs>
+            <w:ind w:left="1680" w:hanging="560"/>
+            <w:rPr>
+              <w:rFonts w:asciiTheme="minorHAnsi" w:eastAsiaTheme="minorEastAsia" w:hAnsiTheme="minorHAnsi" w:cstheme="minorBidi"/>
+              <w:noProof/>
+              <w:color w:val="auto"/>
+              <w:kern w:val="2"/>
+              <w:sz w:val="24"/>
+              <w:szCs w:val="24"/>
+              <w:lang w:eastAsia="zh-TW"/>
+              <w14:ligatures w14:val="standardContextual"/>
+            </w:rPr>
+          </w:pPr>
+          <w:hyperlink w:anchor="_Toc236071974" w:history="1">
+            <w:r>
+              <w:rPr>
+                <w:rStyle w:val="affa"/>
+                <w:rFonts w:hint="eastAsia"/>
+                <w:noProof/>
+              </w:rPr>
+              <w:t>表</w:t>
+            </w:r>
+            <w:r>
+              <w:rPr>
+                <w:rStyle w:val="affa"/>
+                <w:noProof/>
+              </w:rPr>
+              <w:t xml:space="preserve"> 4</w:t>
+            </w:r>
+            <w:r>
+              <w:rPr>
+                <w:rStyle w:val="affa"/>
+                <w:rFonts w:hint="eastAsia"/>
+                <w:noProof/>
+              </w:rPr>
+              <w:t>：</w:t>
+            </w:r>
+            <w:r>
+              <w:rPr>
+                <w:rStyle w:val="affa"/>
+                <w:noProof/>
+              </w:rPr>
+              <w:t xml:space="preserve">AIEC 15 </w:t>
+            </w:r>
+            <w:r>
+              <w:rPr>
+                <w:rStyle w:val="affa"/>
+                <w:rFonts w:hint="eastAsia"/>
+                <w:noProof/>
+              </w:rPr>
+              <w:t>項量化評測指標</w:t>
+            </w:r>
+            <w:r>
+              <w:rPr>
+                <w:rStyle w:val="affa"/>
+                <w:noProof/>
+              </w:rPr>
+              <w:t xml:space="preserve"> (Q1~Q15) </w:t>
+            </w:r>
+            <w:r>
+              <w:rPr>
+                <w:rStyle w:val="affa"/>
+                <w:rFonts w:hint="eastAsia"/>
+                <w:noProof/>
+              </w:rPr>
+              <w:t>與合格門檻對照總表</w:t>
+            </w:r>
+            <w:r>
+              <w:rPr>
+                <w:noProof/>
+                <w:webHidden/>
+              </w:rPr>
+              <w:tab/>
+            </w:r>
+            <w:r>
+              <w:rPr>
+                <w:noProof/>
+                <w:webHidden/>
+              </w:rPr>
+              <w:fldChar w:fldCharType="begin"/>
+            </w:r>
+            <w:r>
+              <w:rPr>
+                <w:noProof/>
+                <w:webHidden/>
+              </w:rPr>
+              <w:instrText xml:space="preserve"> PAGEREF _Toc236071974 \h </w:instrText>
+            </w:r>
+            <w:r>
+              <w:rPr>
+                <w:noProof/>
+                <w:webHidden/>
+              </w:rPr>
+            </w:r>
+            <w:r>
+              <w:rPr>
+                <w:noProof/>
+                <w:webHidden/>
+              </w:rPr>
+              <w:fldChar w:fldCharType="separate"/>
+            </w:r>
+            <w:r>
+              <w:rPr>
+                <w:noProof/>
+                <w:webHidden/>
+              </w:rPr>
+              <w:t>12</w:t>
+            </w:r>
+            <w:r>
+              <w:rPr>
+                <w:noProof/>
+                <w:webHidden/>
+              </w:rPr>
+              <w:fldChar w:fldCharType="end"/>
+            </w:r>
+          </w:hyperlink>
+        </w:p>
+        <w:p>
+          <w:pPr>
+            <w:pStyle w:val="affb"/>
+            <w:tabs>
+              <w:tab w:val="right" w:leader="dot" w:pos="9350"/>
+            </w:tabs>
+            <w:ind w:left="1680" w:hanging="560"/>
+            <w:rPr>
+              <w:rFonts w:asciiTheme="minorHAnsi" w:eastAsiaTheme="minorEastAsia" w:hAnsiTheme="minorHAnsi" w:cstheme="minorBidi"/>
+              <w:noProof/>
+              <w:color w:val="auto"/>
+              <w:kern w:val="2"/>
+              <w:sz w:val="24"/>
+              <w:szCs w:val="24"/>
+              <w:lang w:eastAsia="zh-TW"/>
+              <w14:ligatures w14:val="standardContextual"/>
+            </w:rPr>
+          </w:pPr>
+          <w:hyperlink w:anchor="_Toc236071975" w:history="1">
+            <w:r>
+              <w:rPr>
+                <w:rStyle w:val="affa"/>
+                <w:rFonts w:hint="eastAsia"/>
+                <w:noProof/>
+              </w:rPr>
+              <w:t>表</w:t>
+            </w:r>
+            <w:r>
+              <w:rPr>
+                <w:rStyle w:val="affa"/>
+                <w:noProof/>
+              </w:rPr>
+              <w:t xml:space="preserve"> 5</w:t>
+            </w:r>
+            <w:r>
+              <w:rPr>
+                <w:rStyle w:val="affa"/>
+                <w:rFonts w:hint="eastAsia"/>
+                <w:noProof/>
+              </w:rPr>
+              <w:t>：</w:t>
+            </w:r>
+            <w:r>
+              <w:rPr>
+                <w:rStyle w:val="affa"/>
+                <w:noProof/>
+              </w:rPr>
+              <w:t xml:space="preserve">AIEC </w:t>
+            </w:r>
+            <w:r>
+              <w:rPr>
+                <w:rStyle w:val="affa"/>
+                <w:rFonts w:hint="eastAsia"/>
+                <w:noProof/>
+              </w:rPr>
+              <w:t>國防</w:t>
+            </w:r>
+            <w:r>
+              <w:rPr>
+                <w:rStyle w:val="affa"/>
+                <w:noProof/>
+              </w:rPr>
+              <w:t xml:space="preserve"> AI </w:t>
+            </w:r>
+            <w:r>
+              <w:rPr>
+                <w:rStyle w:val="affa"/>
+                <w:rFonts w:hint="eastAsia"/>
+                <w:noProof/>
+              </w:rPr>
+              <w:t>導入專案</w:t>
+            </w:r>
+            <w:r>
+              <w:rPr>
+                <w:rStyle w:val="affa"/>
+                <w:noProof/>
+              </w:rPr>
+              <w:t xml:space="preserve"> 24 </w:t>
+            </w:r>
+            <w:r>
+              <w:rPr>
+                <w:rStyle w:val="affa"/>
+                <w:rFonts w:hint="eastAsia"/>
+                <w:noProof/>
+              </w:rPr>
+              <w:t>個月執行時程規劃表</w:t>
+            </w:r>
+            <w:r>
+              <w:rPr>
+                <w:noProof/>
+                <w:webHidden/>
+              </w:rPr>
+              <w:tab/>
+            </w:r>
+            <w:r>
+              <w:rPr>
+                <w:noProof/>
+                <w:webHidden/>
+              </w:rPr>
+              <w:fldChar w:fldCharType="begin"/>
+            </w:r>
+            <w:r>
+              <w:rPr>
+                <w:noProof/>
+                <w:webHidden/>
+              </w:rPr>
+              <w:instrText xml:space="preserve"> PAGEREF _Toc236071975 \h </w:instrText>
+            </w:r>
+            <w:r>
+              <w:rPr>
+                <w:noProof/>
+                <w:webHidden/>
+              </w:rPr>
+            </w:r>
+            <w:r>
+              <w:rPr>
+                <w:noProof/>
+                <w:webHidden/>
+              </w:rPr>
+              <w:fldChar w:fldCharType="separate"/>
+            </w:r>
+            <w:r>
+              <w:rPr>
+                <w:noProof/>
+                <w:webHidden/>
+              </w:rPr>
+              <w:t>15</w:t>
+            </w:r>
+            <w:r>
+              <w:rPr>
+                <w:noProof/>
+                <w:webHidden/>
+              </w:rPr>
+              <w:fldChar w:fldCharType="end"/>
+            </w:r>
+          </w:hyperlink>
+        </w:p>
+        <w:p>
+          <w:pPr>
+            <w:pStyle w:val="affb"/>
+            <w:tabs>
+              <w:tab w:val="right" w:leader="dot" w:pos="9350"/>
+            </w:tabs>
+            <w:ind w:left="1680" w:hanging="560"/>
+            <w:rPr>
+              <w:rFonts w:asciiTheme="minorHAnsi" w:eastAsiaTheme="minorEastAsia" w:hAnsiTheme="minorHAnsi" w:cstheme="minorBidi"/>
+              <w:noProof/>
+              <w:color w:val="auto"/>
+              <w:kern w:val="2"/>
+              <w:sz w:val="24"/>
+              <w:szCs w:val="24"/>
+              <w:lang w:eastAsia="zh-TW"/>
+              <w14:ligatures w14:val="standardContextual"/>
+            </w:rPr>
+          </w:pPr>
+          <w:hyperlink w:anchor="_Toc236071976" w:history="1">
+            <w:r>
+              <w:rPr>
+                <w:rStyle w:val="affa"/>
+                <w:rFonts w:hint="eastAsia"/>
+                <w:noProof/>
+              </w:rPr>
+              <w:t>表</w:t>
+            </w:r>
+            <w:r>
+              <w:rPr>
+                <w:rStyle w:val="affa"/>
+                <w:noProof/>
+              </w:rPr>
+              <w:t xml:space="preserve"> 6</w:t>
+            </w:r>
+            <w:r>
+              <w:rPr>
+                <w:rStyle w:val="affa"/>
+                <w:rFonts w:hint="eastAsia"/>
+                <w:noProof/>
+              </w:rPr>
+              <w:t>：專案人力、主權算力與軟硬體資源配置表</w:t>
+            </w:r>
+            <w:r>
+              <w:rPr>
+                <w:noProof/>
+                <w:webHidden/>
+              </w:rPr>
+              <w:tab/>
+            </w:r>
+            <w:r>
+              <w:rPr>
+                <w:noProof/>
+                <w:webHidden/>
+              </w:rPr>
+              <w:fldChar w:fldCharType="begin"/>
+            </w:r>
+            <w:r>
+              <w:rPr>
+                <w:noProof/>
+                <w:webHidden/>
+              </w:rPr>
+              <w:instrText xml:space="preserve"> PAGEREF _Toc236071976 \h </w:instrText>
+            </w:r>
+            <w:r>
+              <w:rPr>
+                <w:noProof/>
+                <w:webHidden/>
+              </w:rPr>
+            </w:r>
+            <w:r>
+              <w:rPr>
+                <w:noProof/>
+                <w:webHidden/>
+              </w:rPr>
+              <w:fldChar w:fldCharType="separate"/>
+            </w:r>
+            <w:r>
+              <w:rPr>
+                <w:noProof/>
+                <w:webHidden/>
+              </w:rPr>
+              <w:t>17</w:t>
+            </w:r>
+            <w:r>
+              <w:rPr>
+                <w:noProof/>
+                <w:webHidden/>
+              </w:rPr>
+              <w:fldChar w:fldCharType="end"/>
+            </w:r>
+          </w:hyperlink>
+        </w:p>
+        <w:p>
+          <w:pPr>
+            <w:pStyle w:val="affb"/>
+            <w:tabs>
+              <w:tab w:val="right" w:leader="dot" w:pos="9350"/>
+            </w:tabs>
+            <w:ind w:left="1680" w:hanging="560"/>
+            <w:rPr>
+              <w:rFonts w:asciiTheme="minorHAnsi" w:eastAsiaTheme="minorEastAsia" w:hAnsiTheme="minorHAnsi" w:cstheme="minorBidi"/>
+              <w:noProof/>
+              <w:color w:val="auto"/>
+              <w:kern w:val="2"/>
+              <w:sz w:val="24"/>
+              <w:szCs w:val="24"/>
+              <w:lang w:eastAsia="zh-TW"/>
+              <w14:ligatures w14:val="standardContextual"/>
+            </w:rPr>
+          </w:pPr>
+          <w:hyperlink w:anchor="_Toc236071977" w:history="1">
+            <w:r>
+              <w:rPr>
+                <w:rStyle w:val="affa"/>
+                <w:rFonts w:hint="eastAsia"/>
+                <w:noProof/>
+              </w:rPr>
+              <w:t>表</w:t>
+            </w:r>
+            <w:r>
+              <w:rPr>
+                <w:rStyle w:val="affa"/>
+                <w:noProof/>
+              </w:rPr>
+              <w:t xml:space="preserve"> 7</w:t>
+            </w:r>
+            <w:r>
+              <w:rPr>
+                <w:rStyle w:val="affa"/>
+                <w:rFonts w:hint="eastAsia"/>
+                <w:noProof/>
+              </w:rPr>
+              <w:t>：國防</w:t>
+            </w:r>
+            <w:r>
+              <w:rPr>
+                <w:rStyle w:val="affa"/>
+                <w:noProof/>
+              </w:rPr>
+              <w:t xml:space="preserve"> AI </w:t>
+            </w:r>
+            <w:r>
+              <w:rPr>
+                <w:rStyle w:val="affa"/>
+                <w:rFonts w:hint="eastAsia"/>
+                <w:noProof/>
+              </w:rPr>
+              <w:t>導入主要風險評估與處置矩陣表</w:t>
+            </w:r>
+            <w:r>
+              <w:rPr>
+                <w:noProof/>
+                <w:webHidden/>
+              </w:rPr>
+              <w:tab/>
+            </w:r>
+            <w:r>
+              <w:rPr>
+                <w:noProof/>
+                <w:webHidden/>
+              </w:rPr>
+              <w:fldChar w:fldCharType="begin"/>
+            </w:r>
+            <w:r>
+              <w:rPr>
+                <w:noProof/>
+                <w:webHidden/>
+              </w:rPr>
+              <w:instrText xml:space="preserve"> PAGEREF _Toc236071977 \h </w:instrText>
+            </w:r>
+            <w:r>
+              <w:rPr>
+                <w:noProof/>
+                <w:webHidden/>
+              </w:rPr>
+            </w:r>
+            <w:r>
+              <w:rPr>
+                <w:noProof/>
+                <w:webHidden/>
+              </w:rPr>
+              <w:fldChar w:fldCharType="separate"/>
+            </w:r>
+            <w:r>
+              <w:rPr>
+                <w:noProof/>
+                <w:webHidden/>
+              </w:rPr>
+              <w:t>17</w:t>
+            </w:r>
+            <w:r>
+              <w:rPr>
+                <w:noProof/>
+                <w:webHidden/>
+              </w:rPr>
+              <w:fldChar w:fldCharType="end"/>
+            </w:r>
+          </w:hyperlink>
+        </w:p>
+        <w:p>
           <w:r>
             <w:fldChar w:fldCharType="end"/>
           </w:r>
@@ -2705,7 +3689,7 @@
         <w:pStyle w:val="1"/>
         <w:spacing w:before="320" w:after="160"/>
       </w:pPr>
-      <w:bookmarkStart w:id="2" w:name="_Toc236071648"/>
+      <w:bookmarkStart w:id="2" w:name="_Toc236071949"/>
       <w:r>
         <w:lastRenderedPageBreak/>
         <w:t>🖼</w:t>
@@ -2726,7 +3710,7 @@
     </w:p>
     <w:sdt>
       <w:sdtPr>
-        <w:id w:val="479264506"/>
+        <w:id w:val="-1412147902"/>
         <w:docPartObj>
           <w:docPartGallery w:val="Table of Contents"/>
           <w:docPartUnique/>
@@ -2735,6 +3719,23 @@
       <w:sdtEndPr/>
       <w:sdtContent>
         <w:p>
+          <w:pPr>
+            <w:pStyle w:val="affb"/>
+            <w:tabs>
+              <w:tab w:val="right" w:leader="dot" w:pos="9350"/>
+            </w:tabs>
+            <w:ind w:left="1680" w:hanging="560"/>
+            <w:rPr>
+              <w:rFonts w:asciiTheme="minorHAnsi" w:eastAsiaTheme="minorEastAsia" w:hAnsiTheme="minorHAnsi" w:cstheme="minorBidi"/>
+              <w:noProof/>
+              <w:color w:val="auto"/>
+              <w:kern w:val="2"/>
+              <w:sz w:val="24"/>
+              <w:szCs w:val="24"/>
+              <w:lang w:eastAsia="zh-TW"/>
+              <w14:ligatures w14:val="standardContextual"/>
+            </w:rPr>
+          </w:pPr>
           <w:r>
             <w:fldChar w:fldCharType="begin"/>
           </w:r>
@@ -2750,6 +3751,406 @@
           <w:r>
             <w:fldChar w:fldCharType="separate"/>
           </w:r>
+          <w:hyperlink w:anchor="_Toc236071978" w:history="1">
+            <w:r>
+              <w:rPr>
+                <w:rStyle w:val="affa"/>
+                <w:rFonts w:hint="eastAsia"/>
+                <w:noProof/>
+              </w:rPr>
+              <w:t>圖</w:t>
+            </w:r>
+            <w:r>
+              <w:rPr>
+                <w:rStyle w:val="affa"/>
+                <w:noProof/>
+              </w:rPr>
+              <w:t xml:space="preserve"> 1</w:t>
+            </w:r>
+            <w:r>
+              <w:rPr>
+                <w:rStyle w:val="affa"/>
+                <w:rFonts w:hint="eastAsia"/>
+                <w:noProof/>
+              </w:rPr>
+              <w:t>：</w:t>
+            </w:r>
+            <w:r>
+              <w:rPr>
+                <w:rStyle w:val="affa"/>
+                <w:noProof/>
+              </w:rPr>
+              <w:t xml:space="preserve">AIEC </w:t>
+            </w:r>
+            <w:r>
+              <w:rPr>
+                <w:rStyle w:val="affa"/>
+                <w:rFonts w:hint="eastAsia"/>
+                <w:noProof/>
+              </w:rPr>
+              <w:t>國防</w:t>
+            </w:r>
+            <w:r>
+              <w:rPr>
+                <w:rStyle w:val="affa"/>
+                <w:noProof/>
+              </w:rPr>
+              <w:t xml:space="preserve"> AI </w:t>
+            </w:r>
+            <w:r>
+              <w:rPr>
+                <w:rStyle w:val="affa"/>
+                <w:rFonts w:hint="eastAsia"/>
+                <w:noProof/>
+              </w:rPr>
+              <w:t>評測五大階段標準流程圖</w:t>
+            </w:r>
+            <w:r>
+              <w:rPr>
+                <w:rStyle w:val="affa"/>
+                <w:noProof/>
+              </w:rPr>
+              <w:t xml:space="preserve"> (Nano Banana pro </w:t>
+            </w:r>
+            <w:r>
+              <w:rPr>
+                <w:rStyle w:val="affa"/>
+                <w:rFonts w:hint="eastAsia"/>
+                <w:noProof/>
+              </w:rPr>
+              <w:t>生成</w:t>
+            </w:r>
+            <w:r>
+              <w:rPr>
+                <w:rStyle w:val="affa"/>
+                <w:noProof/>
+              </w:rPr>
+              <w:t>)</w:t>
+            </w:r>
+            <w:r>
+              <w:rPr>
+                <w:noProof/>
+                <w:webHidden/>
+              </w:rPr>
+              <w:tab/>
+            </w:r>
+            <w:r>
+              <w:rPr>
+                <w:noProof/>
+                <w:webHidden/>
+              </w:rPr>
+              <w:fldChar w:fldCharType="begin"/>
+            </w:r>
+            <w:r>
+              <w:rPr>
+                <w:noProof/>
+                <w:webHidden/>
+              </w:rPr>
+              <w:instrText xml:space="preserve"> PAGEREF _Toc236071978 \h </w:instrText>
+            </w:r>
+            <w:r>
+              <w:rPr>
+                <w:noProof/>
+                <w:webHidden/>
+              </w:rPr>
+            </w:r>
+            <w:r>
+              <w:rPr>
+                <w:noProof/>
+                <w:webHidden/>
+              </w:rPr>
+              <w:fldChar w:fldCharType="separate"/>
+            </w:r>
+            <w:r>
+              <w:rPr>
+                <w:noProof/>
+                <w:webHidden/>
+              </w:rPr>
+              <w:t>11</w:t>
+            </w:r>
+            <w:r>
+              <w:rPr>
+                <w:noProof/>
+                <w:webHidden/>
+              </w:rPr>
+              <w:fldChar w:fldCharType="end"/>
+            </w:r>
+          </w:hyperlink>
+        </w:p>
+        <w:p>
+          <w:pPr>
+            <w:pStyle w:val="affb"/>
+            <w:tabs>
+              <w:tab w:val="right" w:leader="dot" w:pos="9350"/>
+            </w:tabs>
+            <w:ind w:left="1680" w:hanging="560"/>
+            <w:rPr>
+              <w:rFonts w:asciiTheme="minorHAnsi" w:eastAsiaTheme="minorEastAsia" w:hAnsiTheme="minorHAnsi" w:cstheme="minorBidi"/>
+              <w:noProof/>
+              <w:color w:val="auto"/>
+              <w:kern w:val="2"/>
+              <w:sz w:val="24"/>
+              <w:szCs w:val="24"/>
+              <w:lang w:eastAsia="zh-TW"/>
+              <w14:ligatures w14:val="standardContextual"/>
+            </w:rPr>
+          </w:pPr>
+          <w:hyperlink w:anchor="_Toc236071979" w:history="1">
+            <w:r>
+              <w:rPr>
+                <w:rStyle w:val="affa"/>
+                <w:rFonts w:hint="eastAsia"/>
+                <w:noProof/>
+              </w:rPr>
+              <w:t>圖</w:t>
+            </w:r>
+            <w:r>
+              <w:rPr>
+                <w:rStyle w:val="affa"/>
+                <w:noProof/>
+              </w:rPr>
+              <w:t xml:space="preserve"> 2</w:t>
+            </w:r>
+            <w:r>
+              <w:rPr>
+                <w:rStyle w:val="affa"/>
+                <w:rFonts w:hint="eastAsia"/>
+                <w:noProof/>
+              </w:rPr>
+              <w:t>：國防</w:t>
+            </w:r>
+            <w:r>
+              <w:rPr>
+                <w:rStyle w:val="affa"/>
+                <w:noProof/>
+              </w:rPr>
+              <w:t xml:space="preserve"> AI </w:t>
+            </w:r>
+            <w:r>
+              <w:rPr>
+                <w:rStyle w:val="affa"/>
+                <w:rFonts w:hint="eastAsia"/>
+                <w:noProof/>
+              </w:rPr>
+              <w:t>安全保密審計</w:t>
+            </w:r>
+            <w:r>
+              <w:rPr>
+                <w:rStyle w:val="affa"/>
+                <w:noProof/>
+              </w:rPr>
+              <w:t xml:space="preserve"> 3D </w:t>
+            </w:r>
+            <w:r>
+              <w:rPr>
+                <w:rStyle w:val="affa"/>
+                <w:rFonts w:hint="eastAsia"/>
+                <w:noProof/>
+              </w:rPr>
+              <w:t>縱深防禦矩陣圖</w:t>
+            </w:r>
+            <w:r>
+              <w:rPr>
+                <w:rStyle w:val="affa"/>
+                <w:noProof/>
+              </w:rPr>
+              <w:t xml:space="preserve"> (Nano Banana pro </w:t>
+            </w:r>
+            <w:r>
+              <w:rPr>
+                <w:rStyle w:val="affa"/>
+                <w:rFonts w:hint="eastAsia"/>
+                <w:noProof/>
+              </w:rPr>
+              <w:t>生成</w:t>
+            </w:r>
+            <w:r>
+              <w:rPr>
+                <w:rStyle w:val="affa"/>
+                <w:noProof/>
+              </w:rPr>
+              <w:t>)</w:t>
+            </w:r>
+            <w:r>
+              <w:rPr>
+                <w:noProof/>
+                <w:webHidden/>
+              </w:rPr>
+              <w:tab/>
+            </w:r>
+            <w:r>
+              <w:rPr>
+                <w:noProof/>
+                <w:webHidden/>
+              </w:rPr>
+              <w:fldChar w:fldCharType="begin"/>
+            </w:r>
+            <w:r>
+              <w:rPr>
+                <w:noProof/>
+                <w:webHidden/>
+              </w:rPr>
+              <w:instrText xml:space="preserve"> PAGEREF _Toc236071979 \h </w:instrText>
+            </w:r>
+            <w:r>
+              <w:rPr>
+                <w:noProof/>
+                <w:webHidden/>
+              </w:rPr>
+            </w:r>
+            <w:r>
+              <w:rPr>
+                <w:noProof/>
+                <w:webHidden/>
+              </w:rPr>
+              <w:fldChar w:fldCharType="separate"/>
+            </w:r>
+            <w:r>
+              <w:rPr>
+                <w:noProof/>
+                <w:webHidden/>
+              </w:rPr>
+              <w:t>13</w:t>
+            </w:r>
+            <w:r>
+              <w:rPr>
+                <w:noProof/>
+                <w:webHidden/>
+              </w:rPr>
+              <w:fldChar w:fldCharType="end"/>
+            </w:r>
+          </w:hyperlink>
+        </w:p>
+        <w:p>
+          <w:pPr>
+            <w:pStyle w:val="affb"/>
+            <w:tabs>
+              <w:tab w:val="right" w:leader="dot" w:pos="9350"/>
+            </w:tabs>
+            <w:ind w:left="1680" w:hanging="560"/>
+            <w:rPr>
+              <w:rFonts w:asciiTheme="minorHAnsi" w:eastAsiaTheme="minorEastAsia" w:hAnsiTheme="minorHAnsi" w:cstheme="minorBidi"/>
+              <w:noProof/>
+              <w:color w:val="auto"/>
+              <w:kern w:val="2"/>
+              <w:sz w:val="24"/>
+              <w:szCs w:val="24"/>
+              <w:lang w:eastAsia="zh-TW"/>
+              <w14:ligatures w14:val="standardContextual"/>
+            </w:rPr>
+          </w:pPr>
+          <w:hyperlink w:anchor="_Toc236071980" w:history="1">
+            <w:r>
+              <w:rPr>
+                <w:rStyle w:val="affa"/>
+                <w:rFonts w:hint="eastAsia"/>
+                <w:noProof/>
+              </w:rPr>
+              <w:t>圖</w:t>
+            </w:r>
+            <w:r>
+              <w:rPr>
+                <w:rStyle w:val="affa"/>
+                <w:noProof/>
+              </w:rPr>
+              <w:t xml:space="preserve"> 3</w:t>
+            </w:r>
+            <w:r>
+              <w:rPr>
+                <w:rStyle w:val="affa"/>
+                <w:rFonts w:hint="eastAsia"/>
+                <w:noProof/>
+              </w:rPr>
+              <w:t>：民雄院區國家級主權</w:t>
+            </w:r>
+            <w:r>
+              <w:rPr>
+                <w:rStyle w:val="affa"/>
+                <w:noProof/>
+              </w:rPr>
+              <w:t xml:space="preserve"> AI </w:t>
+            </w:r>
+            <w:r>
+              <w:rPr>
+                <w:rStyle w:val="affa"/>
+                <w:rFonts w:hint="eastAsia"/>
+                <w:noProof/>
+              </w:rPr>
+              <w:t>四層算力堆疊架構圖</w:t>
+            </w:r>
+            <w:r>
+              <w:rPr>
+                <w:rStyle w:val="affa"/>
+                <w:noProof/>
+              </w:rPr>
+              <w:t xml:space="preserve"> (Nano Banana pro </w:t>
+            </w:r>
+            <w:r>
+              <w:rPr>
+                <w:rStyle w:val="affa"/>
+                <w:rFonts w:hint="eastAsia"/>
+                <w:noProof/>
+              </w:rPr>
+              <w:t>生成</w:t>
+            </w:r>
+            <w:r>
+              <w:rPr>
+                <w:rStyle w:val="affa"/>
+                <w:noProof/>
+              </w:rPr>
+              <w:t>)</w:t>
+            </w:r>
+            <w:r>
+              <w:rPr>
+                <w:noProof/>
+                <w:webHidden/>
+              </w:rPr>
+              <w:tab/>
+            </w:r>
+            <w:r>
+              <w:rPr>
+                <w:noProof/>
+                <w:webHidden/>
+              </w:rPr>
+              <w:fldChar w:fldCharType="begin"/>
+            </w:r>
+            <w:r>
+              <w:rPr>
+                <w:noProof/>
+                <w:webHidden/>
+              </w:rPr>
+              <w:instrText xml:space="preserve"> PAGEREF _Toc236071980 \h </w:instrText>
+            </w:r>
+            <w:r>
+              <w:rPr>
+                <w:noProof/>
+                <w:webHidden/>
+              </w:rPr>
+            </w:r>
+            <w:r>
+              <w:rPr>
+                <w:noProof/>
+                <w:webHidden/>
+              </w:rPr>
+              <w:fldChar w:fldCharType="separate"/>
+            </w:r>
+            <w:r>
+              <w:rPr>
+                <w:noProof/>
+                <w:webHidden/>
+              </w:rPr>
+              <w:t>14</w:t>
+            </w:r>
+            <w:r>
+              <w:rPr>
+                <w:noProof/>
+                <w:webHidden/>
+              </w:rPr>
+              <w:fldChar w:fldCharType="end"/>
+            </w:r>
+          </w:hyperlink>
+        </w:p>
+        <w:p>
           <w:r>
             <w:fldChar w:fldCharType="end"/>
           </w:r>
@@ -2766,7 +4167,7 @@
         <w:pStyle w:val="1"/>
         <w:spacing w:before="320" w:after="160"/>
       </w:pPr>
-      <w:bookmarkStart w:id="3" w:name="_Toc236071649"/>
+      <w:bookmarkStart w:id="3" w:name="_Toc236071950"/>
       <w:r>
         <w:lastRenderedPageBreak/>
         <w:t>第一章</w:t>
@@ -2790,7 +4191,7 @@
         <w:pStyle w:val="21"/>
         <w:spacing w:before="240" w:after="160"/>
       </w:pPr>
-      <w:bookmarkStart w:id="4" w:name="_Toc236071650"/>
+      <w:bookmarkStart w:id="4" w:name="_Toc236071951"/>
       <w:r>
         <w:t xml:space="preserve">1.1 AI </w:t>
       </w:r>
@@ -2842,7 +4243,7 @@
         <w:pStyle w:val="21"/>
         <w:spacing w:before="240" w:after="160"/>
       </w:pPr>
-      <w:bookmarkStart w:id="5" w:name="_Toc236071651"/>
+      <w:bookmarkStart w:id="5" w:name="_Toc236071952"/>
       <w:r>
         <w:t xml:space="preserve">1.2 </w:t>
       </w:r>
@@ -2942,7 +4343,7 @@
         <w:pStyle w:val="21"/>
         <w:spacing w:before="240" w:after="160"/>
       </w:pPr>
-      <w:bookmarkStart w:id="6" w:name="_Toc236071652"/>
+      <w:bookmarkStart w:id="6" w:name="_Toc236071953"/>
       <w:r>
         <w:t xml:space="preserve">1.3 </w:t>
       </w:r>
@@ -2993,6 +4394,7 @@
         <w:spacing w:before="240" w:after="120"/>
         <w:jc w:val="center"/>
       </w:pPr>
+      <w:bookmarkStart w:id="7" w:name="_Toc236071971"/>
       <w:r>
         <w:rPr>
           <w:color w:val="0C2340"/>
@@ -3021,6 +4423,12 @@
         <w:fldChar w:fldCharType="separate"/>
       </w:r>
       <w:r>
+        <w:rPr>
+          <w:noProof/>
+        </w:rPr>
+        <w:t>1</w:t>
+      </w:r>
+      <w:r>
         <w:fldChar w:fldCharType="end"/>
       </w:r>
       <w:r>
@@ -3053,6 +4461,7 @@
         </w:rPr>
         <w:t>戰術比較表</w:t>
       </w:r>
+      <w:bookmarkEnd w:id="7"/>
     </w:p>
     <w:tbl>
       <w:tblPr>
@@ -3529,14 +4938,14 @@
         <w:pStyle w:val="21"/>
         <w:spacing w:before="240" w:after="160"/>
       </w:pPr>
-      <w:bookmarkStart w:id="7" w:name="_Toc236071653"/>
+      <w:bookmarkStart w:id="8" w:name="_Toc236071954"/>
       <w:r>
         <w:t xml:space="preserve">1.4 </w:t>
       </w:r>
       <w:r>
         <w:t>無人化打擊載具應用：無人機、無人船、無人潛艦、無人車與機器狗</w:t>
       </w:r>
-      <w:bookmarkEnd w:id="7"/>
+      <w:bookmarkEnd w:id="8"/>
     </w:p>
     <w:p>
       <w:pPr>
@@ -3772,7 +5181,7 @@
         <w:pStyle w:val="21"/>
         <w:spacing w:before="240" w:after="160"/>
       </w:pPr>
-      <w:bookmarkStart w:id="8" w:name="_Toc236071654"/>
+      <w:bookmarkStart w:id="9" w:name="_Toc236071955"/>
       <w:r>
         <w:t xml:space="preserve">1.5 </w:t>
       </w:r>
@@ -3782,7 +5191,7 @@
       <w:r>
         <w:t xml:space="preserve"> AI</w:t>
       </w:r>
-      <w:bookmarkEnd w:id="8"/>
+      <w:bookmarkEnd w:id="9"/>
     </w:p>
     <w:p>
       <w:pPr>
@@ -4031,14 +5440,14 @@
         <w:pStyle w:val="21"/>
         <w:spacing w:before="240" w:after="160"/>
       </w:pPr>
-      <w:bookmarkStart w:id="9" w:name="_Toc236071655"/>
+      <w:bookmarkStart w:id="10" w:name="_Toc236071956"/>
       <w:r>
         <w:t xml:space="preserve">1.6 </w:t>
       </w:r>
       <w:r>
         <w:t>適合台灣本土環境落地方案：為什麼要做、如何做、怎麼樣做</w:t>
       </w:r>
-      <w:bookmarkEnd w:id="9"/>
+      <w:bookmarkEnd w:id="10"/>
     </w:p>
     <w:p>
       <w:pPr>
@@ -4122,7 +5531,7 @@
         <w:pStyle w:val="1"/>
         <w:spacing w:before="320" w:after="160"/>
       </w:pPr>
-      <w:bookmarkStart w:id="10" w:name="_Toc236071656"/>
+      <w:bookmarkStart w:id="11" w:name="_Toc236071957"/>
       <w:r>
         <w:lastRenderedPageBreak/>
         <w:t>第二章</w:t>
@@ -4133,14 +5542,14 @@
       <w:r>
         <w:t>專案執行範圍與三大核心區塊架構</w:t>
       </w:r>
-      <w:bookmarkEnd w:id="10"/>
+      <w:bookmarkEnd w:id="11"/>
     </w:p>
     <w:p>
       <w:pPr>
         <w:pStyle w:val="21"/>
         <w:spacing w:before="240" w:after="160"/>
       </w:pPr>
-      <w:bookmarkStart w:id="11" w:name="_Toc236071657"/>
+      <w:bookmarkStart w:id="12" w:name="_Toc236071958"/>
       <w:r>
         <w:t xml:space="preserve">2.1 </w:t>
       </w:r>
@@ -4150,7 +5559,7 @@
       <w:r>
         <w:t xml:space="preserve"> (Governance &amp; Standards)</w:t>
       </w:r>
-      <w:bookmarkEnd w:id="11"/>
+      <w:bookmarkEnd w:id="12"/>
     </w:p>
     <w:p>
       <w:pPr>
@@ -4232,6 +5641,7 @@
         <w:spacing w:before="240" w:after="120"/>
         <w:jc w:val="center"/>
       </w:pPr>
+      <w:bookmarkStart w:id="13" w:name="_Toc236071972"/>
       <w:r>
         <w:rPr>
           <w:color w:val="0C2340"/>
@@ -4260,6 +5670,12 @@
         <w:fldChar w:fldCharType="separate"/>
       </w:r>
       <w:r>
+        <w:rPr>
+          <w:noProof/>
+        </w:rPr>
+        <w:t>2</w:t>
+      </w:r>
+      <w:r>
         <w:fldChar w:fldCharType="end"/>
       </w:r>
       <w:r>
@@ -4292,6 +5708,7 @@
         </w:rPr>
         <w:t>國防權責分工比較表</w:t>
       </w:r>
+      <w:bookmarkEnd w:id="13"/>
     </w:p>
     <w:tbl>
       <w:tblPr>
@@ -4779,6 +6196,7 @@
         <w:spacing w:before="240" w:after="120"/>
         <w:jc w:val="center"/>
       </w:pPr>
+      <w:bookmarkStart w:id="14" w:name="_Toc236071973"/>
       <w:r>
         <w:rPr>
           <w:color w:val="0C2340"/>
@@ -4807,6 +6225,12 @@
         <w:fldChar w:fldCharType="separate"/>
       </w:r>
       <w:r>
+        <w:rPr>
+          <w:noProof/>
+        </w:rPr>
+        <w:t>3</w:t>
+      </w:r>
+      <w:r>
         <w:fldChar w:fldCharType="end"/>
       </w:r>
       <w:r>
@@ -4833,6 +6257,7 @@
         </w:rPr>
         <w:t xml:space="preserve"> (HITL / HOTL / HOOTL)</w:t>
       </w:r>
+      <w:bookmarkEnd w:id="14"/>
     </w:p>
     <w:tbl>
       <w:tblPr>
@@ -5004,6 +6429,7 @@
                 <w:color w:val="1E293B"/>
                 <w:sz w:val="22"/>
               </w:rPr>
+              <w:lastRenderedPageBreak/>
               <w:t>HITL (</w:t>
             </w:r>
             <w:r>
@@ -5039,15 +6465,7 @@
                 <w:color w:val="1E293B"/>
                 <w:sz w:val="22"/>
               </w:rPr>
-              <w:t>最終打擊與開火決策</w:t>
-            </w:r>
-            <w:r>
-              <w:rPr>
-                <w:color w:val="1E293B"/>
-                <w:sz w:val="22"/>
-              </w:rPr>
-              <w:lastRenderedPageBreak/>
-              <w:t>者</w:t>
+              <w:t>最終打擊與開火決策者</w:t>
             </w:r>
           </w:p>
         </w:tc>
@@ -5068,16 +6486,7 @@
                 <w:color w:val="1E293B"/>
                 <w:sz w:val="22"/>
               </w:rPr>
-              <w:lastRenderedPageBreak/>
-              <w:t>僅提供目標自動識別</w:t>
-            </w:r>
-            <w:r>
-              <w:rPr>
-                <w:color w:val="1E293B"/>
-                <w:sz w:val="22"/>
-              </w:rPr>
-              <w:lastRenderedPageBreak/>
-              <w:t>與</w:t>
+              <w:t>僅提供目標自動識別與</w:t>
             </w:r>
             <w:r>
               <w:rPr>
@@ -5112,16 +6521,7 @@
                 <w:color w:val="1E293B"/>
                 <w:sz w:val="22"/>
               </w:rPr>
-              <w:lastRenderedPageBreak/>
-              <w:t>飛彈陣地、致傷性武</w:t>
-            </w:r>
-            <w:r>
-              <w:rPr>
-                <w:color w:val="1E293B"/>
-                <w:sz w:val="22"/>
-              </w:rPr>
-              <w:lastRenderedPageBreak/>
-              <w:t>器打擊、高機密情報處置</w:t>
+              <w:t>飛彈陣地、致傷性武器打擊、高機密情報處置</w:t>
             </w:r>
           </w:p>
         </w:tc>
@@ -5150,7 +6550,6 @@
                 <w:color w:val="1E293B"/>
                 <w:sz w:val="22"/>
               </w:rPr>
-              <w:lastRenderedPageBreak/>
               <w:t>HOTL (</w:t>
             </w:r>
             <w:r>
@@ -5350,7 +6749,7 @@
           <w:noProof/>
         </w:rPr>
         <w:drawing>
-          <wp:inline distT="0" distB="0" distL="0" distR="0" wp14:anchorId="4A12123D" wp14:editId="32529364">
+          <wp:inline distT="0" distB="0" distL="0" distR="0" wp14:anchorId="67548228" wp14:editId="3012142B">
             <wp:extent cx="5669280" cy="2153447"/>
             <wp:effectExtent l="0" t="0" r="0" b="0"/>
             <wp:docPr id="1" name="Picture 1"/>
@@ -5392,6 +6791,7 @@
         <w:spacing w:before="240" w:after="120"/>
         <w:jc w:val="center"/>
       </w:pPr>
+      <w:bookmarkStart w:id="15" w:name="_Toc236071978"/>
       <w:r>
         <w:rPr>
           <w:color w:val="0C2340"/>
@@ -5420,6 +6820,12 @@
         <w:fldChar w:fldCharType="separate"/>
       </w:r>
       <w:r>
+        <w:rPr>
+          <w:noProof/>
+        </w:rPr>
+        <w:t>1</w:t>
+      </w:r>
+      <w:r>
         <w:fldChar w:fldCharType="end"/>
       </w:r>
       <w:r>
@@ -5470,13 +6876,14 @@
         </w:rPr>
         <w:t>)</w:t>
       </w:r>
+      <w:bookmarkEnd w:id="15"/>
     </w:p>
     <w:p>
       <w:pPr>
         <w:pStyle w:val="21"/>
         <w:spacing w:before="240" w:after="160"/>
       </w:pPr>
-      <w:bookmarkStart w:id="12" w:name="_Toc236071658"/>
+      <w:bookmarkStart w:id="16" w:name="_Toc236071959"/>
       <w:r>
         <w:t xml:space="preserve">2.2 </w:t>
       </w:r>
@@ -5486,7 +6893,7 @@
       <w:r>
         <w:t xml:space="preserve"> (Matrix &amp; Architecture)</w:t>
       </w:r>
-      <w:bookmarkEnd w:id="12"/>
+      <w:bookmarkEnd w:id="16"/>
     </w:p>
     <w:p>
       <w:pPr>
@@ -5568,6 +6975,7 @@
         <w:spacing w:before="240" w:after="120"/>
         <w:jc w:val="center"/>
       </w:pPr>
+      <w:bookmarkStart w:id="17" w:name="_Toc236071974"/>
       <w:r>
         <w:rPr>
           <w:color w:val="0C2340"/>
@@ -5597,6 +7005,12 @@
         <w:fldChar w:fldCharType="separate"/>
       </w:r>
       <w:r>
+        <w:rPr>
+          <w:noProof/>
+        </w:rPr>
+        <w:t>4</w:t>
+      </w:r>
+      <w:r>
         <w:fldChar w:fldCharType="end"/>
       </w:r>
       <w:r>
@@ -5629,6 +7043,7 @@
         </w:rPr>
         <w:t>與合格門檻對照總表</w:t>
       </w:r>
+      <w:bookmarkEnd w:id="17"/>
     </w:p>
     <w:tbl>
       <w:tblPr>
@@ -7459,7 +8874,7 @@
           <w:noProof/>
         </w:rPr>
         <w:drawing>
-          <wp:inline distT="0" distB="0" distL="0" distR="0" wp14:anchorId="24ED2604" wp14:editId="38D83441">
+          <wp:inline distT="0" distB="0" distL="0" distR="0" wp14:anchorId="409C9514" wp14:editId="521009D7">
             <wp:extent cx="5669280" cy="2153447"/>
             <wp:effectExtent l="0" t="0" r="0" b="0"/>
             <wp:docPr id="2" name="Picture 2"/>
@@ -7501,6 +8916,7 @@
         <w:spacing w:before="240" w:after="120"/>
         <w:jc w:val="center"/>
       </w:pPr>
+      <w:bookmarkStart w:id="18" w:name="_Toc236071979"/>
       <w:r>
         <w:rPr>
           <w:color w:val="0C2340"/>
@@ -7529,6 +8945,12 @@
         <w:fldChar w:fldCharType="separate"/>
       </w:r>
       <w:r>
+        <w:rPr>
+          <w:noProof/>
+        </w:rPr>
+        <w:t>2</w:t>
+      </w:r>
+      <w:r>
         <w:fldChar w:fldCharType="end"/>
       </w:r>
       <w:r>
@@ -7579,13 +9001,14 @@
         </w:rPr>
         <w:t>)</w:t>
       </w:r>
+      <w:bookmarkEnd w:id="18"/>
     </w:p>
     <w:p>
       <w:pPr>
         <w:pStyle w:val="21"/>
         <w:spacing w:before="240" w:after="160"/>
       </w:pPr>
-      <w:bookmarkStart w:id="13" w:name="_Toc236071659"/>
+      <w:bookmarkStart w:id="19" w:name="_Toc236071960"/>
       <w:r>
         <w:t xml:space="preserve">2.3 </w:t>
       </w:r>
@@ -7595,7 +9018,7 @@
       <w:r>
         <w:t xml:space="preserve"> SOP (Application Systems &amp; SOPs)</w:t>
       </w:r>
-      <w:bookmarkEnd w:id="13"/>
+      <w:bookmarkEnd w:id="19"/>
     </w:p>
     <w:p>
       <w:pPr>
@@ -7706,7 +9129,7 @@
         </w:rPr>
         <w:lastRenderedPageBreak/>
         <w:drawing>
-          <wp:inline distT="0" distB="0" distL="0" distR="0" wp14:anchorId="5959826B" wp14:editId="59ED36C9">
+          <wp:inline distT="0" distB="0" distL="0" distR="0" wp14:anchorId="4C565452" wp14:editId="26EDB81D">
             <wp:extent cx="5669280" cy="2153447"/>
             <wp:effectExtent l="0" t="0" r="0" b="0"/>
             <wp:docPr id="3" name="Picture 3"/>
@@ -7748,6 +9171,7 @@
         <w:spacing w:before="240" w:after="120"/>
         <w:jc w:val="center"/>
       </w:pPr>
+      <w:bookmarkStart w:id="20" w:name="_Toc236071980"/>
       <w:r>
         <w:rPr>
           <w:color w:val="0C2340"/>
@@ -7776,6 +9200,12 @@
         <w:fldChar w:fldCharType="separate"/>
       </w:r>
       <w:r>
+        <w:rPr>
+          <w:noProof/>
+        </w:rPr>
+        <w:t>3</w:t>
+      </w:r>
+      <w:r>
         <w:fldChar w:fldCharType="end"/>
       </w:r>
       <w:r>
@@ -7814,6 +9244,7 @@
         </w:rPr>
         <w:t>)</w:t>
       </w:r>
+      <w:bookmarkEnd w:id="20"/>
     </w:p>
     <w:p>
       <w:r>
@@ -7825,7 +9256,7 @@
         <w:pStyle w:val="1"/>
         <w:spacing w:before="320" w:after="160"/>
       </w:pPr>
-      <w:bookmarkStart w:id="14" w:name="_Toc236071660"/>
+      <w:bookmarkStart w:id="21" w:name="_Toc236071961"/>
       <w:r>
         <w:lastRenderedPageBreak/>
         <w:t>第三章</w:t>
@@ -7842,14 +9273,14 @@
       <w:r>
         <w:t>個月時程規劃</w:t>
       </w:r>
-      <w:bookmarkEnd w:id="14"/>
+      <w:bookmarkEnd w:id="21"/>
     </w:p>
     <w:p>
       <w:pPr>
         <w:pStyle w:val="21"/>
         <w:spacing w:before="240" w:after="160"/>
       </w:pPr>
-      <w:bookmarkStart w:id="15" w:name="_Toc236071661"/>
+      <w:bookmarkStart w:id="22" w:name="_Toc236071962"/>
       <w:r>
         <w:t xml:space="preserve">3.1 </w:t>
       </w:r>
@@ -7859,7 +9290,7 @@
       <w:r>
         <w:t xml:space="preserve"> (Milestones)</w:t>
       </w:r>
-      <w:bookmarkEnd w:id="15"/>
+      <w:bookmarkEnd w:id="22"/>
     </w:p>
     <w:p>
       <w:pPr>
@@ -8206,7 +9637,7 @@
         <w:pStyle w:val="21"/>
         <w:spacing w:before="240" w:after="160"/>
       </w:pPr>
-      <w:bookmarkStart w:id="16" w:name="_Toc236071662"/>
+      <w:bookmarkStart w:id="23" w:name="_Toc236071963"/>
       <w:r>
         <w:t xml:space="preserve">3.2 24 </w:t>
       </w:r>
@@ -8216,7 +9647,7 @@
       <w:r>
         <w:t xml:space="preserve"> (Gantt Schedule)</w:t>
       </w:r>
-      <w:bookmarkEnd w:id="16"/>
+      <w:bookmarkEnd w:id="23"/>
     </w:p>
     <w:p>
       <w:pPr>
@@ -8224,6 +9655,7 @@
         <w:spacing w:before="240" w:after="120"/>
         <w:jc w:val="center"/>
       </w:pPr>
+      <w:bookmarkStart w:id="24" w:name="_Toc236071975"/>
       <w:r>
         <w:rPr>
           <w:color w:val="0C2340"/>
@@ -8252,6 +9684,12 @@
         <w:fldChar w:fldCharType="separate"/>
       </w:r>
       <w:r>
+        <w:rPr>
+          <w:noProof/>
+        </w:rPr>
+        <w:t>5</w:t>
+      </w:r>
+      <w:r>
         <w:fldChar w:fldCharType="end"/>
       </w:r>
       <w:r>
@@ -8296,6 +9734,7 @@
         </w:rPr>
         <w:t>個月執行時程規劃表</w:t>
       </w:r>
+      <w:bookmarkEnd w:id="24"/>
     </w:p>
     <w:tbl>
       <w:tblPr>
@@ -9732,7 +11171,7 @@
         <w:pStyle w:val="1"/>
         <w:spacing w:before="320" w:after="160"/>
       </w:pPr>
-      <w:bookmarkStart w:id="17" w:name="_Toc236071663"/>
+      <w:bookmarkStart w:id="25" w:name="_Toc236071964"/>
       <w:r>
         <w:lastRenderedPageBreak/>
         <w:t>第四章</w:t>
@@ -9743,21 +11182,21 @@
       <w:r>
         <w:t>資源配置與專案風險管理</w:t>
       </w:r>
-      <w:bookmarkEnd w:id="17"/>
+      <w:bookmarkEnd w:id="25"/>
     </w:p>
     <w:p>
       <w:pPr>
         <w:pStyle w:val="21"/>
         <w:spacing w:before="240" w:after="160"/>
       </w:pPr>
-      <w:bookmarkStart w:id="18" w:name="_Toc236071664"/>
+      <w:bookmarkStart w:id="26" w:name="_Toc236071965"/>
       <w:r>
         <w:t xml:space="preserve">4.1 </w:t>
       </w:r>
       <w:r>
         <w:t>軟硬體、民雄算力與人力資源配置表</w:t>
       </w:r>
-      <w:bookmarkEnd w:id="18"/>
+      <w:bookmarkEnd w:id="26"/>
     </w:p>
     <w:p>
       <w:pPr>
@@ -9765,6 +11204,7 @@
         <w:spacing w:before="240" w:after="120"/>
         <w:jc w:val="center"/>
       </w:pPr>
+      <w:bookmarkStart w:id="27" w:name="_Toc236071976"/>
       <w:r>
         <w:rPr>
           <w:color w:val="0C2340"/>
@@ -9793,6 +11233,12 @@
         <w:fldChar w:fldCharType="separate"/>
       </w:r>
       <w:r>
+        <w:rPr>
+          <w:noProof/>
+        </w:rPr>
+        <w:t>6</w:t>
+      </w:r>
+      <w:r>
         <w:fldChar w:fldCharType="end"/>
       </w:r>
       <w:r>
@@ -9801,6 +11247,7 @@
         </w:rPr>
         <w:t>：專案人力、主權算力與軟硬體資源配置表</w:t>
       </w:r>
+      <w:bookmarkEnd w:id="27"/>
     </w:p>
     <w:tbl>
       <w:tblPr>
@@ -10377,7 +11824,7 @@
         <w:pStyle w:val="21"/>
         <w:spacing w:before="240" w:after="160"/>
       </w:pPr>
-      <w:bookmarkStart w:id="19" w:name="_Toc236071665"/>
+      <w:bookmarkStart w:id="28" w:name="_Toc236071966"/>
       <w:r>
         <w:t xml:space="preserve">4.2 </w:t>
       </w:r>
@@ -10387,7 +11834,7 @@
       <w:r>
         <w:t xml:space="preserve"> (Risk Matrix)</w:t>
       </w:r>
-      <w:bookmarkEnd w:id="19"/>
+      <w:bookmarkEnd w:id="28"/>
     </w:p>
     <w:p>
       <w:pPr>
@@ -10395,6 +11842,7 @@
         <w:spacing w:before="240" w:after="120"/>
         <w:jc w:val="center"/>
       </w:pPr>
+      <w:bookmarkStart w:id="29" w:name="_Toc236071977"/>
       <w:r>
         <w:rPr>
           <w:color w:val="0C2340"/>
@@ -10423,6 +11871,12 @@
         <w:fldChar w:fldCharType="separate"/>
       </w:r>
       <w:r>
+        <w:rPr>
+          <w:noProof/>
+        </w:rPr>
+        <w:t>7</w:t>
+      </w:r>
+      <w:r>
         <w:fldChar w:fldCharType="end"/>
       </w:r>
       <w:r>
@@ -10443,6 +11897,7 @@
         </w:rPr>
         <w:t>導入主要風險評估與處置矩陣表</w:t>
       </w:r>
+      <w:bookmarkEnd w:id="29"/>
     </w:p>
     <w:tbl>
       <w:tblPr>
@@ -11126,7 +12581,7 @@
         <w:pStyle w:val="1"/>
         <w:spacing w:before="320" w:after="160"/>
       </w:pPr>
-      <w:bookmarkStart w:id="20" w:name="_Toc236071666"/>
+      <w:bookmarkStart w:id="30" w:name="_Toc236071967"/>
       <w:r>
         <w:lastRenderedPageBreak/>
         <w:t>第五章</w:t>
@@ -11137,7 +12592,7 @@
       <w:r>
         <w:t>預期效益與戰略成果</w:t>
       </w:r>
-      <w:bookmarkEnd w:id="20"/>
+      <w:bookmarkEnd w:id="30"/>
     </w:p>
     <w:p>
       <w:pPr>
@@ -11152,14 +12607,14 @@
         <w:pStyle w:val="21"/>
         <w:spacing w:before="240" w:after="160"/>
       </w:pPr>
-      <w:bookmarkStart w:id="21" w:name="_Toc236071667"/>
+      <w:bookmarkStart w:id="31" w:name="_Toc236071968"/>
       <w:r>
         <w:t xml:space="preserve">1. </w:t>
       </w:r>
       <w:r>
         <w:t>戰術作戰層面：達成極致非對稱打擊效益</w:t>
       </w:r>
-      <w:bookmarkEnd w:id="21"/>
+      <w:bookmarkEnd w:id="31"/>
     </w:p>
     <w:p>
       <w:pPr>
@@ -11186,14 +12641,14 @@
         <w:pStyle w:val="21"/>
         <w:spacing w:before="240" w:after="160"/>
       </w:pPr>
-      <w:bookmarkStart w:id="22" w:name="_Toc236071668"/>
+      <w:bookmarkStart w:id="32" w:name="_Toc236071969"/>
       <w:r>
         <w:t xml:space="preserve">2. </w:t>
       </w:r>
       <w:r>
         <w:t>資安與保密層面：建構零漏洞主權防衛屏障</w:t>
       </w:r>
-      <w:bookmarkEnd w:id="22"/>
+      <w:bookmarkEnd w:id="32"/>
     </w:p>
     <w:p>
       <w:pPr>
@@ -11244,7 +12699,7 @@
         <w:pStyle w:val="21"/>
         <w:spacing w:before="240" w:after="160"/>
       </w:pPr>
-      <w:bookmarkStart w:id="23" w:name="_Toc236071669"/>
+      <w:bookmarkStart w:id="33" w:name="_Toc236071970"/>
       <w:r>
         <w:t xml:space="preserve">3. </w:t>
       </w:r>
@@ -11257,7 +12712,7 @@
       <w:r>
         <w:t>評測認證標竿</w:t>
       </w:r>
-      <w:bookmarkEnd w:id="23"/>
+      <w:bookmarkEnd w:id="33"/>
     </w:p>
     <w:p>
       <w:pPr>
@@ -11594,31 +13049,31 @@
       </w:rPr>
     </w:lvl>
   </w:abstractNum>
-  <w:num w:numId="1" w16cid:durableId="1174148859">
+  <w:num w:numId="1" w16cid:durableId="1764566678">
     <w:abstractNumId w:val="8"/>
   </w:num>
-  <w:num w:numId="2" w16cid:durableId="435945746">
+  <w:num w:numId="2" w16cid:durableId="1790006082">
     <w:abstractNumId w:val="6"/>
   </w:num>
-  <w:num w:numId="3" w16cid:durableId="1730884016">
+  <w:num w:numId="3" w16cid:durableId="1092317919">
     <w:abstractNumId w:val="5"/>
   </w:num>
-  <w:num w:numId="4" w16cid:durableId="1080173225">
+  <w:num w:numId="4" w16cid:durableId="529756465">
     <w:abstractNumId w:val="4"/>
   </w:num>
-  <w:num w:numId="5" w16cid:durableId="1770807219">
+  <w:num w:numId="5" w16cid:durableId="1312445954">
     <w:abstractNumId w:val="7"/>
   </w:num>
-  <w:num w:numId="6" w16cid:durableId="1731609334">
+  <w:num w:numId="6" w16cid:durableId="1911378918">
     <w:abstractNumId w:val="3"/>
   </w:num>
-  <w:num w:numId="7" w16cid:durableId="1206218824">
+  <w:num w:numId="7" w16cid:durableId="1490632303">
     <w:abstractNumId w:val="2"/>
   </w:num>
-  <w:num w:numId="8" w16cid:durableId="1683819283">
+  <w:num w:numId="8" w16cid:durableId="613056217">
     <w:abstractNumId w:val="1"/>
   </w:num>
-  <w:num w:numId="9" w16cid:durableId="1048842335">
+  <w:num w:numId="9" w16cid:durableId="2079790452">
     <w:abstractNumId w:val="0"/>
   </w:num>
 </w:numbering>
@@ -23013,7 +24468,7 @@
     <w:autoRedefine/>
     <w:uiPriority w:val="39"/>
     <w:unhideWhenUsed/>
-    <w:rsid w:val="00486C13"/>
+    <w:rsid w:val="00613E3C"/>
   </w:style>
   <w:style w:type="paragraph" w:styleId="2a">
     <w:name w:val="toc 2"/>
@@ -23022,7 +24477,7 @@
     <w:autoRedefine/>
     <w:uiPriority w:val="39"/>
     <w:unhideWhenUsed/>
-    <w:rsid w:val="00486C13"/>
+    <w:rsid w:val="00613E3C"/>
     <w:pPr>
       <w:ind w:leftChars="200" w:left="480"/>
     </w:pPr>
@@ -23032,11 +24487,22 @@
     <w:basedOn w:val="a2"/>
     <w:uiPriority w:val="99"/>
     <w:unhideWhenUsed/>
-    <w:rsid w:val="00486C13"/>
+    <w:rsid w:val="00613E3C"/>
     <w:rPr>
       <w:color w:val="0000FF" w:themeColor="hyperlink"/>
       <w:u w:val="single"/>
     </w:rPr>
+  </w:style>
+  <w:style w:type="paragraph" w:styleId="affb">
+    <w:name w:val="table of figures"/>
+    <w:basedOn w:val="a1"/>
+    <w:next w:val="a1"/>
+    <w:uiPriority w:val="99"/>
+    <w:unhideWhenUsed/>
+    <w:rsid w:val="00613E3C"/>
+    <w:pPr>
+      <w:ind w:leftChars="400" w:hangingChars="200" w:hanging="200"/>
+    </w:pPr>
   </w:style>
 </w:styles>
 </file>

</xml_diff>

<commit_message>
Remove '(Nano Banana pro 生成)' suffix from all figure titles and document text
</commit_message>
<xml_diff>
--- a/AIEC國防領域AI應用導入專案規劃書.docx
+++ b/AIEC國防領域AI應用導入專案規劃書.docx
@@ -546,7 +546,7 @@
         <w:pStyle w:val="1"/>
         <w:spacing w:before="320" w:after="160"/>
       </w:pPr>
-      <w:bookmarkStart w:id="0" w:name="_Toc236071947"/>
+      <w:bookmarkStart w:id="0" w:name="_Toc236072126"/>
       <w:r>
         <w:lastRenderedPageBreak/>
         <w:t>📋</w:t>
@@ -564,7 +564,7 @@
     </w:p>
     <w:sdt>
       <w:sdtPr>
-        <w:id w:val="-1613894109"/>
+        <w:id w:val="-1346622249"/>
         <w:docPartObj>
           <w:docPartGallery w:val="Table of Contents"/>
           <w:docPartUnique/>
@@ -598,7 +598,7 @@
           <w:r>
             <w:fldChar w:fldCharType="separate"/>
           </w:r>
-          <w:hyperlink w:anchor="_Toc236071947" w:history="1">
+          <w:hyperlink w:anchor="_Toc236072126" w:history="1">
             <w:r>
               <w:rPr>
                 <w:rStyle w:val="affa"/>
@@ -648,7 +648,7 @@
                 <w:noProof/>
                 <w:webHidden/>
               </w:rPr>
-              <w:instrText xml:space="preserve"> PAGEREF _Toc236071947 \h </w:instrText>
+              <w:instrText xml:space="preserve"> PAGEREF _Toc236072126 \h </w:instrText>
             </w:r>
             <w:r>
               <w:rPr>
@@ -696,7 +696,7 @@
               <w14:ligatures w14:val="standardContextual"/>
             </w:rPr>
           </w:pPr>
-          <w:hyperlink w:anchor="_Toc236071948" w:history="1">
+          <w:hyperlink w:anchor="_Toc236072127" w:history="1">
             <w:r>
               <w:rPr>
                 <w:rStyle w:val="affa"/>
@@ -746,7 +746,7 @@
                 <w:noProof/>
                 <w:webHidden/>
               </w:rPr>
-              <w:instrText xml:space="preserve"> PAGEREF _Toc236071948 \h </w:instrText>
+              <w:instrText xml:space="preserve"> PAGEREF _Toc236072127 \h </w:instrText>
             </w:r>
             <w:r>
               <w:rPr>
@@ -794,7 +794,7 @@
               <w14:ligatures w14:val="standardContextual"/>
             </w:rPr>
           </w:pPr>
-          <w:hyperlink w:anchor="_Toc236071949" w:history="1">
+          <w:hyperlink w:anchor="_Toc236072128" w:history="1">
             <w:r>
               <w:rPr>
                 <w:rStyle w:val="affa"/>
@@ -844,7 +844,7 @@
                 <w:noProof/>
                 <w:webHidden/>
               </w:rPr>
-              <w:instrText xml:space="preserve"> PAGEREF _Toc236071949 \h </w:instrText>
+              <w:instrText xml:space="preserve"> PAGEREF _Toc236072128 \h </w:instrText>
             </w:r>
             <w:r>
               <w:rPr>
@@ -892,7 +892,7 @@
               <w14:ligatures w14:val="standardContextual"/>
             </w:rPr>
           </w:pPr>
-          <w:hyperlink w:anchor="_Toc236071950" w:history="1">
+          <w:hyperlink w:anchor="_Toc236072129" w:history="1">
             <w:r>
               <w:rPr>
                 <w:rStyle w:val="affa"/>
@@ -950,7 +950,7 @@
                 <w:noProof/>
                 <w:webHidden/>
               </w:rPr>
-              <w:instrText xml:space="preserve"> PAGEREF _Toc236071950 \h </w:instrText>
+              <w:instrText xml:space="preserve"> PAGEREF _Toc236072129 \h </w:instrText>
             </w:r>
             <w:r>
               <w:rPr>
@@ -999,7 +999,7 @@
               <w14:ligatures w14:val="standardContextual"/>
             </w:rPr>
           </w:pPr>
-          <w:hyperlink w:anchor="_Toc236071951" w:history="1">
+          <w:hyperlink w:anchor="_Toc236072130" w:history="1">
             <w:r>
               <w:rPr>
                 <w:rStyle w:val="affa"/>
@@ -1034,7 +1034,7 @@
                 <w:noProof/>
                 <w:webHidden/>
               </w:rPr>
-              <w:instrText xml:space="preserve"> PAGEREF _Toc236071951 \h </w:instrText>
+              <w:instrText xml:space="preserve"> PAGEREF _Toc236072130 \h </w:instrText>
             </w:r>
             <w:r>
               <w:rPr>
@@ -1083,7 +1083,7 @@
               <w14:ligatures w14:val="standardContextual"/>
             </w:rPr>
           </w:pPr>
-          <w:hyperlink w:anchor="_Toc236071952" w:history="1">
+          <w:hyperlink w:anchor="_Toc236072131" w:history="1">
             <w:r>
               <w:rPr>
                 <w:rStyle w:val="affa"/>
@@ -1133,7 +1133,7 @@
                 <w:noProof/>
                 <w:webHidden/>
               </w:rPr>
-              <w:instrText xml:space="preserve"> PAGEREF _Toc236071952 \h </w:instrText>
+              <w:instrText xml:space="preserve"> PAGEREF _Toc236072131 \h </w:instrText>
             </w:r>
             <w:r>
               <w:rPr>
@@ -1182,7 +1182,7 @@
               <w14:ligatures w14:val="standardContextual"/>
             </w:rPr>
           </w:pPr>
-          <w:hyperlink w:anchor="_Toc236071953" w:history="1">
+          <w:hyperlink w:anchor="_Toc236072132" w:history="1">
             <w:r>
               <w:rPr>
                 <w:rStyle w:val="affa"/>
@@ -1232,7 +1232,7 @@
                 <w:noProof/>
                 <w:webHidden/>
               </w:rPr>
-              <w:instrText xml:space="preserve"> PAGEREF _Toc236071953 \h </w:instrText>
+              <w:instrText xml:space="preserve"> PAGEREF _Toc236072132 \h </w:instrText>
             </w:r>
             <w:r>
               <w:rPr>
@@ -1281,7 +1281,7 @@
               <w14:ligatures w14:val="standardContextual"/>
             </w:rPr>
           </w:pPr>
-          <w:hyperlink w:anchor="_Toc236071954" w:history="1">
+          <w:hyperlink w:anchor="_Toc236072133" w:history="1">
             <w:r>
               <w:rPr>
                 <w:rStyle w:val="affa"/>
@@ -1316,7 +1316,7 @@
                 <w:noProof/>
                 <w:webHidden/>
               </w:rPr>
-              <w:instrText xml:space="preserve"> PAGEREF _Toc236071954 \h </w:instrText>
+              <w:instrText xml:space="preserve"> PAGEREF _Toc236072133 \h </w:instrText>
             </w:r>
             <w:r>
               <w:rPr>
@@ -1365,7 +1365,7 @@
               <w14:ligatures w14:val="standardContextual"/>
             </w:rPr>
           </w:pPr>
-          <w:hyperlink w:anchor="_Toc236071955" w:history="1">
+          <w:hyperlink w:anchor="_Toc236072134" w:history="1">
             <w:r>
               <w:rPr>
                 <w:rStyle w:val="affa"/>
@@ -1407,7 +1407,7 @@
                 <w:noProof/>
                 <w:webHidden/>
               </w:rPr>
-              <w:instrText xml:space="preserve"> PAGEREF _Toc236071955 \h </w:instrText>
+              <w:instrText xml:space="preserve"> PAGEREF _Toc236072134 \h </w:instrText>
             </w:r>
             <w:r>
               <w:rPr>
@@ -1456,7 +1456,7 @@
               <w14:ligatures w14:val="standardContextual"/>
             </w:rPr>
           </w:pPr>
-          <w:hyperlink w:anchor="_Toc236071956" w:history="1">
+          <w:hyperlink w:anchor="_Toc236072135" w:history="1">
             <w:r>
               <w:rPr>
                 <w:rStyle w:val="affa"/>
@@ -1491,7 +1491,7 @@
                 <w:noProof/>
                 <w:webHidden/>
               </w:rPr>
-              <w:instrText xml:space="preserve"> PAGEREF _Toc236071956 \h </w:instrText>
+              <w:instrText xml:space="preserve"> PAGEREF _Toc236072135 \h </w:instrText>
             </w:r>
             <w:r>
               <w:rPr>
@@ -1539,7 +1539,7 @@
               <w14:ligatures w14:val="standardContextual"/>
             </w:rPr>
           </w:pPr>
-          <w:hyperlink w:anchor="_Toc236071957" w:history="1">
+          <w:hyperlink w:anchor="_Toc236072136" w:history="1">
             <w:r>
               <w:rPr>
                 <w:rStyle w:val="affa"/>
@@ -1582,7 +1582,7 @@
                 <w:noProof/>
                 <w:webHidden/>
               </w:rPr>
-              <w:instrText xml:space="preserve"> PAGEREF _Toc236071957 \h </w:instrText>
+              <w:instrText xml:space="preserve"> PAGEREF _Toc236072136 \h </w:instrText>
             </w:r>
             <w:r>
               <w:rPr>
@@ -1631,7 +1631,7 @@
               <w14:ligatures w14:val="standardContextual"/>
             </w:rPr>
           </w:pPr>
-          <w:hyperlink w:anchor="_Toc236071958" w:history="1">
+          <w:hyperlink w:anchor="_Toc236072137" w:history="1">
             <w:r>
               <w:rPr>
                 <w:rStyle w:val="affa"/>
@@ -1673,7 +1673,7 @@
                 <w:noProof/>
                 <w:webHidden/>
               </w:rPr>
-              <w:instrText xml:space="preserve"> PAGEREF _Toc236071958 \h </w:instrText>
+              <w:instrText xml:space="preserve"> PAGEREF _Toc236072137 \h </w:instrText>
             </w:r>
             <w:r>
               <w:rPr>
@@ -1722,7 +1722,7 @@
               <w14:ligatures w14:val="standardContextual"/>
             </w:rPr>
           </w:pPr>
-          <w:hyperlink w:anchor="_Toc236071959" w:history="1">
+          <w:hyperlink w:anchor="_Toc236072138" w:history="1">
             <w:r>
               <w:rPr>
                 <w:rStyle w:val="affa"/>
@@ -1764,7 +1764,7 @@
                 <w:noProof/>
                 <w:webHidden/>
               </w:rPr>
-              <w:instrText xml:space="preserve"> PAGEREF _Toc236071959 \h </w:instrText>
+              <w:instrText xml:space="preserve"> PAGEREF _Toc236072138 \h </w:instrText>
             </w:r>
             <w:r>
               <w:rPr>
@@ -1813,7 +1813,7 @@
               <w14:ligatures w14:val="standardContextual"/>
             </w:rPr>
           </w:pPr>
-          <w:hyperlink w:anchor="_Toc236071960" w:history="1">
+          <w:hyperlink w:anchor="_Toc236072139" w:history="1">
             <w:r>
               <w:rPr>
                 <w:rStyle w:val="affa"/>
@@ -1855,7 +1855,7 @@
                 <w:noProof/>
                 <w:webHidden/>
               </w:rPr>
-              <w:instrText xml:space="preserve"> PAGEREF _Toc236071960 \h </w:instrText>
+              <w:instrText xml:space="preserve"> PAGEREF _Toc236072139 \h </w:instrText>
             </w:r>
             <w:r>
               <w:rPr>
@@ -1903,7 +1903,7 @@
               <w14:ligatures w14:val="standardContextual"/>
             </w:rPr>
           </w:pPr>
-          <w:hyperlink w:anchor="_Toc236071961" w:history="1">
+          <w:hyperlink w:anchor="_Toc236072140" w:history="1">
             <w:r>
               <w:rPr>
                 <w:rStyle w:val="affa"/>
@@ -1961,7 +1961,7 @@
                 <w:noProof/>
                 <w:webHidden/>
               </w:rPr>
-              <w:instrText xml:space="preserve"> PAGEREF _Toc236071961 \h </w:instrText>
+              <w:instrText xml:space="preserve"> PAGEREF _Toc236072140 \h </w:instrText>
             </w:r>
             <w:r>
               <w:rPr>
@@ -2010,7 +2010,7 @@
               <w14:ligatures w14:val="standardContextual"/>
             </w:rPr>
           </w:pPr>
-          <w:hyperlink w:anchor="_Toc236071962" w:history="1">
+          <w:hyperlink w:anchor="_Toc236072141" w:history="1">
             <w:r>
               <w:rPr>
                 <w:rStyle w:val="affa"/>
@@ -2052,7 +2052,7 @@
                 <w:noProof/>
                 <w:webHidden/>
               </w:rPr>
-              <w:instrText xml:space="preserve"> PAGEREF _Toc236071962 \h </w:instrText>
+              <w:instrText xml:space="preserve"> PAGEREF _Toc236072141 \h </w:instrText>
             </w:r>
             <w:r>
               <w:rPr>
@@ -2101,7 +2101,7 @@
               <w14:ligatures w14:val="standardContextual"/>
             </w:rPr>
           </w:pPr>
-          <w:hyperlink w:anchor="_Toc236071963" w:history="1">
+          <w:hyperlink w:anchor="_Toc236072142" w:history="1">
             <w:r>
               <w:rPr>
                 <w:rStyle w:val="affa"/>
@@ -2143,7 +2143,7 @@
                 <w:noProof/>
                 <w:webHidden/>
               </w:rPr>
-              <w:instrText xml:space="preserve"> PAGEREF _Toc236071963 \h </w:instrText>
+              <w:instrText xml:space="preserve"> PAGEREF _Toc236072142 \h </w:instrText>
             </w:r>
             <w:r>
               <w:rPr>
@@ -2191,7 +2191,7 @@
               <w14:ligatures w14:val="standardContextual"/>
             </w:rPr>
           </w:pPr>
-          <w:hyperlink w:anchor="_Toc236071964" w:history="1">
+          <w:hyperlink w:anchor="_Toc236072143" w:history="1">
             <w:r>
               <w:rPr>
                 <w:rStyle w:val="affa"/>
@@ -2234,7 +2234,7 @@
                 <w:noProof/>
                 <w:webHidden/>
               </w:rPr>
-              <w:instrText xml:space="preserve"> PAGEREF _Toc236071964 \h </w:instrText>
+              <w:instrText xml:space="preserve"> PAGEREF _Toc236072143 \h </w:instrText>
             </w:r>
             <w:r>
               <w:rPr>
@@ -2283,7 +2283,7 @@
               <w14:ligatures w14:val="standardContextual"/>
             </w:rPr>
           </w:pPr>
-          <w:hyperlink w:anchor="_Toc236071965" w:history="1">
+          <w:hyperlink w:anchor="_Toc236072144" w:history="1">
             <w:r>
               <w:rPr>
                 <w:rStyle w:val="affa"/>
@@ -2318,7 +2318,7 @@
                 <w:noProof/>
                 <w:webHidden/>
               </w:rPr>
-              <w:instrText xml:space="preserve"> PAGEREF _Toc236071965 \h </w:instrText>
+              <w:instrText xml:space="preserve"> PAGEREF _Toc236072144 \h </w:instrText>
             </w:r>
             <w:r>
               <w:rPr>
@@ -2367,7 +2367,7 @@
               <w14:ligatures w14:val="standardContextual"/>
             </w:rPr>
           </w:pPr>
-          <w:hyperlink w:anchor="_Toc236071966" w:history="1">
+          <w:hyperlink w:anchor="_Toc236072145" w:history="1">
             <w:r>
               <w:rPr>
                 <w:rStyle w:val="affa"/>
@@ -2409,7 +2409,7 @@
                 <w:noProof/>
                 <w:webHidden/>
               </w:rPr>
-              <w:instrText xml:space="preserve"> PAGEREF _Toc236071966 \h </w:instrText>
+              <w:instrText xml:space="preserve"> PAGEREF _Toc236072145 \h </w:instrText>
             </w:r>
             <w:r>
               <w:rPr>
@@ -2457,7 +2457,7 @@
               <w14:ligatures w14:val="standardContextual"/>
             </w:rPr>
           </w:pPr>
-          <w:hyperlink w:anchor="_Toc236071967" w:history="1">
+          <w:hyperlink w:anchor="_Toc236072146" w:history="1">
             <w:r>
               <w:rPr>
                 <w:rStyle w:val="affa"/>
@@ -2500,7 +2500,7 @@
                 <w:noProof/>
                 <w:webHidden/>
               </w:rPr>
-              <w:instrText xml:space="preserve"> PAGEREF _Toc236071967 \h </w:instrText>
+              <w:instrText xml:space="preserve"> PAGEREF _Toc236072146 \h </w:instrText>
             </w:r>
             <w:r>
               <w:rPr>
@@ -2549,7 +2549,7 @@
               <w14:ligatures w14:val="standardContextual"/>
             </w:rPr>
           </w:pPr>
-          <w:hyperlink w:anchor="_Toc236071968" w:history="1">
+          <w:hyperlink w:anchor="_Toc236072147" w:history="1">
             <w:r>
               <w:rPr>
                 <w:rStyle w:val="affa"/>
@@ -2584,7 +2584,7 @@
                 <w:noProof/>
                 <w:webHidden/>
               </w:rPr>
-              <w:instrText xml:space="preserve"> PAGEREF _Toc236071968 \h </w:instrText>
+              <w:instrText xml:space="preserve"> PAGEREF _Toc236072147 \h </w:instrText>
             </w:r>
             <w:r>
               <w:rPr>
@@ -2633,7 +2633,7 @@
               <w14:ligatures w14:val="standardContextual"/>
             </w:rPr>
           </w:pPr>
-          <w:hyperlink w:anchor="_Toc236071969" w:history="1">
+          <w:hyperlink w:anchor="_Toc236072148" w:history="1">
             <w:r>
               <w:rPr>
                 <w:rStyle w:val="affa"/>
@@ -2668,7 +2668,7 @@
                 <w:noProof/>
                 <w:webHidden/>
               </w:rPr>
-              <w:instrText xml:space="preserve"> PAGEREF _Toc236071969 \h </w:instrText>
+              <w:instrText xml:space="preserve"> PAGEREF _Toc236072148 \h </w:instrText>
             </w:r>
             <w:r>
               <w:rPr>
@@ -2717,7 +2717,7 @@
               <w14:ligatures w14:val="standardContextual"/>
             </w:rPr>
           </w:pPr>
-          <w:hyperlink w:anchor="_Toc236071970" w:history="1">
+          <w:hyperlink w:anchor="_Toc236072149" w:history="1">
             <w:r>
               <w:rPr>
                 <w:rStyle w:val="affa"/>
@@ -2767,7 +2767,7 @@
                 <w:noProof/>
                 <w:webHidden/>
               </w:rPr>
-              <w:instrText xml:space="preserve"> PAGEREF _Toc236071970 \h </w:instrText>
+              <w:instrText xml:space="preserve"> PAGEREF _Toc236072149 \h </w:instrText>
             </w:r>
             <w:r>
               <w:rPr>
@@ -2815,7 +2815,7 @@
         <w:pStyle w:val="1"/>
         <w:spacing w:before="320" w:after="160"/>
       </w:pPr>
-      <w:bookmarkStart w:id="1" w:name="_Toc236071948"/>
+      <w:bookmarkStart w:id="1" w:name="_Toc236072127"/>
       <w:r>
         <w:lastRenderedPageBreak/>
         <w:t>📊</w:t>
@@ -2833,7 +2833,7 @@
     </w:p>
     <w:sdt>
       <w:sdtPr>
-        <w:id w:val="288018844"/>
+        <w:id w:val="-2123833900"/>
         <w:docPartObj>
           <w:docPartGallery w:val="Table of Contents"/>
           <w:docPartUnique/>
@@ -2874,7 +2874,7 @@
           <w:r>
             <w:fldChar w:fldCharType="separate"/>
           </w:r>
-          <w:hyperlink w:anchor="_Toc236071971" w:history="1">
+          <w:hyperlink w:anchor="_Toc236072150" w:history="1">
             <w:r>
               <w:rPr>
                 <w:rStyle w:val="affa"/>
@@ -2947,7 +2947,7 @@
                 <w:noProof/>
                 <w:webHidden/>
               </w:rPr>
-              <w:instrText xml:space="preserve"> PAGEREF _Toc236071971 \h </w:instrText>
+              <w:instrText xml:space="preserve"> PAGEREF _Toc236072150 \h </w:instrText>
             </w:r>
             <w:r>
               <w:rPr>
@@ -2996,7 +2996,7 @@
               <w14:ligatures w14:val="standardContextual"/>
             </w:rPr>
           </w:pPr>
-          <w:hyperlink w:anchor="_Toc236071972" w:history="1">
+          <w:hyperlink w:anchor="_Toc236072151" w:history="1">
             <w:r>
               <w:rPr>
                 <w:rStyle w:val="affa"/>
@@ -3069,7 +3069,7 @@
                 <w:noProof/>
                 <w:webHidden/>
               </w:rPr>
-              <w:instrText xml:space="preserve"> PAGEREF _Toc236071972 \h </w:instrText>
+              <w:instrText xml:space="preserve"> PAGEREF _Toc236072151 \h </w:instrText>
             </w:r>
             <w:r>
               <w:rPr>
@@ -3118,7 +3118,7 @@
               <w14:ligatures w14:val="standardContextual"/>
             </w:rPr>
           </w:pPr>
-          <w:hyperlink w:anchor="_Toc236071973" w:history="1">
+          <w:hyperlink w:anchor="_Toc236072152" w:history="1">
             <w:r>
               <w:rPr>
                 <w:rStyle w:val="affa"/>
@@ -3183,7 +3183,7 @@
                 <w:noProof/>
                 <w:webHidden/>
               </w:rPr>
-              <w:instrText xml:space="preserve"> PAGEREF _Toc236071973 \h </w:instrText>
+              <w:instrText xml:space="preserve"> PAGEREF _Toc236072152 \h </w:instrText>
             </w:r>
             <w:r>
               <w:rPr>
@@ -3232,7 +3232,7 @@
               <w14:ligatures w14:val="standardContextual"/>
             </w:rPr>
           </w:pPr>
-          <w:hyperlink w:anchor="_Toc236071974" w:history="1">
+          <w:hyperlink w:anchor="_Toc236072153" w:history="1">
             <w:r>
               <w:rPr>
                 <w:rStyle w:val="affa"/>
@@ -3305,7 +3305,7 @@
                 <w:noProof/>
                 <w:webHidden/>
               </w:rPr>
-              <w:instrText xml:space="preserve"> PAGEREF _Toc236071974 \h </w:instrText>
+              <w:instrText xml:space="preserve"> PAGEREF _Toc236072153 \h </w:instrText>
             </w:r>
             <w:r>
               <w:rPr>
@@ -3354,7 +3354,7 @@
               <w14:ligatures w14:val="standardContextual"/>
             </w:rPr>
           </w:pPr>
-          <w:hyperlink w:anchor="_Toc236071975" w:history="1">
+          <w:hyperlink w:anchor="_Toc236072154" w:history="1">
             <w:r>
               <w:rPr>
                 <w:rStyle w:val="affa"/>
@@ -3442,7 +3442,7 @@
                 <w:noProof/>
                 <w:webHidden/>
               </w:rPr>
-              <w:instrText xml:space="preserve"> PAGEREF _Toc236071975 \h </w:instrText>
+              <w:instrText xml:space="preserve"> PAGEREF _Toc236072154 \h </w:instrText>
             </w:r>
             <w:r>
               <w:rPr>
@@ -3491,7 +3491,7 @@
               <w14:ligatures w14:val="standardContextual"/>
             </w:rPr>
           </w:pPr>
-          <w:hyperlink w:anchor="_Toc236071976" w:history="1">
+          <w:hyperlink w:anchor="_Toc236072155" w:history="1">
             <w:r>
               <w:rPr>
                 <w:rStyle w:val="affa"/>
@@ -3534,7 +3534,7 @@
                 <w:noProof/>
                 <w:webHidden/>
               </w:rPr>
-              <w:instrText xml:space="preserve"> PAGEREF _Toc236071976 \h </w:instrText>
+              <w:instrText xml:space="preserve"> PAGEREF _Toc236072155 \h </w:instrText>
             </w:r>
             <w:r>
               <w:rPr>
@@ -3583,7 +3583,7 @@
               <w14:ligatures w14:val="standardContextual"/>
             </w:rPr>
           </w:pPr>
-          <w:hyperlink w:anchor="_Toc236071977" w:history="1">
+          <w:hyperlink w:anchor="_Toc236072156" w:history="1">
             <w:r>
               <w:rPr>
                 <w:rStyle w:val="affa"/>
@@ -3641,7 +3641,7 @@
                 <w:noProof/>
                 <w:webHidden/>
               </w:rPr>
-              <w:instrText xml:space="preserve"> PAGEREF _Toc236071977 \h </w:instrText>
+              <w:instrText xml:space="preserve"> PAGEREF _Toc236072156 \h </w:instrText>
             </w:r>
             <w:r>
               <w:rPr>
@@ -3689,7 +3689,7 @@
         <w:pStyle w:val="1"/>
         <w:spacing w:before="320" w:after="160"/>
       </w:pPr>
-      <w:bookmarkStart w:id="2" w:name="_Toc236071949"/>
+      <w:bookmarkStart w:id="2" w:name="_Toc236072128"/>
       <w:r>
         <w:lastRenderedPageBreak/>
         <w:t>🖼</w:t>
@@ -3710,7 +3710,7 @@
     </w:p>
     <w:sdt>
       <w:sdtPr>
-        <w:id w:val="-1412147902"/>
+        <w:id w:val="-2085521204"/>
         <w:docPartObj>
           <w:docPartGallery w:val="Table of Contents"/>
           <w:docPartUnique/>
@@ -3751,7 +3751,7 @@
           <w:r>
             <w:fldChar w:fldCharType="separate"/>
           </w:r>
-          <w:hyperlink w:anchor="_Toc236071978" w:history="1">
+          <w:hyperlink w:anchor="_Toc236072157" w:history="1">
             <w:r>
               <w:rPr>
                 <w:rStyle w:val="affa"/>
@@ -3807,28 +3807,6 @@
             </w:r>
             <w:r>
               <w:rPr>
-                <w:rStyle w:val="affa"/>
-                <w:noProof/>
-              </w:rPr>
-              <w:t xml:space="preserve"> (Nano Banana pro </w:t>
-            </w:r>
-            <w:r>
-              <w:rPr>
-                <w:rStyle w:val="affa"/>
-                <w:rFonts w:hint="eastAsia"/>
-                <w:noProof/>
-              </w:rPr>
-              <w:t>生成</w:t>
-            </w:r>
-            <w:r>
-              <w:rPr>
-                <w:rStyle w:val="affa"/>
-                <w:noProof/>
-              </w:rPr>
-              <w:t>)</w:t>
-            </w:r>
-            <w:r>
-              <w:rPr>
                 <w:noProof/>
                 <w:webHidden/>
               </w:rPr>
@@ -3846,7 +3824,7 @@
                 <w:noProof/>
                 <w:webHidden/>
               </w:rPr>
-              <w:instrText xml:space="preserve"> PAGEREF _Toc236071978 \h </w:instrText>
+              <w:instrText xml:space="preserve"> PAGEREF _Toc236072157 \h </w:instrText>
             </w:r>
             <w:r>
               <w:rPr>
@@ -3895,7 +3873,7 @@
               <w14:ligatures w14:val="standardContextual"/>
             </w:rPr>
           </w:pPr>
-          <w:hyperlink w:anchor="_Toc236071979" w:history="1">
+          <w:hyperlink w:anchor="_Toc236072158" w:history="1">
             <w:r>
               <w:rPr>
                 <w:rStyle w:val="affa"/>
@@ -3951,28 +3929,6 @@
             </w:r>
             <w:r>
               <w:rPr>
-                <w:rStyle w:val="affa"/>
-                <w:noProof/>
-              </w:rPr>
-              <w:t xml:space="preserve"> (Nano Banana pro </w:t>
-            </w:r>
-            <w:r>
-              <w:rPr>
-                <w:rStyle w:val="affa"/>
-                <w:rFonts w:hint="eastAsia"/>
-                <w:noProof/>
-              </w:rPr>
-              <w:t>生成</w:t>
-            </w:r>
-            <w:r>
-              <w:rPr>
-                <w:rStyle w:val="affa"/>
-                <w:noProof/>
-              </w:rPr>
-              <w:t>)</w:t>
-            </w:r>
-            <w:r>
-              <w:rPr>
                 <w:noProof/>
                 <w:webHidden/>
               </w:rPr>
@@ -3990,7 +3946,7 @@
                 <w:noProof/>
                 <w:webHidden/>
               </w:rPr>
-              <w:instrText xml:space="preserve"> PAGEREF _Toc236071979 \h </w:instrText>
+              <w:instrText xml:space="preserve"> PAGEREF _Toc236072158 \h </w:instrText>
             </w:r>
             <w:r>
               <w:rPr>
@@ -4039,7 +3995,7 @@
               <w14:ligatures w14:val="standardContextual"/>
             </w:rPr>
           </w:pPr>
-          <w:hyperlink w:anchor="_Toc236071980" w:history="1">
+          <w:hyperlink w:anchor="_Toc236072159" w:history="1">
             <w:r>
               <w:rPr>
                 <w:rStyle w:val="affa"/>
@@ -4080,28 +4036,6 @@
             </w:r>
             <w:r>
               <w:rPr>
-                <w:rStyle w:val="affa"/>
-                <w:noProof/>
-              </w:rPr>
-              <w:t xml:space="preserve"> (Nano Banana pro </w:t>
-            </w:r>
-            <w:r>
-              <w:rPr>
-                <w:rStyle w:val="affa"/>
-                <w:rFonts w:hint="eastAsia"/>
-                <w:noProof/>
-              </w:rPr>
-              <w:t>生成</w:t>
-            </w:r>
-            <w:r>
-              <w:rPr>
-                <w:rStyle w:val="affa"/>
-                <w:noProof/>
-              </w:rPr>
-              <w:t>)</w:t>
-            </w:r>
-            <w:r>
-              <w:rPr>
                 <w:noProof/>
                 <w:webHidden/>
               </w:rPr>
@@ -4119,7 +4053,7 @@
                 <w:noProof/>
                 <w:webHidden/>
               </w:rPr>
-              <w:instrText xml:space="preserve"> PAGEREF _Toc236071980 \h </w:instrText>
+              <w:instrText xml:space="preserve"> PAGEREF _Toc236072159 \h </w:instrText>
             </w:r>
             <w:r>
               <w:rPr>
@@ -4167,7 +4101,7 @@
         <w:pStyle w:val="1"/>
         <w:spacing w:before="320" w:after="160"/>
       </w:pPr>
-      <w:bookmarkStart w:id="3" w:name="_Toc236071950"/>
+      <w:bookmarkStart w:id="3" w:name="_Toc236072129"/>
       <w:r>
         <w:lastRenderedPageBreak/>
         <w:t>第一章</w:t>
@@ -4191,7 +4125,7 @@
         <w:pStyle w:val="21"/>
         <w:spacing w:before="240" w:after="160"/>
       </w:pPr>
-      <w:bookmarkStart w:id="4" w:name="_Toc236071951"/>
+      <w:bookmarkStart w:id="4" w:name="_Toc236072130"/>
       <w:r>
         <w:t xml:space="preserve">1.1 AI </w:t>
       </w:r>
@@ -4243,7 +4177,7 @@
         <w:pStyle w:val="21"/>
         <w:spacing w:before="240" w:after="160"/>
       </w:pPr>
-      <w:bookmarkStart w:id="5" w:name="_Toc236071952"/>
+      <w:bookmarkStart w:id="5" w:name="_Toc236072131"/>
       <w:r>
         <w:t xml:space="preserve">1.2 </w:t>
       </w:r>
@@ -4343,7 +4277,7 @@
         <w:pStyle w:val="21"/>
         <w:spacing w:before="240" w:after="160"/>
       </w:pPr>
-      <w:bookmarkStart w:id="6" w:name="_Toc236071953"/>
+      <w:bookmarkStart w:id="6" w:name="_Toc236072132"/>
       <w:r>
         <w:t xml:space="preserve">1.3 </w:t>
       </w:r>
@@ -4394,7 +4328,7 @@
         <w:spacing w:before="240" w:after="120"/>
         <w:jc w:val="center"/>
       </w:pPr>
-      <w:bookmarkStart w:id="7" w:name="_Toc236071971"/>
+      <w:bookmarkStart w:id="7" w:name="_Toc236072150"/>
       <w:r>
         <w:rPr>
           <w:color w:val="0C2340"/>
@@ -4938,7 +4872,7 @@
         <w:pStyle w:val="21"/>
         <w:spacing w:before="240" w:after="160"/>
       </w:pPr>
-      <w:bookmarkStart w:id="8" w:name="_Toc236071954"/>
+      <w:bookmarkStart w:id="8" w:name="_Toc236072133"/>
       <w:r>
         <w:t xml:space="preserve">1.4 </w:t>
       </w:r>
@@ -5181,7 +5115,7 @@
         <w:pStyle w:val="21"/>
         <w:spacing w:before="240" w:after="160"/>
       </w:pPr>
-      <w:bookmarkStart w:id="9" w:name="_Toc236071955"/>
+      <w:bookmarkStart w:id="9" w:name="_Toc236072134"/>
       <w:r>
         <w:t xml:space="preserve">1.5 </w:t>
       </w:r>
@@ -5440,7 +5374,7 @@
         <w:pStyle w:val="21"/>
         <w:spacing w:before="240" w:after="160"/>
       </w:pPr>
-      <w:bookmarkStart w:id="10" w:name="_Toc236071956"/>
+      <w:bookmarkStart w:id="10" w:name="_Toc236072135"/>
       <w:r>
         <w:t xml:space="preserve">1.6 </w:t>
       </w:r>
@@ -5531,7 +5465,7 @@
         <w:pStyle w:val="1"/>
         <w:spacing w:before="320" w:after="160"/>
       </w:pPr>
-      <w:bookmarkStart w:id="11" w:name="_Toc236071957"/>
+      <w:bookmarkStart w:id="11" w:name="_Toc236072136"/>
       <w:r>
         <w:lastRenderedPageBreak/>
         <w:t>第二章</w:t>
@@ -5549,7 +5483,7 @@
         <w:pStyle w:val="21"/>
         <w:spacing w:before="240" w:after="160"/>
       </w:pPr>
-      <w:bookmarkStart w:id="12" w:name="_Toc236071958"/>
+      <w:bookmarkStart w:id="12" w:name="_Toc236072137"/>
       <w:r>
         <w:t xml:space="preserve">2.1 </w:t>
       </w:r>
@@ -5641,7 +5575,7 @@
         <w:spacing w:before="240" w:after="120"/>
         <w:jc w:val="center"/>
       </w:pPr>
-      <w:bookmarkStart w:id="13" w:name="_Toc236071972"/>
+      <w:bookmarkStart w:id="13" w:name="_Toc236072151"/>
       <w:r>
         <w:rPr>
           <w:color w:val="0C2340"/>
@@ -6196,7 +6130,7 @@
         <w:spacing w:before="240" w:after="120"/>
         <w:jc w:val="center"/>
       </w:pPr>
-      <w:bookmarkStart w:id="14" w:name="_Toc236071973"/>
+      <w:bookmarkStart w:id="14" w:name="_Toc236072152"/>
       <w:r>
         <w:rPr>
           <w:color w:val="0C2340"/>
@@ -6749,7 +6683,7 @@
           <w:noProof/>
         </w:rPr>
         <w:drawing>
-          <wp:inline distT="0" distB="0" distL="0" distR="0" wp14:anchorId="67548228" wp14:editId="3012142B">
+          <wp:inline distT="0" distB="0" distL="0" distR="0" wp14:anchorId="20141670" wp14:editId="3DAD846E">
             <wp:extent cx="5669280" cy="2153447"/>
             <wp:effectExtent l="0" t="0" r="0" b="0"/>
             <wp:docPr id="1" name="Picture 1"/>
@@ -6791,7 +6725,7 @@
         <w:spacing w:before="240" w:after="120"/>
         <w:jc w:val="center"/>
       </w:pPr>
-      <w:bookmarkStart w:id="15" w:name="_Toc236071978"/>
+      <w:bookmarkStart w:id="15" w:name="_Toc236072157"/>
       <w:r>
         <w:rPr>
           <w:color w:val="0C2340"/>
@@ -6857,24 +6791,6 @@
           <w:color w:val="0C2340"/>
         </w:rPr>
         <w:t>評測五大階段標準流程圖</w:t>
-      </w:r>
-      <w:r>
-        <w:rPr>
-          <w:color w:val="0C2340"/>
-        </w:rPr>
-        <w:t xml:space="preserve"> (Nano Banana pro </w:t>
-      </w:r>
-      <w:r>
-        <w:rPr>
-          <w:color w:val="0C2340"/>
-        </w:rPr>
-        <w:t>生成</w:t>
-      </w:r>
-      <w:r>
-        <w:rPr>
-          <w:color w:val="0C2340"/>
-        </w:rPr>
-        <w:t>)</w:t>
       </w:r>
       <w:bookmarkEnd w:id="15"/>
     </w:p>
@@ -6883,7 +6799,7 @@
         <w:pStyle w:val="21"/>
         <w:spacing w:before="240" w:after="160"/>
       </w:pPr>
-      <w:bookmarkStart w:id="16" w:name="_Toc236071959"/>
+      <w:bookmarkStart w:id="16" w:name="_Toc236072138"/>
       <w:r>
         <w:t xml:space="preserve">2.2 </w:t>
       </w:r>
@@ -6975,7 +6891,7 @@
         <w:spacing w:before="240" w:after="120"/>
         <w:jc w:val="center"/>
       </w:pPr>
-      <w:bookmarkStart w:id="17" w:name="_Toc236071974"/>
+      <w:bookmarkStart w:id="17" w:name="_Toc236072153"/>
       <w:r>
         <w:rPr>
           <w:color w:val="0C2340"/>
@@ -8874,7 +8790,7 @@
           <w:noProof/>
         </w:rPr>
         <w:drawing>
-          <wp:inline distT="0" distB="0" distL="0" distR="0" wp14:anchorId="409C9514" wp14:editId="521009D7">
+          <wp:inline distT="0" distB="0" distL="0" distR="0" wp14:anchorId="44BE3D36" wp14:editId="513F24DF">
             <wp:extent cx="5669280" cy="2153447"/>
             <wp:effectExtent l="0" t="0" r="0" b="0"/>
             <wp:docPr id="2" name="Picture 2"/>
@@ -8916,7 +8832,7 @@
         <w:spacing w:before="240" w:after="120"/>
         <w:jc w:val="center"/>
       </w:pPr>
-      <w:bookmarkStart w:id="18" w:name="_Toc236071979"/>
+      <w:bookmarkStart w:id="18" w:name="_Toc236072158"/>
       <w:r>
         <w:rPr>
           <w:color w:val="0C2340"/>
@@ -8982,24 +8898,6 @@
           <w:color w:val="0C2340"/>
         </w:rPr>
         <w:t>縱深防禦矩陣圖</w:t>
-      </w:r>
-      <w:r>
-        <w:rPr>
-          <w:color w:val="0C2340"/>
-        </w:rPr>
-        <w:t xml:space="preserve"> (Nano Banana pro </w:t>
-      </w:r>
-      <w:r>
-        <w:rPr>
-          <w:color w:val="0C2340"/>
-        </w:rPr>
-        <w:t>生成</w:t>
-      </w:r>
-      <w:r>
-        <w:rPr>
-          <w:color w:val="0C2340"/>
-        </w:rPr>
-        <w:t>)</w:t>
       </w:r>
       <w:bookmarkEnd w:id="18"/>
     </w:p>
@@ -9008,7 +8906,7 @@
         <w:pStyle w:val="21"/>
         <w:spacing w:before="240" w:after="160"/>
       </w:pPr>
-      <w:bookmarkStart w:id="19" w:name="_Toc236071960"/>
+      <w:bookmarkStart w:id="19" w:name="_Toc236072139"/>
       <w:r>
         <w:t xml:space="preserve">2.3 </w:t>
       </w:r>
@@ -9129,7 +9027,7 @@
         </w:rPr>
         <w:lastRenderedPageBreak/>
         <w:drawing>
-          <wp:inline distT="0" distB="0" distL="0" distR="0" wp14:anchorId="4C565452" wp14:editId="26EDB81D">
+          <wp:inline distT="0" distB="0" distL="0" distR="0" wp14:anchorId="7E765A32" wp14:editId="1D6F328B">
             <wp:extent cx="5669280" cy="2153447"/>
             <wp:effectExtent l="0" t="0" r="0" b="0"/>
             <wp:docPr id="3" name="Picture 3"/>
@@ -9171,7 +9069,7 @@
         <w:spacing w:before="240" w:after="120"/>
         <w:jc w:val="center"/>
       </w:pPr>
-      <w:bookmarkStart w:id="20" w:name="_Toc236071980"/>
+      <w:bookmarkStart w:id="20" w:name="_Toc236072159"/>
       <w:r>
         <w:rPr>
           <w:color w:val="0C2340"/>
@@ -9225,24 +9123,6 @@
           <w:color w:val="0C2340"/>
         </w:rPr>
         <w:t>四層算力堆疊架構圖</w:t>
-      </w:r>
-      <w:r>
-        <w:rPr>
-          <w:color w:val="0C2340"/>
-        </w:rPr>
-        <w:t xml:space="preserve"> (Nano Banana pro </w:t>
-      </w:r>
-      <w:r>
-        <w:rPr>
-          <w:color w:val="0C2340"/>
-        </w:rPr>
-        <w:t>生成</w:t>
-      </w:r>
-      <w:r>
-        <w:rPr>
-          <w:color w:val="0C2340"/>
-        </w:rPr>
-        <w:t>)</w:t>
       </w:r>
       <w:bookmarkEnd w:id="20"/>
     </w:p>
@@ -9256,7 +9136,7 @@
         <w:pStyle w:val="1"/>
         <w:spacing w:before="320" w:after="160"/>
       </w:pPr>
-      <w:bookmarkStart w:id="21" w:name="_Toc236071961"/>
+      <w:bookmarkStart w:id="21" w:name="_Toc236072140"/>
       <w:r>
         <w:lastRenderedPageBreak/>
         <w:t>第三章</w:t>
@@ -9280,7 +9160,7 @@
         <w:pStyle w:val="21"/>
         <w:spacing w:before="240" w:after="160"/>
       </w:pPr>
-      <w:bookmarkStart w:id="22" w:name="_Toc236071962"/>
+      <w:bookmarkStart w:id="22" w:name="_Toc236072141"/>
       <w:r>
         <w:t xml:space="preserve">3.1 </w:t>
       </w:r>
@@ -9637,7 +9517,7 @@
         <w:pStyle w:val="21"/>
         <w:spacing w:before="240" w:after="160"/>
       </w:pPr>
-      <w:bookmarkStart w:id="23" w:name="_Toc236071963"/>
+      <w:bookmarkStart w:id="23" w:name="_Toc236072142"/>
       <w:r>
         <w:t xml:space="preserve">3.2 24 </w:t>
       </w:r>
@@ -9655,7 +9535,7 @@
         <w:spacing w:before="240" w:after="120"/>
         <w:jc w:val="center"/>
       </w:pPr>
-      <w:bookmarkStart w:id="24" w:name="_Toc236071975"/>
+      <w:bookmarkStart w:id="24" w:name="_Toc236072154"/>
       <w:r>
         <w:rPr>
           <w:color w:val="0C2340"/>
@@ -11171,7 +11051,7 @@
         <w:pStyle w:val="1"/>
         <w:spacing w:before="320" w:after="160"/>
       </w:pPr>
-      <w:bookmarkStart w:id="25" w:name="_Toc236071964"/>
+      <w:bookmarkStart w:id="25" w:name="_Toc236072143"/>
       <w:r>
         <w:lastRenderedPageBreak/>
         <w:t>第四章</w:t>
@@ -11189,7 +11069,7 @@
         <w:pStyle w:val="21"/>
         <w:spacing w:before="240" w:after="160"/>
       </w:pPr>
-      <w:bookmarkStart w:id="26" w:name="_Toc236071965"/>
+      <w:bookmarkStart w:id="26" w:name="_Toc236072144"/>
       <w:r>
         <w:t xml:space="preserve">4.1 </w:t>
       </w:r>
@@ -11204,7 +11084,7 @@
         <w:spacing w:before="240" w:after="120"/>
         <w:jc w:val="center"/>
       </w:pPr>
-      <w:bookmarkStart w:id="27" w:name="_Toc236071976"/>
+      <w:bookmarkStart w:id="27" w:name="_Toc236072155"/>
       <w:r>
         <w:rPr>
           <w:color w:val="0C2340"/>
@@ -11824,7 +11704,7 @@
         <w:pStyle w:val="21"/>
         <w:spacing w:before="240" w:after="160"/>
       </w:pPr>
-      <w:bookmarkStart w:id="28" w:name="_Toc236071966"/>
+      <w:bookmarkStart w:id="28" w:name="_Toc236072145"/>
       <w:r>
         <w:t xml:space="preserve">4.2 </w:t>
       </w:r>
@@ -11842,7 +11722,7 @@
         <w:spacing w:before="240" w:after="120"/>
         <w:jc w:val="center"/>
       </w:pPr>
-      <w:bookmarkStart w:id="29" w:name="_Toc236071977"/>
+      <w:bookmarkStart w:id="29" w:name="_Toc236072156"/>
       <w:r>
         <w:rPr>
           <w:color w:val="0C2340"/>
@@ -12581,7 +12461,7 @@
         <w:pStyle w:val="1"/>
         <w:spacing w:before="320" w:after="160"/>
       </w:pPr>
-      <w:bookmarkStart w:id="30" w:name="_Toc236071967"/>
+      <w:bookmarkStart w:id="30" w:name="_Toc236072146"/>
       <w:r>
         <w:lastRenderedPageBreak/>
         <w:t>第五章</w:t>
@@ -12607,7 +12487,7 @@
         <w:pStyle w:val="21"/>
         <w:spacing w:before="240" w:after="160"/>
       </w:pPr>
-      <w:bookmarkStart w:id="31" w:name="_Toc236071968"/>
+      <w:bookmarkStart w:id="31" w:name="_Toc236072147"/>
       <w:r>
         <w:t xml:space="preserve">1. </w:t>
       </w:r>
@@ -12641,7 +12521,7 @@
         <w:pStyle w:val="21"/>
         <w:spacing w:before="240" w:after="160"/>
       </w:pPr>
-      <w:bookmarkStart w:id="32" w:name="_Toc236071969"/>
+      <w:bookmarkStart w:id="32" w:name="_Toc236072148"/>
       <w:r>
         <w:t xml:space="preserve">2. </w:t>
       </w:r>
@@ -12699,7 +12579,7 @@
         <w:pStyle w:val="21"/>
         <w:spacing w:before="240" w:after="160"/>
       </w:pPr>
-      <w:bookmarkStart w:id="33" w:name="_Toc236071970"/>
+      <w:bookmarkStart w:id="33" w:name="_Toc236072149"/>
       <w:r>
         <w:t xml:space="preserve">3. </w:t>
       </w:r>
@@ -13049,31 +12929,31 @@
       </w:rPr>
     </w:lvl>
   </w:abstractNum>
-  <w:num w:numId="1" w16cid:durableId="1764566678">
+  <w:num w:numId="1" w16cid:durableId="1614241707">
     <w:abstractNumId w:val="8"/>
   </w:num>
-  <w:num w:numId="2" w16cid:durableId="1790006082">
+  <w:num w:numId="2" w16cid:durableId="2043820294">
     <w:abstractNumId w:val="6"/>
   </w:num>
-  <w:num w:numId="3" w16cid:durableId="1092317919">
+  <w:num w:numId="3" w16cid:durableId="1936399096">
     <w:abstractNumId w:val="5"/>
   </w:num>
-  <w:num w:numId="4" w16cid:durableId="529756465">
+  <w:num w:numId="4" w16cid:durableId="1835492450">
     <w:abstractNumId w:val="4"/>
   </w:num>
-  <w:num w:numId="5" w16cid:durableId="1312445954">
+  <w:num w:numId="5" w16cid:durableId="1020886819">
     <w:abstractNumId w:val="7"/>
   </w:num>
-  <w:num w:numId="6" w16cid:durableId="1911378918">
+  <w:num w:numId="6" w16cid:durableId="431972120">
     <w:abstractNumId w:val="3"/>
   </w:num>
-  <w:num w:numId="7" w16cid:durableId="1490632303">
+  <w:num w:numId="7" w16cid:durableId="1706446429">
     <w:abstractNumId w:val="2"/>
   </w:num>
-  <w:num w:numId="8" w16cid:durableId="613056217">
+  <w:num w:numId="8" w16cid:durableId="1260985036">
     <w:abstractNumId w:val="1"/>
   </w:num>
-  <w:num w:numId="9" w16cid:durableId="2079790452">
+  <w:num w:numId="9" w16cid:durableId="137041041">
     <w:abstractNumId w:val="0"/>
   </w:num>
 </w:numbering>
@@ -24468,7 +24348,7 @@
     <w:autoRedefine/>
     <w:uiPriority w:val="39"/>
     <w:unhideWhenUsed/>
-    <w:rsid w:val="00613E3C"/>
+    <w:rsid w:val="00076EAF"/>
   </w:style>
   <w:style w:type="paragraph" w:styleId="2a">
     <w:name w:val="toc 2"/>
@@ -24477,7 +24357,7 @@
     <w:autoRedefine/>
     <w:uiPriority w:val="39"/>
     <w:unhideWhenUsed/>
-    <w:rsid w:val="00613E3C"/>
+    <w:rsid w:val="00076EAF"/>
     <w:pPr>
       <w:ind w:leftChars="200" w:left="480"/>
     </w:pPr>
@@ -24487,7 +24367,7 @@
     <w:basedOn w:val="a2"/>
     <w:uiPriority w:val="99"/>
     <w:unhideWhenUsed/>
-    <w:rsid w:val="00613E3C"/>
+    <w:rsid w:val="00076EAF"/>
     <w:rPr>
       <w:color w:val="0000FF" w:themeColor="hyperlink"/>
       <w:u w:val="single"/>
@@ -24499,7 +24379,7 @@
     <w:next w:val="a1"/>
     <w:uiPriority w:val="99"/>
     <w:unhideWhenUsed/>
-    <w:rsid w:val="00613E3C"/>
+    <w:rsid w:val="00076EAF"/>
     <w:pPr>
       <w:ind w:leftChars="400" w:hangingChars="200" w:hanging="200"/>
     </w:pPr>

</xml_diff>